<commit_message>
docs(thesis): snapshot before the 42.14% coverage correction (7 Sep)
Imported from backups/. State of the document immediately before that edit.
Co-Authored-By: Claude Opus 5 <noreply@anthropic.com>
Claude-Session: https://claude.ai/code/session_01HpujHPon5BPtHmMGKvBo5Z
</commit_message>
<xml_diff>
--- a/Thesis_Ch1-5_with_figures.docx
+++ b/Thesis_Ch1-5_with_figures.docx
@@ -2863,7 +2863,7 @@
         </w:tabs>
       </w:pPr>
       <w:r>
-        <w:t>Figure 4.9: Yield forecast for maize at 800 mm rainfall, 120 kg of nitrogen per hectare and soil pH 6.2: 4.74 t/ha with a likely range of 3.24 to 6.24 t/ha</w:t>
+        <w:t>Figure 4.9: Yield forecast for maize at 800 mm rainfall, 120 kg of nitrogen per hectare and soil pH 6.2: 4.74 t/ha with a likely range of 3.24 to 6.24 t/ha, from a model trained on synthetic data</w:t>
       </w:r>
       <w:r>
         <w:tab/>
@@ -2996,7 +2996,7 @@
         <w:rPr>
           <w:szCs w:val="24"/>
         </w:rPr>
-        <w:t>The global agricultural sector faces the unprecedented challenge of increasing food production to sustain a human population projected to approach 10 billion by 2050 (Dayıoğlu &amp; Türker, 2021). To meet these escalating demands while mitigating the adverse impacts of climate change, resource depletion, and environmental degradation, traditional farming methodologies are rapidly shifting towards “Agriculture 4.0” (Abbasi, Martinez, &amp; Ahmad, 2022). This paradigm integrates modern information and communication technologies (ICT), the Internet of Things (IoT), artificial intelligence (AI), and data analytics to optimise agricultural systems (Abiri, Rizan, Balasundram, Shahbazi, &amp; Abdul-Hamid, 2023). At the core of this digital transformation is the necessity for accurate, real-time data collection and on-farm recordkeeping, which serve as the foundation for precision agriculture and operational efficiency (Basir, Buckmaster, Raturi, &amp; Zhang, 2024).</w:t>
+        <w:t>The global agricultural sector faces the unprecedented challenge of increasing food production to sustain a human population projected to approach 10 billion by 2050 (Dayıoğlu &amp; Türker, 2021). To meet these escalating demands while mitigating the adverse impacts of climate change, resource depletion, and environmental degradation, traditional farming methodologies are rapidly shifting towards “Agriculture 4.0” (Abbasi et al., 2022). This paradigm integrates modern information and communication technologies (ICT), the Internet of Things (IoT), artificial intelligence (AI), and data analytics to optimise agricultural systems (Abiri et al., 2023). At the core of this digital transformation is the necessity for accurate, real-time data collection and on-farm recordkeeping, which serve as the foundation for precision agriculture and operational efficiency (Basir et al., 2024).</w:t>
       </w:r>
     </w:p>
     <w:p>
@@ -3007,14 +3007,13 @@
         <w:rPr>
           <w:szCs w:val="24"/>
         </w:rPr>
-        <w:t xml:space="preserve">Historically, agricultural practitioners have relied on unstructured, paper-based logbooks or human memory to track operations. While these traditional methods possess inherent provenance, they are highly susceptible to data fragmentation, loss, recall bias, and significant transcription errors (Basir et al., 2024). In response, Farm Management Information Systems (FMIS) evolved from simple digitalised field books into complex platforms designed to collect, process, store, and disseminate data to support human decision-making in farm enterprises (Fountas et al., 2015; Tummers, Kassahun, &amp; Tekinerdogan, 2019). Modern digital recordkeeping platforms streamline administrative burdens, facilitate data interoperability, and enable precise financial tracking and bioprocess monitoring. Empirical adoption studies further establish that </w:t>
-      </w:r>
-      <w:r>
-        <w:rPr>
-          <w:szCs w:val="24"/>
-        </w:rPr>
-        <w:lastRenderedPageBreak/>
-        <w:t>uptake of these systems is strongly conditioned by farmers’ education, access to advisory services, and access to rural credit—factors that are unevenly distributed in developing economies (Carrer, de Souza Filho, &amp; Batalha, 2017).</w:t>
+        <w:t xml:space="preserve">Historically, agricultural practitioners have relied on unstructured, paper-based logbooks or human memory to track operations. While these traditional methods possess inherent provenance, they are highly susceptible to data fragmentation, loss, recall bias, and significant transcription errors (Basir et al., 2024). In response, Farm Management Information Systems (FMIS) evolved from simple digitalised field books into complex platforms designed to collect, process, store, and disseminate data to support human decision-making in farm enterprises (Fountas et al., 2015; Tummers et al., 2019). Modern digital recordkeeping platforms streamline administrative burdens, facilitate data interoperability, and enable precise financial tracking and bioprocess monitoring. Empirical adoption studies further establish that </w:t>
+      </w:r>
+      <w:r>
+        <w:rPr>
+          <w:szCs w:val="24"/>
+        </w:rPr>
+        <w:t>uptake of these systems is strongly conditioned by farmers’ education, access to advisory services, and access to rural credit—factors that are unevenly distributed in developing economies (Carrer et al., 2017).</w:t>
       </w:r>
     </w:p>
     <w:p>
@@ -3025,7 +3024,7 @@
         <w:rPr>
           <w:szCs w:val="24"/>
         </w:rPr>
-        <w:t>However, the distribution and adoption of these digital agricultural technologies remain highly unequal globally (Javaid, Haleem, Singh, &amp; Suman, 2022; Mhlanga &amp; Ndhlovu, 2023). In Sub-Saharan Africa, including Nigeria, the integration of advanced FMIS faces unique socio-economic and infrastructural barriers. The Nigerian agricultural landscape predominantly comprises smallholder farmers and medium-scale enterprises that frequently lack access to robust technological infrastructure and capital (Abioye et al., 2024). Market analyses attributed to the Global System for Mobile Communications Association (GSMA) report that 68% of Nigerians in rural areas lacked smartphones in 2022, rural ownership standing at 32% against 58% in urban areas. This severe digital divide is primarily exacerbated by high inflation, device-affordability constraints, and pervasive digital illiteracy (Mhlanga &amp; Ndhlovu, 2023). Consequently, while the existing 32% smartphone penetration provides a critical leapfrog opportunity to deploy mobile-based agricultural advisory services, comprehensive digital farm record management remains heavily underutilised. Engineers and software developers must therefore contextualise global digital-farming advancements into localised, accessible platforms. Developing tools that merge farm mechanisation tracking, post-harvest bioprocess monitoring, and financial management into a single decision-support architecture holds the potential to strengthen agricultural productivity in Nigeria.</w:t>
+        <w:t>However, the distribution and adoption of these digital agricultural technologies remain highly unequal globally (Javaid et al., 2022; Mhlanga &amp; Ndhlovu, 2023). In Sub-Saharan Africa, including Nigeria, the integration of advanced FMIS faces unique socio-economic and infrastructural barriers. The Nigerian agricultural landscape predominantly comprises smallholder farmers and medium-scale enterprises that frequently lack access to robust technological infrastructure and capital (Abioye et al., 2024). Market analyses attributed to the Global System for Mobile Communications Association (GSMA) report that 68% of Nigerians in rural areas lacked smartphones in 2022, rural ownership standing at 32% against 58% in urban areas. This severe digital divide is primarily exacerbated by high inflation, device-affordability constraints, and pervasive digital illiteracy (Mhlanga &amp; Ndhlovu, 2023). Consequently, while the existing 32% smartphone penetration provides a critical leapfrog opportunity to deploy mobile-based agricultural advisory services, comprehensive digital farm record management remains heavily underutilised. Engineers and software developers must therefore contextualise global digital-farming advancements into localised, accessible platforms. Developing tools that merge farm mechanisation tracking, post-harvest bioprocess monitoring, and financial management into a single decision-support architecture holds the potential to strengthen agricultural productivity in Nigeria.</w:t>
       </w:r>
     </w:p>
     <w:p>
@@ -3058,8 +3057,7 @@
         <w:rPr>
           <w:szCs w:val="24"/>
         </w:rPr>
-        <w:lastRenderedPageBreak/>
-        <w:t>Enterprise Resource Planning (ERP) systems frequently exhibit high complexity, lack standardised data formats, and impose prohibitive costs that exclude small and medium-scale farmers (Fountas et al., 2015; Giua, Materia, &amp; Camanzi, 2021).</w:t>
+        <w:t>Enterprise Resource Planning (ERP) systems frequently exhibit high complexity, lack standardised data formats, and impose prohibitive costs that exclude small and medium-scale farmers (Fountas et al., 2015; Giua et al., 2021).</w:t>
       </w:r>
     </w:p>
     <w:p>
@@ -3070,13 +3068,13 @@
         <w:rPr>
           <w:szCs w:val="24"/>
         </w:rPr>
-        <w:t>Furthermore, agricultural operations suffer from critical data fragmentation. Farm managers typically maintain Farm Financial Accounts (FFA) entirely separate from their operational and bioprocess records, resulting in duplicated data entry, administrative fatigue, and analytical inefficiencies (Poppe, Vrolijk, &amp; Bosloper, 2</w:t>
-      </w:r>
-      <w:r>
-        <w:rPr>
-          <w:szCs w:val="24"/>
-        </w:rPr>
-        <w:t>023). Because essential metrics</w:t>
+        <w:t>Furthermore, agricultural operations suffer from critical data fragmentation. Farm managers typically maintain Farm Financial Accounts (FFA) entirely separate from their operational and bioprocess records, resulting in duplicated data entry, administrative fatigue, and analytical inefficiencies (Poppe et al., 2023)</w:t>
+      </w:r>
+      <w:r>
+        <w:rPr>
+          <w:szCs w:val="24"/>
+        </w:rPr>
+        <w:t>. Because essential metrics</w:t>
       </w:r>
       <w:r>
         <w:rPr>
@@ -3111,7 +3109,7 @@
         <w:rPr>
           <w:szCs w:val="24"/>
         </w:rPr>
-        <w:t>Without interoperable, structured data, Nigerian agricultural enterprises cannot deploy predictive analytics or decision-support algorithms to optimise resource utilisation (van Klompenburg, Kassahun, &amp; Catal, 2020). In rural contexts where poor internet connectivity and limited technical training exacerbate these issues, deploying resource-intensive, cloud-heavy ERP solutions proves impractical (Abbasi et al., 2022; Mhlanga &amp; Ndhlovu, 2023). Therefore, a critical gap exists for a localised, unifi</w:t>
+        <w:t>Without interoperable, structured data, Nigerian agricultural enterprises cannot deploy predictive analytics or decision-support algorithms to optimise resource utilisation (van Klompenburg et al., 2020). In rural contexts where poor internet connectivity and limited technical training exacerbate these issues, deploying resource-intensive, cloud-heavy ERP solutions proves impractical (Abbasi et al., 2022; Mhlanga &amp; Ndhlovu, 2023). Therefore, a critical gap exists for a localised, unifi</w:t>
       </w:r>
       <w:r>
         <w:rPr>
@@ -3318,7 +3316,7 @@
       </w:r>
       <w:r>
         <w:tab/>
-        <w:t>To model the post-harvest drying of harvested produce using established thin-layer drying kinetics, and to couple the resulting moisture, water-balance and marketable-mass outcomes to the farm’s financial record, so that the unit cost of production is expressed against saleable rather than harvested mass (Onwude, Hashim, Janius, Nawi, &amp; Abdan, 2016; Baidhe, Clementson, Senyah, &amp; Hammed, 2024).</w:t>
+        <w:t>To model the post-harvest drying of harvested produce using established thin-layer drying kinetics, and to couple the resulting moisture, water-balance and marketable-mass outcomes to the farm’s financial record, so that the unit cost of production is expressed against saleable rather than harvested mass (Onwude et al., 2016; Baidhe et al., 2024).</w:t>
       </w:r>
     </w:p>
     <w:p>
@@ -3586,7 +3584,7 @@
         <w:rPr>
           <w:szCs w:val="24"/>
         </w:rPr>
-        <w:t>To address these inefficiencies, Farm Management Information Systems (FMIS) emerged as centralised, planned architectures designed to collect, process, store, and disseminate agricultural data (Fountas et al., 2015). A critical evolutionary flaw, however, occurred in farm administration: the separation of Farm Financial Accounts (FFA) from operational bioprocess records. As Poppe, Vrolijk, and Bosloper (2023) observed, financial accounting and farm-management systems originated from the same historical note-taking practices but diverged into separate software ecosystems as they computerised. This separation forces farmers to duplicate data entry across disjointed systems, increasing administrative burdens and preventing the accurate correlation of agronomic inputs with true financial profitability.</w:t>
+        <w:t>To address these inefficiencies, Farm Management Information Systems (FMIS) emerged as centralised, planned architectures designed to collect, process, store, and disseminate agricultural data (Fountas et al., 2015). A critical evolutionary flaw, however, occurred in farm administration: the separation of Farm Financial Accounts (FFA) from operational bioprocess records. As Poppe et al. (2023) observed, financial accounting and farm-management systems originated from the same historical note-taking practices but diverged into separate software ecosystems as they computerised. This separation forces farmers to duplicate data entry across disjointed systems, increasing administrative burdens and preventing the accurate correlation of agronomic inputs with true financial profitability.</w:t>
       </w:r>
     </w:p>
     <w:p>
@@ -3614,7 +3612,7 @@
         <w:rPr>
           <w:szCs w:val="24"/>
         </w:rPr>
-        <w:t>Within agricultural informatics, a Decision-Support System (DSS) does not make isolated operational decisions; rather, it processes heterogeneous metrics—such as weather patterns, soil conditions, market prices, and historical yields—through deterministic rules or statistical and machine-learning models to provide stakeholders with actionable, optimised alternatives (van Klompenburg et al., 2020). By converting complex biological and economic variables into understandable visualisations and predictive estimates, DSS platforms bridge the gap between static farm records and proactive resource management. Recent work demonstrates that such systems can be deployed even for resource-constrained smallholders when the underlying predictive models are deliberately kept inexpensive and mobile-deployable (Olisah, Smith, Smith, Lawrence, &amp; Ojukwu, 2024).</w:t>
+        <w:t>Within agricultural informatics, a Decision-Support System (DSS) does not make isolated operational decisions; rather, it processes heterogeneous metrics—such as weather patterns, soil conditions, market prices, and historical yields—through deterministic rules or statistical and machine-learning models to provide stakeholders with actionable, optimised alternatives (van Klompenburg et al., 2020). By converting complex biological and economic variables into understandable visualisations and predictive estimates, DSS platforms bridge the gap between static farm records and proactive resource management. Recent work demonstrates that such systems can be deployed even for resource-constrained smallholders when the underlying predictive models are deliberately kept inexpensive and mobile-deployable (Olisah et al., 2024).</w:t>
       </w:r>
     </w:p>
     <w:p>
@@ -4046,7 +4044,7 @@
         <w:rPr>
           <w:szCs w:val="24"/>
         </w:rPr>
-        <w:t xml:space="preserve">To overcome this, modern architectures increasingly integrate blockchain technology as a secure data-governance mechanism (Xiong et al., 2020). Blockchain utilises an immutable, distributed digital ledger to store yield data, mechanisation logs, and financial metrics. By locking operational and financial records into a tamper-proof framework, the system provides a constant flow of credible, unaltered data. </w:t>
+        <w:t xml:space="preserve">To overcome this, modern architectures increasingly integrate blockchain technology as a secure data-governance mechanism (Xiong et al., 2020). Blockchain utilises an immutable, distributed digital ledger to store yield data, mechanisation logs, and financial metrics. By locking operational and financial records into a soft-immutable, audit-trailed framework, the system provides a constant flow of credible, auditable data. </w:t>
       </w:r>
       <w:r>
         <w:rPr>
@@ -4440,7 +4438,7 @@
         <w:pStyle w:val="BodyPara"/>
       </w:pPr>
       <w:r>
-        <w:t>The kinetics of that operation are conventionally described by thin-layer models, which express the dimensionless moisture ratio of a product as a function of drying time. Three are long established and remain the reference forms. The Newton, or Lewis, model, MR = exp(−kt), treats drying as a first-order process governed by a single rate constant (Lewis, 1921). The Page model, MR = exp(−k·tⁿ), introduces an empirical exponent that accommodates the deviation from first-order behaviour observed in most biological materials (Page, 1949). The Henderson and Pabis model adds a pre-exponential coefficient derived from the first term of the analytical solution to Fick’s second law (Henderson &amp; Pabis, 1961). Onwude, Hashim, Janius, Nawi, and Abdan (2016), in a review of thin-layer modelling of fruits and vegetables, find that semi-theoretical forms of this kind dominate the applied literature precisely because they are fitted from a small number of time-and-mass observations that a practitioner can actually take, and Erbay and Icier (2010) reach the same conclusion for foods generally. Model parameters are recovered by regression on a linearising transform — for the Page model, the double logarithm ln(−ln MR) = ln k + n·ln t — which makes the fit reproducible and inspectable rather than opaque.</w:t>
+        <w:t>The kinetics of that operation are conventionally described by thin-layer models, which express the dimensionless moisture ratio of a product as a function of drying time. Three are long established and remain the reference forms. The Newton, or Lewis, model, MR = exp(−kt), treats drying as a first-order process governed by a single rate constant (Lewis, 1921). The Page model, MR = exp(−k·tⁿ), introduces an empirical exponent that accommodates the deviation from first-order behaviour observed in most biological materials (Page, 1949). The Henderson and Pabis model adds a pre-exponential coefficient derived from the first term of the analytical solution to Fick’s second law (Henderson &amp; Pabis, 1961). Onwude et al. (2016), in a review of thin-layer modelling of fruits and vegetables, find that semi-theoretical forms of this kind dominate the applied literature precisely because they are fitted from a small number of time-and-mass observations that a practitioner can actually take, and Erbay and Icier (2010) reach the same conclusion for foods generally. Model parameters are recovered by regression on a linearising transform — for the Page model, the double logarithm ln(−ln MR) = ln k + n·ln t — which makes the fit reproducible and inspectable rather than opaque.</w:t>
       </w:r>
     </w:p>
     <w:p>
@@ -4537,7 +4535,7 @@
         <w:pStyle w:val="BodyPara"/>
       </w:pPr>
       <w:r>
-        <w:t>Baidhe, Clementson, Senyah, and Hammed (2024), appraising post-harvest drying and storage operations across Africa, report that inadequate and poorly controlled drying remains a principal determinant of grain quality loss on the continent, and that smallholder practice is dominated by open sun drying whose end point is judged by eye rather than measured. Their finding matters for the present work in a specific way: where the end point is unmeasured, the mass that reaches the store is unknown, and a farmer who has not measured it has no way to know the quantity against which their production costs should be divided.</w:t>
+        <w:t>Baidhe et al. (2024), appraising post-harvest drying and storage operations across Africa, report that inadequate and poorly controlled drying remains a principal determinant of grain quality loss on the continent, and that smallholder practice is dominated by open sun drying whose end point is judged by eye rather than measured. Their finding matters for the present work in a specific way: where the end point is unmeasured, the mass that reaches the store is unknown, and a farmer who has not measured it has no way to know the quantity against which their production costs should be divided.</w:t>
       </w:r>
     </w:p>
     <w:p>
@@ -4558,7 +4556,7 @@
         <w:t xml:space="preserve">the classification of cost into variable, fixed and semi-variable behaviour, and the computation of unit cost of production and break-even price against a defined output quantity </w:t>
       </w:r>
       <w:r>
-        <w:t xml:space="preserve">(Kay, Edwards, &amp; Duffy, 2016) </w:t>
+        <w:t xml:space="preserve">(Kay et al., 2016) </w:t>
       </w:r>
       <w:r>
         <w:t>but it assumes the output quantity is given. The contribution of the post-harvest module designed in Chapter Three and evaluated in Chapter Four is that junction: the thin-layer models themselves are long established and are not claimed as novel, but their coupling to the paired financial record, so that the denominator of the unit-cost calculation is the mass that can actually be sold, is not found in the reviewed literature. Objective (v) of Section 1.3 is stated in exactly those terms.</w:t>
@@ -5689,7 +5687,7 @@
         <w:rPr>
           <w:szCs w:val="24"/>
         </w:rPr>
-        <w:t>The decision-support engine follows a two-tier design that deliberately aligns model complexity with available data and device capability (van Klompenburg, Kassahun, &amp; Catal, 2020; Olisah, Smith, Smith, Lawrence, &amp; Ojukwu, 2024).</w:t>
+        <w:t>The decision-support engine follows a two-tier design that deliberately aligns model complexity with available data and device capability (van Klompenburg et al., 2020; Olisah et al., 2024).</w:t>
       </w:r>
     </w:p>
     <w:p>
@@ -5921,7 +5919,7 @@
         <w:pStyle w:val="BodyPara"/>
       </w:pPr>
       <w:r>
-        <w:t xml:space="preserve">This module extends the deterministic tier from margin accounting to cost-behaviour analysis, and supplies the vocabulary of enterprise budgeting reviewed in Section 2.7.2 (Kay, Edwards, &amp; Duffy, 2016). Recorded cost is classified at the schema edge into variable, semi-variable and fixed behaviour; the proportion of cost that carries a subtype is reported as an explicit classification-coverage figure, and the residue is reported as </w:t>
+        <w:t xml:space="preserve">This module extends the deterministic tier from margin accounting to cost-behaviour analysis, and supplies the vocabulary of enterprise budgeting reviewed in Section 2.7.2 (Kay et al., 2016). Recorded cost is classified at the schema edge into variable, semi-variable and fixed behaviour; the proportion of cost that carries a subtype is reported as an explicit classification-coverage figure, and the residue is reported as </w:t>
       </w:r>
       <w:r>
         <w:lastRenderedPageBreak/>
@@ -13721,7 +13719,7 @@
         <w:pStyle w:val="FigureCaption"/>
       </w:pPr>
       <w:r>
-        <w:t>Figure 4.9: Yield forecast for maize at 800 mm rainfall, 120 kg of nitrogen per hectare and soil pH 6.2: 4.74 t/ha with a likely range of 3.24 to 6.24 t/ha</w:t>
+        <w:t>Figure 4.9: Yield forecast for maize at 800 mm rainfall, 120 kg of nitrogen per hectare and soil pH 6.2: 4.74 t/ha with a likely range of 3.24 to 6.24 t/ha, from a model trained on synthetic data</w:t>
       </w:r>
     </w:p>
     <w:p>
@@ -15825,7 +15823,7 @@
           <w:bCs/>
           <w:szCs w:val="24"/>
         </w:rPr>
-        <w:t>Documentation gaps. Two citations that were outstanding in the implementation are now resolved and are attributed in Chapter Two: the cost-behaviour taxonomy to the enterprise-budgeting literature of agricultural economics (Kay, Edwards, &amp; Duffy, 2016), and the safe-storage moisture ceilings to post-harvest handling guidance (FAO, n.d.; Baidhe et al., 2024).</w:t>
+        <w:t>Documentation gaps. Two citations that were outstanding in the implementation are now resolved and are attributed in Chapter Two: the cost-behaviour taxonomy to the enterprise-budgeting literature of agricultural economics (Kay et al., 2016), and the safe-storage moisture ceilings to post-harvest handling guidance (FAO, n.d.; Baidhe et al., 2024).</w:t>
       </w:r>
     </w:p>
     <w:p>
@@ -16272,10 +16270,10 @@
         <w:t xml:space="preserve">On the modelling ladder. </w:t>
       </w:r>
       <w:r>
-        <w:t>Van</w:t>
-      </w:r>
-      <w:r>
-        <w:t xml:space="preserve"> Klompenburg, Kassahun, and Catal (2020) find tree-based ensembles to perform strongly on tabular agricultural data at far lower computational cost than deep networks, and the implemented forecast tier follows that finding with a 200-estimator Random Forest. Chapter </w:t>
+        <w:t>Van Klompenburg et al. (2020)</w:t>
+      </w:r>
+      <w:r>
+        <w:t xml:space="preserve"> find tree-based ensembles to perform strongly on tabular agricultural data at far lower computational cost than deep networks, and the implemented forecast tier follows that finding with a 200-estimator Random Forest. Chapter </w:t>
       </w:r>
       <w:r>
         <w:t>one</w:t>
@@ -16304,8 +16302,7 @@
         <w:t xml:space="preserve">On post-harvest drying. The thin-layer models the platform fits are those established by Lewis (1921) and Page (1949) and reviewed by Onwude et al. (2016); nothing in the </w:t>
       </w:r>
       <w:r>
-        <w:lastRenderedPageBreak/>
-        <w:t>kinetics is new, and no claim to the contrary is made. What the reviewed literature does not do is carry those outputs into a cost record. Baidhe, Clementson, Senyah, and Hammed (2024) report that inadequate and unmeasured drying remains a principal determinant of grain quality loss across Africa, and that smallholder practice judges the end point by eye; the enterprise-budgeting literature (Kay, Edwards, &amp; Duffy, 2016) supplies the cost-behaviour taxonomy and the unit-cost formulation but assumes the output quantity is given. This work joins the two, and the ₦35.00-to-₦41.67 result is what the junction produces. That is the contribution claimed for Objective (v), stated at its true size: a demonstrated computation on seeded runs, not a validated finding about Nigerian maize.</w:t>
+        <w:t>kinetics is new, and no claim to the contrary is made. What the reviewed literature does not do is carry those outputs into a cost record. Baidhe et al. (2024) report that inadequate and unmeasured drying remains a principal determinant of grain quality loss across Africa, and that smallholder practice judges the end point by eye; the enterprise-budgeting literature (Kay et al., 2016) supplies the cost-behaviour taxonomy and the unit-cost formulation but assumes the output quantity is given. This work joins the two, and the ₦35.00-to-₦41.67 result is what the junction produces. That is the contribution claimed for Objective (v), stated at its true size: a demonstrated computation on seeded runs, not a validated finding about Nigerian maize.</w:t>
       </w:r>
     </w:p>
     <w:p>
@@ -16405,6 +16402,15 @@
       </w:r>
       <w:r>
         <w:t>the defects were found by the project’s own audit and closed before submission rather than being discovered by an examiner.</w:t>
+      </w:r>
+    </w:p>
+    <w:p>
+      <w:pPr>
+        <w:pStyle w:val="BodyPara"/>
+      </w:pPr>
+      <w:r>
+        <w:rPr/>
+        <w:t>Ledger integrity boundary. The soft-immutability constraint reported at Sections 3.5 and 4.15 is enforced by the application: deletion is refused, no update route exists, and a correction posts a linked contra entry that leaves the original visible. It is audit-trail discipline, not cryptographic tamper-evidence. There is no hash chaining, no signing and no append-only log; a party with database access is not constrained by it.</w:t>
       </w:r>
     </w:p>
     <w:p>

</xml_diff>

<commit_message>
docs(thesis): snapshot before the 4.15 clause edit (7 Sep)
Imported from backups/. State of the document immediately before that edit.
Co-Authored-By: Claude Opus 5 <noreply@anthropic.com>
Claude-Session: https://claude.ai/code/session_01HpujHPon5BPtHmMGKvBo5Z
</commit_message>
<xml_diff>
--- a/Thesis_Ch1-5_with_figures.docx
+++ b/Thesis_Ch1-5_with_figures.docx
@@ -624,7 +624,7 @@
         <w:rPr>
           <w:szCs w:val="24"/>
         </w:rPr>
-        <w:t xml:space="preserve">Nigerian smallholder and medium-scale farms keep production and cost records on paper, so the cost of production per crop is rarely known at sale; existing farm management software assumes continuous connectivity and charges per user seat. This work designed, implemented and evaluated AGRI-PROFIT, an offline-first web platform comprising a soft-immutable paired-write ledger in which every operational record posts its financial transaction in a single commit and is corrected only by a linked contra entry, a deterministic decision-support layer computing nine quantities including per-crop gross margin, unit cost of production on two bases and retrospective break-even yield, and a post-harvest drying module applying thin-layer kinetics to the farm’s own records. A design-and-build methodology was adopted, its four-strand evaluation specified in advance. Functional verification at the submitted commit returned 426 collected backend cases — 422 passed, 4 skipped, none failed — at 96% statement coverage over 1,601 statements, with 148 frontend tests across 13 files at 41.84–43.23% statement coverage, and the drying model recovered its designed parameters exactly. For a 100 kg maize harvest dried from 25% to 13% moisture and weighed out at 84 kg, unit cost moves from ₦35.00 to ₦41.67 per kilogram: post-harvest mass loss expressed in money. Under 0.4 Mbps simulated throttling the service worker reduced network transfer on a repeat visit from 139,245 bytes to 127, first paint from 5,661.2 ms to 70.6 ms and largest contentful paint to 1,612.0 ms. Role-based authorisation over three roles and eleven permissions, expiring hashed share tokens, login throttling and credential scrubbing were verified live on the running stack. The yield-forecast tier returned R² 0.9762, MAE 0.2414 t/ha and RMSE 0.4883 t/ha, reproducible to six decimal places, on synthetic data alone; no claim of field-predictive accuracy is made. Measured resource consumption below 205 MiB gives an estimated ₦20,950 per month, or ₦105 per farm </w:t>
+        <w:t xml:space="preserve">Nigerian smallholder and medium-scale farms keep production and cost records on paper, so the cost of production per crop is rarely known at sale; existing farm management software assumes continuous connectivity and charges per user seat. This work designed, implemented and evaluated AGRI-PROFIT, an offline-first web platform comprising a soft-immutable paired-write ledger in which every operational record posts its financial transaction in a single commit and is corrected only by a linked contra entry, a deterministic decision-support layer computing nine quantities including per-crop gross margin, unit cost of production on two bases and retrospective break-even yield, and a post-harvest drying module applying thin-layer kinetics to the farm’s own records. A design-and-build methodology was adopted, its four-strand evaluation specified in advance. Functional verification at the submitted commit returned 426 collected backend cases — 422 passed, 4 skipped, none failed — at 96% statement coverage over 1,601 statements, with 148 frontend tests across 13 files at 42.14% statement coverage, and the drying model recovered its designed parameters exactly. For a 100 kg maize harvest dried from 25% to 13% moisture and weighed out at 84 kg, unit cost moves from ₦35.00 to ₦41.67 per kilogram: post-harvest mass loss expressed in money. Under 0.4 Mbps simulated throttling the service worker reduced network transfer on a repeat visit from 139,245 bytes to 127, first paint from 5,661.2 ms to 70.6 ms and largest contentful paint to 1,612.0 ms. Role-based authorisation over three roles and eleven permissions, expiring hashed share tokens, login throttling and credential scrubbing were verified live on the running stack. The yield-forecast tier returned R² 0.9762, MAE 0.2414 t/ha and RMSE 0.4883 t/ha, reproducible to six decimal places, on synthetic data alone; no claim of field-predictive accuracy is made. Measured resource consumption below 205 MiB gives an estimated ₦20,950 per month, or ₦105 per farm </w:t>
       </w:r>
       <w:r>
         <w:rPr>
@@ -15664,8 +15664,7 @@
               <w:t xml:space="preserve">Three of four specified strands executed: functional verification (426 collected backend cases, 422 passed, 4 skipped, 0 failed, at </w:t>
             </w:r>
             <w:r>
-              <w:lastRenderedPageBreak/>
-              <w:t>96% statement coverage, with 148 frontend tests at 41.84–43.23%, plus three sets of negative controls and a migration chain run against real PostgreSQL); performance benchmarking across two network conditions with cold and warm cache and driven-browser attribution; and a hosting-cost analysis anchored on a measured footprint</w:t>
+              <w:t>96% statement coverage, with 148 frontend tests at 42.14%, plus three sets of negative controls and a migration chain run against real PostgreSQL); performance benchmarking across two network conditions with cold and warm cache and driven-browser attribution; and a hosting-cost analysis anchored on a measured footprint</w:t>
             </w:r>
           </w:p>
         </w:tc>

</xml_diff>

<commit_message>
docs(thesis): snapshot before the part 2 revision (9 Sep)
Imported from backups/. State of the document immediately before that edit.
Co-Authored-By: Claude Opus 5 <noreply@anthropic.com>
Claude-Session: https://claude.ai/code/session_01HpujHPon5BPtHmMGKvBo5Z
</commit_message>
<xml_diff>
--- a/Thesis_Ch1-5_with_figures.docx
+++ b/Thesis_Ch1-5_with_figures.docx
@@ -16049,15 +16049,10 @@
         <w:pStyle w:val="BodyPara"/>
       </w:pPr>
       <w:r>
-        <w:lastRenderedPageBreak/>
-        <w:t>The procedures used were those specified in Chapter Three and reported in Chapter Four. Development was iterative and version-controlled, with human-reviewed, agent-assisted implementation. The evaluation was specified in advance as four strands: functional verification by automated test suite with hand-computed fixtures and negative controls; performance benchmarking by Lighthouse under mobile emulation and simulated network throttling; a hosting-cost analysis anchored on a measured container footprint; and a heuristic-plus-System-Usability-Scale evaluation with a small expert panel. Three of the four were executed. The fourth, usability, was specified, its instruments were prepared in full, and it was not carried out. A fifth body of evidence, not among the four strands as originally specified, was obtained by probing the running production composition directly and is reported in Section 4.11. All evidence in this work is measured at</w:t>
-      </w:r>
-      <w:r>
-        <w:t xml:space="preserve"> a single implementation state: </w:t>
-      </w:r>
-      <w:r>
-        <w:t>commit 8a29ee0aeed4d00b4caf9e58854821e80b6d403d on the main branch, dated 31 August 2026, referred to as the baseline commit. Where a measurement was taken at an earlier commit it is attributed at the point of use.</w:t>
-      </w:r>
+        <w:t>The procedures used were those specified in Chapter Three and reported in Chapter Four. Development was iterative and version-controlled, with human-reviewed, agent-assisted implementation. The evaluation was specified in advance as four strands: functional verification by automated test suite with hand-computed fixtures and negative controls; performance benchmarking by Lighthouse under mobile emulation and simulated network throttling; a hosting-cost analysis anchored on a measured container footprint; and a heuristic-plus-System-Usability-Scale evaluation with a small expert panel. Three of the four were executed. The fourth, usability, was specified, its instruments were prepared in full, and it was not carried out. A fifth body of evidence, not among the four strands as originally specified, was obtained by probing the running production composition directly and is reported in Section 4.11. The evidence in this work is drawn from two implementation states, and each class of evidence is attributed to the state at which it was produced. The numerical figures, the database census and the live probes were captured on 29 August 2026 and re-verified on 7 September 2026; the interface screenshots and the test counts were produced on 7 September 2026; the performance figures were measured on 29 August 2026 and have not been re-measured. The two states are named in Section 4.1 and recorded in full in Appendix G. Where a measurement was taken at an earlier state it is attributed at the point of use.</w:t>
+      </w:r>
+      <w:r/>
+      <w:r/>
     </w:p>
     <w:p>
       <w:pPr>

</xml_diff>

<commit_message>
docs(thesis): snapshot before the Appendix A revision (9 Sep)
Imported from backups/. State of the document immediately before that edit.
Co-Authored-By: Claude Opus 5 <noreply@anthropic.com>
Claude-Session: https://claude.ai/code/session_01HpujHPon5BPtHmMGKvBo5Z
</commit_message>
<xml_diff>
--- a/Thesis_Ch1-5_with_figures.docx
+++ b/Thesis_Ch1-5_with_figures.docx
@@ -2363,7 +2363,7 @@
         </w:tabs>
       </w:pPr>
       <w:r>
-        <w:t>Table 4.2: Per-crop decision support, farm 26, at the baseline commit</w:t>
+        <w:t>Table 4.2: Per-crop decision support, farm 26</w:t>
       </w:r>
       <w:r>
         <w:tab/>
@@ -6754,7 +6754,7 @@
         <w:rPr>
           <w:szCs w:val="24"/>
         </w:rPr>
-        <w:t>Objective 2 concerns the conversion of recorded farm activity into decision-relevant financial information. The deterministic tier is exactly that conversion: it computes from the ledger the platform actually holds, with no model, no estimation and no external data. This section reports its output against the seeded demonstration farm at the baseline commit. Every figure is a live API response, and every one is traceable to the records that produced it.</w:t>
+        <w:t>Objective 2 concerns the conversion of recorded farm activity into decision-relevant financial information. The deterministic tier is exactly that conversion: it computes from the ledger the platform actually holds, with no model, no estimation and no external data. This section reports its output against the seeded demonstration farm. Every figure is a live API response, and every one is traceable to the records that produced it.</w:t>
       </w:r>
     </w:p>
     <w:p>
@@ -6766,7 +6766,7 @@
         <w:rPr>
           <w:szCs w:val="24"/>
         </w:rPr>
-        <w:t>Table 4.2: Per-crop decision support, farm 26, at the baseline commit</w:t>
+        <w:t>Table 4.2: Per-crop decision support, farm 26</w:t>
       </w:r>
       <w:bookmarkEnd w:id="110"/>
     </w:p>
@@ -14392,7 +14392,7 @@
         <w:pStyle w:val="BodyPara"/>
       </w:pPr>
       <w:r>
-        <w:t>Table B.2 of Appendix B records the deployment, migration and recovery checks and their outcomes. The distinction that these results establish, and that must be carried into Chapter Five, is between a deployment path that has been demonstrated and a deployment that has been performed. This work has the first and not the second. The production composition builds, starts and answers its probes; the migration chain runs and rolls back against a real PostgreSQL server; a backup was taken and restored with every row count matching and the paired-write invariant intact. No instance serves a real user, no certificate has been issued for a real hostname, and there is no observability of any kind — no metrics, no tracing, no alerting, the containers logging to standard output only. Nor is any continuous-integration result recorded for the baseline commit: the workflow is defined and the substance of its jobs was executed locally, which is what Section 4.9 reports, and no claim that the pipeline passed is made anywhere in this work.</w:t>
+        <w:t>Table B.2 of Appendix B records the deployment, migration and recovery checks and their outcomes. The distinction that these results establish, and that must be carried into Chapter Five, is between a deployment path that has been demonstrated and a deployment that has been performed. This work has the first and not the second. The production composition builds, starts and answers its probes; the migration chain runs and rolls back against a real PostgreSQL server; a backup was taken and restored with every row count matching and the paired-write invariant intact. No instance serves a real user, no certificate has been issued for a real hostname, and there is no observability of any kind — no metrics, no tracing, no alerting, the containers logging to standard output only. Nor is any continuous-integration result recorded: the workflow is defined and the substance of its jobs was executed locally, which is what Section 4.9 reports, and no claim that the pipeline passed is made anywhere in this work.</w:t>
       </w:r>
     </w:p>
     <w:p>
@@ -15789,7 +15789,7 @@
           <w:bCs/>
           <w:szCs w:val="24"/>
         </w:rPr>
-        <w:t>Verification gaps — evaluation limitations. There are no component tests for the page and form layer, including the drying-curve chart. The local-database migration is proven against an in-memory IndexedDB implementation rather than a real browser, so browser-specific storage eviction, quota behaviour and vendor bugs are out of its reach. Backend tests run on SQLite while production runs PostgreSQL; only the migration chain was executed against a real PostgreSQL server. Concurrency is measured on SQLite and inferred for PostgreSQL. There is no end-to-end browser test of the offline-to-online transition, the service-worker lifecycle or the installation path. The frontend suite is not timing-robust under machine contention. There has been no independent security review, no penetration test, no threat model, and no load, stress or soak testing. And no continuous-integration run result is recorded for the baseline commit.</w:t>
+        <w:t>Verification gaps — evaluation limitations. There are no component tests for the page and form layer, including the drying-curve chart. The local-database migration is proven against an in-memory IndexedDB implementation rather than a real browser, so browser-specific storage eviction, quota behaviour and vendor bugs are out of its reach. Backend tests run on SQLite while production runs PostgreSQL; only the migration chain was executed against a real PostgreSQL server. Concurrency is measured on SQLite and inferred for PostgreSQL. There is no end-to-end browser test of the offline-to-online transition, the service-worker lifecycle or the installation path. The frontend suite is not timing-robust under machine contention. There has been no independent security review, no penetration test, no threat model, and no load, stress or soak testing. And no continuous-integration run result is recorded.</w:t>
       </w:r>
     </w:p>
     <w:p>
@@ -19655,7 +19655,7 @@
           </w:tcPr>
           <w:p>
             <w:r>
-              <w:t>No run result is recorded for the baseline commit</w:t>
+              <w:t>No run result is recorded</w:t>
             </w:r>
           </w:p>
         </w:tc>

</xml_diff>

<commit_message>
docs(thesis): snapshot before the Appendix B and C revision (9 Sep)
Imported from backups/. State of the document immediately before that edit.
Co-Authored-By: Claude Opus 5 <noreply@anthropic.com>
Claude-Session: https://claude.ai/code/session_01HpujHPon5BPtHmMGKvBo5Z
</commit_message>
<xml_diff>
--- a/Thesis_Ch1-5_with_figures.docx
+++ b/Thesis_Ch1-5_with_figures.docx
@@ -6721,7 +6721,7 @@
           <w:bCs/>
           <w:szCs w:val="24"/>
         </w:rPr>
-        <w:t>The reporting baseline. The evidence in this chapter is drawn from two implementation states, and each class of evidence is attributed to the state at which it was produced. The numerical figures, the database census and the live probes were captured on 29 August 2026 and re-verified against the running system on 7 September 2026, returning identical values on every figure. The interface screenshots and the test counts were produced on 7 September 2026. The performance figures were measured on 29 August 2026 and have not been re-measured. The two states, and the record of what was captured at each, are given in Appendix G. Demonstration figures are read from the seeded demonstration farm, farm 26, signed in as its own user; the live database holds several other farms, and no figure in this chapter is read from any of them. The figures presented in Chapter Three are design diagrams of the architecture, the data model and the paired write; they are author-drawn representations of the design and are not evidence captures.</w:t>
+        <w:t>The reporting baseline. The evidence in this chapter is drawn from two implementation states, and each class of evidence is attributed to the state at which it was produced. The numerical figures and the live probes were captured on 29 August 2026 and the figures were re-verified against the running system on 7 September 2026, returning identical values throughout. The database census reported in Section 4.8 is that of 29 August 2026; the demonstration farm has not been written to since 24 August 2026, but the wider database has, so the census is stated at its own date. The interface screenshots and the test counts were produced on 7 September 2026. The performance figures were measured on 29 August 2026 and have not been re-measured. The two states, and the record of what was captured at each, are given in Appendix G. Demonstration figures are read from the seeded demonstration farm, farm 26, signed in as its own user; the live database holds several other farms, and no figure in this chapter is read from any of them. The figures presented in Chapter Three are design diagrams of the architecture, the data model and the paired write; they are author-drawn representations of the design and are not evidence captures.</w:t>
       </w:r>
     </w:p>
     <w:p>
@@ -16049,7 +16049,7 @@
         <w:pStyle w:val="BodyPara"/>
       </w:pPr>
       <w:r>
-        <w:t>The procedures used were those specified in Chapter Three and reported in Chapter Four. Development was iterative and version-controlled, with human-reviewed, agent-assisted implementation. The evaluation was specified in advance as four strands: functional verification by automated test suite with hand-computed fixtures and negative controls; performance benchmarking by Lighthouse under mobile emulation and simulated network throttling; a hosting-cost analysis anchored on a measured container footprint; and a heuristic-plus-System-Usability-Scale evaluation with a small expert panel. Three of the four were executed. The fourth, usability, was specified, its instruments were prepared in full, and it was not carried out. A fifth body of evidence, not among the four strands as originally specified, was obtained by probing the running production composition directly and is reported in Section 4.11. The evidence in this work is drawn from two implementation states, and each class of evidence is attributed to the state at which it was produced. The numerical figures, the database census and the live probes were captured on 29 August 2026 and re-verified on 7 September 2026; the interface screenshots and the test counts were produced on 7 September 2026; the performance figures were measured on 29 August 2026 and have not been re-measured. The two states are named in Section 4.1 and recorded in full in Appendix G. Where a measurement was taken at an earlier state it is attributed at the point of use.</w:t>
+        <w:t>The procedures used were those specified in Chapter Three and reported in Chapter Four. Development was iterative and version-controlled, with human-reviewed, agent-assisted implementation. The evaluation was specified in advance as four strands: functional verification by automated test suite with hand-computed fixtures and negative controls; performance benchmarking by Lighthouse under mobile emulation and simulated network throttling; a hosting-cost analysis anchored on a measured container footprint; and a heuristic-plus-System-Usability-Scale evaluation with a small expert panel. Three of the four were executed. The fourth, usability, was specified, its instruments were prepared in full, and it was not carried out. A fifth body of evidence, not among the four strands as originally specified, was obtained by probing the running production composition directly and is reported in Section 4.11. The evidence in this work is drawn from two implementation states, and each class of evidence is attributed to the state at which it was produced. The numerical figures and the live probes were captured on 29 August 2026 and the figures re-verified on 7 September 2026; the database census is stated at 29 August 2026; the interface screenshots and the test counts were produced on 7 September 2026; the performance figures were measured on 29 August 2026 and have not been re-measured. The two states are named in Section 4.1 and recorded in full in Appendix G. Where a measurement was taken at an earlier state it is attributed at the point of use.</w:t>
       </w:r>
       <w:r/>
       <w:r/>

</xml_diff>

<commit_message>
docs(thesis): snapshot before the Appendix E revision (9 Sep)
Imported from backups/. State of the document immediately before that edit.
Co-Authored-By: Claude Opus 5 <noreply@anthropic.com>
Claude-Session: https://claude.ai/code/session_01HpujHPon5BPtHmMGKvBo5Z
</commit_message>
<xml_diff>
--- a/Thesis_Ch1-5_with_figures.docx
+++ b/Thesis_Ch1-5_with_figures.docx
@@ -11947,7 +11947,7 @@
         <w:rPr>
           <w:szCs w:val="24"/>
         </w:rPr>
-        <w:t>One point about the Page fit is recorded because an earlier draft of this chapter left it open. The fit requires intermediate time-and-moisture readings, and the readings on the seeded runs were supplied by the seed script. At the baseline commit the drying entry form does capture such readings: the drying fields component provides repeatable optional reading rows, the client-side drying rules validate them before the record is queued, and the drying-curve component plots them (Figure 4.4). A run entered through the interface with three or more readings therefore reaches the backend with a series on which the Page model is fitted, and a run entered without them correctly receives no Page fit rather than a fabricated one.</w:t>
+        <w:t>One point about the Page fit is recorded because an earlier draft of this chapter left it open. The fit requires intermediate time-and-moisture readings, and the readings on the seeded runs were supplied by the seed script. The drying entry form does capture such readings: the drying fields component provides repeatable optional reading rows, the client-side drying rules validate them before the record is queued, and the drying-curve component plots them (Figure 4.4). A run entered through the interface with three or more readings therefore reaches the backend with a series on which the Page model is fitted, and a run entered without them correctly receives no Page fit rather than a fabricated one.</w:t>
       </w:r>
     </w:p>
     <w:p>
@@ -12149,7 +12149,7 @@
         <w:rPr>
           <w:szCs w:val="24"/>
         </w:rPr>
-        <w:t>Objective (ii) requires that mechanisation and equipment expenditure be captured within the same ledger as the operational record, and costed there. The enterprise-economics layer extends the deterministic tier from margin accounting to cost-behaviour analysis. All figures are live responses from farm 26 at the baseline commit.</w:t>
+        <w:t>Objective (ii) requires that mechanisation and equipment expenditure be captured within the same ledger as the operational record, and costed there. The enterprise-economics layer extends the deterministic tier from margin accounting to cost-behaviour analysis. All figures are live responses from farm 26 on 7 September 2026.</w:t>
       </w:r>
     </w:p>
     <w:p>
@@ -13314,7 +13314,7 @@
         <w:rPr>
           <w:szCs w:val="24"/>
         </w:rPr>
-        <w:t>Two simplifications ride along and are stated rather than hidden: the method is straight-line with no salvage value and no accumulated-depreciation floor, so an asset held past its implied life keeps charging and the overlay is an upper bound. The reporting window may also be pinned explicitly rather than derived, which is a reproducibility measure: a derived span widens every time a log is entered, and a figure quoted from a widening window cannot be re-derived afterwards. That is not hypothetical for the figures reported here. The seven-day window in Table 4.9 is the span between the earliest and latest records on this farm, and it is seven days only because the cowpea records of 24 August joined the maize records of 18 August; before they were entered the span was a single day. Every fixed-cost figure in this chapter is therefore stated against the ledger as it stood at the baseline and would move if further activity were recorded. Had a record been entered on 30 August, the window would widen to thirteen days, the period fixed cost would rise from ₦10,068.49 to ₦18,698.63, and the total break-even price would move from ₦42.37 to ₦42.97 for maize and from ₦631.56 to ₦640.52 for cowpea. The cash prices would not move at all. A farmer who logs one late operation changes his own total-cost break-even prices without intending to.</w:t>
+        <w:t>Two simplifications ride along and are stated rather than hidden: the method is straight-line with no salvage value and no accumulated-depreciation floor, so an asset held past its implied life keeps charging and the overlay is an upper bound. The reporting window may also be pinned explicitly rather than derived, which is a reproducibility measure: a derived span widens every time a log is entered, and a figure quoted from a widening window cannot be re-derived afterwards. That is not hypothetical for the figures reported here. The seven-day window in Table 4.9 is the span between the earliest and latest records on this farm, and it is seven days only because the cowpea records of 24 August joined the maize records of 18 August; before they were entered the span was a single day. Every fixed-cost figure in this chapter is therefore stated against the ledger as it stood on 7 September 2026 and would move if further activity were recorded. Had a record been entered on 30 August, the window would widen to thirteen days, the period fixed cost would rise from ₦10,068.49 to ₦18,698.63, and the total break-even price would move from ₦42.37 to ₦42.97 for maize and from ₦631.56 to ₦640.52 for cowpea. The cash prices would not move at all. A farmer who logs one late operation changes his own total-cost break-even prices without intending to.</w:t>
       </w:r>
     </w:p>
     <w:p>
@@ -13550,8 +13550,7 @@
         <w:rPr>
           <w:szCs w:val="24"/>
         </w:rPr>
-        <w:lastRenderedPageBreak/>
-        <w:t>computed, verified, served and invisible; that finding is withdrawn, and all six enterprise-economics endpoints are reachable in the interface at the baseline commit. Two findings carried by earlier drafts of Table A.1 of Appendix A have been withdrawn: the Olympic-average yield baseline and the entry form’s crop list were both reported as implemented-but-unreachable, and both are reachable at the baseline commit.</w:t>
+        <w:t>computed, verified, served and invisible; that finding is withdrawn, and all six enterprise-economics endpoints are reachable in the interface. Two findings carried by earlier drafts of Table A.1 of Appendix A have been withdrawn: the Olympic-average yield baseline and the entry form’s crop list were both reported as implemented-but-unreachable, and both are reachable.</w:t>
       </w:r>
     </w:p>
     <w:p>
@@ -13845,7 +13844,7 @@
         <w:rPr>
           <w:szCs w:val="24"/>
         </w:rPr>
-        <w:t>At the baseline commit the live database held 14 farms, 13 users, 109 operational logs, 109 financial transactions, 3 equipment records, 1 maintenance log and 10 share tokens, with the schema at Alembic revision b9e5f30c74a1. A direct query for operational logs carrying no paired financial transaction returned zero rows. The one-to-one correspondence between operational logs and financial transactions is not a coincidence of the sample: it is the paired-write invariant of Section 3.5 visible in the data, every operational record having posted its financial transaction in the same commit.</w:t>
+        <w:t>On 29 August 2026 the live database held 14 farms, 13 users, 109 operational logs, 109 financial transactions, 3 equipment records, 1 maintenance log and 10 share tokens, with the schema at Alembic revision b9e5f30c74a1. A direct query for operational logs carrying no paired financial transaction returned zero rows. The one-to-one correspondence between operational logs and financial transactions is not a coincidence of the sample: it is the paired-write invariant of Section 3.5 visible in the data, every operational record having posted its financial transaction in the same commit.</w:t>
       </w:r>
     </w:p>
     <w:p>
@@ -14364,7 +14363,7 @@
         <w:pStyle w:val="BodyPara"/>
       </w:pPr>
       <w:r>
-        <w:t>Objective 3 is answered by mechanisms whose evidence has not so far been reported in this chapter. This section reports it. Every result below was obtained by probing the running production composition at the baseline commit, not by reading source; each is therefore manually inspected evidence of a live system, supported in most cases by named automated tests.</w:t>
+        <w:t>Objective 3 is answered by mechanisms whose evidence has not so far been reported in this chapter. This section reports it. Every result below was obtained by probing the running production composition on 29 August 2026, not by reading source; each is therefore manually inspected evidence of a live system, supported in most cases by named automated tests.</w:t>
       </w:r>
     </w:p>
     <w:p>
@@ -16095,8 +16094,7 @@
         <w:pStyle w:val="BodyPara"/>
       </w:pPr>
       <w:r>
-        <w:lastRenderedPageBreak/>
-        <w:t>Structural integrity of the record. At the baseline commit the live database held 109 operational logs and 109 financial transactions, and a direct query for operational logs carrying no paired transaction returned zero rows. The one-to-one correspondence is not a property of the sample but the paired-write invariant made visible in the data, and it is the single most quotable structural result of the work.</w:t>
+        <w:t>Structural integrity of the record. On 29 August 2026 the live database held 109 operational logs and 109 financial transactions, and a direct query for operational logs carrying no paired transaction returned zero rows. The one-to-one correspondence is not a property of the sample but the paired-write invariant made visible in the data, and it is the single most quotable structural result of the work.</w:t>
       </w:r>
     </w:p>
     <w:p>
@@ -16187,7 +16185,7 @@
         <w:t>esponses to it are integrative,</w:t>
       </w:r>
       <w:r>
-        <w:t xml:space="preserve"> two systems and a synchronisation path between them. AGRI-PROFIT’s response is different in kind: there is only one write, and it posts both records in a single commit, so the two cannot drift because they were never separate. The finding that makes this more than an assertion is arithmetic. At the baseline commit the database held exactly as many financial t</w:t>
+        <w:t xml:space="preserve"> two systems and a synchronisation path between them. AGRI-PROFIT’s response is different in kind: there is only one write, and it posts both records in a single commit, so the two cannot drift because they were never separate. The finding that makes this more than an assertion is arithmetic. On 29 August 2026 the database held exactly as many financial t</w:t>
       </w:r>
       <w:r>
         <w:t>ransactions as operational logs</w:t>

</xml_diff>

<commit_message>
docs(thesis): pre-edit baseline, 9 September 2026 21:07
Imported from backups/. Last state before any edit made on 10 September 2026.
The following commit applies those edits, so the diff between the two is
exactly what changed.
Co-Authored-By: Claude Opus 5 <noreply@anthropic.com>
Claude-Session: https://claude.ai/code/session_01HpujHPon5BPtHmMGKvBo5Z
</commit_message>
<xml_diff>
--- a/Thesis_Ch1-5_with_figures.docx
+++ b/Thesis_Ch1-5_with_figures.docx
@@ -2301,6 +2301,21 @@
       </w:pPr>
       <w:r>
         <w:t>APPENDIX F: SEEDED DRYING RUN IN FULL</w:t>
+      </w:r>
+      <w:r>
+        <w:tab/>
+        <w:t>—</w:t>
+      </w:r>
+    </w:p>
+    <w:p>
+      <w:pPr>
+        <w:pStyle w:val="TOC1"/>
+        <w:tabs>
+          <w:tab w:val="right" w:leader="dot" w:pos="8503"/>
+        </w:tabs>
+      </w:pPr>
+      <w:r>
+        <w:t xml:space="preserve">APPENDIX G: THE TWO IMPLEMENTATION STATES</w:t>
       </w:r>
       <w:r>
         <w:tab/>
@@ -22624,6 +22639,513 @@
                 <w:sz w:val="22"/>
               </w:rPr>
               <w:t>Safe, against the 13.0% wet-basis maize threshold</w:t>
+            </w:r>
+          </w:p>
+        </w:tc>
+      </w:tr>
+    </w:tbl>
+    <w:p>
+      <w:pPr>
+        <w:pStyle w:val="ChapterLabel"/>
+      </w:pPr>
+      <w:r>
+        <w:t xml:space="preserve">APPENDIX G</w:t>
+      </w:r>
+    </w:p>
+    <w:p>
+      <w:pPr>
+        <w:pStyle w:val="ChapterTitle"/>
+      </w:pPr>
+      <w:r>
+        <w:t xml:space="preserve">THE TWO IMPLEMENTATION STATES</w:t>
+      </w:r>
+    </w:p>
+    <w:p>
+      <w:pPr>
+        <w:pStyle w:val="TableCaption"/>
+      </w:pPr>
+      <w:r>
+        <w:t xml:space="preserve">Table G.1: The two implementation states and what was captured at each</w:t>
+      </w:r>
+    </w:p>
+    <w:tbl>
+      <w:tblPr>
+        <w:tblStyle w:val="TableGrid"/>
+        <w:tblW w:w="0" w:type="auto"/>
+        <w:tblBorders>
+          <w:left w:val="none" w:sz="0" w:space="0" w:color="auto"/>
+          <w:right w:val="none" w:sz="0" w:space="0" w:color="auto"/>
+          <w:insideH w:val="none" w:sz="0" w:space="0" w:color="auto"/>
+          <w:insideV w:val="none" w:sz="0" w:space="0" w:color="auto"/>
+        </w:tblBorders>
+        <w:tblLook w:val="04A0" w:firstRow="1" w:lastRow="0" w:firstColumn="1" w:lastColumn="0" w:noHBand="0" w:noVBand="1"/>
+      </w:tblPr>
+      <w:tblGrid>
+        <w:gridCol w:w="2180"/>
+        <w:gridCol w:w="2180"/>
+        <w:gridCol w:w="2180"/>
+        <w:gridCol w:w="2181"/>
+      </w:tblGrid>
+      <w:tr>
+        <w:tc>
+          <w:tcPr>
+            <w:tcW w:w="2180" w:type="dxa"/>
+            <w:tcBorders>
+              <w:bottom w:val="single" w:sz="4" w:space="0" w:color="auto"/>
+            </w:tcBorders>
+          </w:tcPr>
+          <w:p>
+            <w:pPr>
+              <w:pStyle w:val="BodyPara"/>
+              <w:spacing w:after="120" w:line="240" w:lineRule="auto"/>
+              <w:rPr>
+                <w:b/>
+              </w:rPr>
+            </w:pPr>
+            <w:r>
+              <w:rPr>
+                <w:b/>
+              </w:rPr>
+              <w:t xml:space="preserve">Evidence class</w:t>
+            </w:r>
+          </w:p>
+        </w:tc>
+        <w:tc>
+          <w:tcPr>
+            <w:tcW w:w="2180" w:type="dxa"/>
+            <w:tcBorders>
+              <w:bottom w:val="single" w:sz="4" w:space="0" w:color="auto"/>
+            </w:tcBorders>
+          </w:tcPr>
+          <w:p>
+            <w:pPr>
+              <w:pStyle w:val="BodyPara"/>
+              <w:spacing w:after="120" w:line="240" w:lineRule="auto"/>
+              <w:rPr>
+                <w:b/>
+              </w:rPr>
+            </w:pPr>
+            <w:r>
+              <w:rPr>
+                <w:b/>
+              </w:rPr>
+              <w:t xml:space="preserve">Commit</w:t>
+            </w:r>
+          </w:p>
+        </w:tc>
+        <w:tc>
+          <w:tcPr>
+            <w:tcW w:w="2180" w:type="dxa"/>
+            <w:tcBorders>
+              <w:bottom w:val="single" w:sz="4" w:space="0" w:color="auto"/>
+            </w:tcBorders>
+          </w:tcPr>
+          <w:p>
+            <w:pPr>
+              <w:pStyle w:val="BodyPara"/>
+              <w:spacing w:after="120" w:line="240" w:lineRule="auto"/>
+              <w:rPr>
+                <w:b/>
+              </w:rPr>
+            </w:pPr>
+            <w:r>
+              <w:rPr>
+                <w:b/>
+              </w:rPr>
+              <w:t xml:space="preserve">Date</w:t>
+            </w:r>
+          </w:p>
+        </w:tc>
+        <w:tc>
+          <w:tcPr>
+            <w:tcW w:w="2181" w:type="dxa"/>
+            <w:tcBorders>
+              <w:bottom w:val="single" w:sz="4" w:space="0" w:color="auto"/>
+            </w:tcBorders>
+          </w:tcPr>
+          <w:p>
+            <w:pPr>
+              <w:pStyle w:val="BodyPara"/>
+              <w:spacing w:after="120" w:line="240" w:lineRule="auto"/>
+              <w:rPr>
+                <w:b/>
+              </w:rPr>
+            </w:pPr>
+            <w:r>
+              <w:rPr>
+                <w:b/>
+              </w:rPr>
+              <w:t xml:space="preserve">Artefact</w:t>
+            </w:r>
+          </w:p>
+        </w:tc>
+      </w:tr>
+      <w:tr>
+        <w:tc>
+          <w:tcPr>
+            <w:tcW w:w="2180" w:type="dxa"/>
+            <w:tcBorders>
+              <w:top w:val="single" w:sz="4" w:space="0" w:color="auto"/>
+              <w:bottom w:val="nil"/>
+            </w:tcBorders>
+          </w:tcPr>
+          <w:p>
+            <w:pPr>
+              <w:pStyle w:val="BodyPara"/>
+              <w:spacing w:after="120" w:line="240" w:lineRule="auto"/>
+            </w:pPr>
+            <w:r>
+              <w:t xml:space="preserve">Numerical figures</w:t>
+            </w:r>
+          </w:p>
+        </w:tc>
+        <w:tc>
+          <w:tcPr>
+            <w:tcW w:w="2180" w:type="dxa"/>
+            <w:tcBorders>
+              <w:top w:val="single" w:sz="4" w:space="0" w:color="auto"/>
+              <w:bottom w:val="nil"/>
+            </w:tcBorders>
+          </w:tcPr>
+          <w:p>
+            <w:pPr>
+              <w:pStyle w:val="BodyPara"/>
+              <w:spacing w:after="120" w:line="240" w:lineRule="auto"/>
+            </w:pPr>
+            <w:r>
+              <w:t xml:space="preserve">Captured at 78a68c292205acdcac1a52f977fbea31b6e8495e; re-verified at 598eab0a02533e9692332d92382d42f16fc9e346</w:t>
+            </w:r>
+          </w:p>
+        </w:tc>
+        <w:tc>
+          <w:tcPr>
+            <w:tcW w:w="2180" w:type="dxa"/>
+            <w:tcBorders>
+              <w:top w:val="single" w:sz="4" w:space="0" w:color="auto"/>
+              <w:bottom w:val="nil"/>
+            </w:tcBorders>
+          </w:tcPr>
+          <w:p>
+            <w:pPr>
+              <w:pStyle w:val="BodyPara"/>
+              <w:spacing w:after="120" w:line="240" w:lineRule="auto"/>
+            </w:pPr>
+            <w:r>
+              <w:t xml:space="preserve">29 August 2026; re-verified 7 September 2026</w:t>
+            </w:r>
+          </w:p>
+        </w:tc>
+        <w:tc>
+          <w:tcPr>
+            <w:tcW w:w="2181" w:type="dxa"/>
+            <w:tcBorders>
+              <w:top w:val="single" w:sz="4" w:space="0" w:color="auto"/>
+              <w:bottom w:val="nil"/>
+            </w:tcBorders>
+          </w:tcPr>
+          <w:p>
+            <w:pPr>
+              <w:pStyle w:val="BodyPara"/>
+              <w:spacing w:after="120" w:line="240" w:lineRule="auto"/>
+            </w:pPr>
+            <w:r>
+              <w:t xml:space="preserve">docs/EVIDENCE_FREEZE_2026-08-29.md §2; docs/EVIDENCE_CAPTURE_2026-09-07.md §3</w:t>
+            </w:r>
+          </w:p>
+        </w:tc>
+      </w:tr>
+      <w:tr>
+        <w:tc>
+          <w:tcPr>
+            <w:tcW w:w="2180" w:type="dxa"/>
+            <w:tcBorders>
+              <w:top w:val="nil"/>
+              <w:bottom w:val="nil"/>
+            </w:tcBorders>
+          </w:tcPr>
+          <w:p>
+            <w:pPr>
+              <w:pStyle w:val="BodyPara"/>
+              <w:spacing w:after="120" w:line="240" w:lineRule="auto"/>
+            </w:pPr>
+            <w:r>
+              <w:t xml:space="preserve">Database census</w:t>
+            </w:r>
+          </w:p>
+        </w:tc>
+        <w:tc>
+          <w:tcPr>
+            <w:tcW w:w="2180" w:type="dxa"/>
+            <w:tcBorders>
+              <w:top w:val="nil"/>
+              <w:bottom w:val="nil"/>
+            </w:tcBorders>
+          </w:tcPr>
+          <w:p>
+            <w:pPr>
+              <w:pStyle w:val="BodyPara"/>
+              <w:spacing w:after="120" w:line="240" w:lineRule="auto"/>
+            </w:pPr>
+            <w:r>
+              <w:t xml:space="preserve">78a68c292205acdcac1a52f977fbea31b6e8495e</w:t>
+            </w:r>
+          </w:p>
+        </w:tc>
+        <w:tc>
+          <w:tcPr>
+            <w:tcW w:w="2180" w:type="dxa"/>
+            <w:tcBorders>
+              <w:top w:val="nil"/>
+              <w:bottom w:val="nil"/>
+            </w:tcBorders>
+          </w:tcPr>
+          <w:p>
+            <w:pPr>
+              <w:pStyle w:val="BodyPara"/>
+              <w:spacing w:after="120" w:line="240" w:lineRule="auto"/>
+            </w:pPr>
+            <w:r>
+              <w:t xml:space="preserve">29 August 2026</w:t>
+            </w:r>
+          </w:p>
+        </w:tc>
+        <w:tc>
+          <w:tcPr>
+            <w:tcW w:w="2181" w:type="dxa"/>
+            <w:tcBorders>
+              <w:top w:val="nil"/>
+              <w:bottom w:val="nil"/>
+            </w:tcBorders>
+          </w:tcPr>
+          <w:p>
+            <w:pPr>
+              <w:pStyle w:val="BodyPara"/>
+              <w:spacing w:after="120" w:line="240" w:lineRule="auto"/>
+            </w:pPr>
+            <w:r>
+              <w:t xml:space="preserve">docs/EVIDENCE_FREEZE_2026-08-29.md §4</w:t>
+            </w:r>
+          </w:p>
+        </w:tc>
+      </w:tr>
+      <w:tr>
+        <w:tc>
+          <w:tcPr>
+            <w:tcW w:w="2180" w:type="dxa"/>
+            <w:tcBorders>
+              <w:top w:val="nil"/>
+              <w:bottom w:val="nil"/>
+            </w:tcBorders>
+          </w:tcPr>
+          <w:p>
+            <w:pPr>
+              <w:pStyle w:val="BodyPara"/>
+              <w:spacing w:after="120" w:line="240" w:lineRule="auto"/>
+            </w:pPr>
+            <w:r>
+              <w:t xml:space="preserve">Live probes</w:t>
+            </w:r>
+          </w:p>
+        </w:tc>
+        <w:tc>
+          <w:tcPr>
+            <w:tcW w:w="2180" w:type="dxa"/>
+            <w:tcBorders>
+              <w:top w:val="nil"/>
+              <w:bottom w:val="nil"/>
+            </w:tcBorders>
+          </w:tcPr>
+          <w:p>
+            <w:pPr>
+              <w:pStyle w:val="BodyPara"/>
+              <w:spacing w:after="120" w:line="240" w:lineRule="auto"/>
+            </w:pPr>
+            <w:r>
+              <w:t xml:space="preserve">78a68c292205acdcac1a52f977fbea31b6e8495e</w:t>
+            </w:r>
+          </w:p>
+        </w:tc>
+        <w:tc>
+          <w:tcPr>
+            <w:tcW w:w="2180" w:type="dxa"/>
+            <w:tcBorders>
+              <w:top w:val="nil"/>
+              <w:bottom w:val="nil"/>
+            </w:tcBorders>
+          </w:tcPr>
+          <w:p>
+            <w:pPr>
+              <w:pStyle w:val="BodyPara"/>
+              <w:spacing w:after="120" w:line="240" w:lineRule="auto"/>
+            </w:pPr>
+            <w:r>
+              <w:t xml:space="preserve">29 August 2026</w:t>
+            </w:r>
+          </w:p>
+        </w:tc>
+        <w:tc>
+          <w:tcPr>
+            <w:tcW w:w="2181" w:type="dxa"/>
+            <w:tcBorders>
+              <w:top w:val="nil"/>
+              <w:bottom w:val="nil"/>
+            </w:tcBorders>
+          </w:tcPr>
+          <w:p>
+            <w:pPr>
+              <w:pStyle w:val="BodyPara"/>
+              <w:spacing w:after="120" w:line="240" w:lineRule="auto"/>
+            </w:pPr>
+            <w:r>
+              <w:t xml:space="preserve">docs/EVIDENCE_FREEZE_2026-08-29.md §3.7–§3.13</w:t>
+            </w:r>
+          </w:p>
+        </w:tc>
+      </w:tr>
+      <w:tr>
+        <w:tc>
+          <w:tcPr>
+            <w:tcW w:w="2180" w:type="dxa"/>
+            <w:tcBorders>
+              <w:top w:val="nil"/>
+              <w:bottom w:val="nil"/>
+            </w:tcBorders>
+          </w:tcPr>
+          <w:p>
+            <w:pPr>
+              <w:pStyle w:val="BodyPara"/>
+              <w:spacing w:after="120" w:line="240" w:lineRule="auto"/>
+            </w:pPr>
+            <w:r>
+              <w:t xml:space="preserve">Interface screenshots and test counts</w:t>
+            </w:r>
+          </w:p>
+        </w:tc>
+        <w:tc>
+          <w:tcPr>
+            <w:tcW w:w="2180" w:type="dxa"/>
+            <w:tcBorders>
+              <w:top w:val="nil"/>
+              <w:bottom w:val="nil"/>
+            </w:tcBorders>
+          </w:tcPr>
+          <w:p>
+            <w:pPr>
+              <w:pStyle w:val="BodyPara"/>
+              <w:spacing w:after="120" w:line="240" w:lineRule="auto"/>
+            </w:pPr>
+            <w:r>
+              <w:t xml:space="preserve">598eab0a02533e9692332d92382d42f16fc9e346</w:t>
+            </w:r>
+          </w:p>
+        </w:tc>
+        <w:tc>
+          <w:tcPr>
+            <w:tcW w:w="2180" w:type="dxa"/>
+            <w:tcBorders>
+              <w:top w:val="nil"/>
+              <w:bottom w:val="nil"/>
+            </w:tcBorders>
+          </w:tcPr>
+          <w:p>
+            <w:pPr>
+              <w:pStyle w:val="BodyPara"/>
+              <w:spacing w:after="120" w:line="240" w:lineRule="auto"/>
+            </w:pPr>
+            <w:r>
+              <w:t xml:space="preserve">7 September 2026</w:t>
+            </w:r>
+          </w:p>
+        </w:tc>
+        <w:tc>
+          <w:tcPr>
+            <w:tcW w:w="2181" w:type="dxa"/>
+            <w:tcBorders>
+              <w:top w:val="nil"/>
+              <w:bottom w:val="nil"/>
+            </w:tcBorders>
+          </w:tcPr>
+          <w:p>
+            <w:pPr>
+              <w:pStyle w:val="BodyPara"/>
+              <w:spacing w:after="120" w:line="240" w:lineRule="auto"/>
+            </w:pPr>
+            <w:r>
+              <w:t xml:space="preserve">docs/EVIDENCE_FREEZE_2026-09-07.md §2, §3; Screenshots/fig_4_1.png–fig_4_11.png, fig_x_filter.png, fig_x_pnl.png</w:t>
+            </w:r>
+          </w:p>
+        </w:tc>
+      </w:tr>
+      <w:tr>
+        <w:tc>
+          <w:tcPr>
+            <w:tcW w:w="2180" w:type="dxa"/>
+            <w:tcBorders>
+              <w:top w:val="nil"/>
+              <w:bottom w:val="single" w:sz="4" w:space="0" w:color="auto"/>
+            </w:tcBorders>
+          </w:tcPr>
+          <w:p>
+            <w:pPr>
+              <w:pStyle w:val="BodyPara"/>
+              <w:spacing w:after="120" w:line="240" w:lineRule="auto"/>
+            </w:pPr>
+            <w:r>
+              <w:t xml:space="preserve">Performance figures</w:t>
+            </w:r>
+          </w:p>
+        </w:tc>
+        <w:tc>
+          <w:tcPr>
+            <w:tcW w:w="2180" w:type="dxa"/>
+            <w:tcBorders>
+              <w:top w:val="nil"/>
+              <w:bottom w:val="single" w:sz="4" w:space="0" w:color="auto"/>
+            </w:tcBorders>
+          </w:tcPr>
+          <w:p>
+            <w:pPr>
+              <w:pStyle w:val="BodyPara"/>
+              <w:spacing w:after="120" w:line="240" w:lineRule="auto"/>
+            </w:pPr>
+            <w:r>
+              <w:t xml:space="preserve">78a68c292205acdcac1a52f977fbea31b6e8495e — not re-measured</w:t>
+            </w:r>
+          </w:p>
+        </w:tc>
+        <w:tc>
+          <w:tcPr>
+            <w:tcW w:w="2180" w:type="dxa"/>
+            <w:tcBorders>
+              <w:top w:val="nil"/>
+              <w:bottom w:val="single" w:sz="4" w:space="0" w:color="auto"/>
+            </w:tcBorders>
+          </w:tcPr>
+          <w:p>
+            <w:pPr>
+              <w:pStyle w:val="BodyPara"/>
+              <w:spacing w:after="120" w:line="240" w:lineRule="auto"/>
+            </w:pPr>
+            <w:r>
+              <w:t xml:space="preserve">29 August 2026</w:t>
+            </w:r>
+          </w:p>
+        </w:tc>
+        <w:tc>
+          <w:tcPr>
+            <w:tcW w:w="2181" w:type="dxa"/>
+            <w:tcBorders>
+              <w:top w:val="nil"/>
+              <w:bottom w:val="single" w:sz="4" w:space="0" w:color="auto"/>
+            </w:tcBorders>
+          </w:tcPr>
+          <w:p>
+            <w:pPr>
+              <w:pStyle w:val="BodyPara"/>
+              <w:spacing w:after="120" w:line="240" w:lineRule="auto"/>
+            </w:pPr>
+            <w:r>
+              <w:t xml:space="preserve">docs/perf/2026-08-29/README.md, with lh-4g-run1–5 and lh-slow3g-run1–5 .report.json/.html and flow-iter1–3.json</w:t>
             </w:r>
           </w:p>
         </w:tc>

</xml_diff>

<commit_message>
docs(thesis): correct abstract precision claim, normalise Objective 4 wording, add 5.2.4 bridge
- abstract precision claim corrected to match Chapter 4 (para 61): the drying model "recovered its designed parameters exactly" becomes "to within one part in ten thousand"
- Objective 4 attainment wording normalised to "partially achieved" across all sites (abstract, 3.8 evaluation strands, Chapter 4 closing paragraph); no occurrence of "partly met" remains
- three empty paragraphs removed before the 4.11 Security and Deployment Verification heading
- 5.2.4 conclusion: [AUTHOR: bridge needed] replaced with the positive-findings paragraph, giving "equally definite" its antecedent

Also carries the two 4.14 Limitations insertions (application defects; basis of
the revenue figures) present in the working tree.

Co-Authored-By: Claude Opus 5 <noreply@anthropic.com>
Claude-Session: https://claude.ai/code/session_01HpujHPon5BPtHmMGKvBo5Z
</commit_message>
<xml_diff>
--- a/Thesis_Ch1-5_with_figures.docx
+++ b/Thesis_Ch1-5_with_figures.docx
@@ -624,14 +624,13 @@
         <w:rPr>
           <w:szCs w:val="24"/>
         </w:rPr>
-        <w:t xml:space="preserve">Nigerian smallholder and medium-scale farms keep production and cost records on paper, so the cost of production per crop is rarely known at sale; existing farm management software assumes continuous connectivity and charges per user seat. This work designed, implemented and evaluated AGRI-PROFIT, an offline-first web platform comprising a soft-immutable paired-write ledger in which every operational record posts its financial transaction in a single commit and is corrected only by a linked contra entry, a deterministic decision-support layer computing nine quantities including per-crop gross margin, unit cost of production on two bases and retrospective break-even yield, and a post-harvest drying module applying thin-layer kinetics to the farm’s own records. A design-and-build methodology was adopted, its four-strand evaluation specified in advance. Functional verification at both recorded implementation states returned 426 collected backend cases — 422 passed, 4 skipped, none failed — at 96% statement coverage over 1,601 statements, with 148 frontend tests at 42.14% statement coverage, and the drying model recovered its designed parameters exactly. For a 100 kg maize harvest dried from 25% to 13% moisture and weighed out at 84 kg, unit cost moves from ₦35.00 to ₦41.67 per kilogram: post-harvest mass loss expressed in money. Under 0.4 Mbps simulated throttling the service worker reduced network transfer on a repeat visit from 139,245 bytes to 127, first paint from 5,661.2 ms to 70.6 ms and largest contentful paint to 1,612.0 ms. Role-based authorisation over three roles and eleven permissions, expiring hashed share tokens, login throttling and credential scrubbing were verified live on the running stack. The yield-forecast tier returned R² 0.9762, MAE 0.2414 t/ha and RMSE 0.4883 t/ha, reproducible to six decimal places, on synthetic data alone; no claim of field-predictive accuracy is made. Measured resource consumption below 205 MiB gives an estimated ₦20,950 per month, or ₦105 per farm </w:t>
-      </w:r>
-      <w:r>
-        <w:rPr>
-          <w:szCs w:val="24"/>
-        </w:rPr>
-        <w:lastRenderedPageBreak/>
-        <w:t>at a two-hundred-farm tenancy. The usability evaluation was not conducted and no System Usability Scale score is reported, so that objective is only partly met, and the platform has never been deployed to serve a real user.</w:t>
+        <w:t xml:space="preserve">Nigerian smallholder and medium-scale farms keep production and cost records on paper, so the cost of production per crop is rarely known at sale; existing farm management software assumes continuous connectivity and charges per user seat. This work designed, implemented and evaluated AGRI-PROFIT, an offline-first web platform comprising a soft-immutable paired-write ledger in which every operational record posts its financial transaction in a single commit and is corrected only by a linked contra entry, a deterministic decision-support layer computing nine quantities including per-crop gross margin, unit cost of production on two bases and retrospective break-even yield, and a post-harvest drying module applying thin-layer kinetics to the farm’s own records. A design-and-build methodology was adopted, its four-strand evaluation specified in advance. Functional verification at both recorded implementation states returned 426 collected backend cases — 422 passed, 4 skipped, none failed — at 96% statement coverage over 1,601 statements, with 148 frontend tests at 42.14% statement coverage, and the drying model recovered its designed parameters to within one part in ten thousand. For a 100 kg maize harvest dried from 25% to 13% moisture and weighed out at 84 kg, unit cost moves from ₦35.00 to ₦41.67 per kilogram: post-harvest mass loss expressed in money. Under 0.4 Mbps simulated throttling the service worker reduced network transfer on a repeat visit from 139,245 bytes to 127, first paint from 5,661.2 ms to 70.6 ms and largest contentful paint to 1,612.0 ms. Role-based authorisation over three roles and eleven permissions, expiring hashed share tokens, login throttling and credential scrubbing were verified live on the running stack. The yield-forecast tier returned R² 0.9762, MAE 0.2414 t/ha and RMSE 0.4883 t/ha, reproducible to six decimal places, on synthetic data alone; no claim of field-predictive accuracy is made. Measured resource consumption below 205 MiB gives an estimated ₦20,950 per month, or ₦105 per farm </w:t>
+      </w:r>
+      <w:r>
+        <w:rPr>
+          <w:szCs w:val="24"/>
+        </w:rPr>
+        <w:t>at a two-hundred-farm tenancy. The usability evaluation was not conducted and no System Usability Scale score is reported, so that objective is only partially achieved, and the platform has never been deployed to serve a real user.</w:t>
       </w:r>
     </w:p>
     <w:p>
@@ -6011,7 +6010,7 @@
         <w:rPr>
           <w:szCs w:val="24"/>
         </w:rPr>
-        <w:t>Objective 4 requires an empirical evaluation of the platform’s usability, cost-effectiveness and operational viability under Nigerian constraints. A full field deployment with a large sample of smallholder farmers represents the ideal evaluation; however, such a deployment fell outside the time and access constraints of this study and is therefore presented as designed future work (Section 3.8.5). The evaluation specified for this study comprises four complementary strands, each producing evidence that can be reported in the results chapter. A distinction must be drawn here and held throughout: this section states the evaluation as specified, and Chapter Four reports which strands were executed. Three of the four were executed. The usability strand of Section 3.8.4 was specified and its instruments were prepared, and it was not carried out; no usability figure of any kind is reported in this work, and Objective 4 is consequently reported as partly met.</w:t>
+        <w:t>Objective 4 requires an empirical evaluation of the platform’s usability, cost-effectiveness and operational viability under Nigerian constraints. A full field deployment with a large sample of smallholder farmers represents the ideal evaluation; however, such a deployment fell outside the time and access constraints of this study and is therefore presented as designed future work (Section 3.8.5). The evaluation specified for this study comprises four complementary strands, each producing evidence that can be reported in the results chapter. A distinction must be drawn here and held throughout: this section states the evaluation as specified, and Chapter Four reports which strands were executed. Three of the four were executed. The usability strand of Section 3.8.4 was specified and its instruments were prepared, and it was not carried out; no usability figure of any kind is reported in this work, and Objective 4 is consequently reported as partially achieved.</w:t>
       </w:r>
     </w:p>
     <w:p>
@@ -14371,24 +14370,6 @@
     </w:p>
     <w:p>
       <w:pPr>
-        <w:pStyle w:val="BodyPara"/>
-        <w:spacing w:after="120" w:line="240" w:lineRule="auto"/>
-      </w:pPr>
-    </w:p>
-    <w:p>
-      <w:pPr>
-        <w:pStyle w:val="BodyPara"/>
-        <w:spacing w:after="120" w:line="240" w:lineRule="auto"/>
-      </w:pPr>
-    </w:p>
-    <w:p>
-      <w:pPr>
-        <w:pStyle w:val="BodyPara"/>
-        <w:spacing w:after="120" w:line="240" w:lineRule="auto"/>
-      </w:pPr>
-    </w:p>
-    <w:p>
-      <w:pPr>
         <w:pStyle w:val="H2"/>
       </w:pPr>
       <w:r>
@@ -15363,7 +15344,7 @@
         <w:rPr>
           <w:szCs w:val="24"/>
         </w:rPr>
-        <w:t>Because this strand is outstanding, Objective 4 is reported as partially met in Section 4.13, and no claim of a usability finding, a task-completion measurement, a SUS score or a comparison against paper-based practice appears anywhere in this thesis.</w:t>
+        <w:t>Because this strand is outstanding, Objective 4 is reported as partially achieved in Section 4.13, and no claim of a usability finding, a task-completion measurement, a SUS score or a comparison against paper-based practice appears anywhere in this thesis.</w:t>
       </w:r>
     </w:p>
     <w:p>
@@ -15828,7 +15809,7 @@
           <w:bCs/>
           <w:szCs w:val="24"/>
         </w:rPr>
-        <w:t>Verification gaps — evaluation limitations. There are no component tests for the page and form layer, including the drying-curve chart. The local-database migration is proven against an in-memory IndexedDB implementation rather than a real browser, so browser-specific storage eviction, quota behaviour and vendor bugs are out of its reach. Backend tests run on SQLite while production runs PostgreSQL; only the migration chain was executed against a real PostgreSQL server. Concurrency is measured on SQLite and inferred for PostgreSQL. There is no end-to-end browser test of the offline-to-online transition, the service-worker lifecycle or the installation path. The frontend suite is not timing-robust under machine contention. There has been no independent security review, no penetration test, no threat model, and no load, stress or soak testing. And no continuous-integration run result is recorded.</w:t>
+        <w:t xml:space="preserve">Application defects. A second reversal of the same record is rejected (Section 3.5). A mistaken reversal can therefore only be compensated by a new unlinked entry, which breaks the reversal linkage preserved by every other correction. The read cache serves a stored response and revalidates in the background, initiating a fetch unsequenced against the purge, so a fetch begun before a purge can repopulate the cache with a pre-mutation body. Correcting an equipment record posts no cache purge, leaving the overlay-derived reads cached with no error shown, as recorded in Section 3.6.1; the verification in Appendix B covers the API and is silent on the client. The entry form merges the farm's recorded crops with the model's, so an unforecastable crop is selectable and carries no signal that the forecast tier cannot serve it. All three list endpoints default to 100 rows and the client sends no limit, so both the record list and the displayed count cap silently. Two of these, the equipment purge and the client-side bounds, share a shape. In both, the guard exists with its reasoning recorded beside it, and the adjacent path does not call it.</w:t>
       </w:r>
     </w:p>
     <w:p>
@@ -15840,6 +15821,30 @@
           <w:bCs/>
           <w:szCs w:val="24"/>
         </w:rPr>
+        <w:t xml:space="preserve">Basis of the revenue figures. The unit cost calculation divides by marketable mass while the revenue calculation divides by harvest mass. These two divisions sit within the same loop body, a structural choice holding true for any farm rather than an artefact of the seed. Both masses sit in the same row of Table 4.2 as 100 kg and 84 kg. This divergence inherits into gross margin, the ranking, the realised price, break-even yield, the operating-expense ratio, farm revenue, and the farm operating-expense ratio. The asymmetry reaches only figures carrying a revenue term; no cost-side figure is affected. The whole ₦35.00 to ₦41.67 chain, both break-even prices, the sensitivity matrix, and the unit costs on both bases remain entirely unchanged. The calculation basis forces a 7.78 identity: break-even yield in kilograms and the operating-expense ratio in per cent print the exact same digits solely because revenue equals the derived price of ₦450 times the 100 kg harvest mass. These figures stand unreconciled rather than wrong. The records are consistent with a wet-mass sale, in which case nothing is overstated and only the reconciliation is absent.</w:t>
+      </w:r>
+    </w:p>
+    <w:p>
+      <w:pPr>
+        <w:pStyle w:val="BodyPara"/>
+      </w:pPr>
+      <w:r>
+        <w:rPr>
+          <w:bCs/>
+          <w:szCs w:val="24"/>
+        </w:rPr>
+        <w:t>Verification gaps — evaluation limitations. There are no component tests for the page and form layer, including the drying-curve chart. The client-side mirror of the monetary bounds is asserted only as a pure function; the wiring between the form and the validator is tested nowhere, as the 422 results in Appendix B are server-side responses. The local-database migration is proven against an in-memory IndexedDB implementation rather than a real browser, so browser-specific storage eviction, quota behaviour and vendor bugs are out of its reach. Backend tests run on SQLite while production runs PostgreSQL; only the migration chain was executed against a real PostgreSQL server. Concurrency is measured on SQLite and inferred for PostgreSQL. There is no end-to-end browser test of the offline-to-online transition, the service-worker lifecycle or the installation path. The frontend suite is not timing-robust under machine contention. There has been no independent security review, no penetration test, no threat model, and no load, stress or soak testing. And no continuous-integration run result is recorded.</w:t>
+      </w:r>
+    </w:p>
+    <w:p>
+      <w:pPr>
+        <w:pStyle w:val="BodyPara"/>
+      </w:pPr>
+      <w:r>
+        <w:rPr>
+          <w:bCs/>
+          <w:szCs w:val="24"/>
+        </w:rPr>
         <w:t xml:space="preserve">Data-state limitations. The live database holds eleven unidentified exploratory farms from development, deliberately left in place rather than deleted on an assumption, and two farms share the name “Demo Farm” — only farm 26 carries the seeded data, which is why no figure in this chapter is taken from a farm-list view. Machine hours are populated on three of eight mechanisation logs. Two components of the hosting </w:t>
       </w:r>
       <w:r>
@@ -15847,8 +15852,7 @@
           <w:bCs/>
           <w:szCs w:val="24"/>
         </w:rPr>
-        <w:lastRenderedPageBreak/>
-        <w:t>footprint — the static server and the container runtime — were not sampled at all, so the total is part-measured and part-assumed.</w:t>
+        <w:t>footprint — the static server and the container runtime — were not sampled at all, so the total is part-measured and part-assumed. The maize and cowpea sale figures are chosen totals rather than rate-times-quantity, so the realised prices derived from them act as reconstructions rather than observed prices.</w:t>
       </w:r>
     </w:p>
     <w:p>
@@ -15991,7 +15995,7 @@
         <w:rPr>
           <w:szCs w:val="24"/>
         </w:rPr>
-        <w:t>R² 0.9762, MAE 0.2414 t/ha, RMSE 0.4883 t/ha, reproducible to six decimal places and evidence about the pipeline rather than about Nigerian yields; the platform has a production path that has been demonstrated but has never served a real user; no independent security assessment exists; and the usability strand was specified and not executed, leaving Objective 4 partly met. Chapter Five interprets these results against the problem set out in Chapter One, states the platform’s limitations in full, and sets out what would be required to take it from a verified prototype to a deployed system.</w:t>
+        <w:t>R² 0.9762, MAE 0.2414 t/ha, RMSE 0.4883 t/ha, reproducible to six decimal places and evidence about the pipeline rather than about Nigerian yields; the platform has a production path that has been demonstrated but has never served a real user; no independent security assessment exists; and the usability strand was specified and not executed, leaving Objective 4 partially achieved. Chapter Five interprets these results against the problem set out in Chapter One, states the platform’s limitations in full, and sets out what would be required to take it from a verified prototype to a deployed system.</w:t>
       </w:r>
     </w:p>
     <w:p>
@@ -16465,7 +16469,7 @@
         <w:pStyle w:val="BodyPara"/>
       </w:pPr>
       <w:r>
-        <w:t>[AUTHOR: bridge needed]</w:t>
+        <w:t>What this work establishes is definite. The paired-write ledger functions exactly as designed: on 29 August 2026, the live database maintained 109 operational logs against 109 financial transactions with zero unpaired records, proving the write-time invariant from Section 3.5 in real data rather than merely asserting it. The deterministic decision-support tier computes nine quantities directly from a farm's own records, and strictly withholds any output lacking sufficient input data rather than substituting a plausible default. The post-harvest module bridges agricultural processing with farm economics, linking a moisture measurement to a price per marketable kilogram in a single chain computed by the platform without manual intervention at any step, moving maize from ₦35.00 to ₦41.67 per kilogram. This 19% difference is post-harvest mass reduction expressed in money, and the chain that produces it is the engineering contribution of this work. The offline-first architecture performs under constraint: under a simulated 0.4 Mbps network, a repeat application visit dropped from 139,245 bytes over eight requests to just 127 bytes over seven. System security—including authorisation across three roles and eleven permissions, expiring hashed share tokens, login throttling, and credential scrubbing—was verified on the running stack.</w:t>
       </w:r>
     </w:p>
     <w:p>

</xml_diff>

<commit_message>
docs(thesis): unify tier numbering, discharge the bridge markers, ground the forecast limitations
- tier numbering unified on Section 2.6.3's scheme (Random Forest tier renumbered Tier 3 at 3.6.5 and Table A.1)
- 5.2.3 entry labels: classifier added to the ledger-integrity entry
- three [AUTHOR: bridge needed] markers discharged (5.2.2, 5.2.3, 5.3.2 stems)
- 3.6.5 para 364 rephrased; error measures named, broken "reported as such" removed, forward reference now points at 5.2.3
- new 5.2.3 entry: forecast interval calibration
- future-work sentence closing 5.2.3
- literature grounding added to the forecast-tier entry and to 4.14's revenue-basis paragraph

3.6.5's lead-in also gained a clause naming the ladder rungs the platform
realises, so the renumbered list does not read as a typo. No [AUTHOR: ...]
marker remains in the document.

Co-Authored-By: Claude Opus 5 <noreply@anthropic.com>
Claude-Session: https://claude.ai/code/session_01HpujHPon5BPtHmMGKvBo5Z
</commit_message>
<xml_diff>
--- a/Thesis_Ch1-5_with_figures.docx
+++ b/Thesis_Ch1-5_with_figures.docx
@@ -5715,7 +5715,7 @@
         <w:rPr>
           <w:szCs w:val="24"/>
         </w:rPr>
-        <w:t>The decision-support engine follows a two-tier design that deliberately aligns model complexity with available data and device capability (van Klompenburg et al., 2020; Olisah et al., 2024).</w:t>
+        <w:t>The decision-support engine follows a two-tier design that deliberately aligns model complexity with available data and device capability, realising the first and third rungs of the ladder set out in Section 2.6.3 (van Klompenburg et al., 2020; Olisah et al., 2024).</w:t>
       </w:r>
     </w:p>
     <w:p>
@@ -5777,13 +5777,7 @@
           <w:bCs/>
           <w:szCs w:val="24"/>
         </w:rPr>
-        <w:t xml:space="preserve">Tier 2 – Statistical yield forecast (optional). </w:t>
-      </w:r>
-      <w:r>
-        <w:rPr>
-          <w:szCs w:val="24"/>
-        </w:rPr>
-        <w:t>A Random Forest regressor produces a yield estimate from agronomic inputs such as rainfall, fertiliser, and soil pH, reporting error measures suited to regression tasks. The forecast is accompanied by a dispersion measure computed across the individual trees of the ensemble, reported as a confidence percentage and as an interval about the ensemble mean. The measure indicates agreement among trees; it is not a calibrated prediction interval, and is reported as such. Established methods for interval estimation from a random forest exist (Meinshausen, 2006; Wager et al., 2014) and are identified in Chapter Five as the route to a calibrated figure. [AUTHOR: rephrase]</w:t>
+        <w:t>Tier 3 – Statistical yield forecast (optional). A Random Forest regressor produces a yield estimate from agronomic inputs such as rainfall, fertiliser, and soil pH, reported with the coefficient of determination, mean absolute error and root mean square error. Each forecast carries a dispersion measure computed across the individual trees of the ensemble and reported as a confidence percentage and as an interval about the ensemble mean. That measure indicates how far the trees agree with one another. It is not a calibrated prediction interval, and Section 5.2.3 sets out the established methods that would produce one (Meinshausen, 2006; Wager et al., 2014).</w:t>
       </w:r>
     </w:p>
     <w:p>
@@ -15821,7 +15815,7 @@
           <w:bCs/>
           <w:szCs w:val="24"/>
         </w:rPr>
-        <w:t xml:space="preserve">Basis of the revenue figures. The unit cost calculation divides by marketable mass while the revenue calculation divides by harvest mass. These two divisions sit within the same loop body, a structural choice holding true for any farm rather than an artefact of the seed. Both masses sit in the same row of Table 4.2 as 100 kg and 84 kg. This divergence inherits into gross margin, the ranking, the realised price, break-even yield, the operating-expense ratio, farm revenue, and the farm operating-expense ratio. The asymmetry reaches only figures carrying a revenue term; no cost-side figure is affected. The whole ₦35.00 to ₦41.67 chain, both break-even prices, the sensitivity matrix, and the unit costs on both bases remain entirely unchanged. The calculation basis forces a 7.78 identity: break-even yield in kilograms and the operating-expense ratio in per cent print the exact same digits solely because revenue equals the derived price of ₦450 times the 100 kg harvest mass. These figures stand unreconciled rather than wrong. The records are consistent with a wet-mass sale, in which case nothing is overstated and only the reconciliation is absent.</w:t>
+        <w:t>Basis of the revenue figures. The unit cost calculation divides by marketable mass while the revenue calculation divides by harvest mass. These two divisions sit within the same loop body, a structural choice holding true for any farm rather than an artefact of the seed. Both masses sit in the same row of Table 4.2 as 100 kg and 84 kg. This divergence inherits into gross margin, the ranking, the realised price, break-even yield, the operating-expense ratio, farm revenue, and the farm operating-expense ratio. The asymmetry reaches only figures carrying a revenue term; no cost-side figure is affected. The whole ₦35.00 to ₦41.67 chain, both break-even prices, the sensitivity matrix, and the unit costs on both bases remain entirely unchanged. The calculation basis forces a 7.78 identity: break-even yield in kilograms and the operating-expense ratio in per cent print the exact same digits solely because revenue equals the derived price of ₦450 times the 100 kg harvest mass. These figures stand unreconciled rather than wrong. The records are consistent with a wet-mass sale, in which case nothing is overstated and only the reconciliation is absent. The enterprise-budgeting formulation this layer follows computes unit cost and break-even price against a single defined output quantity (Kay et al., 2016), so cost and revenue divided by different masses is a departure from that formulation and is what remains to be reconciled.</w:t>
       </w:r>
     </w:p>
     <w:p>
@@ -16294,7 +16288,7 @@
         <w:pStyle w:val="BodyPara"/>
       </w:pPr>
       <w:r>
-        <w:t>[AUTHOR: bridge needed]</w:t>
+        <w:t>That claim is a claim about the literature, and it can only be tested against the literature. What follows compares this work topic by topic with the sources reviewed in Chapter Two: where the platform follows a published finding, where it departs from one, and where the reviewed work stops short of the junction this study occupies. Each paragraph is headed with the topic it treats.</w:t>
       </w:r>
     </w:p>
     <w:p>
@@ -16353,7 +16347,7 @@
         <w:pStyle w:val="BodyPara"/>
       </w:pPr>
       <w:r>
-        <w:t>[AUTHOR: bridge needed]</w:t>
+        <w:t>The limitations that bound this work are set out in Section 4.14 and are interpreted here rather than restated in full. Two kinds are distinguished throughout, and each entry below is labelled with the kind or kinds it belongs to: an implementation limitation is something the system does not do, and an evaluation limitation is something the system may well do that this study did not measure. The distinction is not a softening. It separates what would require building from what would require measuring, and the two have different consequences for what may be claimed.</w:t>
       </w:r>
     </w:p>
     <w:p>
@@ -16378,8 +16372,15 @@
         <w:t xml:space="preserve"> implementation and evaluation. The yield model is trained on synthetic data and is not validated against any real observation; it learns from no farm’s records and does not adapt from use. Its reported quality measures the recovery of a constructed relationship. It is, however, reproducible: the pipeline is seed-deterministic, the dataset carries a recorded fingerprint, and the three metrics were re-derived to six decimal places on 29 August 2026 by regenerating and refitting rather than by reading the sidecar. What is unproven is the model’s relevance, not the integrity of the procedure. The claim </w:t>
       </w:r>
       <w:r>
-        <w:lastRenderedPageBreak/>
-        <w:t>that the artefact was not reproducible from the repository, carried by an earlier draft, was wrong and understated the project’s own rigour. No claim of field-predictive accuracy is made, and the model should not be relied upon for a planting or input decision in its present state.</w:t>
+        <w:t>that the artefact was not reproducible from the repository, carried by an earlier draft, was wrong and understated the project’s own rigour. No claim of field-predictive accuracy is made, and the model should not be relied upon for a planting or input decision in its present state. The model family is chosen on the cost and interpretability grounds established by van Klompenburg et al. (2020) and not on a claim of superior accuracy, and the pre-processing problem that Olisah et al. (2024) find decisive is one this tier does not yet meet, because synthetic data arrives clean.</w:t>
+      </w:r>
+    </w:p>
+    <w:p>
+      <w:pPr>
+        <w:pStyle w:val="BodyPara"/>
+      </w:pPr>
+      <w:r>
+        <w:t>Forecast interval implementation. The methodological ladder of Section 2.6.3 has three rungs and the platform realises two of them, the deterministic tier and the tree-based ensemble; the intermediate regression tier is not implemented. The dispersion measure reported beside a forecast is computed across the individual trees of the ensemble and indicates agreement among them. It is not a calibrated prediction interval and is not reported as one. Established methods for interval estimation from a random forest exist (Meinshausen, 2006; Wager et al., 2014), and they are the route to a calibrated figure. No figure in Chapter Four derives from the unimplemented tier. The one interval reported there, 3.24 to 6.24 t/ha about a point estimate of 4.74 t/ha, is stated in those terms: it is the ensemble's internal disagreement on a single case and carries no calibration claim.</w:t>
       </w:r>
     </w:p>
     <w:p>
@@ -16445,7 +16446,7 @@
       </w:pPr>
       <w:r>
         <w:rPr/>
-        <w:t>Ledger integrity boundary. The soft-immutability constraint reported at Sections 3.5 and 4.15 is enforced by the application: deletion is refused, no update route exists, and a correction posts a linked contra entry that leaves the original visible. It is audit-trail discipline, not cryptographic tamper-evidence. There is no hash chaining, no signing and no append-only log; a party with database access is not constrained by it.</w:t>
+        <w:t>Ledger integrity boundary implementation. The soft-immutability constraint reported at Sections 3.5 and 4.15 is enforced by the application: deletion is refused, no update route exists, and a correction posts a linked contra entry that leaves the original visible. It is audit-trail discipline, not cryptographic tamper-evidence. There is no hash chaining, no signing and no append-only log; a party with database access is not constrained by it. Three verification gaps are carried into future work rather than closed here: there has been no independent security review; there are no component tests for the page and form layer, including the drying-curve chart, and no end-to-end browser test of the offline-to-online transition; and concurrency is measured on SQLite and inferred for PostgreSQL.</w:t>
       </w:r>
     </w:p>
     <w:p>
@@ -16623,7 +16624,7 @@
         <w:pStyle w:val="BodyPara"/>
       </w:pPr>
       <w:r>
-        <w:t>[AUTHOR: bridge needed]</w:t>
+        <w:t>Five lines of further work follow from what this study did and did not establish. They run from what the existing data and code can already support toward what does not yet exist, and each is bounded by what Chapter Four actually measured.</w:t>
       </w:r>
     </w:p>
     <w:p>
@@ -17596,7 +17597,7 @@
                 <w:bCs/>
                 <w:lang w:val="en-GB"/>
               </w:rPr>
-              <w:t>Predictive decision support (Tier 2):</w:t>
+              <w:t>Predictive decision support (Tier 3):</w:t>
             </w:r>
             <w:r>
               <w:rPr>

</xml_diff>

<commit_message>
docs(thesis): fix 3.8.4 cross-reference, source 4.10 cost figures, drop dead TOC entry
- §3.8.4 cross-reference corrected from Section 4.11 to 4.12
- §4.10 given the hosting-cost figures its dependants cite, sourced from
  Tables C.1-C.3
- TOC entry for the non-existent §5.1.3 removed

Co-Authored-By: Claude Opus 5 <noreply@anthropic.com>
Claude-Session: https://claude.ai/code/session_011P7xNiUBbxrtAuKry16MD1
</commit_message>
<xml_diff>
--- a/Thesis_Ch1-5_with_figures.docx
+++ b/Thesis_Ch1-5_with_figures.docx
@@ -2214,21 +2214,6 @@
       </w:pPr>
       <w:r>
         <w:t>5.1.2 Summary of Findings</w:t>
-      </w:r>
-      <w:r>
-        <w:tab/>
-        <w:t>—</w:t>
-      </w:r>
-    </w:p>
-    <w:p>
-      <w:pPr>
-        <w:pStyle w:val="TOC3"/>
-        <w:tabs>
-          <w:tab w:val="right" w:leader="dot" w:pos="8503"/>
-        </w:tabs>
-      </w:pPr>
-      <w:r>
-        <w:t>5.1.3 Achievement Against the Research Objectives</w:t>
       </w:r>
       <w:r>
         <w:tab/>
@@ -9530,7 +9515,7 @@
         <w:rPr>
           <w:szCs w:val="24"/>
         </w:rPr>
-        <w:t>were prepared in full and are provided as a separate evaluation pack. The strand was not executed within the period of this study. Section 4.11 reports that absence and reports no figure against these instruments; the tables there are drafted to receive real data and are deliberately left empty.</w:t>
+        <w:t>were prepared in full and are provided as a separate evaluation pack. The strand was not executed within the period of this study. Section 4.12 reports that absence and reports no figure against these instruments; the tables there are drafted to receive real data and are deliberately left empty.</w:t>
       </w:r>
     </w:p>
     <w:p>
@@ -9765,8 +9750,6 @@
           <w:p>
             <w:pPr>
               <w:pStyle w:val="TableCell"/>
-              <w:spacing w:line="240" w:lineRule="auto"/>
-              <w:jc w:val="center"/>
             </w:pPr>
             <w:r>
               <w:rPr>
@@ -9789,8 +9772,6 @@
           <w:p>
             <w:pPr>
               <w:pStyle w:val="TableCell"/>
-              <w:spacing w:line="240" w:lineRule="auto"/>
-              <w:jc w:val="center"/>
             </w:pPr>
             <w:r>
               <w:rPr>
@@ -9813,8 +9794,6 @@
           <w:p>
             <w:pPr>
               <w:pStyle w:val="TableCell"/>
-              <w:spacing w:line="240" w:lineRule="auto"/>
-              <w:jc w:val="center"/>
             </w:pPr>
             <w:r>
               <w:rPr>
@@ -9843,8 +9822,6 @@
           <w:p>
             <w:pPr>
               <w:pStyle w:val="TableCell"/>
-              <w:spacing w:line="240" w:lineRule="auto"/>
-              <w:jc w:val="center"/>
             </w:pPr>
             <w:r>
               <w:rPr>
@@ -9865,8 +9842,6 @@
           <w:p>
             <w:pPr>
               <w:pStyle w:val="TableCell"/>
-              <w:spacing w:line="240" w:lineRule="auto"/>
-              <w:jc w:val="center"/>
             </w:pPr>
             <w:r>
               <w:rPr>
@@ -9887,8 +9862,6 @@
           <w:p>
             <w:pPr>
               <w:pStyle w:val="TableCell"/>
-              <w:spacing w:line="240" w:lineRule="auto"/>
-              <w:jc w:val="center"/>
             </w:pPr>
             <w:r>
               <w:rPr>
@@ -9916,8 +9889,6 @@
           <w:p>
             <w:pPr>
               <w:pStyle w:val="TableCell"/>
-              <w:spacing w:line="240" w:lineRule="auto"/>
-              <w:jc w:val="center"/>
             </w:pPr>
             <w:r>
               <w:rPr>
@@ -9939,8 +9910,6 @@
           <w:p>
             <w:pPr>
               <w:pStyle w:val="TableCell"/>
-              <w:spacing w:line="240" w:lineRule="auto"/>
-              <w:jc w:val="center"/>
             </w:pPr>
             <w:r>
               <w:rPr>
@@ -9976,8 +9945,6 @@
           <w:p>
             <w:pPr>
               <w:pStyle w:val="TableCell"/>
-              <w:spacing w:line="240" w:lineRule="auto"/>
-              <w:jc w:val="center"/>
             </w:pPr>
             <w:r>
               <w:rPr>
@@ -10005,8 +9972,6 @@
           <w:p>
             <w:pPr>
               <w:pStyle w:val="TableCell"/>
-              <w:spacing w:line="240" w:lineRule="auto"/>
-              <w:jc w:val="center"/>
             </w:pPr>
             <w:r>
               <w:rPr>
@@ -10028,8 +9993,6 @@
           <w:p>
             <w:pPr>
               <w:pStyle w:val="TableCell"/>
-              <w:spacing w:line="240" w:lineRule="auto"/>
-              <w:jc w:val="center"/>
             </w:pPr>
             <w:r>
               <w:rPr>
@@ -10051,8 +10014,6 @@
           <w:p>
             <w:pPr>
               <w:pStyle w:val="TableCell"/>
-              <w:spacing w:line="240" w:lineRule="auto"/>
-              <w:jc w:val="center"/>
             </w:pPr>
             <w:r>
               <w:rPr>
@@ -10079,8 +10040,6 @@
           <w:p>
             <w:pPr>
               <w:pStyle w:val="TableCell"/>
-              <w:spacing w:line="240" w:lineRule="auto"/>
-              <w:jc w:val="center"/>
             </w:pPr>
             <w:r>
               <w:rPr>
@@ -10101,8 +10060,6 @@
           <w:p>
             <w:pPr>
               <w:pStyle w:val="TableCell"/>
-              <w:spacing w:line="240" w:lineRule="auto"/>
-              <w:jc w:val="center"/>
             </w:pPr>
             <w:r>
               <w:rPr>
@@ -10123,8 +10080,6 @@
           <w:p>
             <w:pPr>
               <w:pStyle w:val="TableCell"/>
-              <w:spacing w:line="240" w:lineRule="auto"/>
-              <w:jc w:val="center"/>
             </w:pPr>
             <w:r>
               <w:rPr>
@@ -10281,8 +10236,6 @@
           <w:p>
             <w:pPr>
               <w:pStyle w:val="TableCell"/>
-              <w:spacing w:line="240" w:lineRule="auto"/>
-              <w:jc w:val="center"/>
               <w:rPr>
                 <w:sz w:val="24"/>
                 <w:szCs w:val="24"/>
@@ -10310,8 +10263,6 @@
           <w:p>
             <w:pPr>
               <w:pStyle w:val="TableCell"/>
-              <w:spacing w:line="240" w:lineRule="auto"/>
-              <w:jc w:val="center"/>
               <w:rPr>
                 <w:sz w:val="24"/>
                 <w:szCs w:val="24"/>
@@ -10339,8 +10290,6 @@
           <w:p>
             <w:pPr>
               <w:pStyle w:val="TableCell"/>
-              <w:spacing w:line="240" w:lineRule="auto"/>
-              <w:jc w:val="center"/>
               <w:rPr>
                 <w:sz w:val="24"/>
                 <w:szCs w:val="24"/>
@@ -10368,8 +10317,6 @@
           <w:p>
             <w:pPr>
               <w:pStyle w:val="TableCell"/>
-              <w:spacing w:line="240" w:lineRule="auto"/>
-              <w:jc w:val="center"/>
               <w:rPr>
                 <w:sz w:val="24"/>
                 <w:szCs w:val="24"/>
@@ -10397,8 +10344,6 @@
           <w:p>
             <w:pPr>
               <w:pStyle w:val="TableCell"/>
-              <w:spacing w:line="240" w:lineRule="auto"/>
-              <w:jc w:val="center"/>
               <w:rPr>
                 <w:sz w:val="24"/>
                 <w:szCs w:val="24"/>
@@ -10426,8 +10371,6 @@
           <w:p>
             <w:pPr>
               <w:pStyle w:val="TableCell"/>
-              <w:spacing w:line="240" w:lineRule="auto"/>
-              <w:jc w:val="center"/>
               <w:rPr>
                 <w:sz w:val="24"/>
                 <w:szCs w:val="24"/>
@@ -10455,8 +10398,6 @@
           <w:p>
             <w:pPr>
               <w:pStyle w:val="TableCell"/>
-              <w:spacing w:line="240" w:lineRule="auto"/>
-              <w:jc w:val="center"/>
               <w:rPr>
                 <w:sz w:val="24"/>
                 <w:szCs w:val="24"/>
@@ -10487,8 +10428,6 @@
           <w:p>
             <w:pPr>
               <w:pStyle w:val="TableCell"/>
-              <w:spacing w:line="240" w:lineRule="auto"/>
-              <w:jc w:val="center"/>
               <w:rPr>
                 <w:sz w:val="24"/>
                 <w:szCs w:val="24"/>
@@ -10511,8 +10450,6 @@
           <w:p>
             <w:pPr>
               <w:pStyle w:val="TableCell"/>
-              <w:spacing w:line="240" w:lineRule="auto"/>
-              <w:jc w:val="center"/>
               <w:rPr>
                 <w:sz w:val="24"/>
                 <w:szCs w:val="24"/>
@@ -10535,8 +10472,6 @@
           <w:p>
             <w:pPr>
               <w:pStyle w:val="TableCell"/>
-              <w:spacing w:line="240" w:lineRule="auto"/>
-              <w:jc w:val="center"/>
               <w:rPr>
                 <w:sz w:val="24"/>
                 <w:szCs w:val="24"/>
@@ -10559,8 +10494,6 @@
           <w:p>
             <w:pPr>
               <w:pStyle w:val="TableCell"/>
-              <w:spacing w:line="240" w:lineRule="auto"/>
-              <w:jc w:val="center"/>
               <w:rPr>
                 <w:sz w:val="24"/>
                 <w:szCs w:val="24"/>
@@ -10583,8 +10516,6 @@
           <w:p>
             <w:pPr>
               <w:pStyle w:val="TableCell"/>
-              <w:spacing w:line="240" w:lineRule="auto"/>
-              <w:jc w:val="center"/>
               <w:rPr>
                 <w:sz w:val="24"/>
                 <w:szCs w:val="24"/>
@@ -10609,8 +10540,6 @@
           <w:p>
             <w:pPr>
               <w:pStyle w:val="TableCell"/>
-              <w:spacing w:line="240" w:lineRule="auto"/>
-              <w:jc w:val="center"/>
               <w:rPr>
                 <w:sz w:val="24"/>
                 <w:szCs w:val="24"/>
@@ -10633,8 +10562,6 @@
           <w:p>
             <w:pPr>
               <w:pStyle w:val="TableCell"/>
-              <w:spacing w:line="240" w:lineRule="auto"/>
-              <w:jc w:val="center"/>
               <w:rPr>
                 <w:sz w:val="24"/>
                 <w:szCs w:val="24"/>
@@ -10663,8 +10590,6 @@
           <w:p>
             <w:pPr>
               <w:pStyle w:val="TableCell"/>
-              <w:spacing w:line="240" w:lineRule="auto"/>
-              <w:jc w:val="center"/>
               <w:rPr>
                 <w:sz w:val="24"/>
                 <w:szCs w:val="24"/>
@@ -10687,8 +10612,6 @@
           <w:p>
             <w:pPr>
               <w:pStyle w:val="TableCell"/>
-              <w:spacing w:line="240" w:lineRule="auto"/>
-              <w:jc w:val="center"/>
               <w:rPr>
                 <w:sz w:val="24"/>
                 <w:szCs w:val="24"/>
@@ -10711,8 +10634,6 @@
           <w:p>
             <w:pPr>
               <w:pStyle w:val="TableCell"/>
-              <w:spacing w:line="240" w:lineRule="auto"/>
-              <w:jc w:val="center"/>
               <w:rPr>
                 <w:sz w:val="24"/>
                 <w:szCs w:val="24"/>
@@ -10735,8 +10656,6 @@
           <w:p>
             <w:pPr>
               <w:pStyle w:val="TableCell"/>
-              <w:spacing w:line="240" w:lineRule="auto"/>
-              <w:jc w:val="center"/>
               <w:rPr>
                 <w:sz w:val="24"/>
                 <w:szCs w:val="24"/>
@@ -10759,8 +10678,6 @@
           <w:p>
             <w:pPr>
               <w:pStyle w:val="TableCell"/>
-              <w:spacing w:line="240" w:lineRule="auto"/>
-              <w:jc w:val="center"/>
               <w:rPr>
                 <w:sz w:val="24"/>
                 <w:szCs w:val="24"/>
@@ -10785,8 +10702,6 @@
           <w:p>
             <w:pPr>
               <w:pStyle w:val="TableCell"/>
-              <w:spacing w:line="240" w:lineRule="auto"/>
-              <w:jc w:val="center"/>
               <w:rPr>
                 <w:sz w:val="24"/>
                 <w:szCs w:val="24"/>
@@ -10809,8 +10724,6 @@
           <w:p>
             <w:pPr>
               <w:pStyle w:val="TableCell"/>
-              <w:spacing w:line="240" w:lineRule="auto"/>
-              <w:jc w:val="center"/>
               <w:rPr>
                 <w:sz w:val="24"/>
                 <w:szCs w:val="24"/>
@@ -10839,8 +10752,6 @@
           <w:p>
             <w:pPr>
               <w:pStyle w:val="TableCell"/>
-              <w:spacing w:line="240" w:lineRule="auto"/>
-              <w:jc w:val="center"/>
               <w:rPr>
                 <w:sz w:val="24"/>
                 <w:szCs w:val="24"/>
@@ -10863,8 +10774,6 @@
           <w:p>
             <w:pPr>
               <w:pStyle w:val="TableCell"/>
-              <w:spacing w:line="240" w:lineRule="auto"/>
-              <w:jc w:val="center"/>
               <w:rPr>
                 <w:sz w:val="24"/>
                 <w:szCs w:val="24"/>
@@ -10887,8 +10796,6 @@
           <w:p>
             <w:pPr>
               <w:pStyle w:val="TableCell"/>
-              <w:spacing w:line="240" w:lineRule="auto"/>
-              <w:jc w:val="center"/>
               <w:rPr>
                 <w:sz w:val="24"/>
                 <w:szCs w:val="24"/>
@@ -10911,8 +10818,6 @@
           <w:p>
             <w:pPr>
               <w:pStyle w:val="TableCell"/>
-              <w:spacing w:line="240" w:lineRule="auto"/>
-              <w:jc w:val="center"/>
               <w:rPr>
                 <w:sz w:val="24"/>
                 <w:szCs w:val="24"/>
@@ -10935,8 +10840,6 @@
           <w:p>
             <w:pPr>
               <w:pStyle w:val="TableCell"/>
-              <w:spacing w:line="240" w:lineRule="auto"/>
-              <w:jc w:val="center"/>
               <w:rPr>
                 <w:sz w:val="24"/>
                 <w:szCs w:val="24"/>
@@ -10961,8 +10864,6 @@
           <w:p>
             <w:pPr>
               <w:pStyle w:val="TableCell"/>
-              <w:spacing w:line="240" w:lineRule="auto"/>
-              <w:jc w:val="center"/>
               <w:rPr>
                 <w:sz w:val="24"/>
                 <w:szCs w:val="24"/>
@@ -10985,8 +10886,6 @@
           <w:p>
             <w:pPr>
               <w:pStyle w:val="TableCell"/>
-              <w:spacing w:line="240" w:lineRule="auto"/>
-              <w:jc w:val="center"/>
               <w:rPr>
                 <w:sz w:val="24"/>
                 <w:szCs w:val="24"/>
@@ -11015,8 +10914,6 @@
           <w:p>
             <w:pPr>
               <w:pStyle w:val="TableCell"/>
-              <w:spacing w:line="240" w:lineRule="auto"/>
-              <w:jc w:val="center"/>
               <w:rPr>
                 <w:sz w:val="24"/>
                 <w:szCs w:val="24"/>
@@ -11039,8 +10936,6 @@
           <w:p>
             <w:pPr>
               <w:pStyle w:val="TableCell"/>
-              <w:spacing w:line="240" w:lineRule="auto"/>
-              <w:jc w:val="center"/>
               <w:rPr>
                 <w:sz w:val="24"/>
                 <w:szCs w:val="24"/>
@@ -11063,8 +10958,6 @@
           <w:p>
             <w:pPr>
               <w:pStyle w:val="TableCell"/>
-              <w:spacing w:line="240" w:lineRule="auto"/>
-              <w:jc w:val="center"/>
               <w:rPr>
                 <w:sz w:val="24"/>
                 <w:szCs w:val="24"/>
@@ -11087,8 +10980,6 @@
           <w:p>
             <w:pPr>
               <w:pStyle w:val="TableCell"/>
-              <w:spacing w:line="240" w:lineRule="auto"/>
-              <w:jc w:val="center"/>
               <w:rPr>
                 <w:sz w:val="24"/>
                 <w:szCs w:val="24"/>
@@ -11111,8 +11002,6 @@
           <w:p>
             <w:pPr>
               <w:pStyle w:val="TableCell"/>
-              <w:spacing w:line="240" w:lineRule="auto"/>
-              <w:jc w:val="center"/>
               <w:rPr>
                 <w:sz w:val="24"/>
                 <w:szCs w:val="24"/>
@@ -11137,8 +11026,6 @@
           <w:p>
             <w:pPr>
               <w:pStyle w:val="TableCell"/>
-              <w:spacing w:line="240" w:lineRule="auto"/>
-              <w:jc w:val="center"/>
               <w:rPr>
                 <w:sz w:val="24"/>
                 <w:szCs w:val="24"/>
@@ -11161,8 +11048,6 @@
           <w:p>
             <w:pPr>
               <w:pStyle w:val="TableCell"/>
-              <w:spacing w:line="240" w:lineRule="auto"/>
-              <w:jc w:val="center"/>
               <w:rPr>
                 <w:sz w:val="24"/>
                 <w:szCs w:val="24"/>
@@ -11191,8 +11076,6 @@
           <w:p>
             <w:pPr>
               <w:pStyle w:val="TableCell"/>
-              <w:spacing w:line="240" w:lineRule="auto"/>
-              <w:jc w:val="center"/>
               <w:rPr>
                 <w:sz w:val="24"/>
                 <w:szCs w:val="24"/>
@@ -11215,8 +11098,6 @@
           <w:p>
             <w:pPr>
               <w:pStyle w:val="TableCell"/>
-              <w:spacing w:line="240" w:lineRule="auto"/>
-              <w:jc w:val="center"/>
               <w:rPr>
                 <w:sz w:val="24"/>
                 <w:szCs w:val="24"/>
@@ -11239,8 +11120,6 @@
           <w:p>
             <w:pPr>
               <w:pStyle w:val="TableCell"/>
-              <w:spacing w:line="240" w:lineRule="auto"/>
-              <w:jc w:val="center"/>
               <w:rPr>
                 <w:sz w:val="24"/>
                 <w:szCs w:val="24"/>
@@ -11263,8 +11142,6 @@
           <w:p>
             <w:pPr>
               <w:pStyle w:val="TableCell"/>
-              <w:spacing w:line="240" w:lineRule="auto"/>
-              <w:jc w:val="center"/>
               <w:rPr>
                 <w:sz w:val="24"/>
                 <w:szCs w:val="24"/>
@@ -11287,8 +11164,6 @@
           <w:p>
             <w:pPr>
               <w:pStyle w:val="TableCell"/>
-              <w:spacing w:line="240" w:lineRule="auto"/>
-              <w:jc w:val="center"/>
               <w:rPr>
                 <w:sz w:val="24"/>
                 <w:szCs w:val="24"/>
@@ -11313,8 +11188,6 @@
           <w:p>
             <w:pPr>
               <w:pStyle w:val="TableCell"/>
-              <w:spacing w:line="240" w:lineRule="auto"/>
-              <w:jc w:val="center"/>
               <w:rPr>
                 <w:sz w:val="24"/>
                 <w:szCs w:val="24"/>
@@ -11337,8 +11210,6 @@
           <w:p>
             <w:pPr>
               <w:pStyle w:val="TableCell"/>
-              <w:spacing w:line="240" w:lineRule="auto"/>
-              <w:jc w:val="center"/>
               <w:rPr>
                 <w:sz w:val="24"/>
                 <w:szCs w:val="24"/>
@@ -11367,8 +11238,6 @@
           <w:p>
             <w:pPr>
               <w:pStyle w:val="TableCell"/>
-              <w:spacing w:line="240" w:lineRule="auto"/>
-              <w:jc w:val="center"/>
               <w:rPr>
                 <w:sz w:val="24"/>
                 <w:szCs w:val="24"/>
@@ -11384,8 +11253,6 @@
           <w:p>
             <w:pPr>
               <w:pStyle w:val="TableCell"/>
-              <w:spacing w:line="240" w:lineRule="auto"/>
-              <w:jc w:val="center"/>
               <w:rPr>
                 <w:sz w:val="24"/>
                 <w:szCs w:val="24"/>
@@ -11410,8 +11277,6 @@
           <w:p>
             <w:pPr>
               <w:pStyle w:val="TableCell"/>
-              <w:spacing w:line="240" w:lineRule="auto"/>
-              <w:jc w:val="center"/>
               <w:rPr>
                 <w:sz w:val="24"/>
                 <w:szCs w:val="24"/>
@@ -11436,8 +11301,6 @@
           <w:p>
             <w:pPr>
               <w:pStyle w:val="TableCell"/>
-              <w:spacing w:line="240" w:lineRule="auto"/>
-              <w:jc w:val="center"/>
               <w:rPr>
                 <w:sz w:val="24"/>
                 <w:szCs w:val="24"/>
@@ -11462,8 +11325,6 @@
           <w:p>
             <w:pPr>
               <w:pStyle w:val="TableCell"/>
-              <w:spacing w:line="240" w:lineRule="auto"/>
-              <w:jc w:val="center"/>
               <w:rPr>
                 <w:sz w:val="24"/>
                 <w:szCs w:val="24"/>
@@ -11488,8 +11349,6 @@
           <w:p>
             <w:pPr>
               <w:pStyle w:val="TableCell"/>
-              <w:spacing w:line="240" w:lineRule="auto"/>
-              <w:jc w:val="center"/>
               <w:rPr>
                 <w:sz w:val="24"/>
                 <w:szCs w:val="24"/>
@@ -11505,8 +11364,6 @@
           <w:p>
             <w:pPr>
               <w:pStyle w:val="TableCell"/>
-              <w:spacing w:line="240" w:lineRule="auto"/>
-              <w:jc w:val="center"/>
               <w:rPr>
                 <w:sz w:val="24"/>
                 <w:szCs w:val="24"/>
@@ -11566,7 +11423,6 @@
         <w:rPr>
           <w:szCs w:val="24"/>
         </w:rPr>
-        <w:lastRenderedPageBreak/>
         <w:t xml:space="preserve">Second, </w:t>
       </w:r>
       <w:r>
@@ -11592,6 +11448,7 @@
         <w:rPr>
           <w:szCs w:val="24"/>
         </w:rPr>
+        <w:lastRenderedPageBreak/>
         <w:t>Third, the figures are the ledger, not a projection. Each is the sum of transactions carrying that crop’s category, with reversed pairs netted — at farm level and per crop as well.</w:t>
       </w:r>
     </w:p>
@@ -11660,7 +11517,6 @@
           <w:noProof/>
           <w:lang w:val="en-GB" w:eastAsia="en-GB"/>
         </w:rPr>
-        <w:lastRenderedPageBreak/>
         <w:drawing>
           <wp:inline distT="0" distB="0" distL="0" distR="0">
             <wp:extent cx="5394960" cy="2532385"/>
@@ -11703,6 +11559,7 @@
         <w:pStyle w:val="FigureCaption"/>
       </w:pPr>
       <w:r>
+        <w:lastRenderedPageBreak/>
         <w:t>Figure 4.1: Per-crop gross margin and enterprise ranking, showing unit cost of production on both the harvested and the marketable basis</w:t>
       </w:r>
     </w:p>
@@ -11787,8 +11644,6 @@
           <w:p>
             <w:pPr>
               <w:pStyle w:val="TableCell"/>
-              <w:spacing w:line="240" w:lineRule="auto"/>
-              <w:jc w:val="center"/>
               <w:rPr>
                 <w:sz w:val="24"/>
                 <w:szCs w:val="24"/>
@@ -11816,8 +11671,6 @@
           <w:p>
             <w:pPr>
               <w:pStyle w:val="TableCell"/>
-              <w:spacing w:line="240" w:lineRule="auto"/>
-              <w:jc w:val="center"/>
               <w:rPr>
                 <w:sz w:val="24"/>
                 <w:szCs w:val="24"/>
@@ -11845,8 +11698,6 @@
           <w:p>
             <w:pPr>
               <w:pStyle w:val="TableCell"/>
-              <w:spacing w:line="240" w:lineRule="auto"/>
-              <w:jc w:val="center"/>
               <w:rPr>
                 <w:sz w:val="24"/>
                 <w:szCs w:val="24"/>
@@ -11874,8 +11725,6 @@
           <w:p>
             <w:pPr>
               <w:pStyle w:val="TableCell"/>
-              <w:spacing w:line="240" w:lineRule="auto"/>
-              <w:jc w:val="center"/>
               <w:rPr>
                 <w:sz w:val="24"/>
                 <w:szCs w:val="24"/>
@@ -11903,8 +11752,6 @@
           <w:p>
             <w:pPr>
               <w:pStyle w:val="TableCell"/>
-              <w:spacing w:line="240" w:lineRule="auto"/>
-              <w:jc w:val="center"/>
               <w:rPr>
                 <w:sz w:val="24"/>
                 <w:szCs w:val="24"/>
@@ -11935,8 +11782,6 @@
           <w:p>
             <w:pPr>
               <w:pStyle w:val="TableCell"/>
-              <w:spacing w:line="240" w:lineRule="auto"/>
-              <w:jc w:val="center"/>
               <w:rPr>
                 <w:sz w:val="24"/>
                 <w:szCs w:val="24"/>
@@ -11959,8 +11804,6 @@
           <w:p>
             <w:pPr>
               <w:pStyle w:val="TableCell"/>
-              <w:spacing w:line="240" w:lineRule="auto"/>
-              <w:jc w:val="center"/>
               <w:rPr>
                 <w:sz w:val="24"/>
                 <w:szCs w:val="24"/>
@@ -11983,8 +11826,6 @@
           <w:p>
             <w:pPr>
               <w:pStyle w:val="TableCell"/>
-              <w:spacing w:line="240" w:lineRule="auto"/>
-              <w:jc w:val="center"/>
               <w:rPr>
                 <w:sz w:val="24"/>
                 <w:szCs w:val="24"/>
@@ -12007,8 +11848,6 @@
           <w:p>
             <w:pPr>
               <w:pStyle w:val="TableCell"/>
-              <w:spacing w:line="240" w:lineRule="auto"/>
-              <w:jc w:val="center"/>
               <w:rPr>
                 <w:sz w:val="24"/>
                 <w:szCs w:val="24"/>
@@ -12033,8 +11872,6 @@
           <w:p>
             <w:pPr>
               <w:pStyle w:val="TableCell"/>
-              <w:spacing w:line="240" w:lineRule="auto"/>
-              <w:jc w:val="center"/>
               <w:rPr>
                 <w:sz w:val="24"/>
                 <w:szCs w:val="24"/>
@@ -12063,8 +11900,6 @@
           <w:p>
             <w:pPr>
               <w:pStyle w:val="TableCell"/>
-              <w:spacing w:line="240" w:lineRule="auto"/>
-              <w:jc w:val="center"/>
               <w:rPr>
                 <w:sz w:val="24"/>
                 <w:szCs w:val="24"/>
@@ -12087,8 +11922,6 @@
           <w:p>
             <w:pPr>
               <w:pStyle w:val="TableCell"/>
-              <w:spacing w:line="240" w:lineRule="auto"/>
-              <w:jc w:val="center"/>
               <w:rPr>
                 <w:sz w:val="24"/>
                 <w:szCs w:val="24"/>
@@ -12111,8 +11944,6 @@
           <w:p>
             <w:pPr>
               <w:pStyle w:val="TableCell"/>
-              <w:spacing w:line="240" w:lineRule="auto"/>
-              <w:jc w:val="center"/>
               <w:rPr>
                 <w:sz w:val="24"/>
                 <w:szCs w:val="24"/>
@@ -12135,8 +11966,6 @@
           <w:p>
             <w:pPr>
               <w:pStyle w:val="TableCell"/>
-              <w:spacing w:line="240" w:lineRule="auto"/>
-              <w:jc w:val="center"/>
               <w:rPr>
                 <w:sz w:val="24"/>
                 <w:szCs w:val="24"/>
@@ -12161,8 +11990,6 @@
           <w:p>
             <w:pPr>
               <w:pStyle w:val="TableCell"/>
-              <w:spacing w:line="240" w:lineRule="auto"/>
-              <w:jc w:val="center"/>
               <w:rPr>
                 <w:sz w:val="24"/>
                 <w:szCs w:val="24"/>
@@ -12191,8 +12018,6 @@
           <w:p>
             <w:pPr>
               <w:pStyle w:val="TableCell"/>
-              <w:spacing w:line="240" w:lineRule="auto"/>
-              <w:jc w:val="center"/>
               <w:rPr>
                 <w:sz w:val="24"/>
                 <w:szCs w:val="24"/>
@@ -12215,8 +12040,6 @@
           <w:p>
             <w:pPr>
               <w:pStyle w:val="TableCell"/>
-              <w:spacing w:line="240" w:lineRule="auto"/>
-              <w:jc w:val="center"/>
               <w:rPr>
                 <w:sz w:val="24"/>
                 <w:szCs w:val="24"/>
@@ -12239,8 +12062,6 @@
           <w:p>
             <w:pPr>
               <w:pStyle w:val="TableCell"/>
-              <w:spacing w:line="240" w:lineRule="auto"/>
-              <w:jc w:val="center"/>
               <w:rPr>
                 <w:sz w:val="24"/>
                 <w:szCs w:val="24"/>
@@ -12263,8 +12084,6 @@
           <w:p>
             <w:pPr>
               <w:pStyle w:val="TableCell"/>
-              <w:spacing w:line="240" w:lineRule="auto"/>
-              <w:jc w:val="center"/>
               <w:rPr>
                 <w:sz w:val="24"/>
                 <w:szCs w:val="24"/>
@@ -12287,8 +12106,6 @@
           <w:p>
             <w:pPr>
               <w:pStyle w:val="TableCell"/>
-              <w:spacing w:line="240" w:lineRule="auto"/>
-              <w:jc w:val="center"/>
               <w:rPr>
                 <w:sz w:val="24"/>
                 <w:szCs w:val="24"/>
@@ -12317,8 +12134,6 @@
           <w:p>
             <w:pPr>
               <w:pStyle w:val="TableCell"/>
-              <w:spacing w:line="240" w:lineRule="auto"/>
-              <w:jc w:val="center"/>
               <w:rPr>
                 <w:sz w:val="24"/>
                 <w:szCs w:val="24"/>
@@ -12329,7 +12144,6 @@
                 <w:sz w:val="24"/>
                 <w:szCs w:val="24"/>
               </w:rPr>
-              <w:lastRenderedPageBreak/>
               <w:t>Cowpea</w:t>
             </w:r>
           </w:p>
@@ -12342,8 +12156,6 @@
           <w:p>
             <w:pPr>
               <w:pStyle w:val="TableCell"/>
-              <w:spacing w:line="240" w:lineRule="auto"/>
-              <w:jc w:val="center"/>
               <w:rPr>
                 <w:sz w:val="24"/>
                 <w:szCs w:val="24"/>
@@ -12366,8 +12178,6 @@
           <w:p>
             <w:pPr>
               <w:pStyle w:val="TableCell"/>
-              <w:spacing w:line="240" w:lineRule="auto"/>
-              <w:jc w:val="center"/>
               <w:rPr>
                 <w:sz w:val="24"/>
                 <w:szCs w:val="24"/>
@@ -12390,8 +12200,6 @@
           <w:p>
             <w:pPr>
               <w:pStyle w:val="TableCell"/>
-              <w:spacing w:line="240" w:lineRule="auto"/>
-              <w:jc w:val="center"/>
               <w:rPr>
                 <w:sz w:val="24"/>
                 <w:szCs w:val="24"/>
@@ -12414,8 +12222,6 @@
           <w:p>
             <w:pPr>
               <w:pStyle w:val="TableCell"/>
-              <w:spacing w:line="240" w:lineRule="auto"/>
-              <w:jc w:val="center"/>
               <w:rPr>
                 <w:sz w:val="24"/>
                 <w:szCs w:val="24"/>
@@ -12444,8 +12250,6 @@
           <w:p>
             <w:pPr>
               <w:pStyle w:val="TableCell"/>
-              <w:spacing w:line="240" w:lineRule="auto"/>
-              <w:jc w:val="center"/>
               <w:rPr>
                 <w:sz w:val="24"/>
                 <w:szCs w:val="24"/>
@@ -12468,8 +12272,6 @@
           <w:p>
             <w:pPr>
               <w:pStyle w:val="TableCell"/>
-              <w:spacing w:line="240" w:lineRule="auto"/>
-              <w:jc w:val="center"/>
               <w:rPr>
                 <w:sz w:val="24"/>
                 <w:szCs w:val="24"/>
@@ -12492,8 +12294,6 @@
           <w:p>
             <w:pPr>
               <w:pStyle w:val="TableCell"/>
-              <w:spacing w:line="240" w:lineRule="auto"/>
-              <w:jc w:val="center"/>
               <w:rPr>
                 <w:sz w:val="24"/>
                 <w:szCs w:val="24"/>
@@ -12516,8 +12316,6 @@
           <w:p>
             <w:pPr>
               <w:pStyle w:val="TableCell"/>
-              <w:spacing w:line="240" w:lineRule="auto"/>
-              <w:jc w:val="center"/>
               <w:rPr>
                 <w:sz w:val="24"/>
                 <w:szCs w:val="24"/>
@@ -12540,8 +12338,6 @@
           <w:p>
             <w:pPr>
               <w:pStyle w:val="TableCell"/>
-              <w:spacing w:line="240" w:lineRule="auto"/>
-              <w:jc w:val="center"/>
               <w:rPr>
                 <w:sz w:val="24"/>
                 <w:szCs w:val="24"/>
@@ -12572,7 +12368,14 @@
         <w:rPr>
           <w:szCs w:val="24"/>
         </w:rPr>
-        <w:t>The 19% difference between ₦35.00 and ₦41.67 is post-harvest mass reduction expressed in money. A farmer pricing against the wet-basis figure would be pricing against a mass that no longer exists and would under-recover by ₦6.67 on every kilogram sold. The same pattern appears on cowpea, where the two bases differ by ₦63.40 per kilogram. The two crops differ in how much the basis matters, and the difference is not arbitrary. Maize was dried from 25.0% to 13.0% moisture on a wet basis, removing twelve percentage points; cowpea from 18.0% to 11.5%, removing six and a half. The shift in unit cost follows: 19.05% for maize against 11.37% for cowpea. A platform that applied a single correction factor across enterprises would overstate the adjustment for one crop and understate it for the other. This is the argument for computing the marketable basis from each run's own moisture record rather than assuming a typical loss.</w:t>
+        <w:t xml:space="preserve">The 19% difference between ₦35.00 and ₦41.67 is post-harvest mass reduction expressed in money. A farmer pricing against the wet-basis figure would be pricing against a mass that no longer exists and would under-recover by ₦6.67 on every kilogram sold. The same pattern appears on cowpea, where the two bases differ by </w:t>
+      </w:r>
+      <w:r>
+        <w:rPr>
+          <w:szCs w:val="24"/>
+        </w:rPr>
+        <w:lastRenderedPageBreak/>
+        <w:t>₦63.40 per kilogram. The two crops differ in how much the basis matters, and the difference is not arbitrary. Maize was dried from 25.0% to 13.0% moisture on a wet basis, removing twelve percentage points; cowpea from 18.0% to 11.5%, removing six and a half. The shift in unit cost follows: 19.05% for maize against 11.37% for cowpea. A platform that applied a single correction factor across enterprises would overstate the adjustment for one crop and understate it for the other. This is the argument for computing the marketable basis from each run's own moisture record rather than assuming a typical loss.</w:t>
       </w:r>
     </w:p>
     <w:p>
@@ -12597,32 +12400,26 @@
         <w:rPr>
           <w:szCs w:val="24"/>
         </w:rPr>
-        <w:t xml:space="preserve"> For the maize run those two differ: from 100 kg at 25% moisture the dry matter is 75.0 kg, which at 13% final moisture should weigh 86.21 kg, against 84 kg observed. Costing against the predicted 86.21 kg would give ₦40.60 per kilogram and would charge the farmer’s pricing decision with grain that never reached the store. </w:t>
-      </w:r>
+        <w:t xml:space="preserve"> For the maize run those two differ: from 100 kg at 25% moisture the dry matter is 75.0 kg, which at 13% final moisture should weigh 86.21 kg, against 84 kg observed. Costing against the predicted 86.21 kg would give ₦40.60 per kilogram and would charge the farmer’s pricing decision with grain that never reached the store. Costing against the observed 84 kg is the conservative and correct choice, and it is the one the platform makes. And where no drying run exists, as with cassava, the marketable figure is withheld rather than defaulted to the harvest mass — the two are not the same quantity, and reporting one as the other would be a silent error.</w:t>
+      </w:r>
+    </w:p>
+    <w:p>
+      <w:pPr>
+        <w:pStyle w:val="BodyPara"/>
+      </w:pPr>
+      <w:r>
+        <w:t>The same reporting decision applies to cowpea. Its dry-matter balance predicts an outlet mass of 444.75 kg against 431.0 kg observed, a process loss of 13.75 kg or 3.09% — below the five per cent threshold at which the platform raises a data-quality warning. Costing against the predicted mass would give ₦601.92 per kilogram; the platform uses the observed 431.0 kg and reports ₦621.11. Both predicted masses are quoted here rounded, while the costing divides by the unrounded value. In both crops the conservative denominator is the one the farmer can actually carry to market.</w:t>
+      </w:r>
+    </w:p>
+    <w:p>
+      <w:pPr>
+        <w:pStyle w:val="H2"/>
+      </w:pPr>
       <w:r>
         <w:rPr>
           <w:szCs w:val="24"/>
         </w:rPr>
         <w:lastRenderedPageBreak/>
-        <w:t>Costing against the observed 84 kg is the conservative and correct choice, and it is the one the platform makes. And where no drying run exists, as with cassava, the marketable figure is withheld rather than defaulted to the harvest mass — the two are not the same quantity, and reporting one as the other would be a silent error.</w:t>
-      </w:r>
-    </w:p>
-    <w:p>
-      <w:pPr>
-        <w:pStyle w:val="BodyPara"/>
-      </w:pPr>
-      <w:r>
-        <w:t>The same reporting decision applies to cowpea. Its dry-matter balance predicts an outlet mass of 444.75 kg against 431.0 kg observed, a process loss of 13.75 kg or 3.09% — below the five per cent threshold at which the platform raises a data-quality warning. Costing against the predicted mass would give ₦601.92 per kilogram; the platform uses the observed 431.0 kg and reports ₦621.11. Both predicted masses are quoted here rounded, while the costing divides by the unrounded value. In both crops the conservative denominator is the one the farmer can actually carry to market.</w:t>
-      </w:r>
-    </w:p>
-    <w:p>
-      <w:pPr>
-        <w:pStyle w:val="H2"/>
-      </w:pPr>
-      <w:r>
-        <w:rPr>
-          <w:szCs w:val="24"/>
-        </w:rPr>
         <w:t>4.4 Break-Even Yield and Break-Even Price</w:t>
       </w:r>
     </w:p>
@@ -12723,8 +12520,6 @@
           <w:p>
             <w:pPr>
               <w:pStyle w:val="TableCell"/>
-              <w:spacing w:line="240" w:lineRule="auto"/>
-              <w:jc w:val="center"/>
               <w:rPr>
                 <w:sz w:val="24"/>
                 <w:szCs w:val="24"/>
@@ -12752,8 +12547,6 @@
           <w:p>
             <w:pPr>
               <w:pStyle w:val="TableCell"/>
-              <w:spacing w:line="240" w:lineRule="auto"/>
-              <w:jc w:val="center"/>
               <w:rPr>
                 <w:sz w:val="24"/>
                 <w:szCs w:val="24"/>
@@ -12781,8 +12574,6 @@
           <w:p>
             <w:pPr>
               <w:pStyle w:val="TableCell"/>
-              <w:spacing w:line="240" w:lineRule="auto"/>
-              <w:jc w:val="center"/>
               <w:rPr>
                 <w:sz w:val="24"/>
                 <w:szCs w:val="24"/>
@@ -12821,8 +12612,6 @@
           <w:p>
             <w:pPr>
               <w:pStyle w:val="TableCell"/>
-              <w:spacing w:line="240" w:lineRule="auto"/>
-              <w:jc w:val="center"/>
               <w:rPr>
                 <w:sz w:val="24"/>
                 <w:szCs w:val="24"/>
@@ -12850,8 +12639,6 @@
           <w:p>
             <w:pPr>
               <w:pStyle w:val="TableCell"/>
-              <w:spacing w:line="240" w:lineRule="auto"/>
-              <w:jc w:val="center"/>
               <w:rPr>
                 <w:sz w:val="24"/>
                 <w:szCs w:val="24"/>
@@ -12882,8 +12669,6 @@
           <w:p>
             <w:pPr>
               <w:pStyle w:val="TableCell"/>
-              <w:spacing w:line="240" w:lineRule="auto"/>
-              <w:jc w:val="center"/>
               <w:rPr>
                 <w:sz w:val="24"/>
                 <w:szCs w:val="24"/>
@@ -12906,8 +12691,6 @@
           <w:p>
             <w:pPr>
               <w:pStyle w:val="TableCell"/>
-              <w:spacing w:line="240" w:lineRule="auto"/>
-              <w:jc w:val="center"/>
               <w:rPr>
                 <w:sz w:val="24"/>
                 <w:szCs w:val="24"/>
@@ -12930,8 +12713,6 @@
           <w:p>
             <w:pPr>
               <w:pStyle w:val="TableCell"/>
-              <w:spacing w:line="240" w:lineRule="auto"/>
-              <w:jc w:val="center"/>
               <w:rPr>
                 <w:sz w:val="24"/>
                 <w:szCs w:val="24"/>
@@ -12954,8 +12735,6 @@
           <w:p>
             <w:pPr>
               <w:pStyle w:val="TableCell"/>
-              <w:spacing w:line="240" w:lineRule="auto"/>
-              <w:jc w:val="center"/>
               <w:rPr>
                 <w:sz w:val="24"/>
                 <w:szCs w:val="24"/>
@@ -12980,8 +12759,6 @@
           <w:p>
             <w:pPr>
               <w:pStyle w:val="TableCell"/>
-              <w:spacing w:line="240" w:lineRule="auto"/>
-              <w:jc w:val="center"/>
               <w:rPr>
                 <w:sz w:val="24"/>
                 <w:szCs w:val="24"/>
@@ -13010,8 +12787,6 @@
           <w:p>
             <w:pPr>
               <w:pStyle w:val="TableCell"/>
-              <w:spacing w:line="240" w:lineRule="auto"/>
-              <w:jc w:val="center"/>
               <w:rPr>
                 <w:sz w:val="24"/>
                 <w:szCs w:val="24"/>
@@ -13034,8 +12809,6 @@
           <w:p>
             <w:pPr>
               <w:pStyle w:val="TableCell"/>
-              <w:spacing w:line="240" w:lineRule="auto"/>
-              <w:jc w:val="center"/>
               <w:rPr>
                 <w:sz w:val="24"/>
                 <w:szCs w:val="24"/>
@@ -13058,8 +12831,6 @@
           <w:p>
             <w:pPr>
               <w:pStyle w:val="TableCell"/>
-              <w:spacing w:line="240" w:lineRule="auto"/>
-              <w:jc w:val="center"/>
               <w:rPr>
                 <w:sz w:val="24"/>
                 <w:szCs w:val="24"/>
@@ -13082,8 +12853,6 @@
           <w:p>
             <w:pPr>
               <w:pStyle w:val="TableCell"/>
-              <w:spacing w:line="240" w:lineRule="auto"/>
-              <w:jc w:val="center"/>
               <w:rPr>
                 <w:sz w:val="24"/>
                 <w:szCs w:val="24"/>
@@ -13108,8 +12877,6 @@
           <w:p>
             <w:pPr>
               <w:pStyle w:val="TableCell"/>
-              <w:spacing w:line="240" w:lineRule="auto"/>
-              <w:jc w:val="center"/>
               <w:rPr>
                 <w:sz w:val="24"/>
                 <w:szCs w:val="24"/>
@@ -13138,8 +12905,6 @@
           <w:p>
             <w:pPr>
               <w:pStyle w:val="TableCell"/>
-              <w:spacing w:line="240" w:lineRule="auto"/>
-              <w:jc w:val="center"/>
               <w:rPr>
                 <w:sz w:val="24"/>
                 <w:szCs w:val="24"/>
@@ -13162,8 +12927,6 @@
           <w:p>
             <w:pPr>
               <w:pStyle w:val="TableCell"/>
-              <w:spacing w:line="240" w:lineRule="auto"/>
-              <w:jc w:val="center"/>
               <w:rPr>
                 <w:sz w:val="24"/>
                 <w:szCs w:val="24"/>
@@ -13186,8 +12949,6 @@
           <w:p>
             <w:pPr>
               <w:pStyle w:val="TableCell"/>
-              <w:spacing w:line="240" w:lineRule="auto"/>
-              <w:jc w:val="center"/>
               <w:rPr>
                 <w:sz w:val="24"/>
                 <w:szCs w:val="24"/>
@@ -13210,8 +12971,6 @@
           <w:p>
             <w:pPr>
               <w:pStyle w:val="TableCell"/>
-              <w:spacing w:line="240" w:lineRule="auto"/>
-              <w:jc w:val="center"/>
               <w:rPr>
                 <w:sz w:val="24"/>
                 <w:szCs w:val="24"/>
@@ -13236,8 +12995,6 @@
           <w:p>
             <w:pPr>
               <w:pStyle w:val="TableCell"/>
-              <w:spacing w:line="240" w:lineRule="auto"/>
-              <w:jc w:val="center"/>
               <w:rPr>
                 <w:sz w:val="24"/>
                 <w:szCs w:val="24"/>
@@ -13266,8 +13023,6 @@
           <w:p>
             <w:pPr>
               <w:pStyle w:val="TableCell"/>
-              <w:spacing w:line="240" w:lineRule="auto"/>
-              <w:jc w:val="center"/>
               <w:rPr>
                 <w:sz w:val="24"/>
                 <w:szCs w:val="24"/>
@@ -13278,7 +13033,6 @@
                 <w:sz w:val="24"/>
                 <w:szCs w:val="24"/>
               </w:rPr>
-              <w:lastRenderedPageBreak/>
               <w:t>Tomato</w:t>
             </w:r>
           </w:p>
@@ -13291,8 +13045,6 @@
           <w:p>
             <w:pPr>
               <w:pStyle w:val="TableCell"/>
-              <w:spacing w:line="240" w:lineRule="auto"/>
-              <w:jc w:val="center"/>
               <w:rPr>
                 <w:sz w:val="24"/>
                 <w:szCs w:val="24"/>
@@ -13315,8 +13067,6 @@
           <w:p>
             <w:pPr>
               <w:pStyle w:val="TableCell"/>
-              <w:spacing w:line="240" w:lineRule="auto"/>
-              <w:jc w:val="center"/>
               <w:rPr>
                 <w:sz w:val="24"/>
                 <w:szCs w:val="24"/>
@@ -13348,8 +13098,6 @@
           <w:p>
             <w:pPr>
               <w:pStyle w:val="TableCell"/>
-              <w:spacing w:line="240" w:lineRule="auto"/>
-              <w:jc w:val="center"/>
               <w:rPr>
                 <w:sz w:val="24"/>
                 <w:szCs w:val="24"/>
@@ -13374,8 +13122,6 @@
           <w:p>
             <w:pPr>
               <w:pStyle w:val="TableCell"/>
-              <w:spacing w:line="240" w:lineRule="auto"/>
-              <w:jc w:val="center"/>
               <w:rPr>
                 <w:sz w:val="24"/>
                 <w:szCs w:val="24"/>
@@ -13404,8 +13150,6 @@
           <w:p>
             <w:pPr>
               <w:pStyle w:val="TableCell"/>
-              <w:spacing w:line="240" w:lineRule="auto"/>
-              <w:jc w:val="center"/>
               <w:rPr>
                 <w:sz w:val="24"/>
                 <w:szCs w:val="24"/>
@@ -13428,8 +13172,6 @@
           <w:p>
             <w:pPr>
               <w:pStyle w:val="TableCell"/>
-              <w:spacing w:line="240" w:lineRule="auto"/>
-              <w:jc w:val="center"/>
               <w:rPr>
                 <w:sz w:val="24"/>
                 <w:szCs w:val="24"/>
@@ -13452,8 +13194,6 @@
           <w:p>
             <w:pPr>
               <w:pStyle w:val="TableCell"/>
-              <w:spacing w:line="240" w:lineRule="auto"/>
-              <w:jc w:val="center"/>
               <w:rPr>
                 <w:sz w:val="24"/>
                 <w:szCs w:val="24"/>
@@ -13485,8 +13225,6 @@
           <w:p>
             <w:pPr>
               <w:pStyle w:val="TableCell"/>
-              <w:spacing w:line="240" w:lineRule="auto"/>
-              <w:jc w:val="center"/>
               <w:rPr>
                 <w:sz w:val="24"/>
                 <w:szCs w:val="24"/>
@@ -13511,8 +13249,6 @@
           <w:p>
             <w:pPr>
               <w:pStyle w:val="TableCell"/>
-              <w:spacing w:line="240" w:lineRule="auto"/>
-              <w:jc w:val="center"/>
               <w:rPr>
                 <w:sz w:val="24"/>
                 <w:szCs w:val="24"/>
@@ -13604,6 +13340,7 @@
         <w:rPr>
           <w:szCs w:val="24"/>
         </w:rPr>
+        <w:lastRenderedPageBreak/>
         <w:t>Table 4.5: Break-even price, maize and cowpea, farm 26</w:t>
       </w:r>
       <w:bookmarkEnd w:id="114"/>
@@ -13652,8 +13389,6 @@
           <w:p>
             <w:pPr>
               <w:pStyle w:val="TableCell"/>
-              <w:spacing w:line="240" w:lineRule="auto"/>
-              <w:jc w:val="center"/>
             </w:pPr>
             <w:r>
               <w:rPr>
@@ -13676,8 +13411,6 @@
           <w:p>
             <w:pPr>
               <w:pStyle w:val="TableCell"/>
-              <w:spacing w:line="240" w:lineRule="auto"/>
-              <w:jc w:val="center"/>
             </w:pPr>
             <w:r>
               <w:rPr>
@@ -13700,8 +13433,6 @@
           <w:p>
             <w:pPr>
               <w:pStyle w:val="TableCell"/>
-              <w:spacing w:line="240" w:lineRule="auto"/>
-              <w:jc w:val="center"/>
             </w:pPr>
             <w:r>
               <w:rPr>
@@ -13727,8 +13458,6 @@
           <w:p>
             <w:pPr>
               <w:pStyle w:val="TableCell"/>
-              <w:spacing w:line="240" w:lineRule="auto"/>
-              <w:jc w:val="center"/>
             </w:pPr>
             <w:r>
               <w:rPr>
@@ -13746,8 +13475,6 @@
           <w:p>
             <w:pPr>
               <w:pStyle w:val="TableCell"/>
-              <w:spacing w:line="240" w:lineRule="auto"/>
-              <w:jc w:val="center"/>
             </w:pPr>
             <w:r>
               <w:rPr>
@@ -13765,8 +13492,6 @@
           <w:p>
             <w:pPr>
               <w:pStyle w:val="TableCell"/>
-              <w:spacing w:line="240" w:lineRule="auto"/>
-              <w:jc w:val="center"/>
             </w:pPr>
             <w:r>
               <w:rPr>
@@ -13790,8 +13515,6 @@
           <w:p>
             <w:pPr>
               <w:pStyle w:val="TableCell"/>
-              <w:spacing w:line="240" w:lineRule="auto"/>
-              <w:jc w:val="center"/>
             </w:pPr>
             <w:r>
               <w:rPr>
@@ -13809,8 +13532,6 @@
           <w:p>
             <w:pPr>
               <w:pStyle w:val="TableCell"/>
-              <w:spacing w:line="240" w:lineRule="auto"/>
-              <w:jc w:val="center"/>
             </w:pPr>
             <w:r>
               <w:rPr>
@@ -13828,8 +13549,6 @@
           <w:p>
             <w:pPr>
               <w:pStyle w:val="TableCell"/>
-              <w:spacing w:line="240" w:lineRule="auto"/>
-              <w:jc w:val="center"/>
             </w:pPr>
             <w:r>
               <w:rPr>
@@ -13853,8 +13572,6 @@
           <w:p>
             <w:pPr>
               <w:pStyle w:val="TableCell"/>
-              <w:spacing w:line="240" w:lineRule="auto"/>
-              <w:jc w:val="center"/>
             </w:pPr>
             <w:r>
               <w:rPr>
@@ -13872,8 +13589,6 @@
           <w:p>
             <w:pPr>
               <w:pStyle w:val="TableCell"/>
-              <w:spacing w:line="240" w:lineRule="auto"/>
-              <w:jc w:val="center"/>
             </w:pPr>
             <w:r>
               <w:rPr>
@@ -13891,8 +13606,6 @@
           <w:p>
             <w:pPr>
               <w:pStyle w:val="TableCell"/>
-              <w:spacing w:line="240" w:lineRule="auto"/>
-              <w:jc w:val="center"/>
             </w:pPr>
             <w:r>
               <w:rPr>
@@ -13916,8 +13629,6 @@
           <w:p>
             <w:pPr>
               <w:pStyle w:val="TableCell"/>
-              <w:spacing w:line="240" w:lineRule="auto"/>
-              <w:jc w:val="center"/>
             </w:pPr>
             <w:r>
               <w:rPr>
@@ -13935,8 +13646,6 @@
           <w:p>
             <w:pPr>
               <w:pStyle w:val="TableCell"/>
-              <w:spacing w:line="240" w:lineRule="auto"/>
-              <w:jc w:val="center"/>
             </w:pPr>
             <w:r>
               <w:rPr>
@@ -13954,8 +13663,6 @@
           <w:p>
             <w:pPr>
               <w:pStyle w:val="TableCell"/>
-              <w:spacing w:line="240" w:lineRule="auto"/>
-              <w:jc w:val="center"/>
             </w:pPr>
             <w:r>
               <w:rPr>
@@ -13979,8 +13686,6 @@
           <w:p>
             <w:pPr>
               <w:pStyle w:val="TableCell"/>
-              <w:spacing w:line="240" w:lineRule="auto"/>
-              <w:jc w:val="center"/>
             </w:pPr>
             <w:r>
               <w:rPr>
@@ -13998,8 +13703,6 @@
           <w:p>
             <w:pPr>
               <w:pStyle w:val="TableCell"/>
-              <w:spacing w:line="240" w:lineRule="auto"/>
-              <w:jc w:val="center"/>
             </w:pPr>
             <w:r>
               <w:rPr>
@@ -14017,8 +13720,6 @@
           <w:p>
             <w:pPr>
               <w:pStyle w:val="TableCell"/>
-              <w:spacing w:line="240" w:lineRule="auto"/>
-              <w:jc w:val="center"/>
             </w:pPr>
             <w:r>
               <w:rPr>
@@ -14042,8 +13743,6 @@
           <w:p>
             <w:pPr>
               <w:pStyle w:val="TableCell"/>
-              <w:spacing w:line="240" w:lineRule="auto"/>
-              <w:jc w:val="center"/>
             </w:pPr>
             <w:r>
               <w:rPr>
@@ -14063,8 +13762,6 @@
           <w:p>
             <w:pPr>
               <w:pStyle w:val="TableCell"/>
-              <w:spacing w:line="240" w:lineRule="auto"/>
-              <w:jc w:val="center"/>
             </w:pPr>
             <w:r>
               <w:rPr>
@@ -14084,8 +13781,6 @@
           <w:p>
             <w:pPr>
               <w:pStyle w:val="TableCell"/>
-              <w:spacing w:line="240" w:lineRule="auto"/>
-              <w:jc w:val="center"/>
             </w:pPr>
             <w:r>
               <w:rPr>
@@ -14111,8 +13806,6 @@
           <w:p>
             <w:pPr>
               <w:pStyle w:val="TableCell"/>
-              <w:spacing w:line="240" w:lineRule="auto"/>
-              <w:jc w:val="center"/>
             </w:pPr>
             <w:r>
               <w:rPr>
@@ -14132,8 +13825,6 @@
           <w:p>
             <w:pPr>
               <w:pStyle w:val="TableCell"/>
-              <w:spacing w:line="240" w:lineRule="auto"/>
-              <w:jc w:val="center"/>
             </w:pPr>
             <w:r>
               <w:rPr>
@@ -14153,8 +13844,6 @@
           <w:p>
             <w:pPr>
               <w:pStyle w:val="TableCell"/>
-              <w:spacing w:line="240" w:lineRule="auto"/>
-              <w:jc w:val="center"/>
             </w:pPr>
             <w:r>
               <w:rPr>
@@ -14313,8 +14002,6 @@
           <w:p>
             <w:pPr>
               <w:pStyle w:val="TableCell"/>
-              <w:spacing w:line="240" w:lineRule="auto"/>
-              <w:jc w:val="center"/>
             </w:pPr>
             <w:r>
               <w:rPr>
@@ -14337,8 +14024,6 @@
           <w:p>
             <w:pPr>
               <w:pStyle w:val="TableCell"/>
-              <w:spacing w:line="240" w:lineRule="auto"/>
-              <w:jc w:val="center"/>
             </w:pPr>
             <w:r>
               <w:rPr>
@@ -14361,8 +14046,6 @@
           <w:p>
             <w:pPr>
               <w:pStyle w:val="TableCell"/>
-              <w:spacing w:line="240" w:lineRule="auto"/>
-              <w:jc w:val="center"/>
             </w:pPr>
             <w:r>
               <w:rPr>
@@ -14385,8 +14068,6 @@
           <w:p>
             <w:pPr>
               <w:pStyle w:val="TableCell"/>
-              <w:spacing w:line="240" w:lineRule="auto"/>
-              <w:jc w:val="center"/>
             </w:pPr>
             <w:r>
               <w:rPr>
@@ -14412,8 +14093,6 @@
           <w:p>
             <w:pPr>
               <w:pStyle w:val="TableCell"/>
-              <w:spacing w:line="240" w:lineRule="auto"/>
-              <w:jc w:val="center"/>
             </w:pPr>
             <w:r>
               <w:rPr>
@@ -14431,8 +14110,6 @@
           <w:p>
             <w:pPr>
               <w:pStyle w:val="TableCell"/>
-              <w:spacing w:line="240" w:lineRule="auto"/>
-              <w:jc w:val="center"/>
             </w:pPr>
             <w:r>
               <w:rPr>
@@ -14450,8 +14127,6 @@
           <w:p>
             <w:pPr>
               <w:pStyle w:val="TableCell"/>
-              <w:spacing w:line="240" w:lineRule="auto"/>
-              <w:jc w:val="center"/>
             </w:pPr>
             <w:r>
               <w:rPr>
@@ -14469,8 +14144,6 @@
           <w:p>
             <w:pPr>
               <w:pStyle w:val="TableCell"/>
-              <w:spacing w:line="240" w:lineRule="auto"/>
-              <w:jc w:val="center"/>
             </w:pPr>
             <w:r>
               <w:rPr>
@@ -14494,8 +14167,6 @@
           <w:p>
             <w:pPr>
               <w:pStyle w:val="TableCell"/>
-              <w:spacing w:line="240" w:lineRule="auto"/>
-              <w:jc w:val="center"/>
             </w:pPr>
             <w:r>
               <w:rPr>
@@ -14513,8 +14184,6 @@
           <w:p>
             <w:pPr>
               <w:pStyle w:val="TableCell"/>
-              <w:spacing w:line="240" w:lineRule="auto"/>
-              <w:jc w:val="center"/>
             </w:pPr>
             <w:r>
               <w:rPr>
@@ -14532,8 +14201,6 @@
           <w:p>
             <w:pPr>
               <w:pStyle w:val="TableCell"/>
-              <w:spacing w:line="240" w:lineRule="auto"/>
-              <w:jc w:val="center"/>
             </w:pPr>
             <w:r>
               <w:rPr>
@@ -14551,8 +14218,6 @@
           <w:p>
             <w:pPr>
               <w:pStyle w:val="TableCell"/>
-              <w:spacing w:line="240" w:lineRule="auto"/>
-              <w:jc w:val="center"/>
             </w:pPr>
             <w:r>
               <w:rPr>
@@ -14576,8 +14241,6 @@
           <w:p>
             <w:pPr>
               <w:pStyle w:val="TableCell"/>
-              <w:spacing w:line="240" w:lineRule="auto"/>
-              <w:jc w:val="center"/>
             </w:pPr>
             <w:r>
               <w:rPr>
@@ -14597,8 +14260,6 @@
           <w:p>
             <w:pPr>
               <w:pStyle w:val="TableCell"/>
-              <w:spacing w:line="240" w:lineRule="auto"/>
-              <w:jc w:val="center"/>
             </w:pPr>
             <w:r>
               <w:rPr>
@@ -14618,8 +14279,6 @@
           <w:p>
             <w:pPr>
               <w:pStyle w:val="TableCell"/>
-              <w:spacing w:line="240" w:lineRule="auto"/>
-              <w:jc w:val="center"/>
             </w:pPr>
             <w:r>
               <w:rPr>
@@ -14639,8 +14298,6 @@
           <w:p>
             <w:pPr>
               <w:pStyle w:val="TableCell"/>
-              <w:spacing w:line="240" w:lineRule="auto"/>
-              <w:jc w:val="center"/>
             </w:pPr>
             <w:r>
               <w:rPr>
@@ -14666,8 +14323,6 @@
           <w:p>
             <w:pPr>
               <w:pStyle w:val="TableCell"/>
-              <w:spacing w:line="240" w:lineRule="auto"/>
-              <w:jc w:val="center"/>
             </w:pPr>
             <w:r>
               <w:rPr>
@@ -14685,8 +14340,6 @@
           <w:p>
             <w:pPr>
               <w:pStyle w:val="TableCell"/>
-              <w:spacing w:line="240" w:lineRule="auto"/>
-              <w:jc w:val="center"/>
             </w:pPr>
             <w:r>
               <w:rPr>
@@ -14704,8 +14357,6 @@
           <w:p>
             <w:pPr>
               <w:pStyle w:val="TableCell"/>
-              <w:spacing w:line="240" w:lineRule="auto"/>
-              <w:jc w:val="center"/>
             </w:pPr>
             <w:r>
               <w:rPr>
@@ -14723,8 +14374,6 @@
           <w:p>
             <w:pPr>
               <w:pStyle w:val="TableCell"/>
-              <w:spacing w:line="240" w:lineRule="auto"/>
-              <w:jc w:val="center"/>
             </w:pPr>
             <w:r>
               <w:rPr>
@@ -14748,8 +14397,6 @@
           <w:p>
             <w:pPr>
               <w:pStyle w:val="TableCell"/>
-              <w:spacing w:line="240" w:lineRule="auto"/>
-              <w:jc w:val="center"/>
             </w:pPr>
             <w:r>
               <w:rPr>
@@ -14767,8 +14414,6 @@
           <w:p>
             <w:pPr>
               <w:pStyle w:val="TableCell"/>
-              <w:spacing w:line="240" w:lineRule="auto"/>
-              <w:jc w:val="center"/>
             </w:pPr>
             <w:r>
               <w:rPr>
@@ -14786,8 +14431,6 @@
           <w:p>
             <w:pPr>
               <w:pStyle w:val="TableCell"/>
-              <w:spacing w:line="240" w:lineRule="auto"/>
-              <w:jc w:val="center"/>
             </w:pPr>
             <w:r>
               <w:rPr>
@@ -14805,8 +14448,6 @@
           <w:p>
             <w:pPr>
               <w:pStyle w:val="TableCell"/>
-              <w:spacing w:line="240" w:lineRule="auto"/>
-              <w:jc w:val="center"/>
             </w:pPr>
             <w:r>
               <w:rPr>
@@ -15309,8 +14950,6 @@
           <w:p>
             <w:pPr>
               <w:pStyle w:val="TableCell"/>
-              <w:spacing w:line="240" w:lineRule="auto"/>
-              <w:jc w:val="center"/>
             </w:pPr>
             <w:r>
               <w:rPr>
@@ -15333,8 +14972,6 @@
           <w:p>
             <w:pPr>
               <w:pStyle w:val="TableCell"/>
-              <w:spacing w:line="240" w:lineRule="auto"/>
-              <w:jc w:val="center"/>
             </w:pPr>
             <w:r>
               <w:rPr>
@@ -15357,8 +14994,6 @@
           <w:p>
             <w:pPr>
               <w:pStyle w:val="TableCell"/>
-              <w:spacing w:line="240" w:lineRule="auto"/>
-              <w:jc w:val="center"/>
             </w:pPr>
             <w:r>
               <w:rPr>
@@ -15381,8 +15016,6 @@
           <w:p>
             <w:pPr>
               <w:pStyle w:val="TableCell"/>
-              <w:spacing w:line="240" w:lineRule="auto"/>
-              <w:jc w:val="center"/>
             </w:pPr>
             <w:r>
               <w:rPr>
@@ -15405,8 +15038,6 @@
           <w:p>
             <w:pPr>
               <w:pStyle w:val="TableCell"/>
-              <w:spacing w:line="240" w:lineRule="auto"/>
-              <w:jc w:val="center"/>
             </w:pPr>
             <w:r>
               <w:rPr>
@@ -15429,8 +15060,6 @@
           <w:p>
             <w:pPr>
               <w:pStyle w:val="TableCell"/>
-              <w:spacing w:line="240" w:lineRule="auto"/>
-              <w:jc w:val="center"/>
             </w:pPr>
             <w:r>
               <w:rPr>
@@ -15453,8 +15082,6 @@
           <w:p>
             <w:pPr>
               <w:pStyle w:val="TableCell"/>
-              <w:spacing w:line="240" w:lineRule="auto"/>
-              <w:jc w:val="center"/>
             </w:pPr>
             <w:r>
               <w:rPr>
@@ -15477,8 +15104,6 @@
           <w:p>
             <w:pPr>
               <w:pStyle w:val="TableCell"/>
-              <w:spacing w:line="240" w:lineRule="auto"/>
-              <w:jc w:val="center"/>
             </w:pPr>
             <w:r>
               <w:rPr>
@@ -15504,8 +15129,6 @@
           <w:p>
             <w:pPr>
               <w:pStyle w:val="TableCell"/>
-              <w:spacing w:line="240" w:lineRule="auto"/>
-              <w:jc w:val="center"/>
             </w:pPr>
             <w:r>
               <w:rPr>
@@ -15523,8 +15146,6 @@
           <w:p>
             <w:pPr>
               <w:pStyle w:val="TableCell"/>
-              <w:spacing w:line="240" w:lineRule="auto"/>
-              <w:jc w:val="center"/>
             </w:pPr>
             <w:r>
               <w:rPr>
@@ -15542,8 +15163,6 @@
           <w:p>
             <w:pPr>
               <w:pStyle w:val="TableCell"/>
-              <w:spacing w:line="240" w:lineRule="auto"/>
-              <w:jc w:val="center"/>
             </w:pPr>
             <w:r>
               <w:rPr>
@@ -15561,8 +15180,6 @@
           <w:p>
             <w:pPr>
               <w:pStyle w:val="TableCell"/>
-              <w:spacing w:line="240" w:lineRule="auto"/>
-              <w:jc w:val="center"/>
             </w:pPr>
             <w:r>
               <w:rPr>
@@ -15580,8 +15197,6 @@
           <w:p>
             <w:pPr>
               <w:pStyle w:val="TableCell"/>
-              <w:spacing w:line="240" w:lineRule="auto"/>
-              <w:jc w:val="center"/>
             </w:pPr>
             <w:r>
               <w:rPr>
@@ -15599,8 +15214,6 @@
           <w:p>
             <w:pPr>
               <w:pStyle w:val="TableCell"/>
-              <w:spacing w:line="240" w:lineRule="auto"/>
-              <w:jc w:val="center"/>
             </w:pPr>
             <w:r>
               <w:rPr>
@@ -15618,8 +15231,6 @@
           <w:p>
             <w:pPr>
               <w:pStyle w:val="TableCell"/>
-              <w:spacing w:line="240" w:lineRule="auto"/>
-              <w:jc w:val="center"/>
             </w:pPr>
             <w:r>
               <w:rPr>
@@ -15637,8 +15248,6 @@
           <w:p>
             <w:pPr>
               <w:pStyle w:val="TableCell"/>
-              <w:spacing w:line="240" w:lineRule="auto"/>
-              <w:jc w:val="center"/>
             </w:pPr>
             <w:r>
               <w:rPr>
@@ -15662,8 +15271,6 @@
           <w:p>
             <w:pPr>
               <w:pStyle w:val="TableCell"/>
-              <w:spacing w:line="240" w:lineRule="auto"/>
-              <w:jc w:val="center"/>
             </w:pPr>
             <w:r>
               <w:rPr>
@@ -15681,8 +15288,6 @@
           <w:p>
             <w:pPr>
               <w:pStyle w:val="TableCell"/>
-              <w:spacing w:line="240" w:lineRule="auto"/>
-              <w:jc w:val="center"/>
             </w:pPr>
             <w:r>
               <w:rPr>
@@ -15700,8 +15305,6 @@
           <w:p>
             <w:pPr>
               <w:pStyle w:val="TableCell"/>
-              <w:spacing w:line="240" w:lineRule="auto"/>
-              <w:jc w:val="center"/>
             </w:pPr>
             <w:r>
               <w:rPr>
@@ -15719,8 +15322,6 @@
           <w:p>
             <w:pPr>
               <w:pStyle w:val="TableCell"/>
-              <w:spacing w:line="240" w:lineRule="auto"/>
-              <w:jc w:val="center"/>
             </w:pPr>
             <w:r>
               <w:rPr>
@@ -15738,8 +15339,6 @@
           <w:p>
             <w:pPr>
               <w:pStyle w:val="TableCell"/>
-              <w:spacing w:line="240" w:lineRule="auto"/>
-              <w:jc w:val="center"/>
             </w:pPr>
             <w:r>
               <w:rPr>
@@ -15757,8 +15356,6 @@
           <w:p>
             <w:pPr>
               <w:pStyle w:val="TableCell"/>
-              <w:spacing w:line="240" w:lineRule="auto"/>
-              <w:jc w:val="center"/>
             </w:pPr>
             <w:r>
               <w:rPr>
@@ -15776,8 +15373,6 @@
           <w:p>
             <w:pPr>
               <w:pStyle w:val="TableCell"/>
-              <w:spacing w:line="240" w:lineRule="auto"/>
-              <w:jc w:val="center"/>
             </w:pPr>
             <w:r>
               <w:rPr>
@@ -15795,8 +15390,6 @@
           <w:p>
             <w:pPr>
               <w:pStyle w:val="TableCell"/>
-              <w:spacing w:line="240" w:lineRule="auto"/>
-              <w:jc w:val="center"/>
             </w:pPr>
             <w:r>
               <w:rPr>
@@ -16178,8 +15771,6 @@
           <w:p>
             <w:pPr>
               <w:pStyle w:val="TableCell"/>
-              <w:spacing w:line="240" w:lineRule="auto"/>
-              <w:jc w:val="center"/>
             </w:pPr>
             <w:r>
               <w:rPr>
@@ -16202,8 +15793,6 @@
           <w:p>
             <w:pPr>
               <w:pStyle w:val="TableCell"/>
-              <w:spacing w:line="240" w:lineRule="auto"/>
-              <w:jc w:val="center"/>
             </w:pPr>
             <w:r>
               <w:rPr>
@@ -16226,8 +15815,6 @@
           <w:p>
             <w:pPr>
               <w:pStyle w:val="TableCell"/>
-              <w:spacing w:line="240" w:lineRule="auto"/>
-              <w:jc w:val="center"/>
             </w:pPr>
             <w:r>
               <w:rPr>
@@ -16253,8 +15840,6 @@
           <w:p>
             <w:pPr>
               <w:pStyle w:val="TableCell"/>
-              <w:spacing w:line="240" w:lineRule="auto"/>
-              <w:jc w:val="center"/>
             </w:pPr>
             <w:r>
               <w:rPr>
@@ -16272,8 +15857,6 @@
           <w:p>
             <w:pPr>
               <w:pStyle w:val="TableCell"/>
-              <w:spacing w:line="240" w:lineRule="auto"/>
-              <w:jc w:val="center"/>
             </w:pPr>
             <w:r>
               <w:rPr>
@@ -16291,8 +15874,6 @@
           <w:p>
             <w:pPr>
               <w:pStyle w:val="TableCell"/>
-              <w:spacing w:line="240" w:lineRule="auto"/>
-              <w:jc w:val="center"/>
             </w:pPr>
             <w:r>
               <w:rPr>
@@ -16316,8 +15897,6 @@
           <w:p>
             <w:pPr>
               <w:pStyle w:val="TableCell"/>
-              <w:spacing w:line="240" w:lineRule="auto"/>
-              <w:jc w:val="center"/>
             </w:pPr>
             <w:r>
               <w:rPr>
@@ -16335,8 +15914,6 @@
           <w:p>
             <w:pPr>
               <w:pStyle w:val="TableCell"/>
-              <w:spacing w:line="240" w:lineRule="auto"/>
-              <w:jc w:val="center"/>
             </w:pPr>
             <w:r>
               <w:rPr>
@@ -16354,8 +15931,6 @@
           <w:p>
             <w:pPr>
               <w:pStyle w:val="TableCell"/>
-              <w:spacing w:line="240" w:lineRule="auto"/>
-              <w:jc w:val="center"/>
             </w:pPr>
             <w:r>
               <w:rPr>
@@ -16379,8 +15954,6 @@
           <w:p>
             <w:pPr>
               <w:pStyle w:val="TableCell"/>
-              <w:spacing w:line="240" w:lineRule="auto"/>
-              <w:jc w:val="center"/>
             </w:pPr>
             <w:r>
               <w:rPr>
@@ -16399,8 +15972,6 @@
           <w:p>
             <w:pPr>
               <w:pStyle w:val="TableCell"/>
-              <w:spacing w:line="240" w:lineRule="auto"/>
-              <w:jc w:val="center"/>
             </w:pPr>
             <w:r>
               <w:rPr>
@@ -16418,8 +15989,6 @@
           <w:p>
             <w:pPr>
               <w:pStyle w:val="TableCell"/>
-              <w:spacing w:line="240" w:lineRule="auto"/>
-              <w:jc w:val="center"/>
             </w:pPr>
             <w:r>
               <w:rPr>
@@ -16443,8 +16012,6 @@
           <w:p>
             <w:pPr>
               <w:pStyle w:val="TableCell"/>
-              <w:spacing w:line="240" w:lineRule="auto"/>
-              <w:jc w:val="center"/>
             </w:pPr>
             <w:r>
               <w:rPr>
@@ -16462,8 +16029,6 @@
           <w:p>
             <w:pPr>
               <w:pStyle w:val="TableCell"/>
-              <w:spacing w:line="240" w:lineRule="auto"/>
-              <w:jc w:val="center"/>
             </w:pPr>
             <w:r>
               <w:rPr>
@@ -16481,8 +16046,6 @@
           <w:p>
             <w:pPr>
               <w:pStyle w:val="TableCell"/>
-              <w:spacing w:line="240" w:lineRule="auto"/>
-              <w:jc w:val="center"/>
             </w:pPr>
             <w:r>
               <w:rPr>
@@ -16506,8 +16069,6 @@
           <w:p>
             <w:pPr>
               <w:pStyle w:val="TableCell"/>
-              <w:spacing w:line="240" w:lineRule="auto"/>
-              <w:jc w:val="center"/>
             </w:pPr>
             <w:r>
               <w:rPr>
@@ -16527,8 +16088,6 @@
           <w:p>
             <w:pPr>
               <w:pStyle w:val="TableCell"/>
-              <w:spacing w:line="240" w:lineRule="auto"/>
-              <w:jc w:val="center"/>
             </w:pPr>
             <w:r>
               <w:rPr>
@@ -16548,8 +16107,6 @@
           <w:p>
             <w:pPr>
               <w:pStyle w:val="TableCell"/>
-              <w:spacing w:line="240" w:lineRule="auto"/>
-              <w:jc w:val="center"/>
             </w:pPr>
             <w:r>
               <w:rPr>
@@ -16575,8 +16132,6 @@
           <w:p>
             <w:pPr>
               <w:pStyle w:val="TableCell"/>
-              <w:spacing w:line="240" w:lineRule="auto"/>
-              <w:jc w:val="center"/>
             </w:pPr>
             <w:r>
               <w:rPr>
@@ -16594,8 +16149,6 @@
           <w:p>
             <w:pPr>
               <w:pStyle w:val="TableCell"/>
-              <w:spacing w:line="240" w:lineRule="auto"/>
-              <w:jc w:val="center"/>
             </w:pPr>
             <w:r>
               <w:rPr>
@@ -16613,8 +16166,6 @@
           <w:p>
             <w:pPr>
               <w:pStyle w:val="TableCell"/>
-              <w:spacing w:line="240" w:lineRule="auto"/>
-              <w:jc w:val="center"/>
             </w:pPr>
             <w:r>
               <w:rPr>
@@ -16638,8 +16189,6 @@
           <w:p>
             <w:pPr>
               <w:pStyle w:val="TableCell"/>
-              <w:spacing w:line="240" w:lineRule="auto"/>
-              <w:jc w:val="center"/>
             </w:pPr>
             <w:r>
               <w:rPr>
@@ -16659,8 +16208,6 @@
           <w:p>
             <w:pPr>
               <w:pStyle w:val="TableCell"/>
-              <w:spacing w:line="240" w:lineRule="auto"/>
-              <w:jc w:val="center"/>
             </w:pPr>
             <w:r>
               <w:rPr>
@@ -16680,8 +16227,6 @@
           <w:p>
             <w:pPr>
               <w:pStyle w:val="TableCell"/>
-              <w:spacing w:line="240" w:lineRule="auto"/>
-              <w:jc w:val="center"/>
             </w:pPr>
             <w:r>
               <w:rPr>
@@ -16707,8 +16252,6 @@
           <w:p>
             <w:pPr>
               <w:pStyle w:val="TableCell"/>
-              <w:spacing w:line="240" w:lineRule="auto"/>
-              <w:jc w:val="center"/>
             </w:pPr>
             <w:r>
               <w:rPr>
@@ -16726,8 +16269,6 @@
           <w:p>
             <w:pPr>
               <w:pStyle w:val="TableCell"/>
-              <w:spacing w:line="240" w:lineRule="auto"/>
-              <w:jc w:val="center"/>
             </w:pPr>
             <w:r>
               <w:rPr>
@@ -16745,8 +16286,6 @@
           <w:p>
             <w:pPr>
               <w:pStyle w:val="TableCell"/>
-              <w:spacing w:line="240" w:lineRule="auto"/>
-              <w:jc w:val="center"/>
             </w:pPr>
             <w:r>
               <w:rPr>
@@ -16770,8 +16309,6 @@
           <w:p>
             <w:pPr>
               <w:pStyle w:val="TableCell"/>
-              <w:spacing w:line="240" w:lineRule="auto"/>
-              <w:jc w:val="center"/>
             </w:pPr>
             <w:r>
               <w:rPr>
@@ -16789,8 +16326,6 @@
           <w:p>
             <w:pPr>
               <w:pStyle w:val="TableCell"/>
-              <w:spacing w:line="240" w:lineRule="auto"/>
-              <w:jc w:val="center"/>
             </w:pPr>
             <w:r>
               <w:rPr>
@@ -16808,8 +16343,6 @@
           <w:p>
             <w:pPr>
               <w:pStyle w:val="TableCell"/>
-              <w:spacing w:line="240" w:lineRule="auto"/>
-              <w:jc w:val="center"/>
             </w:pPr>
             <w:r>
               <w:rPr>
@@ -16833,8 +16366,6 @@
           <w:p>
             <w:pPr>
               <w:pStyle w:val="TableCell"/>
-              <w:spacing w:line="240" w:lineRule="auto"/>
-              <w:jc w:val="center"/>
             </w:pPr>
             <w:r>
               <w:rPr>
@@ -16854,8 +16385,6 @@
           <w:p>
             <w:pPr>
               <w:pStyle w:val="TableCell"/>
-              <w:spacing w:line="240" w:lineRule="auto"/>
-              <w:jc w:val="center"/>
             </w:pPr>
             <w:r>
               <w:rPr>
@@ -16875,8 +16404,6 @@
           <w:p>
             <w:pPr>
               <w:pStyle w:val="TableCell"/>
-              <w:spacing w:line="240" w:lineRule="auto"/>
-              <w:jc w:val="center"/>
             </w:pPr>
             <w:r>
               <w:rPr>
@@ -17104,8 +16631,6 @@
           <w:p>
             <w:pPr>
               <w:pStyle w:val="TableCell"/>
-              <w:spacing w:line="240" w:lineRule="auto"/>
-              <w:jc w:val="center"/>
             </w:pPr>
             <w:r>
               <w:rPr>
@@ -17128,8 +16653,6 @@
           <w:p>
             <w:pPr>
               <w:pStyle w:val="TableCell"/>
-              <w:spacing w:line="240" w:lineRule="auto"/>
-              <w:jc w:val="center"/>
             </w:pPr>
             <w:r>
               <w:rPr>
@@ -17155,8 +16678,6 @@
           <w:p>
             <w:pPr>
               <w:pStyle w:val="TableCell"/>
-              <w:spacing w:line="240" w:lineRule="auto"/>
-              <w:jc w:val="center"/>
             </w:pPr>
             <w:r>
               <w:rPr>
@@ -17174,8 +16695,6 @@
           <w:p>
             <w:pPr>
               <w:pStyle w:val="TableCell"/>
-              <w:spacing w:line="240" w:lineRule="auto"/>
-              <w:jc w:val="center"/>
             </w:pPr>
             <w:r>
               <w:rPr>
@@ -17199,8 +16718,6 @@
           <w:p>
             <w:pPr>
               <w:pStyle w:val="TableCell"/>
-              <w:spacing w:line="240" w:lineRule="auto"/>
-              <w:jc w:val="center"/>
             </w:pPr>
             <w:r>
               <w:rPr>
@@ -17218,8 +16735,6 @@
           <w:p>
             <w:pPr>
               <w:pStyle w:val="TableCell"/>
-              <w:spacing w:line="240" w:lineRule="auto"/>
-              <w:jc w:val="center"/>
             </w:pPr>
             <w:r>
               <w:rPr>
@@ -17243,8 +16758,6 @@
           <w:p>
             <w:pPr>
               <w:pStyle w:val="TableCell"/>
-              <w:spacing w:line="240" w:lineRule="auto"/>
-              <w:jc w:val="center"/>
             </w:pPr>
             <w:r>
               <w:rPr>
@@ -17262,8 +16775,6 @@
           <w:p>
             <w:pPr>
               <w:pStyle w:val="TableCell"/>
-              <w:spacing w:line="240" w:lineRule="auto"/>
-              <w:jc w:val="center"/>
             </w:pPr>
             <w:r>
               <w:rPr>
@@ -17287,8 +16798,6 @@
           <w:p>
             <w:pPr>
               <w:pStyle w:val="TableCell"/>
-              <w:spacing w:line="240" w:lineRule="auto"/>
-              <w:jc w:val="center"/>
             </w:pPr>
             <w:r>
               <w:rPr>
@@ -17306,8 +16815,6 @@
           <w:p>
             <w:pPr>
               <w:pStyle w:val="TableCell"/>
-              <w:spacing w:line="240" w:lineRule="auto"/>
-              <w:jc w:val="center"/>
             </w:pPr>
             <w:r>
               <w:rPr>
@@ -17331,8 +16838,6 @@
           <w:p>
             <w:pPr>
               <w:pStyle w:val="TableCell"/>
-              <w:spacing w:line="240" w:lineRule="auto"/>
-              <w:jc w:val="center"/>
             </w:pPr>
             <w:r>
               <w:rPr>
@@ -17350,8 +16855,6 @@
           <w:p>
             <w:pPr>
               <w:pStyle w:val="TableCell"/>
-              <w:spacing w:line="240" w:lineRule="auto"/>
-              <w:jc w:val="center"/>
             </w:pPr>
             <w:r>
               <w:rPr>
@@ -17375,8 +16878,6 @@
           <w:p>
             <w:pPr>
               <w:pStyle w:val="TableCell"/>
-              <w:spacing w:line="240" w:lineRule="auto"/>
-              <w:jc w:val="center"/>
             </w:pPr>
             <w:r>
               <w:rPr>
@@ -17394,8 +16895,6 @@
           <w:p>
             <w:pPr>
               <w:pStyle w:val="TableCell"/>
-              <w:spacing w:line="240" w:lineRule="auto"/>
-              <w:jc w:val="center"/>
             </w:pPr>
             <w:r>
               <w:rPr>
@@ -18754,6 +18253,17 @@
     </w:p>
     <w:p>
       <w:pPr>
+        <w:pStyle w:val="BodyPara"/>
+      </w:pPr>
+      <w:r>
+        <w:rPr>
+          <w:szCs w:val="24"/>
+        </w:rPr>
+        <w:t>The two exercised containers — the FastAPI backend and PostgreSQL 15 — measure 178.9 to 202.8 MiB at rest against the seeded dataset (Table C.1); on that footprint a 2 GB instance with snapshot backups, an amortised domain and a no-cost TLS certificate totals an estimated $15.40, approximately ₦20,950, per month (Table C.2), which at a conservative two-hundred-farm single-instance tenancy is ₦105 per farm per month (Table C.3).</w:t>
+      </w:r>
+    </w:p>
+    <w:p>
+      <w:pPr>
         <w:pStyle w:val="H2"/>
       </w:pPr>
       <w:r>
@@ -18898,8 +18408,6 @@
           <w:p>
             <w:pPr>
               <w:pStyle w:val="TableCell"/>
-              <w:spacing w:line="240" w:lineRule="auto"/>
-              <w:jc w:val="center"/>
             </w:pPr>
             <w:r>
               <w:rPr>
@@ -18922,8 +18430,6 @@
           <w:p>
             <w:pPr>
               <w:pStyle w:val="TableCell"/>
-              <w:spacing w:line="240" w:lineRule="auto"/>
-              <w:jc w:val="center"/>
             </w:pPr>
             <w:r>
               <w:rPr>
@@ -18946,8 +18452,6 @@
           <w:p>
             <w:pPr>
               <w:pStyle w:val="TableCell"/>
-              <w:spacing w:line="240" w:lineRule="auto"/>
-              <w:jc w:val="center"/>
             </w:pPr>
             <w:r>
               <w:rPr>
@@ -18970,8 +18474,6 @@
           <w:p>
             <w:pPr>
               <w:pStyle w:val="TableCell"/>
-              <w:spacing w:line="240" w:lineRule="auto"/>
-              <w:jc w:val="center"/>
             </w:pPr>
             <w:r>
               <w:rPr>
@@ -18994,8 +18496,6 @@
           <w:p>
             <w:pPr>
               <w:pStyle w:val="TableCell"/>
-              <w:spacing w:line="240" w:lineRule="auto"/>
-              <w:jc w:val="center"/>
             </w:pPr>
             <w:r>
               <w:rPr>
@@ -19021,8 +18521,6 @@
           <w:p>
             <w:pPr>
               <w:pStyle w:val="TableCell"/>
-              <w:spacing w:line="240" w:lineRule="auto"/>
-              <w:jc w:val="center"/>
             </w:pPr>
             <w:r>
               <w:rPr>
@@ -19040,8 +18538,6 @@
           <w:p>
             <w:pPr>
               <w:pStyle w:val="TableCell"/>
-              <w:spacing w:line="240" w:lineRule="auto"/>
-              <w:jc w:val="center"/>
             </w:pPr>
             <w:r>
               <w:rPr>
@@ -19059,8 +18555,6 @@
           <w:p>
             <w:pPr>
               <w:pStyle w:val="TableCell"/>
-              <w:spacing w:line="240" w:lineRule="auto"/>
-              <w:jc w:val="center"/>
             </w:pPr>
             <w:r>
               <w:rPr>
@@ -19078,8 +18572,6 @@
           <w:p>
             <w:pPr>
               <w:pStyle w:val="TableCell"/>
-              <w:spacing w:line="240" w:lineRule="auto"/>
-              <w:jc w:val="center"/>
             </w:pPr>
             <w:r>
               <w:rPr>
@@ -19097,8 +18589,6 @@
           <w:p>
             <w:pPr>
               <w:pStyle w:val="TableCell"/>
-              <w:spacing w:line="240" w:lineRule="auto"/>
-              <w:jc w:val="center"/>
             </w:pPr>
             <w:r>
               <w:rPr>
@@ -19122,8 +18612,6 @@
           <w:p>
             <w:pPr>
               <w:pStyle w:val="TableCell"/>
-              <w:spacing w:line="240" w:lineRule="auto"/>
-              <w:jc w:val="center"/>
             </w:pPr>
             <w:r>
               <w:rPr>
@@ -19141,8 +18629,6 @@
           <w:p>
             <w:pPr>
               <w:pStyle w:val="TableCell"/>
-              <w:spacing w:line="240" w:lineRule="auto"/>
-              <w:jc w:val="center"/>
             </w:pPr>
             <w:r>
               <w:rPr>
@@ -19160,8 +18646,6 @@
           <w:p>
             <w:pPr>
               <w:pStyle w:val="TableCell"/>
-              <w:spacing w:line="240" w:lineRule="auto"/>
-              <w:jc w:val="center"/>
             </w:pPr>
             <w:r>
               <w:rPr>
@@ -19179,8 +18663,6 @@
           <w:p>
             <w:pPr>
               <w:pStyle w:val="TableCell"/>
-              <w:spacing w:line="240" w:lineRule="auto"/>
-              <w:jc w:val="center"/>
             </w:pPr>
             <w:r>
               <w:rPr>
@@ -19198,8 +18680,6 @@
           <w:p>
             <w:pPr>
               <w:pStyle w:val="TableCell"/>
-              <w:spacing w:line="240" w:lineRule="auto"/>
-              <w:jc w:val="center"/>
             </w:pPr>
             <w:r>
               <w:rPr>
@@ -19223,8 +18703,6 @@
           <w:p>
             <w:pPr>
               <w:pStyle w:val="TableCell"/>
-              <w:spacing w:line="240" w:lineRule="auto"/>
-              <w:jc w:val="center"/>
             </w:pPr>
             <w:r>
               <w:rPr>
@@ -19242,8 +18720,6 @@
           <w:p>
             <w:pPr>
               <w:pStyle w:val="TableCell"/>
-              <w:spacing w:line="240" w:lineRule="auto"/>
-              <w:jc w:val="center"/>
             </w:pPr>
             <w:r>
               <w:rPr>
@@ -19261,8 +18737,6 @@
           <w:p>
             <w:pPr>
               <w:pStyle w:val="TableCell"/>
-              <w:spacing w:line="240" w:lineRule="auto"/>
-              <w:jc w:val="center"/>
             </w:pPr>
             <w:r>
               <w:rPr>
@@ -19280,8 +18754,6 @@
           <w:p>
             <w:pPr>
               <w:pStyle w:val="TableCell"/>
-              <w:spacing w:line="240" w:lineRule="auto"/>
-              <w:jc w:val="center"/>
             </w:pPr>
             <w:r>
               <w:rPr>
@@ -19299,8 +18771,6 @@
           <w:p>
             <w:pPr>
               <w:pStyle w:val="TableCell"/>
-              <w:spacing w:line="240" w:lineRule="auto"/>
-              <w:jc w:val="center"/>
             </w:pPr>
             <w:r>
               <w:rPr>
@@ -19324,8 +18794,6 @@
           <w:p>
             <w:pPr>
               <w:pStyle w:val="TableCell"/>
-              <w:spacing w:line="240" w:lineRule="auto"/>
-              <w:jc w:val="center"/>
             </w:pPr>
             <w:r>
               <w:rPr>
@@ -19343,8 +18811,6 @@
           <w:p>
             <w:pPr>
               <w:pStyle w:val="TableCell"/>
-              <w:spacing w:line="240" w:lineRule="auto"/>
-              <w:jc w:val="center"/>
             </w:pPr>
             <w:r>
               <w:rPr>
@@ -19362,8 +18828,6 @@
           <w:p>
             <w:pPr>
               <w:pStyle w:val="TableCell"/>
-              <w:spacing w:line="240" w:lineRule="auto"/>
-              <w:jc w:val="center"/>
             </w:pPr>
             <w:r>
               <w:rPr>
@@ -19381,8 +18845,6 @@
           <w:p>
             <w:pPr>
               <w:pStyle w:val="TableCell"/>
-              <w:spacing w:line="240" w:lineRule="auto"/>
-              <w:jc w:val="center"/>
             </w:pPr>
             <w:r>
               <w:rPr>
@@ -19400,8 +18862,6 @@
           <w:p>
             <w:pPr>
               <w:pStyle w:val="TableCell"/>
-              <w:spacing w:line="240" w:lineRule="auto"/>
-              <w:jc w:val="center"/>
             </w:pPr>
             <w:r>
               <w:rPr>
@@ -19425,8 +18885,6 @@
           <w:p>
             <w:pPr>
               <w:pStyle w:val="TableCell"/>
-              <w:spacing w:line="240" w:lineRule="auto"/>
-              <w:jc w:val="center"/>
             </w:pPr>
             <w:r>
               <w:rPr>
@@ -19444,8 +18902,6 @@
           <w:p>
             <w:pPr>
               <w:pStyle w:val="TableCell"/>
-              <w:spacing w:line="240" w:lineRule="auto"/>
-              <w:jc w:val="center"/>
             </w:pPr>
             <w:r>
               <w:rPr>
@@ -19463,8 +18919,6 @@
           <w:p>
             <w:pPr>
               <w:pStyle w:val="TableCell"/>
-              <w:spacing w:line="240" w:lineRule="auto"/>
-              <w:jc w:val="center"/>
             </w:pPr>
             <w:r>
               <w:rPr>
@@ -19482,8 +18936,6 @@
           <w:p>
             <w:pPr>
               <w:pStyle w:val="TableCell"/>
-              <w:spacing w:line="240" w:lineRule="auto"/>
-              <w:jc w:val="center"/>
             </w:pPr>
             <w:r>
               <w:rPr>
@@ -19501,8 +18953,6 @@
           <w:p>
             <w:pPr>
               <w:pStyle w:val="TableCell"/>
-              <w:spacing w:line="240" w:lineRule="auto"/>
-              <w:jc w:val="center"/>
             </w:pPr>
             <w:r>
               <w:rPr>
@@ -19637,8 +19087,6 @@
           <w:p>
             <w:pPr>
               <w:pStyle w:val="TableCell"/>
-              <w:spacing w:line="240" w:lineRule="auto"/>
-              <w:jc w:val="center"/>
             </w:pPr>
             <w:r>
               <w:rPr>
@@ -19661,8 +19109,6 @@
           <w:p>
             <w:pPr>
               <w:pStyle w:val="TableCell"/>
-              <w:spacing w:line="240" w:lineRule="auto"/>
-              <w:jc w:val="center"/>
             </w:pPr>
             <w:r>
               <w:rPr>
@@ -19685,8 +19131,6 @@
           <w:p>
             <w:pPr>
               <w:pStyle w:val="TableCell"/>
-              <w:spacing w:line="240" w:lineRule="auto"/>
-              <w:jc w:val="center"/>
             </w:pPr>
             <w:r>
               <w:rPr>
@@ -19709,8 +19153,6 @@
           <w:p>
             <w:pPr>
               <w:pStyle w:val="TableCell"/>
-              <w:spacing w:line="240" w:lineRule="auto"/>
-              <w:jc w:val="center"/>
             </w:pPr>
             <w:r>
               <w:rPr>
@@ -19733,8 +19175,6 @@
           <w:p>
             <w:pPr>
               <w:pStyle w:val="TableCell"/>
-              <w:spacing w:line="240" w:lineRule="auto"/>
-              <w:jc w:val="center"/>
             </w:pPr>
             <w:r>
               <w:rPr>
@@ -19760,8 +19200,6 @@
           <w:p>
             <w:pPr>
               <w:pStyle w:val="TableCell"/>
-              <w:spacing w:line="240" w:lineRule="auto"/>
-              <w:jc w:val="center"/>
             </w:pPr>
             <w:r>
               <w:rPr>
@@ -19779,8 +19217,6 @@
           <w:p>
             <w:pPr>
               <w:pStyle w:val="TableCell"/>
-              <w:spacing w:line="240" w:lineRule="auto"/>
-              <w:jc w:val="center"/>
             </w:pPr>
             <w:r>
               <w:rPr>
@@ -19798,8 +19234,6 @@
           <w:p>
             <w:pPr>
               <w:pStyle w:val="TableCell"/>
-              <w:spacing w:line="240" w:lineRule="auto"/>
-              <w:jc w:val="center"/>
             </w:pPr>
           </w:p>
         </w:tc>
@@ -19811,8 +19245,6 @@
           <w:p>
             <w:pPr>
               <w:pStyle w:val="TableCell"/>
-              <w:spacing w:line="240" w:lineRule="auto"/>
-              <w:jc w:val="center"/>
             </w:pPr>
           </w:p>
         </w:tc>
@@ -19824,8 +19256,6 @@
           <w:p>
             <w:pPr>
               <w:pStyle w:val="TableCell"/>
-              <w:spacing w:line="240" w:lineRule="auto"/>
-              <w:jc w:val="center"/>
             </w:pPr>
           </w:p>
         </w:tc>
@@ -19859,14 +19289,12 @@
         </w:rPr>
         <w:t xml:space="preserve">4.13 Results </w:t>
       </w:r>
-      <w:proofErr w:type="gramStart"/>
-      <w:r>
-        <w:rPr>
-          <w:szCs w:val="24"/>
-        </w:rPr>
-        <w:t>Against</w:t>
-      </w:r>
-      <w:proofErr w:type="gramEnd"/>
+      <w:r>
+        <w:rPr>
+          <w:szCs w:val="24"/>
+        </w:rPr>
+        <w:t>against</w:t>
+      </w:r>
       <w:r>
         <w:rPr>
           <w:szCs w:val="24"/>
@@ -19932,8 +19360,6 @@
           <w:p>
             <w:pPr>
               <w:pStyle w:val="TableCell"/>
-              <w:spacing w:line="240" w:lineRule="auto"/>
-              <w:jc w:val="center"/>
             </w:pPr>
             <w:r>
               <w:rPr>
@@ -19956,8 +19382,6 @@
           <w:p>
             <w:pPr>
               <w:pStyle w:val="TableCell"/>
-              <w:spacing w:line="240" w:lineRule="auto"/>
-              <w:jc w:val="center"/>
             </w:pPr>
             <w:r>
               <w:rPr>
@@ -19980,8 +19404,6 @@
           <w:p>
             <w:pPr>
               <w:pStyle w:val="TableCell"/>
-              <w:spacing w:line="240" w:lineRule="auto"/>
-              <w:jc w:val="center"/>
             </w:pPr>
             <w:r>
               <w:rPr>
@@ -20004,8 +19426,6 @@
           <w:p>
             <w:pPr>
               <w:pStyle w:val="TableCell"/>
-              <w:spacing w:line="240" w:lineRule="auto"/>
-              <w:jc w:val="center"/>
             </w:pPr>
             <w:r>
               <w:rPr>
@@ -20034,7 +19454,6 @@
               <w:jc w:val="center"/>
             </w:pPr>
             <w:r>
-              <w:lastRenderedPageBreak/>
               <w:t>1. Identify and evaluate the socio-technical barriers hindering FMIS adoption in Nigeria</w:t>
             </w:r>
           </w:p>
@@ -20101,7 +19520,6 @@
               <w:jc w:val="center"/>
             </w:pPr>
             <w:r>
-              <w:lastRenderedPageBreak/>
               <w:t>2. Convert operational and financial records into actionable decision-support metrics</w:t>
             </w:r>
           </w:p>
@@ -20243,11 +19661,8 @@
               <w:jc w:val="center"/>
             </w:pPr>
             <w:r>
-              <w:lastRenderedPageBreak/>
               <w:t>4. Evaluate usability, cost-effectiveness and operational viability under Nigerian constraints</w:t>
             </w:r>
-            <w:bookmarkStart w:id="134" w:name="_GoBack"/>
-            <w:bookmarkEnd w:id="134"/>
           </w:p>
         </w:tc>
         <w:tc>
@@ -20439,7 +19854,15 @@
           <w:bCs/>
           <w:szCs w:val="24"/>
         </w:rPr>
-        <w:t xml:space="preserve"> against the purge, so a fetch begun before a purge can repopulate the cache with a pre-mutation body. Correcting an equipment record posts no cache purge, leaving the overlay-derived reads cached with no error shown, as recorded in Section 3.6.1; the verification in Appendix B covers the API and is silent on the client. The entry form merges the farm's recorded crops with the </w:t>
+        <w:t xml:space="preserve"> against the purge, so a fetch begun before a purge can repopulate the cache with a pre-</w:t>
+      </w:r>
+      <w:r>
+        <w:rPr>
+          <w:bCs/>
+          <w:szCs w:val="24"/>
+        </w:rPr>
+        <w:lastRenderedPageBreak/>
+        <w:t xml:space="preserve">mutation body. Correcting an equipment record posts no cache purge, leaving the overlay-derived reads cached with no error shown, as recorded in Section 3.6.1; the verification in Appendix B covers the API and is silent on the client. The entry form merges the farm's recorded crops with the </w:t>
       </w:r>
       <w:proofErr w:type="gramStart"/>
       <w:r>
@@ -20467,15 +19890,110 @@
           <w:bCs/>
           <w:szCs w:val="24"/>
         </w:rPr>
+        <w:t xml:space="preserve">Basis of the revenue figures. The unit cost calculation divides by marketable mass while the revenue calculation divides by harvest mass. These two divisions sit within the same loop body, a structural choice holding true for any farm rather than an artefact of the seed. Both masses sit in the same row of Table 4.2 as 100 kg and 84 kg. This divergence inherits into gross margin, the ranking, the </w:t>
+      </w:r>
+      <w:proofErr w:type="spellStart"/>
+      <w:r>
+        <w:rPr>
+          <w:bCs/>
+          <w:szCs w:val="24"/>
+        </w:rPr>
+        <w:t>realised</w:t>
+      </w:r>
+      <w:proofErr w:type="spellEnd"/>
+      <w:r>
+        <w:rPr>
+          <w:bCs/>
+          <w:szCs w:val="24"/>
+        </w:rPr>
+        <w:t xml:space="preserve"> price, break-even yield, the operating-expense ratio, farm revenue, and the farm operating-expense ratio. The asymmetry reaches only figures carrying a revenue term; no cost-side figure is affected. The whole ₦35.00 to ₦41.67 chain, both break-even prices, the sensitivity matrix, and the unit costs on both bases remain entirely unchanged. The calculation basis forces a 7.78 identity: break-even yield in kilograms and the operating-expense ratio in per cent print the exact same digits solely because revenue equals the derived price of ₦450 times the 100 kg harvest mass. These figures stand unreconciled rather than wrong. The records are consistent with a wet-mass sale, in which case nothing is overstated and only the reconciliation is absent. The enterprise-budgeting formulation this layer follows computes unit cost and break-even price against a single defined output quantity </w:t>
+      </w:r>
+      <w:r>
+        <w:rPr>
+          <w:bCs/>
+          <w:szCs w:val="24"/>
+        </w:rPr>
         <w:lastRenderedPageBreak/>
-        <w:t xml:space="preserve">Basis of the revenue figures. The unit cost calculation divides by marketable mass while the revenue calculation divides by harvest mass. These two divisions sit within the same loop body, a structural choice holding true for any farm rather than an artefact of the seed. Both masses sit in the same row of Table 4.2 as 100 kg and 84 kg. This divergence inherits into gross margin, the ranking, the </w:t>
-      </w:r>
-      <w:proofErr w:type="spellStart"/>
+        <w:t>(Kay et al., 2016), so cost and revenue divided by different masses is a departure from that formulation and is what remains to be reconciled.</w:t>
+      </w:r>
+    </w:p>
+    <w:p>
+      <w:pPr>
+        <w:pStyle w:val="BodyPara"/>
+      </w:pPr>
       <w:r>
         <w:rPr>
           <w:bCs/>
           <w:szCs w:val="24"/>
         </w:rPr>
+        <w:t xml:space="preserve">Verification gaps — evaluation limitations. There are no component tests for the page and form layer, including the drying-curve chart. The client-side mirror of the monetary bounds is asserted only as a pure function; the wiring between the form and the validator is tested nowhere, as the 422 results in Appendix B are server-side responses. The local-database migration is proven against an in-memory </w:t>
+      </w:r>
+      <w:proofErr w:type="spellStart"/>
+      <w:r>
+        <w:rPr>
+          <w:bCs/>
+          <w:szCs w:val="24"/>
+        </w:rPr>
+        <w:t>IndexedDB</w:t>
+      </w:r>
+      <w:proofErr w:type="spellEnd"/>
+      <w:r>
+        <w:rPr>
+          <w:bCs/>
+          <w:szCs w:val="24"/>
+        </w:rPr>
+        <w:t xml:space="preserve"> implementation rather than a real browser, so browser-specific storage eviction, quota </w:t>
+      </w:r>
+      <w:proofErr w:type="spellStart"/>
+      <w:r>
+        <w:rPr>
+          <w:bCs/>
+          <w:szCs w:val="24"/>
+        </w:rPr>
+        <w:t>behaviour</w:t>
+      </w:r>
+      <w:proofErr w:type="spellEnd"/>
+      <w:r>
+        <w:rPr>
+          <w:bCs/>
+          <w:szCs w:val="24"/>
+        </w:rPr>
+        <w:t xml:space="preserve"> and vendor bugs are out of its reach. Backend tests run on SQLite while production runs PostgreSQL; only the migration chain was executed against a real PostgreSQL server. Concurrency is measured on SQLite and inferred for PostgreSQL. There is no end-to-end browser test of the offline-to-online transition, the service-worker lifecycle or the installation path. The frontend suite is not timing-robust under machine contention. There has been no independent security review, no penetration test, no threat model, and no load, stress or soak testing. And no continuous-integration run result is recorded.</w:t>
+      </w:r>
+    </w:p>
+    <w:p>
+      <w:pPr>
+        <w:pStyle w:val="BodyPara"/>
+      </w:pPr>
+      <w:r>
+        <w:rPr>
+          <w:bCs/>
+          <w:szCs w:val="24"/>
+        </w:rPr>
+        <w:t xml:space="preserve">Data-state limitations. The live database holds eleven unidentified exploratory farms from development, deliberately left in place rather than deleted on an assumption, and two farms share the name “Demo Farm” — only farm 26 carries the seeded data, which is why no figure in this chapter is taken from a farm-list view. Machine hours are populated on three of eight </w:t>
+      </w:r>
+      <w:proofErr w:type="spellStart"/>
+      <w:r>
+        <w:rPr>
+          <w:bCs/>
+          <w:szCs w:val="24"/>
+        </w:rPr>
+        <w:t>mechanisation</w:t>
+      </w:r>
+      <w:proofErr w:type="spellEnd"/>
+      <w:r>
+        <w:rPr>
+          <w:bCs/>
+          <w:szCs w:val="24"/>
+        </w:rPr>
+        <w:t xml:space="preserve"> logs. Two components of the hosting footprint — the static server and the container runtime — were not sampled at all, so the total is part-measured and part-assumed. The maize and cowpea sale figures are chosen totals rather than rate-times-quantity, so the </w:t>
+      </w:r>
+      <w:proofErr w:type="spellStart"/>
+      <w:r>
+        <w:rPr>
+          <w:bCs/>
+          <w:szCs w:val="24"/>
+        </w:rPr>
         <w:t>realised</w:t>
       </w:r>
       <w:proofErr w:type="spellEnd"/>
@@ -20484,7 +20002,7 @@
           <w:bCs/>
           <w:szCs w:val="24"/>
         </w:rPr>
-        <w:t xml:space="preserve"> price, break-even yield, the operating-expense ratio, farm revenue, and the farm operating-expense ratio. The asymmetry reaches only figures carrying a revenue term; no cost-side figure is affected. The whole ₦35.00 to ₦41.67 chain, both break-even prices, the sensitivity matrix, and the unit costs on both bases remain entirely unchanged. The calculation basis forces a 7.78 identity: break-even yield in kilograms and the operating-expense ratio in per cent print the exact same digits solely because revenue equals the derived price of ₦450 times the 100 kg harvest mass. These figures stand unreconciled rather than wrong. The records are consistent with a wet-mass sale, in which case nothing is overstated and only the reconciliation is absent. The enterprise-budgeting formulation this layer follows computes unit cost and break-even price against a single defined output quantity (Kay et al., 2016), so cost and revenue divided by different masses is a departure from that formulation and is what remains to be reconciled.</w:t>
+        <w:t xml:space="preserve"> prices derived from them act as reconstructions rather than observed prices.</w:t>
       </w:r>
     </w:p>
     <w:p>
@@ -20496,7 +20014,8 @@
           <w:bCs/>
           <w:szCs w:val="24"/>
         </w:rPr>
-        <w:t xml:space="preserve">Verification gaps — evaluation limitations. There are no component tests for the page and form layer, including the drying-curve chart. The client-side mirror of the monetary bounds is asserted only as a pure function; the wiring between the form and the validator is tested nowhere, as the 422 results in Appendix B are server-side responses. The local-database migration is proven against an in-memory </w:t>
+        <w:lastRenderedPageBreak/>
+        <w:t>Documentation gaps. Two citations that were outstanding in the implementation are now resolved and are attributed in Chapter Two: the cost-</w:t>
       </w:r>
       <w:proofErr w:type="spellStart"/>
       <w:r>
@@ -20504,7 +20023,7 @@
           <w:bCs/>
           <w:szCs w:val="24"/>
         </w:rPr>
-        <w:t>IndexedDB</w:t>
+        <w:t>behaviour</w:t>
       </w:r>
       <w:proofErr w:type="spellEnd"/>
       <w:r>
@@ -20512,7 +20031,7 @@
           <w:bCs/>
           <w:szCs w:val="24"/>
         </w:rPr>
-        <w:t xml:space="preserve"> implementation rather than a real browser, so browser-specific storage eviction, quota </w:t>
+        <w:t xml:space="preserve"> taxonomy to the enterprise-budgeting literature of agricultural economics (Kay et al., 2016), and the safe-storage moisture ceilings to post-harvest handling guidance (FAO, </w:t>
       </w:r>
       <w:proofErr w:type="spellStart"/>
       <w:r>
@@ -20520,23 +20039,149 @@
           <w:bCs/>
           <w:szCs w:val="24"/>
         </w:rPr>
+        <w:t>n.d.</w:t>
+      </w:r>
+      <w:proofErr w:type="spellEnd"/>
+      <w:r>
+        <w:rPr>
+          <w:bCs/>
+          <w:szCs w:val="24"/>
+        </w:rPr>
+        <w:t xml:space="preserve">; </w:t>
+      </w:r>
+      <w:proofErr w:type="spellStart"/>
+      <w:r>
+        <w:rPr>
+          <w:bCs/>
+          <w:szCs w:val="24"/>
+        </w:rPr>
+        <w:t>Baidhe</w:t>
+      </w:r>
+      <w:proofErr w:type="spellEnd"/>
+      <w:r>
+        <w:rPr>
+          <w:bCs/>
+          <w:szCs w:val="24"/>
+        </w:rPr>
+        <w:t xml:space="preserve"> et al., 2024).</w:t>
+      </w:r>
+    </w:p>
+    <w:p>
+      <w:pPr>
+        <w:pStyle w:val="BodyPara"/>
+      </w:pPr>
+      <w:r>
+        <w:rPr>
+          <w:bCs/>
+          <w:szCs w:val="24"/>
+        </w:rPr>
+        <w:t>Validation gaps. Nothing here is validated in practice: the production path of Section 4.11 has been built, started, probed, backed up and restored, and no instance has ever served a real user on a real domain on a departmental host. That is a smaller and more accurate claim than the flat statement that the system has never been deployed, and it is the one the evidence supports.</w:t>
+      </w:r>
+    </w:p>
+    <w:p>
+      <w:pPr>
+        <w:pStyle w:val="H2"/>
+      </w:pPr>
+      <w:bookmarkStart w:id="134" w:name="_Toc238621422"/>
+      <w:r>
+        <w:rPr>
+          <w:szCs w:val="24"/>
+        </w:rPr>
+        <w:t>4.15 Summary</w:t>
+      </w:r>
+      <w:bookmarkEnd w:id="134"/>
+    </w:p>
+    <w:p>
+      <w:pPr>
+        <w:pStyle w:val="BodyPara"/>
+      </w:pPr>
+      <w:r>
+        <w:rPr>
+          <w:szCs w:val="24"/>
+        </w:rPr>
+        <w:t xml:space="preserve">The type check, the lint and the production build are clean. The paired write, the soft-immutability constraint and the linked contra entry behave as designed; offline queue identity partitioning, logout cleanup and the local-database migration are each asserted by named tests; and same-farm </w:t>
+      </w:r>
+      <w:proofErr w:type="spellStart"/>
+      <w:r>
+        <w:rPr>
+          <w:szCs w:val="24"/>
+        </w:rPr>
+        <w:t>idempotency</w:t>
+      </w:r>
+      <w:proofErr w:type="spellEnd"/>
+      <w:r>
+        <w:rPr>
+          <w:szCs w:val="24"/>
+        </w:rPr>
+        <w:t xml:space="preserve"> holds sequentially and under a genuine two-thread race. Coverage is concentrated where it matters — every module that serves a request is fully or almost fully covered — and its distribution is reported rather than averaged away.</w:t>
+      </w:r>
+    </w:p>
+    <w:p>
+      <w:pPr>
+        <w:pStyle w:val="BodyPara"/>
+      </w:pPr>
+      <w:r>
+        <w:rPr>
+          <w:szCs w:val="24"/>
+        </w:rPr>
+        <w:t>The deterministic decision-support layer computes from</w:t>
+      </w:r>
+      <w:r>
+        <w:rPr>
+          <w:szCs w:val="24"/>
+        </w:rPr>
+        <w:t xml:space="preserve"> a live ledger nine quantities</w:t>
+      </w:r>
+      <w:r>
+        <w:rPr>
+          <w:szCs w:val="24"/>
+        </w:rPr>
+        <w:t xml:space="preserve"> per-crop gross margin and its ranking; unit cost of production on a harvested-mass basis; unit cost of production on a marketable-mass basis where a drying run exists; retrospective break-even yield; cost structure classified by economic </w:t>
+      </w:r>
+      <w:proofErr w:type="spellStart"/>
+      <w:r>
+        <w:rPr>
+          <w:szCs w:val="24"/>
+        </w:rPr>
         <w:t>behaviour</w:t>
       </w:r>
       <w:proofErr w:type="spellEnd"/>
       <w:r>
         <w:rPr>
-          <w:bCs/>
-          <w:szCs w:val="24"/>
-        </w:rPr>
-        <w:t xml:space="preserve"> and vendor bugs are out of its reach. Backend tests run on SQLite while production runs PostgreSQL; only the migration chain was executed against a real </w:t>
-      </w:r>
-      <w:r>
-        <w:rPr>
-          <w:bCs/>
+          <w:szCs w:val="24"/>
+        </w:rPr>
+        <w:t xml:space="preserve"> with an explicit classification-coverage figure; a derived fixed-cost overlay and its proportional allocation; break-even price on a cash and on a total-cost basis; a yield-sensitivity </w:t>
+      </w:r>
+      <w:r>
+        <w:rPr>
           <w:szCs w:val="24"/>
         </w:rPr>
         <w:lastRenderedPageBreak/>
-        <w:t>PostgreSQL server. Concurrency is measured on SQLite and inferred for PostgreSQL. There is no end-to-end browser test of the offline-to-online transition, the service-worker lifecycle or the installation path. The frontend suite is not timing-robust under machine contention. There has been no independent security review, no penetration test, no threat model, and no load, stress or soak testing. And no continuous-integration run result is recorded.</w:t>
+        <w:t>matrix; a</w:t>
+      </w:r>
+      <w:r>
+        <w:rPr>
+          <w:szCs w:val="24"/>
+        </w:rPr>
+        <w:t xml:space="preserve">nd an operating-expense ratio </w:t>
+      </w:r>
+      <w:r>
+        <w:rPr>
+          <w:szCs w:val="24"/>
+        </w:rPr>
+        <w:t>together with a partial-budget calculator and an Olympic-average yield baseline, netting reversed pairs at farm level and per crop alike, and withholds each figure where its inputs are insufficient rather than substituting a plausible default. All six enterprise endpoints are reachable in the interface. Two independent implementations of the partial budget agree on eight hand-computed cases. The post-harvest module recover</w:t>
+      </w:r>
+      <w:r>
+        <w:rPr>
+          <w:szCs w:val="24"/>
+        </w:rPr>
+        <w:t xml:space="preserve">s known thin-layer parameters (k = 0.30 and n = 0.75) </w:t>
+      </w:r>
+      <w:r>
+        <w:rPr>
+          <w:szCs w:val="24"/>
+        </w:rPr>
+        <w:t>to within one part in ten thousand, keeps water removed distinct from matter lost, and connects a moisture measurement to a price per marketable kilogram in a single computed chain, moving maize from ₦35.00 to ₦41.67 per kilogram, a 19% difference that is post-harvest mass reduction expressed in money.</w:t>
       </w:r>
     </w:p>
     <w:p>
@@ -20545,42 +20190,87 @@
       </w:pPr>
       <w:r>
         <w:rPr>
-          <w:bCs/>
-          <w:szCs w:val="24"/>
-        </w:rPr>
-        <w:t xml:space="preserve">Data-state limitations. The live database holds eleven unidentified exploratory farms from development, deliberately left in place rather than deleted on an assumption, and two farms share the name “Demo Farm” — only farm 26 carries the seeded data, which is why no figure in this chapter is taken from a farm-list view. Machine hours are populated on three of eight </w:t>
-      </w:r>
-      <w:proofErr w:type="spellStart"/>
-      <w:r>
-        <w:rPr>
-          <w:bCs/>
-          <w:szCs w:val="24"/>
-        </w:rPr>
-        <w:t>mechanisation</w:t>
-      </w:r>
-      <w:proofErr w:type="spellEnd"/>
-      <w:r>
-        <w:rPr>
-          <w:bCs/>
-          <w:szCs w:val="24"/>
-        </w:rPr>
-        <w:t xml:space="preserve"> logs. Two components of the hosting footprint — the static server and the container runtime — were not sampled at all, so the total is part-measured and part-assumed. The maize and cowpea sale figures are chosen totals rather than rate-times-quantity, so the </w:t>
-      </w:r>
-      <w:proofErr w:type="spellStart"/>
-      <w:r>
-        <w:rPr>
-          <w:bCs/>
-          <w:szCs w:val="24"/>
-        </w:rPr>
-        <w:t>realised</w:t>
-      </w:r>
-      <w:proofErr w:type="spellEnd"/>
-      <w:r>
-        <w:rPr>
-          <w:bCs/>
-          <w:szCs w:val="24"/>
-        </w:rPr>
-        <w:t xml:space="preserve"> prices derived from them act as reconstructions rather than observed prices.</w:t>
+          <w:szCs w:val="24"/>
+        </w:rPr>
+        <w:t>Under simulated throttling, the service worker reduces network transfer on a repeat visit from 139,245 bytes over eight req</w:t>
+      </w:r>
+      <w:r>
+        <w:rPr>
+          <w:szCs w:val="24"/>
+        </w:rPr>
+        <w:t xml:space="preserve">uests to 127 bytes over seven </w:t>
+      </w:r>
+      <w:r>
+        <w:rPr>
+          <w:szCs w:val="24"/>
+        </w:rPr>
+        <w:t>the residue being the man</w:t>
+      </w:r>
+      <w:r>
+        <w:rPr>
+          <w:szCs w:val="24"/>
+        </w:rPr>
+        <w:t xml:space="preserve">ifest icon, a measured defect </w:t>
+      </w:r>
+      <w:r>
+        <w:rPr>
+          <w:szCs w:val="24"/>
+        </w:rPr>
+        <w:t xml:space="preserve">and reduces first paint by a factor of about eighty, from 5,661.2 </w:t>
+      </w:r>
+      <w:proofErr w:type="spellStart"/>
+      <w:r>
+        <w:rPr>
+          <w:szCs w:val="24"/>
+        </w:rPr>
+        <w:t>ms</w:t>
+      </w:r>
+      <w:proofErr w:type="spellEnd"/>
+      <w:r>
+        <w:rPr>
+          <w:szCs w:val="24"/>
+        </w:rPr>
+        <w:t xml:space="preserve"> to 70.6 </w:t>
+      </w:r>
+      <w:proofErr w:type="spellStart"/>
+      <w:r>
+        <w:rPr>
+          <w:szCs w:val="24"/>
+        </w:rPr>
+        <w:t>ms</w:t>
+      </w:r>
+      <w:proofErr w:type="spellEnd"/>
+      <w:r>
+        <w:rPr>
+          <w:szCs w:val="24"/>
+        </w:rPr>
+        <w:t xml:space="preserve">, though time to main content improves by a factor of about three and a half, and that is the figure a user experiences. Measured resource consumption places the two exercised containers at 178.9 to 202.8 </w:t>
+      </w:r>
+      <w:proofErr w:type="spellStart"/>
+      <w:r>
+        <w:rPr>
+          <w:szCs w:val="24"/>
+        </w:rPr>
+        <w:t>MiB</w:t>
+      </w:r>
+      <w:proofErr w:type="spellEnd"/>
+      <w:r>
+        <w:rPr>
+          <w:szCs w:val="24"/>
+        </w:rPr>
+        <w:t xml:space="preserve">, supporting an estimated $15.40, approximately ₦20,950, per month and a reasoned cost per farm falling to ₦105 </w:t>
+      </w:r>
+      <w:r>
+        <w:rPr>
+          <w:szCs w:val="24"/>
+        </w:rPr>
+        <w:t xml:space="preserve">at a two-hundred-farm tenancy </w:t>
+      </w:r>
+      <w:r>
+        <w:rPr>
+          <w:szCs w:val="24"/>
+        </w:rPr>
+        <w:t>a cost structure that scales in the opposite direction to the per-seat licensing identified in Chapter One as excluding this user.</w:t>
       </w:r>
     </w:p>
     <w:p>
@@ -20589,248 +20279,16 @@
       </w:pPr>
       <w:r>
         <w:rPr>
-          <w:bCs/>
-          <w:szCs w:val="24"/>
-        </w:rPr>
-        <w:t>Documentation gaps. Two citations that were outstanding in the implementation are now resolved and are attributed in Chapter Two: the cost-</w:t>
-      </w:r>
-      <w:proofErr w:type="spellStart"/>
-      <w:r>
-        <w:rPr>
-          <w:bCs/>
-          <w:szCs w:val="24"/>
-        </w:rPr>
-        <w:t>behaviour</w:t>
-      </w:r>
-      <w:proofErr w:type="spellEnd"/>
-      <w:r>
-        <w:rPr>
-          <w:bCs/>
-          <w:szCs w:val="24"/>
-        </w:rPr>
-        <w:t xml:space="preserve"> taxonomy to the enterprise-budgeting literature of agricultural economics (Kay et al., 2016), and the safe-storage moisture ceilings to post-harvest handling guidance (FAO, </w:t>
-      </w:r>
-      <w:proofErr w:type="spellStart"/>
-      <w:r>
-        <w:rPr>
-          <w:bCs/>
-          <w:szCs w:val="24"/>
-        </w:rPr>
-        <w:t>n.d.</w:t>
-      </w:r>
-      <w:proofErr w:type="spellEnd"/>
-      <w:r>
-        <w:rPr>
-          <w:bCs/>
-          <w:szCs w:val="24"/>
-        </w:rPr>
-        <w:t xml:space="preserve">; </w:t>
-      </w:r>
-      <w:proofErr w:type="spellStart"/>
-      <w:r>
-        <w:rPr>
-          <w:bCs/>
-          <w:szCs w:val="24"/>
-        </w:rPr>
-        <w:t>Baidhe</w:t>
-      </w:r>
-      <w:proofErr w:type="spellEnd"/>
-      <w:r>
-        <w:rPr>
-          <w:bCs/>
-          <w:szCs w:val="24"/>
-        </w:rPr>
-        <w:t xml:space="preserve"> et al., 2024).</w:t>
-      </w:r>
-    </w:p>
-    <w:p>
-      <w:pPr>
-        <w:pStyle w:val="BodyPara"/>
-      </w:pPr>
-      <w:r>
-        <w:rPr>
-          <w:bCs/>
-          <w:szCs w:val="24"/>
-        </w:rPr>
-        <w:t xml:space="preserve">Validation gaps. Nothing here is validated in practice: the production path of Section 4.11 has been built, started, probed, backed up and restored, and no instance has ever served a real user on a real domain on a departmental host. That is a smaller and more </w:t>
-      </w:r>
-      <w:r>
-        <w:rPr>
-          <w:bCs/>
+          <w:szCs w:val="24"/>
+        </w:rPr>
+        <w:t xml:space="preserve">The security and tenancy boundary is exercised as well as asserted: three roles over eleven named permissions refuse a worker the farm’s financial picture and refuse a manager the power to disclose it; share links expire at ninety days, are stored only as hashes, and revoke to a verdict indistinguishable from that for a token that never existed; the raw token reaches none of the three logs that record its request; failed logins </w:t>
+      </w:r>
+      <w:r>
+        <w:rPr>
           <w:szCs w:val="24"/>
         </w:rPr>
         <w:lastRenderedPageBreak/>
-        <w:t>accurate claim than the flat statement that the system has never been deployed, and it is the one the evidence supports.</w:t>
-      </w:r>
-    </w:p>
-    <w:p>
-      <w:pPr>
-        <w:pStyle w:val="H2"/>
-      </w:pPr>
-      <w:bookmarkStart w:id="135" w:name="_Toc238621422"/>
-      <w:r>
-        <w:rPr>
-          <w:szCs w:val="24"/>
-        </w:rPr>
-        <w:t>4.15 Summary</w:t>
-      </w:r>
-      <w:bookmarkEnd w:id="135"/>
-    </w:p>
-    <w:p>
-      <w:pPr>
-        <w:pStyle w:val="BodyPara"/>
-      </w:pPr>
-      <w:r>
-        <w:rPr>
-          <w:szCs w:val="24"/>
-        </w:rPr>
-        <w:t xml:space="preserve">The type check, the lint and the production build are clean. The paired write, the soft-immutability constraint and the linked contra entry behave as designed; offline queue identity partitioning, logout cleanup and the local-database migration are each asserted by named tests; and same-farm </w:t>
-      </w:r>
-      <w:proofErr w:type="spellStart"/>
-      <w:r>
-        <w:rPr>
-          <w:szCs w:val="24"/>
-        </w:rPr>
-        <w:t>idempotency</w:t>
-      </w:r>
-      <w:proofErr w:type="spellEnd"/>
-      <w:r>
-        <w:rPr>
-          <w:szCs w:val="24"/>
-        </w:rPr>
-        <w:t xml:space="preserve"> holds sequentially and under a genuine two-thread race. Coverage is concentrated where it matters — every module that serves a request is fully or almost fully covered — and its distribution is reported rather than averaged away.</w:t>
-      </w:r>
-    </w:p>
-    <w:p>
-      <w:pPr>
-        <w:pStyle w:val="BodyPara"/>
-      </w:pPr>
-      <w:r>
-        <w:rPr>
-          <w:szCs w:val="24"/>
-        </w:rPr>
-        <w:t xml:space="preserve">The deterministic decision-support layer computes from a live ledger nine quantities — per-crop gross margin and its ranking; unit cost of production on a harvested-mass basis; unit cost of production on a marketable-mass basis where a drying run exists; retrospective break-even yield; cost structure classified by economic </w:t>
-      </w:r>
-      <w:proofErr w:type="spellStart"/>
-      <w:r>
-        <w:rPr>
-          <w:szCs w:val="24"/>
-        </w:rPr>
-        <w:t>behaviour</w:t>
-      </w:r>
-      <w:proofErr w:type="spellEnd"/>
-      <w:r>
-        <w:rPr>
-          <w:szCs w:val="24"/>
-        </w:rPr>
-        <w:t xml:space="preserve"> with an explicit classification-coverage figure; a derived fixed-cost overlay and its proportional allocation; break-even price on a cash and on a total-cost basis; a yield-sensitivity matrix; and an operating-expense ratio — together with a partial-budget calculator and an Olympic-average yield baseline, netting reversed pairs at farm level and per crop alike, and withholds each figure where its inputs are insufficient rather than substituting a plausible default. All six enterprise endpoints are reachable in the interface. Two independent implementations of the partial budget agree on eight hand-computed cases. The post-harvest module recovers known thin-layer parameters — k = 0.30 and n = 0.75 — to within one part in ten thousand, keeps water removed distinct from matter lost, and connects a moisture measurement to a price per marketable kilogram in a single </w:t>
-      </w:r>
-      <w:r>
-        <w:rPr>
-          <w:szCs w:val="24"/>
-        </w:rPr>
-        <w:lastRenderedPageBreak/>
-        <w:t>computed chain, moving maize from ₦35.00 to ₦41.67 per kilogram, a 19% difference that is post-harvest mass reduction expressed in money.</w:t>
-      </w:r>
-    </w:p>
-    <w:p>
-      <w:pPr>
-        <w:pStyle w:val="BodyPara"/>
-      </w:pPr>
-      <w:r>
-        <w:rPr>
-          <w:szCs w:val="24"/>
-        </w:rPr>
-        <w:t>Under simulated throttling, the service worker reduces network transfer on a repeat visit from 139,245 bytes over eight req</w:t>
-      </w:r>
-      <w:r>
-        <w:rPr>
-          <w:szCs w:val="24"/>
-        </w:rPr>
-        <w:t xml:space="preserve">uests to 127 bytes over seven </w:t>
-      </w:r>
-      <w:r>
-        <w:rPr>
-          <w:szCs w:val="24"/>
-        </w:rPr>
-        <w:t>the residue being the man</w:t>
-      </w:r>
-      <w:r>
-        <w:rPr>
-          <w:szCs w:val="24"/>
-        </w:rPr>
-        <w:t xml:space="preserve">ifest icon, a measured defect </w:t>
-      </w:r>
-      <w:r>
-        <w:rPr>
-          <w:szCs w:val="24"/>
-        </w:rPr>
-        <w:t xml:space="preserve">and reduces first paint by a factor of about eighty, from 5,661.2 </w:t>
-      </w:r>
-      <w:proofErr w:type="spellStart"/>
-      <w:r>
-        <w:rPr>
-          <w:szCs w:val="24"/>
-        </w:rPr>
-        <w:t>ms</w:t>
-      </w:r>
-      <w:proofErr w:type="spellEnd"/>
-      <w:r>
-        <w:rPr>
-          <w:szCs w:val="24"/>
-        </w:rPr>
-        <w:t xml:space="preserve"> to 70.6 </w:t>
-      </w:r>
-      <w:proofErr w:type="spellStart"/>
-      <w:r>
-        <w:rPr>
-          <w:szCs w:val="24"/>
-        </w:rPr>
-        <w:t>ms</w:t>
-      </w:r>
-      <w:proofErr w:type="spellEnd"/>
-      <w:r>
-        <w:rPr>
-          <w:szCs w:val="24"/>
-        </w:rPr>
-        <w:t xml:space="preserve">, though time to main content improves by a factor of about three and a half, and that is the figure a user experiences. Measured resource consumption places the two exercised containers at 178.9 to 202.8 </w:t>
-      </w:r>
-      <w:proofErr w:type="spellStart"/>
-      <w:r>
-        <w:rPr>
-          <w:szCs w:val="24"/>
-        </w:rPr>
-        <w:t>MiB</w:t>
-      </w:r>
-      <w:proofErr w:type="spellEnd"/>
-      <w:r>
-        <w:rPr>
-          <w:szCs w:val="24"/>
-        </w:rPr>
-        <w:t xml:space="preserve">, supporting an estimated $15.40, approximately ₦20,950, per month and a reasoned cost per farm falling to ₦105 </w:t>
-      </w:r>
-      <w:r>
-        <w:rPr>
-          <w:szCs w:val="24"/>
-        </w:rPr>
-        <w:t xml:space="preserve">at a two-hundred-farm tenancy </w:t>
-      </w:r>
-      <w:r>
-        <w:rPr>
-          <w:szCs w:val="24"/>
-        </w:rPr>
-        <w:t>a cost structure that scales in the opposite direction to the per-seat licensing identified in Chapter One as excluding this user.</w:t>
-      </w:r>
-    </w:p>
-    <w:p>
-      <w:pPr>
-        <w:pStyle w:val="BodyPara"/>
-      </w:pPr>
-      <w:r>
-        <w:rPr>
-          <w:szCs w:val="24"/>
-        </w:rPr>
-        <w:t>The security and tenancy boundary is exercised as well as asserted: three roles over eleven named permissions refuse a worker the farm’s financial picture and refuse a manager the power to disclose it; share links expire at ninety days, are stored only as hashes, and revoke to a verdict indistinguishable from that for a token that never existed; the raw token reaches none of the three logs that record its request; failed logins are throttled; the migration chain runs and rolls back against real PostgreSQL; and a backup was taken and restored with every row count matching and the paired-write invariant intact. Against all of that, the yield forecast is an in-distribution resu</w:t>
+        <w:t>are throttled; the migration chain runs and rolls back against real PostgreSQL; and a backup was taken and restored with every row count matching and the paired-write invariant intact. Against all of that, the yield forecast is an in-distribution resu</w:t>
       </w:r>
       <w:r>
         <w:rPr>
@@ -20842,21 +20300,14 @@
         <w:rPr>
           <w:szCs w:val="24"/>
         </w:rPr>
-        <w:t xml:space="preserve">R² 0.9762, MAE 0.2414 t/ha, RMSE 0.4883 t/ha, reproducible to six decimal places and evidence about the pipeline rather than about Nigerian yields; the platform has a production path that has been demonstrated but has never served a real user; no independent security assessment exists; and the usability strand was specified and not executed, leaving Objective 4 partially achieved. Chapter Five interprets these </w:t>
-      </w:r>
-      <w:r>
-        <w:rPr>
-          <w:szCs w:val="24"/>
-        </w:rPr>
-        <w:lastRenderedPageBreak/>
-        <w:t>results against the problem set out in Chapter One, states the platform’s limitations in full, and sets out what would be required to take it from a verified prototype to a deployed system.</w:t>
+        <w:t>R² 0.9762, MAE 0.2414 t/ha, RMSE 0.4883 t/ha, reproducible to six decimal places and evidence about the pipeline rather than about Nigerian yields; the platform has a production path that has been demonstrated but has never served a real user; no independent security assessment exists; and the usability strand was specified and not executed, leaving Objective 4 partially achieved. Chapter Five interprets these results against the problem set out in Chapter One, states the platform’s limitations in full, and sets out what would be required to take it from a verified prototype to a deployed system.</w:t>
       </w:r>
     </w:p>
     <w:p>
       <w:pPr>
         <w:pStyle w:val="ChapterLabel"/>
       </w:pPr>
-      <w:bookmarkStart w:id="136" w:name="_Toc238621466"/>
+      <w:bookmarkStart w:id="135" w:name="_Toc238621466"/>
       <w:r>
         <w:rPr>
           <w:szCs w:val="28"/>
@@ -20864,26 +20315,26 @@
         <w:lastRenderedPageBreak/>
         <w:t>CHAPTER FIVE</w:t>
       </w:r>
+      <w:bookmarkEnd w:id="135"/>
+    </w:p>
+    <w:p>
+      <w:pPr>
+        <w:pStyle w:val="ChapterTitle"/>
+      </w:pPr>
+      <w:bookmarkStart w:id="136" w:name="_Toc238621467"/>
+      <w:r>
+        <w:rPr>
+          <w:szCs w:val="28"/>
+        </w:rPr>
+        <w:t>5.0 SUMMARY</w:t>
+      </w:r>
+      <w:r>
+        <w:rPr>
+          <w:szCs w:val="28"/>
+        </w:rPr>
+        <w:t>, CONCLUSION AND RECOMMENDATIONS</w:t>
+      </w:r>
       <w:bookmarkEnd w:id="136"/>
-    </w:p>
-    <w:p>
-      <w:pPr>
-        <w:pStyle w:val="ChapterTitle"/>
-      </w:pPr>
-      <w:bookmarkStart w:id="137" w:name="_Toc238621467"/>
-      <w:r>
-        <w:rPr>
-          <w:szCs w:val="28"/>
-        </w:rPr>
-        <w:t>5.0 SUMMARY</w:t>
-      </w:r>
-      <w:r>
-        <w:rPr>
-          <w:szCs w:val="28"/>
-        </w:rPr>
-        <w:t>, CONCLUSION AND RECOMMENDATIONS</w:t>
-      </w:r>
-      <w:bookmarkEnd w:id="137"/>
     </w:p>
     <w:p>
       <w:pPr>
@@ -21531,7 +20982,13 @@
       </w:r>
       <w:r>
         <w:lastRenderedPageBreak/>
-        <w:t xml:space="preserve">₦35.00 to ₦41.67 per kilogram. This 19% difference is post-harvest mass reduction expressed in money, and the chain that produces it is the engineering contribution of this work. The offline-first architecture performs under constraint: under a simulated 0.4 Mbps network, a repeat application visit dropped from 139,245 bytes over eight requests to just 127 bytes over seven. System security—including </w:t>
+        <w:t>₦35.00 to ₦41.67 per kilogram. This 19% difference is post-harvest mass reduction expressed in money, and the chain that produces it is the engineering contribution of this work. The offline-first architecture performs under constraint: under a simulated 0.4 Mbps network, a repeat application visit dropped from 139,245 bytes over eight requests to just 127 by</w:t>
+      </w:r>
+      <w:r>
+        <w:t xml:space="preserve">tes over seven. System security </w:t>
+      </w:r>
+      <w:r>
+        <w:t xml:space="preserve">including </w:t>
       </w:r>
       <w:proofErr w:type="spellStart"/>
       <w:r>
@@ -21885,7 +21342,7 @@
       <w:pPr>
         <w:pStyle w:val="ChapterLabel"/>
       </w:pPr>
-      <w:bookmarkStart w:id="138" w:name="_Toc238621489"/>
+      <w:bookmarkStart w:id="137" w:name="_Toc238621489"/>
       <w:r>
         <w:rPr>
           <w:szCs w:val="28"/>
@@ -21893,7 +21350,7 @@
         <w:lastRenderedPageBreak/>
         <w:t>REFERENCES</w:t>
       </w:r>
-      <w:bookmarkEnd w:id="138"/>
+      <w:bookmarkEnd w:id="137"/>
     </w:p>
     <w:p>
       <w:pPr>
@@ -22894,6 +22351,7 @@
         <w:tblStyle w:val="TableGrid"/>
         <w:tblW w:w="8504" w:type="dxa"/>
         <w:jc w:val="center"/>
+        <w:tblCellSpacing w:w="15" w:type="dxa"/>
         <w:tblBorders>
           <w:top w:val="single" w:sz="8" w:space="0" w:color="auto"/>
           <w:left w:val="none" w:sz="0" w:space="0" w:color="auto"/>
@@ -22912,8 +22370,8 @@
         <w:tblLook w:val="0020" w:firstRow="1" w:lastRow="0" w:firstColumn="0" w:lastColumn="0" w:noHBand="0" w:noVBand="0"/>
       </w:tblPr>
       <w:tblGrid>
-        <w:gridCol w:w="5139"/>
-        <w:gridCol w:w="3365"/>
+        <w:gridCol w:w="5129"/>
+        <w:gridCol w:w="3375"/>
       </w:tblGrid>
       <w:tr>
         <w:trPr>
@@ -23471,6 +22929,7 @@
                 <w:bCs/>
                 <w:lang w:val="en-GB"/>
               </w:rPr>
+              <w:lastRenderedPageBreak/>
               <w:t>Identity and per-farm data boundary:</w:t>
             </w:r>
             <w:r>
@@ -24155,6 +23614,7 @@
                 <w:bCs/>
                 <w:lang w:val="en-GB"/>
               </w:rPr>
+              <w:lastRenderedPageBreak/>
               <w:t>Post-harvest drying readings capture:</w:t>
             </w:r>
             <w:r>
@@ -24658,7 +24118,6 @@
               <w:jc w:val="center"/>
             </w:pPr>
             <w:r>
-              <w:lastRenderedPageBreak/>
               <w:t>Share-token storage</w:t>
             </w:r>
           </w:p>
@@ -24909,6 +24368,7 @@
               <w:jc w:val="center"/>
             </w:pPr>
             <w:r>
+              <w:lastRenderedPageBreak/>
               <w:t>Monetary input bounds</w:t>
             </w:r>
           </w:p>
@@ -24967,7 +24427,6 @@
               <w:jc w:val="center"/>
             </w:pPr>
             <w:r>
-              <w:lastRenderedPageBreak/>
               <w:t>Equipment correction</w:t>
             </w:r>
           </w:p>
@@ -25302,7 +24761,6 @@
               <w:jc w:val="center"/>
             </w:pPr>
             <w:r>
-              <w:lastRenderedPageBreak/>
               <w:t>Configuration</w:t>
             </w:r>
           </w:p>
@@ -25416,6 +24874,7 @@
               <w:jc w:val="center"/>
             </w:pPr>
             <w:r>
+              <w:lastRenderedPageBreak/>
               <w:t>Backup and restore</w:t>
             </w:r>
           </w:p>
@@ -25459,7 +24918,6 @@
               <w:jc w:val="center"/>
             </w:pPr>
             <w:r>
-              <w:lastRenderedPageBreak/>
               <w:t>TLS for a real domain</w:t>
             </w:r>
           </w:p>
@@ -25629,8 +25087,6 @@
           <w:p>
             <w:pPr>
               <w:pStyle w:val="TableCell"/>
-              <w:spacing w:line="240" w:lineRule="auto"/>
-              <w:jc w:val="center"/>
             </w:pPr>
             <w:r>
               <w:rPr>
@@ -25653,8 +25109,6 @@
           <w:p>
             <w:pPr>
               <w:pStyle w:val="TableCell"/>
-              <w:spacing w:line="240" w:lineRule="auto"/>
-              <w:jc w:val="center"/>
             </w:pPr>
             <w:r>
               <w:rPr>
@@ -25677,8 +25131,6 @@
           <w:p>
             <w:pPr>
               <w:pStyle w:val="TableCell"/>
-              <w:spacing w:line="240" w:lineRule="auto"/>
-              <w:jc w:val="center"/>
             </w:pPr>
             <w:r>
               <w:rPr>
@@ -25704,8 +25156,6 @@
           <w:p>
             <w:pPr>
               <w:pStyle w:val="TableCell"/>
-              <w:spacing w:line="240" w:lineRule="auto"/>
-              <w:jc w:val="center"/>
             </w:pPr>
             <w:proofErr w:type="spellStart"/>
             <w:r>
@@ -25731,8 +25181,6 @@
           <w:p>
             <w:pPr>
               <w:pStyle w:val="TableCell"/>
-              <w:spacing w:line="240" w:lineRule="auto"/>
-              <w:jc w:val="center"/>
             </w:pPr>
             <w:r>
               <w:rPr>
@@ -25758,8 +25206,6 @@
           <w:p>
             <w:pPr>
               <w:pStyle w:val="TableCell"/>
-              <w:spacing w:line="240" w:lineRule="auto"/>
-              <w:jc w:val="center"/>
             </w:pPr>
             <w:r>
               <w:rPr>
@@ -25811,8 +25257,6 @@
           <w:p>
             <w:pPr>
               <w:pStyle w:val="TableCell"/>
-              <w:spacing w:line="240" w:lineRule="auto"/>
-              <w:jc w:val="center"/>
             </w:pPr>
             <w:r>
               <w:rPr>
@@ -25830,8 +25274,6 @@
           <w:p>
             <w:pPr>
               <w:pStyle w:val="TableCell"/>
-              <w:spacing w:line="240" w:lineRule="auto"/>
-              <w:jc w:val="center"/>
             </w:pPr>
             <w:r>
               <w:rPr>
@@ -25857,8 +25299,6 @@
           <w:p>
             <w:pPr>
               <w:pStyle w:val="TableCell"/>
-              <w:spacing w:line="240" w:lineRule="auto"/>
-              <w:jc w:val="center"/>
             </w:pPr>
             <w:r>
               <w:rPr>
@@ -25882,8 +25322,6 @@
           <w:p>
             <w:pPr>
               <w:pStyle w:val="TableCell"/>
-              <w:spacing w:line="240" w:lineRule="auto"/>
-              <w:jc w:val="center"/>
             </w:pPr>
             <w:r>
               <w:rPr>
@@ -25903,8 +25341,6 @@
           <w:p>
             <w:pPr>
               <w:pStyle w:val="TableCell"/>
-              <w:spacing w:line="240" w:lineRule="auto"/>
-              <w:jc w:val="center"/>
             </w:pPr>
             <w:r>
               <w:rPr>
@@ -25934,8 +25370,6 @@
           <w:p>
             <w:pPr>
               <w:pStyle w:val="TableCell"/>
-              <w:spacing w:line="240" w:lineRule="auto"/>
-              <w:jc w:val="center"/>
             </w:pPr>
             <w:r>
               <w:rPr>
@@ -25959,8 +25393,6 @@
           <w:p>
             <w:pPr>
               <w:pStyle w:val="TableCell"/>
-              <w:spacing w:line="240" w:lineRule="auto"/>
-              <w:jc w:val="center"/>
             </w:pPr>
             <w:r>
               <w:rPr>
@@ -25978,8 +25410,6 @@
           <w:p>
             <w:pPr>
               <w:pStyle w:val="TableCell"/>
-              <w:spacing w:line="240" w:lineRule="auto"/>
-              <w:jc w:val="center"/>
             </w:pPr>
             <w:r>
               <w:rPr>
@@ -25997,8 +25427,6 @@
           <w:p>
             <w:pPr>
               <w:pStyle w:val="TableCell"/>
-              <w:spacing w:line="240" w:lineRule="auto"/>
-              <w:jc w:val="center"/>
             </w:pPr>
             <w:r>
               <w:rPr>
@@ -26044,8 +25472,6 @@
           <w:p>
             <w:pPr>
               <w:pStyle w:val="TableCell"/>
-              <w:spacing w:line="240" w:lineRule="auto"/>
-              <w:jc w:val="center"/>
             </w:pPr>
             <w:r>
               <w:rPr>
@@ -26063,8 +25489,6 @@
           <w:p>
             <w:pPr>
               <w:pStyle w:val="TableCell"/>
-              <w:spacing w:line="240" w:lineRule="auto"/>
-              <w:jc w:val="center"/>
             </w:pPr>
             <w:r>
               <w:rPr>
@@ -26082,8 +25506,6 @@
           <w:p>
             <w:pPr>
               <w:pStyle w:val="TableCell"/>
-              <w:spacing w:line="240" w:lineRule="auto"/>
-              <w:jc w:val="center"/>
             </w:pPr>
             <w:r>
               <w:rPr>
@@ -26158,8 +25580,6 @@
           <w:p>
             <w:pPr>
               <w:pStyle w:val="TableCell"/>
-              <w:spacing w:line="240" w:lineRule="auto"/>
-              <w:jc w:val="center"/>
             </w:pPr>
             <w:r>
               <w:rPr>
@@ -26182,8 +25602,6 @@
           <w:p>
             <w:pPr>
               <w:pStyle w:val="TableCell"/>
-              <w:spacing w:line="240" w:lineRule="auto"/>
-              <w:jc w:val="center"/>
             </w:pPr>
             <w:r>
               <w:rPr>
@@ -26206,8 +25624,6 @@
           <w:p>
             <w:pPr>
               <w:pStyle w:val="TableCell"/>
-              <w:spacing w:line="240" w:lineRule="auto"/>
-              <w:jc w:val="center"/>
             </w:pPr>
             <w:r>
               <w:rPr>
@@ -26233,8 +25649,6 @@
           <w:p>
             <w:pPr>
               <w:pStyle w:val="TableCell"/>
-              <w:spacing w:line="240" w:lineRule="auto"/>
-              <w:jc w:val="center"/>
             </w:pPr>
             <w:r>
               <w:rPr>
@@ -26252,8 +25666,6 @@
           <w:p>
             <w:pPr>
               <w:pStyle w:val="TableCell"/>
-              <w:spacing w:line="240" w:lineRule="auto"/>
-              <w:jc w:val="center"/>
             </w:pPr>
             <w:r>
               <w:rPr>
@@ -26271,8 +25683,6 @@
           <w:p>
             <w:pPr>
               <w:pStyle w:val="TableCell"/>
-              <w:spacing w:line="240" w:lineRule="auto"/>
-              <w:jc w:val="center"/>
             </w:pPr>
             <w:r>
               <w:rPr>
@@ -26296,8 +25706,6 @@
           <w:p>
             <w:pPr>
               <w:pStyle w:val="TableCell"/>
-              <w:spacing w:line="240" w:lineRule="auto"/>
-              <w:jc w:val="center"/>
             </w:pPr>
             <w:r>
               <w:rPr>
@@ -26315,8 +25723,6 @@
           <w:p>
             <w:pPr>
               <w:pStyle w:val="TableCell"/>
-              <w:spacing w:line="240" w:lineRule="auto"/>
-              <w:jc w:val="center"/>
             </w:pPr>
             <w:r>
               <w:rPr>
@@ -26334,8 +25740,6 @@
           <w:p>
             <w:pPr>
               <w:pStyle w:val="TableCell"/>
-              <w:spacing w:line="240" w:lineRule="auto"/>
-              <w:jc w:val="center"/>
             </w:pPr>
             <w:r>
               <w:rPr>
@@ -26359,8 +25763,6 @@
           <w:p>
             <w:pPr>
               <w:pStyle w:val="TableCell"/>
-              <w:spacing w:line="240" w:lineRule="auto"/>
-              <w:jc w:val="center"/>
             </w:pPr>
             <w:r>
               <w:rPr>
@@ -26392,8 +25794,6 @@
           <w:p>
             <w:pPr>
               <w:pStyle w:val="TableCell"/>
-              <w:spacing w:line="240" w:lineRule="auto"/>
-              <w:jc w:val="center"/>
             </w:pPr>
             <w:r>
               <w:rPr>
@@ -26411,8 +25811,6 @@
           <w:p>
             <w:pPr>
               <w:pStyle w:val="TableCell"/>
-              <w:spacing w:line="240" w:lineRule="auto"/>
-              <w:jc w:val="center"/>
             </w:pPr>
             <w:r>
               <w:rPr>
@@ -26436,8 +25834,6 @@
           <w:p>
             <w:pPr>
               <w:pStyle w:val="TableCell"/>
-              <w:spacing w:line="240" w:lineRule="auto"/>
-              <w:jc w:val="center"/>
             </w:pPr>
             <w:r>
               <w:rPr>
@@ -26455,8 +25851,6 @@
           <w:p>
             <w:pPr>
               <w:pStyle w:val="TableCell"/>
-              <w:spacing w:line="240" w:lineRule="auto"/>
-              <w:jc w:val="center"/>
             </w:pPr>
             <w:r>
               <w:rPr>
@@ -26474,8 +25868,6 @@
           <w:p>
             <w:pPr>
               <w:pStyle w:val="TableCell"/>
-              <w:spacing w:line="240" w:lineRule="auto"/>
-              <w:jc w:val="center"/>
             </w:pPr>
             <w:r>
               <w:rPr>
@@ -26499,8 +25891,6 @@
           <w:p>
             <w:pPr>
               <w:pStyle w:val="TableCell"/>
-              <w:spacing w:line="240" w:lineRule="auto"/>
-              <w:jc w:val="center"/>
             </w:pPr>
             <w:r>
               <w:rPr>
@@ -26520,8 +25910,6 @@
           <w:p>
             <w:pPr>
               <w:pStyle w:val="TableCell"/>
-              <w:spacing w:line="240" w:lineRule="auto"/>
-              <w:jc w:val="center"/>
             </w:pPr>
             <w:r>
               <w:rPr>
@@ -26541,8 +25929,6 @@
           <w:p>
             <w:pPr>
               <w:pStyle w:val="TableCell"/>
-              <w:spacing w:line="240" w:lineRule="auto"/>
-              <w:jc w:val="center"/>
             </w:pPr>
             <w:r>
               <w:rPr>
@@ -26611,8 +25997,6 @@
           <w:p>
             <w:pPr>
               <w:pStyle w:val="TableCell"/>
-              <w:spacing w:line="240" w:lineRule="auto"/>
-              <w:jc w:val="center"/>
             </w:pPr>
             <w:r>
               <w:rPr>
@@ -26635,8 +26019,6 @@
           <w:p>
             <w:pPr>
               <w:pStyle w:val="TableCell"/>
-              <w:spacing w:line="240" w:lineRule="auto"/>
-              <w:jc w:val="center"/>
             </w:pPr>
             <w:r>
               <w:rPr>
@@ -26659,8 +26041,6 @@
           <w:p>
             <w:pPr>
               <w:pStyle w:val="TableCell"/>
-              <w:spacing w:line="240" w:lineRule="auto"/>
-              <w:jc w:val="center"/>
             </w:pPr>
             <w:r>
               <w:rPr>
@@ -26686,8 +26066,6 @@
           <w:p>
             <w:pPr>
               <w:pStyle w:val="TableCell"/>
-              <w:spacing w:line="240" w:lineRule="auto"/>
-              <w:jc w:val="center"/>
             </w:pPr>
             <w:r>
               <w:rPr>
@@ -26705,8 +26083,6 @@
           <w:p>
             <w:pPr>
               <w:pStyle w:val="TableCell"/>
-              <w:spacing w:line="240" w:lineRule="auto"/>
-              <w:jc w:val="center"/>
             </w:pPr>
             <w:r>
               <w:rPr>
@@ -26724,8 +26100,6 @@
           <w:p>
             <w:pPr>
               <w:pStyle w:val="TableCell"/>
-              <w:spacing w:line="240" w:lineRule="auto"/>
-              <w:jc w:val="center"/>
             </w:pPr>
             <w:r>
               <w:rPr>
@@ -26749,8 +26123,6 @@
           <w:p>
             <w:pPr>
               <w:pStyle w:val="TableCell"/>
-              <w:spacing w:line="240" w:lineRule="auto"/>
-              <w:jc w:val="center"/>
             </w:pPr>
             <w:r>
               <w:rPr>
@@ -26768,8 +26140,6 @@
           <w:p>
             <w:pPr>
               <w:pStyle w:val="TableCell"/>
-              <w:spacing w:line="240" w:lineRule="auto"/>
-              <w:jc w:val="center"/>
             </w:pPr>
             <w:r>
               <w:rPr>
@@ -26787,8 +26157,6 @@
           <w:p>
             <w:pPr>
               <w:pStyle w:val="TableCell"/>
-              <w:spacing w:line="240" w:lineRule="auto"/>
-              <w:jc w:val="center"/>
             </w:pPr>
             <w:r>
               <w:rPr>
@@ -26812,8 +26180,6 @@
           <w:p>
             <w:pPr>
               <w:pStyle w:val="TableCell"/>
-              <w:spacing w:line="240" w:lineRule="auto"/>
-              <w:jc w:val="center"/>
             </w:pPr>
             <w:r>
               <w:rPr>
@@ -26831,8 +26197,6 @@
           <w:p>
             <w:pPr>
               <w:pStyle w:val="TableCell"/>
-              <w:spacing w:line="240" w:lineRule="auto"/>
-              <w:jc w:val="center"/>
             </w:pPr>
             <w:r>
               <w:rPr>
@@ -26852,8 +26216,6 @@
           <w:p>
             <w:pPr>
               <w:pStyle w:val="TableCell"/>
-              <w:spacing w:line="240" w:lineRule="auto"/>
-              <w:jc w:val="center"/>
             </w:pPr>
             <w:r>
               <w:rPr>
@@ -26877,8 +26239,6 @@
           <w:p>
             <w:pPr>
               <w:pStyle w:val="TableCell"/>
-              <w:spacing w:line="240" w:lineRule="auto"/>
-              <w:jc w:val="center"/>
             </w:pPr>
             <w:r>
               <w:rPr>
@@ -26896,8 +26256,6 @@
           <w:p>
             <w:pPr>
               <w:pStyle w:val="TableCell"/>
-              <w:spacing w:line="240" w:lineRule="auto"/>
-              <w:jc w:val="center"/>
             </w:pPr>
             <w:r>
               <w:rPr>
@@ -26915,8 +26273,6 @@
           <w:p>
             <w:pPr>
               <w:pStyle w:val="TableCell"/>
-              <w:spacing w:line="240" w:lineRule="auto"/>
-              <w:jc w:val="center"/>
             </w:pPr>
             <w:r>
               <w:rPr>
@@ -27653,8 +27009,6 @@
           <w:p>
             <w:pPr>
               <w:pStyle w:val="TableCell"/>
-              <w:spacing w:line="240" w:lineRule="auto"/>
-              <w:jc w:val="center"/>
             </w:pPr>
             <w:r>
               <w:rPr>
@@ -27677,8 +27031,6 @@
           <w:p>
             <w:pPr>
               <w:pStyle w:val="TableCell"/>
-              <w:spacing w:line="240" w:lineRule="auto"/>
-              <w:jc w:val="center"/>
             </w:pPr>
             <w:r>
               <w:rPr>
@@ -27704,8 +27056,6 @@
           <w:p>
             <w:pPr>
               <w:pStyle w:val="TableCell"/>
-              <w:spacing w:line="240" w:lineRule="auto"/>
-              <w:jc w:val="center"/>
             </w:pPr>
             <w:r>
               <w:rPr>
@@ -27723,8 +27073,6 @@
           <w:p>
             <w:pPr>
               <w:pStyle w:val="TableCell"/>
-              <w:spacing w:line="240" w:lineRule="auto"/>
-              <w:jc w:val="center"/>
             </w:pPr>
             <w:r>
               <w:rPr>
@@ -27762,8 +27110,6 @@
           <w:p>
             <w:pPr>
               <w:pStyle w:val="TableCell"/>
-              <w:spacing w:line="240" w:lineRule="auto"/>
-              <w:jc w:val="center"/>
             </w:pPr>
             <w:r>
               <w:rPr>
@@ -27781,8 +27127,6 @@
           <w:p>
             <w:pPr>
               <w:pStyle w:val="TableCell"/>
-              <w:spacing w:line="240" w:lineRule="auto"/>
-              <w:jc w:val="center"/>
             </w:pPr>
             <w:r>
               <w:rPr>
@@ -27806,8 +27150,6 @@
           <w:p>
             <w:pPr>
               <w:pStyle w:val="TableCell"/>
-              <w:spacing w:line="240" w:lineRule="auto"/>
-              <w:jc w:val="center"/>
             </w:pPr>
             <w:r>
               <w:rPr>
@@ -27825,8 +27167,6 @@
           <w:p>
             <w:pPr>
               <w:pStyle w:val="TableCell"/>
-              <w:spacing w:line="240" w:lineRule="auto"/>
-              <w:jc w:val="center"/>
             </w:pPr>
             <w:r>
               <w:rPr>
@@ -27850,8 +27190,6 @@
           <w:p>
             <w:pPr>
               <w:pStyle w:val="TableCell"/>
-              <w:spacing w:line="240" w:lineRule="auto"/>
-              <w:jc w:val="center"/>
             </w:pPr>
             <w:r>
               <w:rPr>
@@ -27869,8 +27207,6 @@
           <w:p>
             <w:pPr>
               <w:pStyle w:val="TableCell"/>
-              <w:spacing w:line="240" w:lineRule="auto"/>
-              <w:jc w:val="center"/>
             </w:pPr>
             <w:r>
               <w:rPr>
@@ -27908,8 +27244,6 @@
           <w:p>
             <w:pPr>
               <w:pStyle w:val="TableCell"/>
-              <w:spacing w:line="240" w:lineRule="auto"/>
-              <w:jc w:val="center"/>
             </w:pPr>
             <w:r>
               <w:rPr>
@@ -27927,8 +27261,6 @@
           <w:p>
             <w:pPr>
               <w:pStyle w:val="TableCell"/>
-              <w:spacing w:line="240" w:lineRule="auto"/>
-              <w:jc w:val="center"/>
             </w:pPr>
             <w:r>
               <w:rPr>
@@ -27952,8 +27284,6 @@
           <w:p>
             <w:pPr>
               <w:pStyle w:val="TableCell"/>
-              <w:spacing w:line="240" w:lineRule="auto"/>
-              <w:jc w:val="center"/>
             </w:pPr>
             <w:r>
               <w:rPr>
@@ -27971,8 +27301,6 @@
           <w:p>
             <w:pPr>
               <w:pStyle w:val="TableCell"/>
-              <w:spacing w:line="240" w:lineRule="auto"/>
-              <w:jc w:val="center"/>
             </w:pPr>
             <w:r>
               <w:rPr>
@@ -27996,8 +27324,6 @@
           <w:p>
             <w:pPr>
               <w:pStyle w:val="TableCell"/>
-              <w:spacing w:line="240" w:lineRule="auto"/>
-              <w:jc w:val="center"/>
             </w:pPr>
             <w:r>
               <w:rPr>
@@ -28017,8 +27343,6 @@
           <w:p>
             <w:pPr>
               <w:pStyle w:val="TableCell"/>
-              <w:spacing w:line="240" w:lineRule="auto"/>
-              <w:jc w:val="center"/>
             </w:pPr>
             <w:r>
               <w:rPr>
@@ -28044,8 +27368,6 @@
           <w:p>
             <w:pPr>
               <w:pStyle w:val="TableCell"/>
-              <w:spacing w:line="240" w:lineRule="auto"/>
-              <w:jc w:val="center"/>
             </w:pPr>
             <w:r>
               <w:rPr>
@@ -28065,8 +27387,6 @@
           <w:p>
             <w:pPr>
               <w:pStyle w:val="TableCell"/>
-              <w:spacing w:line="240" w:lineRule="auto"/>
-              <w:jc w:val="center"/>
             </w:pPr>
             <w:r>
               <w:rPr>
@@ -28092,8 +27412,6 @@
           <w:p>
             <w:pPr>
               <w:pStyle w:val="TableCell"/>
-              <w:spacing w:line="240" w:lineRule="auto"/>
-              <w:jc w:val="center"/>
             </w:pPr>
             <w:r>
               <w:rPr>
@@ -28101,14 +27419,12 @@
               </w:rPr>
               <w:t xml:space="preserve">Feature </w:t>
             </w:r>
-            <w:proofErr w:type="spellStart"/>
             <w:r>
               <w:rPr>
                 <w:sz w:val="22"/>
               </w:rPr>
-              <w:t>importances</w:t>
-            </w:r>
-            <w:proofErr w:type="spellEnd"/>
+              <w:t>importance’s</w:t>
+            </w:r>
           </w:p>
         </w:tc>
         <w:tc>
@@ -28119,8 +27435,6 @@
           <w:p>
             <w:pPr>
               <w:pStyle w:val="TableCell"/>
-              <w:spacing w:line="240" w:lineRule="auto"/>
-              <w:jc w:val="center"/>
             </w:pPr>
             <w:r>
               <w:rPr>
@@ -28158,8 +27472,6 @@
           <w:p>
             <w:pPr>
               <w:pStyle w:val="TableCell"/>
-              <w:spacing w:line="240" w:lineRule="auto"/>
-              <w:jc w:val="center"/>
             </w:pPr>
             <w:r>
               <w:rPr>
@@ -28177,8 +27489,6 @@
           <w:p>
             <w:pPr>
               <w:pStyle w:val="TableCell"/>
-              <w:spacing w:line="240" w:lineRule="auto"/>
-              <w:jc w:val="center"/>
             </w:pPr>
             <w:r>
               <w:rPr>
@@ -28373,7 +27683,6 @@
               <w:jc w:val="center"/>
             </w:pPr>
             <w:r>
-              <w:lastRenderedPageBreak/>
               <w:t>Reproducibility</w:t>
             </w:r>
           </w:p>
@@ -28399,7 +27708,7 @@
       <w:pPr>
         <w:pStyle w:val="ChapterLabel"/>
       </w:pPr>
-      <w:bookmarkStart w:id="139" w:name="_Toc238621362"/>
+      <w:bookmarkStart w:id="138" w:name="_Toc238621362"/>
       <w:r>
         <w:rPr>
           <w:szCs w:val="28"/>
@@ -28407,33 +27716,33 @@
         <w:lastRenderedPageBreak/>
         <w:t>APPENDIX F</w:t>
       </w:r>
+      <w:bookmarkEnd w:id="138"/>
+    </w:p>
+    <w:p>
+      <w:pPr>
+        <w:pStyle w:val="ChapterTitle"/>
+      </w:pPr>
+      <w:bookmarkStart w:id="139" w:name="_Toc238621363"/>
+      <w:r>
+        <w:rPr>
+          <w:szCs w:val="28"/>
+        </w:rPr>
+        <w:t>SEEDED DRYING RUN IN FULL</w:t>
+      </w:r>
       <w:bookmarkEnd w:id="139"/>
     </w:p>
     <w:p>
       <w:pPr>
-        <w:pStyle w:val="ChapterTitle"/>
-      </w:pPr>
-      <w:bookmarkStart w:id="140" w:name="_Toc238621363"/>
-      <w:r>
-        <w:rPr>
-          <w:szCs w:val="28"/>
-        </w:rPr>
-        <w:t>SEEDED DRYING RUN IN FULL</w:t>
+        <w:pStyle w:val="TableCaption"/>
+      </w:pPr>
+      <w:bookmarkStart w:id="140" w:name="_Toc238621491"/>
+      <w:r>
+        <w:rPr>
+          <w:szCs w:val="24"/>
+        </w:rPr>
+        <w:t>Table F.1: Maize drying run, farm 26, as computed by the platform</w:t>
       </w:r>
       <w:bookmarkEnd w:id="140"/>
-    </w:p>
-    <w:p>
-      <w:pPr>
-        <w:pStyle w:val="TableCaption"/>
-      </w:pPr>
-      <w:bookmarkStart w:id="141" w:name="_Toc238621491"/>
-      <w:r>
-        <w:rPr>
-          <w:szCs w:val="24"/>
-        </w:rPr>
-        <w:t>Table F.1: Maize drying run, farm 26, as computed by the platform</w:t>
-      </w:r>
-      <w:bookmarkEnd w:id="141"/>
     </w:p>
     <w:tbl>
       <w:tblPr>
@@ -28478,8 +27787,6 @@
           <w:p>
             <w:pPr>
               <w:pStyle w:val="TableCell"/>
-              <w:spacing w:line="240" w:lineRule="auto"/>
-              <w:jc w:val="center"/>
             </w:pPr>
             <w:r>
               <w:rPr>
@@ -28502,8 +27809,6 @@
           <w:p>
             <w:pPr>
               <w:pStyle w:val="TableCell"/>
-              <w:spacing w:line="240" w:lineRule="auto"/>
-              <w:jc w:val="center"/>
             </w:pPr>
             <w:r>
               <w:rPr>
@@ -28529,8 +27834,6 @@
           <w:p>
             <w:pPr>
               <w:pStyle w:val="TableCell"/>
-              <w:spacing w:line="240" w:lineRule="auto"/>
-              <w:jc w:val="center"/>
             </w:pPr>
             <w:r>
               <w:rPr>
@@ -28548,8 +27851,6 @@
           <w:p>
             <w:pPr>
               <w:pStyle w:val="TableCell"/>
-              <w:spacing w:line="240" w:lineRule="auto"/>
-              <w:jc w:val="center"/>
             </w:pPr>
             <w:r>
               <w:rPr>
@@ -28573,8 +27874,6 @@
           <w:p>
             <w:pPr>
               <w:pStyle w:val="TableCell"/>
-              <w:spacing w:line="240" w:lineRule="auto"/>
-              <w:jc w:val="center"/>
             </w:pPr>
             <w:r>
               <w:rPr>
@@ -28592,8 +27891,6 @@
           <w:p>
             <w:pPr>
               <w:pStyle w:val="TableCell"/>
-              <w:spacing w:line="240" w:lineRule="auto"/>
-              <w:jc w:val="center"/>
             </w:pPr>
             <w:r>
               <w:rPr>
@@ -28617,8 +27914,6 @@
           <w:p>
             <w:pPr>
               <w:pStyle w:val="TableCell"/>
-              <w:spacing w:line="240" w:lineRule="auto"/>
-              <w:jc w:val="center"/>
             </w:pPr>
             <w:r>
               <w:rPr>
@@ -28636,8 +27931,6 @@
           <w:p>
             <w:pPr>
               <w:pStyle w:val="TableCell"/>
-              <w:spacing w:line="240" w:lineRule="auto"/>
-              <w:jc w:val="center"/>
             </w:pPr>
             <w:r>
               <w:rPr>
@@ -28661,8 +27954,6 @@
           <w:p>
             <w:pPr>
               <w:pStyle w:val="TableCell"/>
-              <w:spacing w:line="240" w:lineRule="auto"/>
-              <w:jc w:val="center"/>
             </w:pPr>
             <w:r>
               <w:rPr>
@@ -28680,8 +27971,6 @@
           <w:p>
             <w:pPr>
               <w:pStyle w:val="TableCell"/>
-              <w:spacing w:line="240" w:lineRule="auto"/>
-              <w:jc w:val="center"/>
             </w:pPr>
             <w:r>
               <w:rPr>
@@ -28705,8 +27994,6 @@
           <w:p>
             <w:pPr>
               <w:pStyle w:val="TableCell"/>
-              <w:spacing w:line="240" w:lineRule="auto"/>
-              <w:jc w:val="center"/>
             </w:pPr>
             <w:r>
               <w:rPr>
@@ -28724,8 +28011,6 @@
           <w:p>
             <w:pPr>
               <w:pStyle w:val="TableCell"/>
-              <w:spacing w:line="240" w:lineRule="auto"/>
-              <w:jc w:val="center"/>
             </w:pPr>
             <w:r>
               <w:rPr>
@@ -28749,8 +28034,6 @@
           <w:p>
             <w:pPr>
               <w:pStyle w:val="TableCell"/>
-              <w:spacing w:line="240" w:lineRule="auto"/>
-              <w:jc w:val="center"/>
             </w:pPr>
             <w:r>
               <w:rPr>
@@ -28768,8 +28051,6 @@
           <w:p>
             <w:pPr>
               <w:pStyle w:val="TableCell"/>
-              <w:spacing w:line="240" w:lineRule="auto"/>
-              <w:jc w:val="center"/>
             </w:pPr>
             <w:r>
               <w:rPr>
@@ -28793,8 +28074,6 @@
           <w:p>
             <w:pPr>
               <w:pStyle w:val="TableCell"/>
-              <w:spacing w:line="240" w:lineRule="auto"/>
-              <w:jc w:val="center"/>
             </w:pPr>
             <w:r>
               <w:rPr>
@@ -28812,8 +28091,6 @@
           <w:p>
             <w:pPr>
               <w:pStyle w:val="TableCell"/>
-              <w:spacing w:line="240" w:lineRule="auto"/>
-              <w:jc w:val="center"/>
             </w:pPr>
             <w:r>
               <w:rPr>
@@ -28837,8 +28114,6 @@
           <w:p>
             <w:pPr>
               <w:pStyle w:val="TableCell"/>
-              <w:spacing w:line="240" w:lineRule="auto"/>
-              <w:jc w:val="center"/>
             </w:pPr>
             <w:r>
               <w:rPr>
@@ -28856,8 +28131,6 @@
           <w:p>
             <w:pPr>
               <w:pStyle w:val="TableCell"/>
-              <w:spacing w:line="240" w:lineRule="auto"/>
-              <w:jc w:val="center"/>
             </w:pPr>
             <w:r>
               <w:rPr>
@@ -28865,6 +28138,8 @@
               </w:rPr>
               <w:t>14.08 kg</w:t>
             </w:r>
+            <w:bookmarkStart w:id="141" w:name="_GoBack"/>
+            <w:bookmarkEnd w:id="141"/>
           </w:p>
         </w:tc>
       </w:tr>
@@ -28881,8 +28156,6 @@
           <w:p>
             <w:pPr>
               <w:pStyle w:val="TableCell"/>
-              <w:spacing w:line="240" w:lineRule="auto"/>
-              <w:jc w:val="center"/>
             </w:pPr>
             <w:r>
               <w:rPr>
@@ -28900,8 +28173,6 @@
           <w:p>
             <w:pPr>
               <w:pStyle w:val="TableCell"/>
-              <w:spacing w:line="240" w:lineRule="auto"/>
-              <w:jc w:val="center"/>
             </w:pPr>
             <w:r>
               <w:rPr>
@@ -28925,8 +28196,6 @@
           <w:p>
             <w:pPr>
               <w:pStyle w:val="TableCell"/>
-              <w:spacing w:line="240" w:lineRule="auto"/>
-              <w:jc w:val="center"/>
             </w:pPr>
             <w:r>
               <w:rPr>
@@ -28944,8 +28213,6 @@
           <w:p>
             <w:pPr>
               <w:pStyle w:val="TableCell"/>
-              <w:spacing w:line="240" w:lineRule="auto"/>
-              <w:jc w:val="center"/>
             </w:pPr>
             <w:r>
               <w:rPr>
@@ -28969,8 +28236,6 @@
           <w:p>
             <w:pPr>
               <w:pStyle w:val="TableCell"/>
-              <w:spacing w:line="240" w:lineRule="auto"/>
-              <w:jc w:val="center"/>
             </w:pPr>
             <w:r>
               <w:rPr>
@@ -28988,8 +28253,6 @@
           <w:p>
             <w:pPr>
               <w:pStyle w:val="TableCell"/>
-              <w:spacing w:line="240" w:lineRule="auto"/>
-              <w:jc w:val="center"/>
             </w:pPr>
             <w:r>
               <w:rPr>
@@ -29013,8 +28276,6 @@
           <w:p>
             <w:pPr>
               <w:pStyle w:val="TableCell"/>
-              <w:spacing w:line="240" w:lineRule="auto"/>
-              <w:jc w:val="center"/>
             </w:pPr>
             <w:r>
               <w:rPr>
@@ -29032,8 +28293,6 @@
           <w:p>
             <w:pPr>
               <w:pStyle w:val="TableCell"/>
-              <w:spacing w:line="240" w:lineRule="auto"/>
-              <w:jc w:val="center"/>
             </w:pPr>
             <w:r>
               <w:rPr>
@@ -29057,8 +28316,6 @@
           <w:p>
             <w:pPr>
               <w:pStyle w:val="TableCell"/>
-              <w:spacing w:line="240" w:lineRule="auto"/>
-              <w:jc w:val="center"/>
             </w:pPr>
             <w:r>
               <w:rPr>
@@ -29076,8 +28333,6 @@
           <w:p>
             <w:pPr>
               <w:pStyle w:val="TableCell"/>
-              <w:spacing w:line="240" w:lineRule="auto"/>
-              <w:jc w:val="center"/>
             </w:pPr>
             <w:r>
               <w:rPr>
@@ -29101,8 +28356,6 @@
           <w:p>
             <w:pPr>
               <w:pStyle w:val="TableCell"/>
-              <w:spacing w:line="240" w:lineRule="auto"/>
-              <w:jc w:val="center"/>
             </w:pPr>
             <w:r>
               <w:rPr>
@@ -29120,8 +28373,6 @@
           <w:p>
             <w:pPr>
               <w:pStyle w:val="TableCell"/>
-              <w:spacing w:line="240" w:lineRule="auto"/>
-              <w:jc w:val="center"/>
             </w:pPr>
             <w:r>
               <w:rPr>
@@ -29145,8 +28396,6 @@
           <w:p>
             <w:pPr>
               <w:pStyle w:val="TableCell"/>
-              <w:spacing w:line="240" w:lineRule="auto"/>
-              <w:jc w:val="center"/>
             </w:pPr>
             <w:r>
               <w:rPr>
@@ -29164,8 +28413,6 @@
           <w:p>
             <w:pPr>
               <w:pStyle w:val="TableCell"/>
-              <w:spacing w:line="240" w:lineRule="auto"/>
-              <w:jc w:val="center"/>
             </w:pPr>
             <w:r>
               <w:rPr>
@@ -29217,10 +28464,10 @@
         <w:tblLook w:val="04A0" w:firstRow="1" w:lastRow="0" w:firstColumn="1" w:lastColumn="0" w:noHBand="0" w:noVBand="1"/>
       </w:tblPr>
       <w:tblGrid>
-        <w:gridCol w:w="1106"/>
-        <w:gridCol w:w="3598"/>
-        <w:gridCol w:w="960"/>
-        <w:gridCol w:w="2840"/>
+        <w:gridCol w:w="1134"/>
+        <w:gridCol w:w="3690"/>
+        <w:gridCol w:w="985"/>
+        <w:gridCol w:w="2912"/>
       </w:tblGrid>
       <w:tr>
         <w:trPr>
@@ -29864,7 +29111,7 @@
         <w:noProof/>
         <w:szCs w:val="24"/>
       </w:rPr>
-      <w:t>93</w:t>
+      <w:t>118</w:t>
     </w:r>
     <w:r>
       <w:rPr>
@@ -42249,7 +41496,7 @@
 </file>
 
 <file path=customXml/itemProps1.xml><?xml version="1.0" encoding="utf-8"?>
-<ds:datastoreItem xmlns:ds="http://schemas.openxmlformats.org/officeDocument/2006/customXml" ds:itemID="{D42C5DD5-BF1F-440E-B8F9-C5959635DE90}">
+<ds:datastoreItem xmlns:ds="http://schemas.openxmlformats.org/officeDocument/2006/customXml" ds:itemID="{8395E60A-9281-47C0-A8D0-813B16650644}">
   <ds:schemaRefs>
     <ds:schemaRef ds:uri="http://schemas.openxmlformats.org/officeDocument/2006/bibliography"/>
   </ds:schemaRefs>

</xml_diff>

<commit_message>
docs(thesis): reduce the summary triangle across 4.15, 5.1.2 and 5.2.4
Summary triangle reduced — §4.15 cut from 616 to 280 words, §5.2.4 from
573 to 305, §5.1.2 from 555 to 513; restatement of Chapter 4 removed
while sole-source material, framing and bridges retained; every deleted
figure verified present elsewhere; para 604's reference to Section 4.15
still resolves.

Co-Authored-By: Claude Opus 5 <noreply@anthropic.com>
Claude-Session: https://claude.ai/code/session_011P7xNiUBbxrtAuKry16MD1
</commit_message>
<xml_diff>
--- a/Thesis_Ch1-5_with_figures.docx
+++ b/Thesis_Ch1-5_with_figures.docx
@@ -20124,65 +20124,10 @@
         <w:rPr>
           <w:szCs w:val="24"/>
         </w:rPr>
-        <w:t>The deterministic decision-support layer computes from</w:t>
-      </w:r>
-      <w:r>
-        <w:rPr>
-          <w:szCs w:val="24"/>
-        </w:rPr>
-        <w:t xml:space="preserve"> a live ledger nine quantities</w:t>
-      </w:r>
-      <w:r>
-        <w:rPr>
-          <w:szCs w:val="24"/>
-        </w:rPr>
-        <w:t xml:space="preserve"> per-crop gross margin and its ranking; unit cost of production on a harvested-mass basis; unit cost of production on a marketable-mass basis where a drying run exists; retrospective break-even yield; cost structure classified by economic </w:t>
-      </w:r>
-      <w:proofErr w:type="spellStart"/>
-      <w:r>
-        <w:rPr>
-          <w:szCs w:val="24"/>
-        </w:rPr>
-        <w:t>behaviour</w:t>
-      </w:r>
-      <w:proofErr w:type="spellEnd"/>
-      <w:r>
-        <w:rPr>
-          <w:szCs w:val="24"/>
-        </w:rPr>
-        <w:t xml:space="preserve"> with an explicit classification-coverage figure; a derived fixed-cost overlay and its proportional allocation; break-even price on a cash and on a total-cost basis; a yield-sensitivity </w:t>
-      </w:r>
-      <w:r>
-        <w:rPr>
-          <w:szCs w:val="24"/>
-        </w:rPr>
-        <w:lastRenderedPageBreak/>
-        <w:t>matrix; a</w:t>
-      </w:r>
-      <w:r>
-        <w:rPr>
-          <w:szCs w:val="24"/>
-        </w:rPr>
-        <w:t xml:space="preserve">nd an operating-expense ratio </w:t>
-      </w:r>
-      <w:r>
-        <w:rPr>
-          <w:szCs w:val="24"/>
-        </w:rPr>
-        <w:t>together with a partial-budget calculator and an Olympic-average yield baseline, netting reversed pairs at farm level and per crop alike, and withholds each figure where its inputs are insufficient rather than substituting a plausible default. All six enterprise endpoints are reachable in the interface. Two independent implementations of the partial budget agree on eight hand-computed cases. The post-harvest module recover</w:t>
-      </w:r>
-      <w:r>
-        <w:rPr>
-          <w:szCs w:val="24"/>
-        </w:rPr>
-        <w:t xml:space="preserve">s known thin-layer parameters (k = 0.30 and n = 0.75) </w:t>
-      </w:r>
-      <w:r>
-        <w:rPr>
-          <w:szCs w:val="24"/>
-        </w:rPr>
-        <w:t>to within one part in ten thousand, keeps water removed distinct from matter lost, and connects a moisture measurement to a price per marketable kilogram in a single computed chain, moving maize from ₦35.00 to ₦41.67 per kilogram, a 19% difference that is post-harvest mass reduction expressed in money.</w:t>
-      </w:r>
+        <w:t>The deterministic decision-support layer and the post-harvest module are reported in full at Sections 4.2 to 4.6, and the evidence each produced is set against the objectives it answers in Table 4.12.</w:t>
+      </w:r>
+      <w:proofErr w:type="spellStart"/>
+      <w:proofErr w:type="spellEnd"/>
     </w:p>
     <w:p>
       <w:pPr>
@@ -20192,86 +20137,14 @@
         <w:rPr>
           <w:szCs w:val="24"/>
         </w:rPr>
-        <w:t>Under simulated throttling, the service worker reduces network transfer on a repeat visit from 139,245 bytes over eight req</w:t>
-      </w:r>
-      <w:r>
-        <w:rPr>
-          <w:szCs w:val="24"/>
-        </w:rPr>
-        <w:t xml:space="preserve">uests to 127 bytes over seven </w:t>
-      </w:r>
-      <w:r>
-        <w:rPr>
-          <w:szCs w:val="24"/>
-        </w:rPr>
-        <w:t>the residue being the man</w:t>
-      </w:r>
-      <w:r>
-        <w:rPr>
-          <w:szCs w:val="24"/>
-        </w:rPr>
-        <w:t xml:space="preserve">ifest icon, a measured defect </w:t>
-      </w:r>
-      <w:r>
-        <w:rPr>
-          <w:szCs w:val="24"/>
-        </w:rPr>
-        <w:t xml:space="preserve">and reduces first paint by a factor of about eighty, from 5,661.2 </w:t>
-      </w:r>
-      <w:proofErr w:type="spellStart"/>
-      <w:r>
-        <w:rPr>
-          <w:szCs w:val="24"/>
-        </w:rPr>
-        <w:t>ms</w:t>
-      </w:r>
-      <w:proofErr w:type="spellEnd"/>
-      <w:r>
-        <w:rPr>
-          <w:szCs w:val="24"/>
-        </w:rPr>
-        <w:t xml:space="preserve"> to 70.6 </w:t>
-      </w:r>
-      <w:proofErr w:type="spellStart"/>
-      <w:r>
-        <w:rPr>
-          <w:szCs w:val="24"/>
-        </w:rPr>
-        <w:t>ms</w:t>
-      </w:r>
-      <w:proofErr w:type="spellEnd"/>
-      <w:r>
-        <w:rPr>
-          <w:szCs w:val="24"/>
-        </w:rPr>
-        <w:t xml:space="preserve">, though time to main content improves by a factor of about three and a half, and that is the figure a user experiences. Measured resource consumption places the two exercised containers at 178.9 to 202.8 </w:t>
-      </w:r>
-      <w:proofErr w:type="spellStart"/>
-      <w:r>
-        <w:rPr>
-          <w:szCs w:val="24"/>
-        </w:rPr>
-        <w:t>MiB</w:t>
-      </w:r>
-      <w:proofErr w:type="spellEnd"/>
-      <w:r>
-        <w:rPr>
-          <w:szCs w:val="24"/>
-        </w:rPr>
-        <w:t xml:space="preserve">, supporting an estimated $15.40, approximately ₦20,950, per month and a reasoned cost per farm falling to ₦105 </w:t>
-      </w:r>
-      <w:r>
-        <w:rPr>
-          <w:szCs w:val="24"/>
-        </w:rPr>
-        <w:t xml:space="preserve">at a two-hundred-farm tenancy </w:t>
-      </w:r>
-      <w:r>
-        <w:rPr>
-          <w:szCs w:val="24"/>
-        </w:rPr>
-        <w:t>a cost structure that scales in the opposite direction to the per-seat licensing identified in Chapter One as excluding this user.</w:t>
-      </w:r>
+        <w:t>Under simulated throttling the service worker reduces network transfer on a repeat visit from 139,245 bytes over eight requests to 127 bytes over seven, the residue being the manifest icon, a measured defect. First paint falls by a factor of about eighty, but time to main content improves by a factor of about three and a half, and that is the figure a user experiences.</w:t>
+      </w:r>
+      <w:proofErr w:type="spellStart"/>
+      <w:proofErr w:type="spellEnd"/>
+      <w:proofErr w:type="spellStart"/>
+      <w:proofErr w:type="spellEnd"/>
+      <w:proofErr w:type="spellStart"/>
+      <w:proofErr w:type="spellEnd"/>
     </w:p>
     <w:p>
       <w:pPr>
@@ -20281,26 +20154,7 @@
         <w:rPr>
           <w:szCs w:val="24"/>
         </w:rPr>
-        <w:t xml:space="preserve">The security and tenancy boundary is exercised as well as asserted: three roles over eleven named permissions refuse a worker the farm’s financial picture and refuse a manager the power to disclose it; share links expire at ninety days, are stored only as hashes, and revoke to a verdict indistinguishable from that for a token that never existed; the raw token reaches none of the three logs that record its request; failed logins </w:t>
-      </w:r>
-      <w:r>
-        <w:rPr>
-          <w:szCs w:val="24"/>
-        </w:rPr>
-        <w:lastRenderedPageBreak/>
-        <w:t>are throttled; the migration chain runs and rolls back against real PostgreSQL; and a backup was taken and restored with every row count matching and the paired-write invariant intact. Against all of that, the yield forecast is an in-distribution resu</w:t>
-      </w:r>
-      <w:r>
-        <w:rPr>
-          <w:szCs w:val="24"/>
-        </w:rPr>
-        <w:t xml:space="preserve">lt on synthetic data, </w:t>
-      </w:r>
-      <w:r>
-        <w:rPr>
-          <w:szCs w:val="24"/>
-        </w:rPr>
-        <w:t>R² 0.9762, MAE 0.2414 t/ha, RMSE 0.4883 t/ha, reproducible to six decimal places and evidence about the pipeline rather than about Nigerian yields; the platform has a production path that has been demonstrated but has never served a real user; no independent security assessment exists; and the usability strand was specified and not executed, leaving Objective 4 partially achieved. Chapter Five interprets these results against the problem set out in Chapter One, states the platform’s limitations in full, and sets out what would be required to take it from a verified prototype to a deployed system.</w:t>
+        <w:t>The security and tenancy boundary is exercised as well as asserted, and is reported with its residuals at Section 4.11 and in Tables B.1 and B.2; the standing caveats — synthetic training data for the forecast tier, a production path demonstrated but never deployed, no independent security assessment, and a usability strand specified and not executed — are stated at Sections 4.7, 4.12 and 4.14. Chapter Five interprets these results against the problem set out in Chapter One, states the platform’s limitations in full, and sets out what would be required to take it from a verified prototype to a deployed system.</w:t>
       </w:r>
     </w:p>
     <w:p>
@@ -20500,48 +20354,24 @@
         <w:pStyle w:val="BodyPara"/>
       </w:pPr>
       <w:r>
-        <w:t xml:space="preserve">Operation under constraint. Under simulated slow-3G throttling a cold load transfers 139,245 bytes over eight requests and reaches first paint at 5,661.2 </w:t>
-      </w:r>
-      <w:proofErr w:type="spellStart"/>
-      <w:r>
-        <w:t>ms</w:t>
-      </w:r>
-      <w:proofErr w:type="spellEnd"/>
-      <w:r>
-        <w:t xml:space="preserve">; a warm load transfers 127 bytes over seven requests and reaches first paint at 70.6 </w:t>
-      </w:r>
-      <w:proofErr w:type="spellStart"/>
-      <w:r>
-        <w:t>ms.</w:t>
-      </w:r>
-      <w:proofErr w:type="spellEnd"/>
-      <w:r>
-        <w:t xml:space="preserve"> Two exercised containers consume 178.9 to 202.8 </w:t>
-      </w:r>
-      <w:proofErr w:type="spellStart"/>
-      <w:r>
-        <w:t>MiB</w:t>
-      </w:r>
-      <w:proofErr w:type="spellEnd"/>
-      <w:r>
-        <w:t>, supporting an estimated $15.40, approximately ₦20,950, per month and a reasoned ₦105 per farm per month at a two-hundred-farm tenancy.</w:t>
-      </w:r>
+        <w:t>Operation under constraint. Under simulated slow-3G throttling a cold load transfers 139,245 bytes over eight requests and reaches first paint at 5,661.2 ms; a warm load transfers 127 bytes over seven requests and reaches first paint at 70.6 ms. The operating-cost estimate anchored on the platform’s measured resource consumption is reported at Section 4.10 and in Appendix C.</w:t>
+      </w:r>
+      <w:proofErr w:type="spellStart"/>
+      <w:proofErr w:type="spellEnd"/>
+      <w:proofErr w:type="spellStart"/>
+      <w:proofErr w:type="spellEnd"/>
+      <w:proofErr w:type="spellStart"/>
+      <w:proofErr w:type="spellEnd"/>
     </w:p>
     <w:p>
       <w:pPr>
         <w:pStyle w:val="BodyPara"/>
       </w:pPr>
       <w:r>
-        <w:t xml:space="preserve">Security and the deployment path. Role-based </w:t>
-      </w:r>
-      <w:proofErr w:type="spellStart"/>
-      <w:r>
-        <w:t>authorisation</w:t>
-      </w:r>
-      <w:proofErr w:type="spellEnd"/>
-      <w:r>
-        <w:t xml:space="preserve"> over three roles and eleven named permissions was exercised live, with the permission check preceding the farm-scope check so that a refusal is never an existence oracle; login throttling returned 429 on the eleventh failure within the window without naming an account; share tokens were verified to expire at ninety days, to be stored only as hashes, to be refused as bearer credentials, and to resolve unknown, revoked and expired alike to one identical response; the raw token reached none of the three logs recording its request; monetary bounds rejected four out-of-range inputs; and a backup was taken and restored with every row count matching. The production composition was built, started and probed with seven of seven checks passing. No instance has served a real user.</w:t>
-      </w:r>
+        <w:t>Security and the deployment path. Role-based authorisation over three roles and eleven named permissions was exercised live, with the permission check preceding the farm-scope check so that a refusal is never an existence oracle; login throttling returned 429 on the eleventh failure within the window without naming an account; the raw token reached none of the three logs recording its request; monetary bounds rejected four out-of-range inputs; and a backup was taken and restored with every row count matching. The production composition was built, started and probed with seven of seven checks passing. No instance has served a real user.</w:t>
+      </w:r>
+      <w:proofErr w:type="spellStart"/>
+      <w:proofErr w:type="spellEnd"/>
     </w:p>
     <w:p>
       <w:pPr>
@@ -20978,45 +20808,7 @@
         <w:pStyle w:val="BodyPara"/>
       </w:pPr>
       <w:r>
-        <w:t xml:space="preserve">What this work establishes is definite. The paired-write ledger functions exactly as designed: on 29 August 2026, the live database maintained 109 operational logs against 109 financial transactions with zero unpaired records, proving the write-time invariant from Section 3.5 in real data rather than merely asserting it. The deterministic decision-support tier computes nine quantities directly from a farm's own records, and strictly withholds any output lacking sufficient input data rather than substituting a plausible default. The post-harvest module bridges agricultural processing with farm economics, linking a moisture measurement to a price per marketable kilogram in a single chain computed by the platform without manual intervention at any step, moving maize from </w:t>
-      </w:r>
-      <w:r>
-        <w:lastRenderedPageBreak/>
-        <w:t>₦35.00 to ₦41.67 per kilogram. This 19% difference is post-harvest mass reduction expressed in money, and the chain that produces it is the engineering contribution of this work. The offline-first architecture performs under constraint: under a simulated 0.4 Mbps network, a repeat application visit dropped from 139,245 bytes over eight requests to just 127 by</w:t>
-      </w:r>
-      <w:r>
-        <w:t xml:space="preserve">tes over seven. System security </w:t>
-      </w:r>
-      <w:r>
-        <w:t xml:space="preserve">including </w:t>
-      </w:r>
-      <w:proofErr w:type="spellStart"/>
-      <w:r>
-        <w:t>authorisation</w:t>
-      </w:r>
-      <w:proofErr w:type="spellEnd"/>
-      <w:r>
-        <w:t xml:space="preserve"> across three roles and eleven permissions, expiring hashed share tokens, login throttling, and credential scrubbing—was verified on the running stack.</w:t>
-      </w:r>
-    </w:p>
-    <w:p>
-      <w:pPr>
-        <w:pStyle w:val="BodyPara"/>
-      </w:pPr>
-      <w:r>
-        <w:t>What the work does not establish is equally definite. There has been no field trial, no real farmer data and no user evaluation; the usability strand of the specified evaluation is outstanding and Objective (</w:t>
-      </w:r>
-      <w:r>
-        <w:t>IV</w:t>
-      </w:r>
-      <w:r>
-        <w:t>) is therefore partially achieved. The forecast tier is trained on synthetic data and its reported accuracy is the recovery of a constructed relationship, not a claim about Nigerian yields. The data boundary is proven by tests and by probing a running stack, not by an independent security assessment, and the ledger is audit-trailed rather than cryptographically tamper-evident. The performance figures are modelled throttling against a local server rather than a field measurement. The feature-phone channel that would reach the 68% of rural Nigerians who lack smartphone ownership (Section 2.4.2) is not implemented in any form. And while the platform has a production deployment path that has been built, started, probed, backed up and restored, it has never been deployed to serve a real user, on a real d</w:t>
-      </w:r>
-      <w:r>
-        <w:t xml:space="preserve">omain, on a departmental host </w:t>
-      </w:r>
-      <w:r>
-        <w:t>which is a smaller claim than an earlier draft of this chapter made, and it is the one the evidence supports.</w:t>
+        <w:t>What the work does not establish is equally definite. There has been no field trial, no real farmer data and no user evaluation, so Objective (IV) is partially achieved; the forecast tier is trained on synthetic data and its reported accuracy is the recovery of a constructed relationship; the performance figures are modelled throttling against a local server rather than a field measurement; the data boundary is proven by tests and by probing a running stack rather than by an independent security assessment, and the ledger is audit-trailed rather than cryptographically tamper-evident; and the platform has never been deployed to serve a real user, on a real domain, on a departmental host.</w:t>
       </w:r>
     </w:p>
     <w:p>

</xml_diff>

<commit_message>
docs(thesis): em-dash and reference formatting, edited in Word
Made by the author directly in Microsoft Word, not by an agent.

- em-dash cleanup at 3.1 and 3.6.10, and in two reference entries
- tab formatting in four reference entries

Eight paragraphs in total; paragraph and table counts unchanged.
</commit_message>
<xml_diff>
--- a/Thesis_Ch1-5_with_figures.docx
+++ b/Thesis_Ch1-5_with_figures.docx
@@ -7238,7 +7238,31 @@
         <w:rPr>
           <w:szCs w:val="24"/>
         </w:rPr>
-        <w:t>This chapter presents the design and development methodology adopted for the AGRI-PROFIT platform and the methods used to evaluate it against the aim and objectives established in Chapter One. It describes the research and development approach, the requirements analysis, the overall system architecture, the unified data model, the design of each functional module, the security design, and the evaluation methodology. The chapter is written to describe the target architecture of the platform—that is, the complete system the design specifies—while stating explicitly, where relevant, which capabilities constitute the current release and which are deferred as future work. This distinction is maintained throughout so that the methodology remains an honest account of the system as designed and built.</w:t>
+        <w:t>This chapter presents the design and development methodology adopted for the AGRI-PROFIT platform and the methods used to evaluate it against the aim and objectives established in Chapter One. It describes the research and development approach, the requirements analysis, the overall system architecture, the unified data model, the design of each functional module, the security design, and the evaluation methodology. The chapter is written to describe the targ</w:t>
+      </w:r>
+      <w:r>
+        <w:rPr>
+          <w:szCs w:val="24"/>
+        </w:rPr>
+        <w:t xml:space="preserve">et architecture of the platform </w:t>
+      </w:r>
+      <w:r>
+        <w:rPr>
+          <w:szCs w:val="24"/>
+        </w:rPr>
+        <w:t>that is, the compl</w:t>
+      </w:r>
+      <w:r>
+        <w:rPr>
+          <w:szCs w:val="24"/>
+        </w:rPr>
+        <w:t xml:space="preserve">ete system the design specifies </w:t>
+      </w:r>
+      <w:r>
+        <w:rPr>
+          <w:szCs w:val="24"/>
+        </w:rPr>
+        <w:t>while stating explicitly, where relevant, which capabilities constitute the current release and which are deferred as future work. This distinction is maintained throughout so that the methodology remains an honest account of the system as designed and built.</w:t>
       </w:r>
     </w:p>
     <w:p>
@@ -8718,12 +8742,18 @@
           <w:bCs/>
           <w:szCs w:val="24"/>
         </w:rPr>
-        <w:t xml:space="preserve">Tier 3 – Statistical yield forecast (optional). A Random Forest </w:t>
+        <w:t xml:space="preserve">Tier 3 – Statistical yield forecast (optional). </w:t>
+      </w:r>
+      <w:r>
+        <w:rPr>
+          <w:bCs/>
+          <w:szCs w:val="24"/>
+        </w:rPr>
+        <w:t xml:space="preserve">A Random Forest </w:t>
       </w:r>
       <w:proofErr w:type="spellStart"/>
       <w:r>
         <w:rPr>
-          <w:b/>
           <w:bCs/>
           <w:szCs w:val="24"/>
         </w:rPr>
@@ -8732,7 +8762,6 @@
       <w:proofErr w:type="spellEnd"/>
       <w:r>
         <w:rPr>
-          <w:b/>
           <w:bCs/>
           <w:szCs w:val="24"/>
         </w:rPr>
@@ -8741,7 +8770,6 @@
       <w:proofErr w:type="spellStart"/>
       <w:r>
         <w:rPr>
-          <w:b/>
           <w:bCs/>
           <w:szCs w:val="24"/>
         </w:rPr>
@@ -8750,25 +8778,22 @@
       <w:proofErr w:type="spellEnd"/>
       <w:r>
         <w:rPr>
-          <w:b/>
           <w:bCs/>
           <w:szCs w:val="24"/>
         </w:rPr>
-        <w:t xml:space="preserve">, and soil pH, reported with the coefficient of determination, mean absolute error and root mean square error. Each forecast carries a dispersion measure computed across the individual trees of the ensemble and reported as a confidence percentage and as an interval about the </w:t>
-      </w:r>
-      <w:r>
-        <w:rPr>
-          <w:b/>
+        <w:t xml:space="preserve">, and soil pH, reported with the coefficient of determination, mean absolute error and root mean square error. Each forecast carries a dispersion measure computed across the individual trees of the ensemble and reported as a confidence percentage and as an interval about the ensemble mean. That measure indicates </w:t>
+      </w:r>
+      <w:r>
+        <w:rPr>
           <w:bCs/>
           <w:szCs w:val="24"/>
         </w:rPr>
         <w:lastRenderedPageBreak/>
-        <w:t>ensemble mean. That measure indicates how far the trees agree with one another. It is not a calibrated prediction interval, and Section 5.2.3 sets out the established methods that would produce one (</w:t>
+        <w:t>how far the trees agree with one another. It is not a calibrated prediction interval, and Section 5.2.3 sets out the established methods that would produce one (</w:t>
       </w:r>
       <w:proofErr w:type="spellStart"/>
       <w:r>
         <w:rPr>
-          <w:b/>
           <w:bCs/>
           <w:szCs w:val="24"/>
         </w:rPr>
@@ -8777,7 +8802,6 @@
       <w:proofErr w:type="spellEnd"/>
       <w:r>
         <w:rPr>
-          <w:b/>
           <w:bCs/>
           <w:szCs w:val="24"/>
         </w:rPr>
@@ -8858,14 +8882,14 @@
         <w:rPr>
           <w:szCs w:val="24"/>
         </w:rPr>
-        <w:t xml:space="preserve">To satisfy the security requirement embedded in the aim and in Objective 3, the platform authenticates users and confines each user’s records to their own farm. Authentication issues a signed token upon login, with passwords stored only in hashed form. Every read and write operation across the ledger, reporting, equipment, and decision-support paths is scoped to the authenticated user’s farm, so that one </w:t>
+        <w:t xml:space="preserve">To satisfy the security requirement embedded in the aim and in Objective 3, the platform authenticates users and confines each user’s records to their own farm. Authentication issues a signed token upon login, with passwords stored only in hashed form. Every read and write operation across the ledger, reporting, equipment, and decision-support paths is scoped to the authenticated user’s farm, so that one enterprise’s data cannot be reached by another. The farm/user boundary is introduced </w:t>
       </w:r>
       <w:r>
         <w:rPr>
           <w:szCs w:val="24"/>
         </w:rPr>
         <w:lastRenderedPageBreak/>
-        <w:t>enterprise’s data cannot be reached by another. The farm/user boundary is introduced through a versioned database migration rather than ad-hoc schema creation, preserving the integrity of the managed schema.</w:t>
+        <w:t>through a versioned database migration rather than ad-hoc schema creation, preserving the integrity of the managed schema.</w:t>
       </w:r>
     </w:p>
     <w:p>
@@ -9033,14 +9057,28 @@
         <w:rPr>
           <w:szCs w:val="24"/>
         </w:rPr>
-        <w:t xml:space="preserve">The socio-technical barrier at the heart of Objective 1 is that a large proportion of rural Nigerian farmers do not hold a smartphone. The design response to it is an inbound message channel through which a farm activity could be recorded from a feature phone. This section states that design, and states equally plainly that none of it is built. The </w:t>
+        <w:t xml:space="preserve">The socio-technical barrier at the heart of Objective 1 is that a large proportion of rural Nigerian farmers do not hold a smartphone. The design response to it is an inbound message channel through which a farm activity could be recorded from a feature phone. This section states that design, and states equally plainly that none of it is built. The intended mechanism is an inbound </w:t>
+      </w:r>
+      <w:proofErr w:type="spellStart"/>
+      <w:r>
+        <w:rPr>
+          <w:szCs w:val="24"/>
+        </w:rPr>
+        <w:t>webhook</w:t>
+      </w:r>
+      <w:proofErr w:type="spellEnd"/>
+      <w:r>
+        <w:rPr>
+          <w:szCs w:val="24"/>
+        </w:rPr>
+        <w:t xml:space="preserve"> accepting a message consisting of a sender </w:t>
       </w:r>
       <w:r>
         <w:rPr>
           <w:szCs w:val="24"/>
         </w:rPr>
         <w:lastRenderedPageBreak/>
-        <w:t xml:space="preserve">intended mechanism is an inbound </w:t>
+        <w:t xml:space="preserve">identifier and a short structured text, a parser converting that text into an activity and an amount, a mapping from the sender’s number to a registered farm so that unregistered senders are rejected, and creation of the paired Operational Log and Financial Transaction through the same ledger service the application uses, so that a phone-entered record would be indistinguishable from an app-entered one. The channel would be gateway-agnostic, so that it could be exercised against simulated inbound payloads before any carrier integration. In the release evaluated by this thesis there is no such route, no </w:t>
       </w:r>
       <w:proofErr w:type="spellStart"/>
       <w:r>
@@ -9054,21 +9092,59 @@
         <w:rPr>
           <w:szCs w:val="24"/>
         </w:rPr>
-        <w:t xml:space="preserve"> accepting a message consisting of a sender identifier and a short structured text, a parser converting that text into an activity and an amount, a mapping from the sender’s number to a registered farm so that unregistered senders are rejected, and creation of the paired Operational Log and Financial Transaction through the same ledger service the application uses, so that a phone-entered record would be indistinguishable from an app-entered one. The channel would be gateway-agnostic, so that it could be exercised against simulated inbound payloads before any carrier integration. In the release evaluated by this thesis there is no such route, no </w:t>
+        <w:t>, no parser, no sender-to-farm mapping, no simulated harness and no test; the navigation entries that once gestured at this channel were removed because no backend supported them. The channel is therefore recorded in Section 5.3 as future work, and no result anywhere in Chapter Four or Chapter Five rests on it. Its absence is the principal limit on the reach of the contribution and is stated as such rather than qualified.</w:t>
+      </w:r>
+    </w:p>
+    <w:p>
+      <w:pPr>
+        <w:pStyle w:val="H3"/>
+      </w:pPr>
+      <w:r>
+        <w:t>3.6.9 Post-Harvest Drying Module</w:t>
+      </w:r>
+    </w:p>
+    <w:p>
+      <w:pPr>
+        <w:pStyle w:val="BodyPara"/>
+      </w:pPr>
+      <w:r>
+        <w:t>This module answers Objective (v) and carries the bioprocess engineering content of the platform. It is named the bioprocess module in the source code and its endpoints sit under a bioprocess path; the two names denote the same subsystem and the design term used throughout this thesis is the post-harvest drying module.</w:t>
+      </w:r>
+    </w:p>
+    <w:p>
+      <w:pPr>
+        <w:pStyle w:val="BodyPara"/>
+      </w:pPr>
+      <w:r>
+        <w:t xml:space="preserve">A drying run is entered as an Operational Log of the post-harvest category and therefore posts its cost through the same paired write as any other activity. Its own parameters are the mass and moisture content at inlet, the mass and moisture content at outlet, the drying method, and an optional series of time-and-moisture readings taken during the run. From these the module computes, by the relationships reviewed in Section 2.7: conversion between wet-basis and dry-basis moisture content; a dry-matter balance yielding the outlet mass the run should have produced; a water balance giving the mass </w:t>
+      </w:r>
+      <w:r>
+        <w:lastRenderedPageBreak/>
+        <w:t xml:space="preserve">of water actually removed, held deliberately distinct from the mass difference so that process loss and drying performance are never the same number; a mean drying rate; a safe-storage verdict against a recorded threshold for the crop, returned as an absence rather than as a negative verdict where no threshold is recorded; a rate constant for the Newton model obtained in closed form from the initial and final moisture ratio; and a least-squares fit of the Page model on its </w:t>
       </w:r>
       <w:proofErr w:type="spellStart"/>
       <w:r>
-        <w:rPr>
-          <w:szCs w:val="24"/>
-        </w:rPr>
-        <w:t>webhook</w:t>
+        <w:t>linearising</w:t>
       </w:r>
       <w:proofErr w:type="spellEnd"/>
       <w:r>
-        <w:rPr>
-          <w:szCs w:val="24"/>
-        </w:rPr>
-        <w:t>, no parser, no sender-to-farm mapping, no simulated harness and no test; the navigation entries that once gestured at this channel were removed because no backend supported them. The channel is therefore recorded in Section 5.3 as future work, and no result anywhere in Chapter Four or Chapter Five rests on it. Its absence is the principal limit on the reach of the contribution and is stated as such rather than qualified.</w:t>
+        <w:t xml:space="preserve"> transform, ln(−ln MR) = ln k + </w:t>
+      </w:r>
+      <w:proofErr w:type="spellStart"/>
+      <w:r>
+        <w:t>n·ln</w:t>
+      </w:r>
+      <w:proofErr w:type="spellEnd"/>
+      <w:r>
+        <w:t xml:space="preserve"> t, returning the rate constant k and the exponent n. The Newton constant is computable from the endpoints alone; the Page fit requires at least three usable readings and is withheld, rather than approximated, below that threshold. The thresholds held in the lookup are conservative relative to the published equilibrium values reviewed in Section 2.7, and reconciling each stored constant to a specific published figure per crop is identified in Chapter Five as work outstanding.</w:t>
+      </w:r>
+    </w:p>
+    <w:p>
+      <w:pPr>
+        <w:pStyle w:val="BodyPara"/>
+      </w:pPr>
+      <w:r>
+        <w:t>The design decision that matters financially is which mass becomes the denominator of the unit-cost calculation. The module uses the mass actually weighed out, not the mass the dry-matter balance predicts, because costing against a predicted mass would charge the farmer’s pricing decision with grain that never reached the store. Every malformed submission — outlet mass exceeding inlet mass, a final moisture not below the initial, non-positive mass, moisture outside the physical range, or readings not in strictly increasing time order — is rejected at the schema edge, and the same rules are mirrored in the client so that an invalid run is refused before it is queued offline rather than retrying forever.</w:t>
       </w:r>
     </w:p>
     <w:p>
@@ -9076,7 +9152,7 @@
         <w:pStyle w:val="H3"/>
       </w:pPr>
       <w:r>
-        <w:t>3.6.9 Post-Harvest Drying Module</w:t>
+        <w:t>3.6.10 Enterprise Economics Module</w:t>
       </w:r>
     </w:p>
     <w:p>
@@ -9084,91 +9160,63 @@
         <w:pStyle w:val="BodyPara"/>
       </w:pPr>
       <w:r>
-        <w:t>This module answers Objective (v) and carries the bioprocess engineering content of the platform. It is named the bioprocess module in the source code and its endpoints sit under a bioprocess path; the two names denote the same subsystem and the design term used throughout this thesis is the post-harvest drying module.</w:t>
-      </w:r>
-    </w:p>
-    <w:p>
-      <w:pPr>
-        <w:pStyle w:val="BodyPara"/>
-      </w:pPr>
-      <w:r>
-        <w:t xml:space="preserve">A drying run is entered as an Operational Log of the post-harvest category and therefore posts its cost through the same paired write as any other activity. Its own parameters are the mass and moisture content at inlet, the mass and moisture content at outlet, the drying method, and an optional series of time-and-moisture readings taken during the run. From these the module computes, by the relationships reviewed in Section 2.7: conversion between wet-basis and dry-basis moisture content; a dry-matter balance </w:t>
+        <w:t>This module extends the deterministic tier from margin accounting to cost-</w:t>
+      </w:r>
+      <w:proofErr w:type="spellStart"/>
+      <w:r>
+        <w:t>behaviour</w:t>
+      </w:r>
+      <w:proofErr w:type="spellEnd"/>
+      <w:r>
+        <w:t xml:space="preserve"> analysis, and supplies the vocabulary of enterprise budgeting reviewed in Section 2.7.2 (Kay et al., 2016). Recorded cost is classified at the schema edge into variable, semi-</w:t>
       </w:r>
       <w:r>
         <w:lastRenderedPageBreak/>
-        <w:t xml:space="preserve">yielding the outlet mass the run should have produced; a water balance giving the mass of water actually removed, held deliberately distinct from the mass difference so that process loss and drying performance are never the same number; a mean drying rate; a safe-storage verdict against a recorded threshold for the crop, returned as an absence rather than as a negative verdict where no threshold is recorded; a rate constant for the Newton model obtained in closed form from the initial and final moisture ratio; and a least-squares fit of the Page model on its </w:t>
+        <w:t xml:space="preserve">variable and fixed </w:t>
       </w:r>
       <w:proofErr w:type="spellStart"/>
       <w:r>
-        <w:t>linearising</w:t>
+        <w:t>behaviour</w:t>
       </w:r>
       <w:proofErr w:type="spellEnd"/>
       <w:r>
-        <w:t xml:space="preserve"> transform, ln(−ln MR) = ln k + </w:t>
+        <w:t xml:space="preserve">; the proportion of cost that carries a subtype is reported as an explicit classification-coverage figure, and the residue is reported as unclassified rather than distributed into a plausible bucket, so that a reader can see how much of the analysis rests on classified data. On that base the module derives the fixed-cost overlay of Section 3.6.4 and allocates it in proportion to direct cost, conventional practice being to allocate fixed cost on a physical base, most commonly cultivated area (Kay et al., 2016; Johnson, 2020), which is unavailable here because no field, plot or area entity exists in the data model; the substitution is stated rather than concealed, since apportioning by direct cost distributes fixed cost toward the enterprise that spent most, and coincides with an area-based allocation only where spending per unit area is uniform across crops; computes a break-even price on a cash basis and a total-cost basis, the two answering different questions and the cash price provably the lower; computes a yield-sensitivity matrix, labelled conditional because every row but the baseline describes a yield that did not occur; computes an operating-expense ratio following the conventional definition of operating expense over gross revenue with non-cash charges excluded (Griffith et al., 2024). The numerator is all cost recorded against the enterprise, whether or not it carries a </w:t>
       </w:r>
       <w:proofErr w:type="spellStart"/>
       <w:r>
-        <w:t>n·ln</w:t>
+        <w:t>behaviour</w:t>
       </w:r>
       <w:proofErr w:type="spellEnd"/>
       <w:r>
-        <w:t xml:space="preserve"> t, returning the rate constant k and the exponent n. The Newton constant is computable from the endpoints alone; the Page fit requires at least three usable readings and is withheld, rather than approximated, below that threshold. The thresholds held in the lookup are conservative relative to the published equilibrium values reviewed in Section 2.7, and reconciling each stored constant to a specific published figure per crop is identified in Chapter Five as work outstanding.</w:t>
-      </w:r>
-    </w:p>
-    <w:p>
-      <w:pPr>
-        <w:pStyle w:val="BodyPara"/>
-      </w:pPr>
-      <w:r>
-        <w:t>The design decision that matters financially is which mass becomes the denominator of the unit-cost calculation. The module uses the mass actually weighed out, not the mass the dry-matter balance predicts, because costing against a predicted mass would charge the farmer’s pricing decision with grain that never reached the store. Every malformed submission — outlet mass exceeding inlet mass, a final moisture not below the initial, non-positive mass, moisture outside the physical range, or readings not in strictly increasing time order — is rejected at the schema edge, and the same rules are mirrored in the client so that an invalid run is refused before it is queued offline rather than retrying forever.</w:t>
-      </w:r>
-    </w:p>
-    <w:p>
-      <w:pPr>
-        <w:pStyle w:val="H3"/>
-      </w:pPr>
-      <w:r>
-        <w:t>3.6.10 Enterprise Economics Module</w:t>
-      </w:r>
-    </w:p>
-    <w:p>
-      <w:pPr>
-        <w:pStyle w:val="BodyPara"/>
-      </w:pPr>
-      <w:r>
-        <w:t>This module extends the deterministic tier from margin accounting to cost-</w:t>
-      </w:r>
-      <w:proofErr w:type="spellStart"/>
-      <w:r>
-        <w:t>behaviour</w:t>
-      </w:r>
-      <w:proofErr w:type="spellEnd"/>
-      <w:r>
-        <w:t xml:space="preserve"> analysis, and supplies the vocabulary of enterprise budgeting reviewed in Section 2.7.2 </w:t>
+        <w:t xml:space="preserve"> classification: cost that was in fact spent is counted, because excluding unclassified cost would understate the ratio in exact proportion to how incomplete the classification is, and a data-quality gap should not be permitted to flatter a headline figure. Interest is excluded because no interest is modelled anywhere in the platform, and the depreciation overlay has no route into the numerator; and computes an Olympic-average yield baseline, which discards the highest and lowest season before averaging and is refused, with the season count stated, below three seasons. A partial-budget calculator evaluates a </w:t>
+      </w:r>
+      <w:r>
+        <w:t xml:space="preserve">proposed change by four terms </w:t>
+      </w:r>
+      <w:r>
+        <w:t>added revenue, reduced cost</w:t>
+      </w:r>
+      <w:r>
+        <w:t xml:space="preserve">, lost revenue and added cost </w:t>
+      </w:r>
+      <w:r>
+        <w:t xml:space="preserve">following the standard method </w:t>
       </w:r>
       <w:r>
         <w:lastRenderedPageBreak/>
-        <w:t xml:space="preserve">(Kay et al., 2016). Recorded cost is classified at the schema edge into variable, semi-variable and fixed </w:t>
-      </w:r>
-      <w:proofErr w:type="spellStart"/>
-      <w:r>
-        <w:t>behaviour</w:t>
-      </w:r>
-      <w:proofErr w:type="spellEnd"/>
-      <w:r>
-        <w:t xml:space="preserve">; the proportion of cost that carries a subtype is reported as an explicit classification-coverage figure, and the residue is reported as unclassified rather than distributed into a plausible bucket, so that a reader can see how much of the analysis rests on classified data. On that base the module derives the fixed-cost overlay of Section 3.6.4 and allocates it in proportion to direct cost, conventional practice being to allocate fixed cost on a physical base, most commonly cultivated area (Kay et al., 2016; Johnson, 2020), which is unavailable here because no field, plot or area entity exists in the data model; the substitution is stated rather than concealed, since apportioning by direct cost distributes fixed cost toward the enterprise that spent most, and coincides with an area-based allocation only where spending per unit area is uniform across crops; computes a break-even price on a cash basis and a total-cost basis, the two answering different questions and the cash price provably the lower; computes a yield-sensitivity matrix, labelled conditional because every row but the baseline describes a yield that did not occur; computes an operating-expense ratio following the conventional definition of operating expense over gross revenue with non-cash charges excluded (Griffith et al., 2024). The numerator is all cost recorded against the enterprise, whether or not it carries a </w:t>
-      </w:r>
-      <w:proofErr w:type="spellStart"/>
-      <w:r>
-        <w:t>behaviour</w:t>
-      </w:r>
-      <w:proofErr w:type="spellEnd"/>
-      <w:r>
-        <w:t xml:space="preserve"> classification: cost that was in fact spent is counted, because excluding unclassified cost would understate the ratio in exact proportion to how incomplete the classification is, and a data-quality gap should not be permitted to flatter a headline figure. Interest is excluded because no interest is modelled anywhere in the platform, and the depreciation overlay has no route into the numerator; and computes an Olympic-average yield baseline, which discards the highest and lowest season before averaging and is refused, with the season count stated, below three seasons. A partial-budget calculator evaluates a proposed change by four terms — </w:t>
-      </w:r>
-      <w:r>
-        <w:lastRenderedPageBreak/>
-        <w:t>added revenue, reduced cost, lost revenue and added cost — following the standard method for appraising incremental change in smallholder farming systems (CIMMYT, 1988; Kay et al., 2016) and is implemented twice — once server-side and once in the client, so that it survives offline — with both implementations asserted against a single shared hand-computed fixture.</w:t>
+        <w:t>for appraising incremental change in smallholder farming systems (CIMMYT, 1988; Kay et al., 2</w:t>
+      </w:r>
+      <w:r>
+        <w:t xml:space="preserve">016) and is implemented twice </w:t>
+      </w:r>
+      <w:r>
+        <w:t>once server-side and once in the client</w:t>
+      </w:r>
+      <w:r>
+        <w:t xml:space="preserve">, so that it survives offline </w:t>
+      </w:r>
+      <w:r>
+        <w:t>with both implementations asserted against a single shared hand-computed fixture.</w:t>
       </w:r>
     </w:p>
     <w:p>
@@ -9209,14 +9257,14 @@
         <w:rPr>
           <w:szCs w:val="24"/>
         </w:rPr>
-        <w:t xml:space="preserve"> is role-based: three roles are defined over a table of eleven named permissions, and every request is checked against the permission it requires before any farm-scope check is applied, so that a refusal reports a missing permission and never doubles as an oracle confirming that a record exists. Data isolation confines every read and write on every path to the authenticated user’s farm, a cross-farm read resolving to a not-found response rather than to an empty result. Failed logins are throttled on a fixed budget within a rolling window, the refusal naming no account so that it confirms no email address; the counters are held in process, which means they neither span replicas nor survive a restart, and that residual is named here rather than concealed behind the control. Credential hygiene requires that a share token never appears in any log: the reverse proxy redacts it and the application replaces it with a stable, non-reversible fingerprint that still allows requests to be correlated. Finally, external sharing uses the scoped, revocable, expiring, hash-stored, read-only tokens of Section 3.6.7, which cannot escalate to write access or cross a farm boundary. Together these ensure that data sharing is deliberate and controlled rather than open, which is the precondition for the trust that Objective 3 seeks to establish. What the design does not </w:t>
+        <w:t xml:space="preserve"> is role-based: three roles are defined over a table of eleven named permissions, and every request is checked against the permission it requires before any farm-scope check is applied, so that a refusal reports a missing permission and never doubles as an oracle confirming that a record exists. Data isolation confines every read and write on every path to the authenticated user’s farm, a cross-farm read resolving to a not-found response rather than to an empty result. Failed logins are throttled on a fixed budget within a rolling window, the refusal naming no account so that it confirms no email address; the counters are held in process, which means they neither span replicas nor survive a restart, and that residual is named here rather than concealed behind the control. Credential hygiene requires that a share token never appears in any log: the reverse proxy redacts it and the application replaces it with a stable, non-reversible fingerprint that still allows requests to be correlated. Finally, external sharing uses the scoped, revocable, expiring, hash-stored, read-only tokens of Section 3.6.7, which cannot escalate to write access or cross a farm boundary. Together these ensure that data sharing is deliberate and controlled rather than open, which is the precondition for the trust that Objective 3 seeks to establish. What the design does not provide is stated with equal clarity: there is no session revocation within a token’s </w:t>
       </w:r>
       <w:r>
         <w:rPr>
           <w:szCs w:val="24"/>
         </w:rPr>
         <w:lastRenderedPageBreak/>
-        <w:t>provide is stated with equal clarity: there is no session revocation within a token’s lifetime, no refresh mechanism, no password reset, no second factor, and no independent security assessment of any of it.</w:t>
+        <w:t>lifetime, no refresh mechanism, no password reset, no second factor, and no independent security assessment of any of it.</w:t>
       </w:r>
     </w:p>
     <w:p>
@@ -18259,7 +18307,14 @@
         <w:rPr>
           <w:szCs w:val="24"/>
         </w:rPr>
-        <w:t>The two exercised containers — the FastAPI backend and PostgreSQL 15 — measure 178.9 to 202.8 MiB at rest against the seeded dataset (Table C.1); on that footprint a 2 GB instance with snapshot backups, an amortised domain and a no-cost TLS certificate totals an estimated $15.40, approximately ₦20,950, per month (Table C.2), which at a conservative two-hundred-farm single-instance tenancy is ₦105 per farm per month (Table C.3).</w:t>
+        <w:t xml:space="preserve">The two exercised containers — the FastAPI backend and PostgreSQL 15 — measure 178.9 to 202.8 MiB at rest against the seeded dataset (Table C.1); on that footprint a 2 </w:t>
+      </w:r>
+      <w:r>
+        <w:rPr>
+          <w:szCs w:val="24"/>
+        </w:rPr>
+        <w:lastRenderedPageBreak/>
+        <w:t>GB instance with snapshot backups, an amortised domain and a no-cost TLS certificate totals an estimated $15.40, approximately ₦20,950, per month (Table C.2), which at a conservative two-hundred-farm single-instance tenancy is ₦105 per farm per month (Table C.3).</w:t>
       </w:r>
     </w:p>
     <w:p>
@@ -18270,8 +18325,35 @@
         <w:rPr>
           <w:szCs w:val="24"/>
         </w:rPr>
+        <w:t>4.11 Security and Deployment Verification</w:t>
+      </w:r>
+    </w:p>
+    <w:p>
+      <w:pPr>
+        <w:pStyle w:val="BodyPara"/>
+      </w:pPr>
+      <w:r>
+        <w:t>Objective 3 is answered by mechanisms whose evidence has not so far been reported in this chapter. This section reports it. Every result below was obtained by probing the running production composition on 29 August 2026, not by reading source; each is therefore manually inspected evidence of a live system, supported in most cases by named automated tests.</w:t>
+      </w:r>
+    </w:p>
+    <w:p>
+      <w:pPr>
+        <w:pStyle w:val="BodyPara"/>
+      </w:pPr>
+      <w:r>
+        <w:t>Table B.1 of Appendix B lists each property, the probe that exercised it, and the result. Three properties in that table are design results rather than test results, and are worth stating separately. The permission check precedes the farm-scope check, so a user who lacks a permission receives the same refusal whether or not the record they named exists; a refusal is therefore never an oracle confirming existence. Unknown, revoked and expired share tokens all resolve to one identical not-found response, for the same reason. And the login refusal names no account, so a failed attempt confirms no email address. Each of these is a decision to give the attacker less information than the honest user loses by it.</w:t>
+      </w:r>
+    </w:p>
+    <w:p>
+      <w:pPr>
+        <w:pStyle w:val="BodyPara"/>
+      </w:pPr>
+      <w:r>
+        <w:t xml:space="preserve">Two residuals are recorded rather than concealed behind the controls. The rate-limit counters are held in process: they do not span replicas and they do not survive a restart, and both were observed directly. And there is no session revocation within a token’s lifetime, no refresh mechanism, no password reset and no second factor. The boundary these results establish is that the mechanisms behave as designed under the probes </w:t>
+      </w:r>
+      <w:r>
         <w:lastRenderedPageBreak/>
-        <w:t>4.11 Security and Deployment Verification</w:t>
+        <w:t>applied to them by their author. No independent security assessment, penetration test or threat model was conducted, and that is the single most important thing this thesis does not know about its own security posture.</w:t>
       </w:r>
     </w:p>
     <w:p>
@@ -18279,31 +18361,6 @@
         <w:pStyle w:val="BodyPara"/>
       </w:pPr>
       <w:r>
-        <w:t>Objective 3 is answered by mechanisms whose evidence has not so far been reported in this chapter. This section reports it. Every result below was obtained by probing the running production composition on 29 August 2026, not by reading source; each is therefore manually inspected evidence of a live system, supported in most cases by named automated tests.</w:t>
-      </w:r>
-    </w:p>
-    <w:p>
-      <w:pPr>
-        <w:pStyle w:val="BodyPara"/>
-      </w:pPr>
-      <w:r>
-        <w:t>Table B.1 of Appendix B lists each property, the probe that exercised it, and the result. Three properties in that table are design results rather than test results, and are worth stating separately. The permission check precedes the farm-scope check, so a user who lacks a permission receives the same refusal whether or not the record they named exists; a refusal is therefore never an oracle confirming existence. Unknown, revoked and expired share tokens all resolve to one identical not-found response, for the same reason. And the login refusal names no account, so a failed attempt confirms no email address. Each of these is a decision to give the attacker less information than the honest user loses by it.</w:t>
-      </w:r>
-    </w:p>
-    <w:p>
-      <w:pPr>
-        <w:pStyle w:val="BodyPara"/>
-      </w:pPr>
-      <w:r>
-        <w:t>Two residuals are recorded rather than concealed behind the controls. The rate-limit counters are held in process: they do not span replicas and they do not survive a restart, and both were observed directly. And there is no session revocation within a token’s lifetime, no refresh mechanism, no password reset and no second factor. The boundary these results establish is that the mechanisms behave as designed under the probes applied to them by their author. No independent security assessment, penetration test or threat model was conducted, and that is the single most important thing this thesis does not know about its own security posture.</w:t>
-      </w:r>
-    </w:p>
-    <w:p>
-      <w:pPr>
-        <w:pStyle w:val="BodyPara"/>
-      </w:pPr>
-      <w:r>
-        <w:lastRenderedPageBreak/>
         <w:t>Table B.2 of Appendix B records the deployment, migration and recovery checks and their outcomes. The distinction that these results establish, and that must be carried into Chapter Five, is between a deployment path that has been demonstrated and a deployment that has been performed. This work has the first and not the second. The production composition builds, starts and answers its probes; the migration chain runs and rolls back against a real PostgreSQL server; a backup was taken and restored with every row count matching and the paired-write invariant intact. No instance serves a real user, no certificate has been issued for a real hostname, and there is no observability of any kind — no metrics, no tracing, no alerting, the containers logging to standard output only. Nor is any continuous-integration result recorded: the workflow is defined and the substance of its jobs was executed locally, which is what Section 4.9 reports, and no claim that the pipeline passed is made anywhere in this work.</w:t>
       </w:r>
     </w:p>
@@ -18345,7 +18402,14 @@
         <w:rPr>
           <w:szCs w:val="24"/>
         </w:rPr>
-        <w:t xml:space="preserve"> The project holds a complete facilitator run-sheet and a three-part evaluation pack — a task script, a heuristic checklist and the ten-item SUS questionnaire — and the frozen evidence base contains no completed instrument of any kind: no scored SUS forms, no filled heuristic checklists, no session notes, no participant records and no scans or photographs. This section is therefore drafted to receive real data and reports no figure that no retained instrument supports.</w:t>
+        <w:t xml:space="preserve"> The project holds a complete facilitator run-sheet and a three-part evaluation pack — a task script, a heuristic checklist and the ten-item SUS questionnaire — and the frozen evidence base contains no completed instrument of any kind: no scored SUS forms, no filled heuristic checklists, no session notes, no participant records and no scans or photographs. This </w:t>
+      </w:r>
+      <w:r>
+        <w:rPr>
+          <w:szCs w:val="24"/>
+        </w:rPr>
+        <w:lastRenderedPageBreak/>
+        <w:t>section is therefore drafted to receive real data and reports no figure that no retained instrument supports.</w:t>
       </w:r>
     </w:p>
     <w:p>
@@ -18357,7 +18421,6 @@
         <w:rPr>
           <w:szCs w:val="24"/>
         </w:rPr>
-        <w:lastRenderedPageBreak/>
         <w:t>Table 4.10: Usability evaluation — to be completed from retained instruments</w:t>
       </w:r>
       <w:bookmarkEnd w:id="131"/>
@@ -19037,6 +19100,7 @@
         <w:rPr>
           <w:szCs w:val="24"/>
         </w:rPr>
+        <w:lastRenderedPageBreak/>
         <w:t>Table 4.11: Usability issue log — to be completed</w:t>
       </w:r>
       <w:bookmarkEnd w:id="132"/>
@@ -19275,7 +19339,6 @@
         <w:rPr>
           <w:szCs w:val="24"/>
         </w:rPr>
-        <w:lastRenderedPageBreak/>
         <w:t>Because this strand is outstanding, Objective 4 is reported as partially achieved in Section 4.13, and no claim of a usability finding, a task-completion measurement, a SUS score or a comparison against paper-based practice appears anywhere in this thesis.</w:t>
       </w:r>
     </w:p>
@@ -20126,8 +20189,6 @@
         </w:rPr>
         <w:t>The deterministic decision-support layer and the post-harvest module are reported in full at Sections 4.2 to 4.6, and the evidence each produced is set against the objectives it answers in Table 4.12.</w:t>
       </w:r>
-      <w:proofErr w:type="spellStart"/>
-      <w:proofErr w:type="spellEnd"/>
     </w:p>
     <w:p>
       <w:pPr>
@@ -20137,14 +20198,15 @@
         <w:rPr>
           <w:szCs w:val="24"/>
         </w:rPr>
-        <w:t>Under simulated throttling the service worker reduces network transfer on a repeat visit from 139,245 bytes over eight requests to 127 bytes over seven, the residue being the manifest icon, a measured defect. First paint falls by a factor of about eighty, but time to main content improves by a factor of about three and a half, and that is the figure a user experiences.</w:t>
-      </w:r>
-      <w:proofErr w:type="spellStart"/>
-      <w:proofErr w:type="spellEnd"/>
-      <w:proofErr w:type="spellStart"/>
-      <w:proofErr w:type="spellEnd"/>
-      <w:proofErr w:type="spellStart"/>
-      <w:proofErr w:type="spellEnd"/>
+        <w:t xml:space="preserve">Under simulated throttling the service worker reduces network transfer on a repeat visit from 139,245 bytes over eight requests to 127 bytes over seven, the residue being the manifest icon, a measured defect. First paint falls by a factor of about eighty, but time to </w:t>
+      </w:r>
+      <w:r>
+        <w:rPr>
+          <w:szCs w:val="24"/>
+        </w:rPr>
+        <w:lastRenderedPageBreak/>
+        <w:t>main content improves by a factor of about three and a half, and that is the figure a user experiences.</w:t>
+      </w:r>
     </w:p>
     <w:p>
       <w:pPr>
@@ -20356,38 +20418,251 @@
       <w:r>
         <w:t>Operation under constraint. Under simulated slow-3G throttling a cold load transfers 139,245 bytes over eight requests and reaches first paint at 5,661.2 ms; a warm load transfers 127 bytes over seven requests and reaches first paint at 70.6 ms. The operating-cost estimate anchored on the platform’s measured resource consumption is reported at Section 4.10 and in Appendix C.</w:t>
       </w:r>
+    </w:p>
+    <w:p>
+      <w:pPr>
+        <w:pStyle w:val="BodyPara"/>
+      </w:pPr>
+      <w:r>
+        <w:t>Security and the deployment path. Role-based authorisation over three roles and eleven named permissions was exercised live, with the permission check preceding the farm-scope check so that a refusal is never an existence oracle; login throttling returned 429 on the eleventh failure within the window without naming an account; the raw token reached none of the three logs recording its request; monetary bounds rejected four out-of-range inputs; and a backup was taken and restored with every row count matching. The production composition was built, started and probed with seven of seven checks passing. No instance has served a real user.</w:t>
+      </w:r>
+    </w:p>
+    <w:p>
+      <w:pPr>
+        <w:pStyle w:val="BodyPara"/>
+      </w:pPr>
+      <w:r>
+        <w:t>The usability strand of the specified evaluation was not executed. No System Usability Scale score, heuristic-severity rating, task-completion measurement or evaluator finding is reported anywhere in this work.</w:t>
+      </w:r>
+    </w:p>
+    <w:p>
+      <w:pPr>
+        <w:pStyle w:val="H2"/>
+      </w:pPr>
+      <w:r>
+        <w:lastRenderedPageBreak/>
+        <w:t>5.2 Conclusion</w:t>
+      </w:r>
+    </w:p>
+    <w:p>
+      <w:pPr>
+        <w:pStyle w:val="H3"/>
+      </w:pPr>
+      <w:r>
+        <w:t>5.2.1 Interpretation of the Major Findings</w:t>
+      </w:r>
+    </w:p>
+    <w:p>
+      <w:pPr>
+        <w:pStyle w:val="BodyPara"/>
+      </w:pPr>
+      <w:r>
+        <w:t>The paired write is the structural contribution, and it is visible in the data. The literature identifies the separation of farm financial accounts from operational records as a historical accident with continuing costs: duplicated entry, administrative fatigue, and the impossibility of correlating agronomic inputs with financial outcome (</w:t>
+      </w:r>
       <w:proofErr w:type="spellStart"/>
+      <w:r>
+        <w:t>Poppe</w:t>
+      </w:r>
       <w:proofErr w:type="spellEnd"/>
+      <w:r>
+        <w:t xml:space="preserve"> et al., 2023; </w:t>
+      </w:r>
       <w:proofErr w:type="spellStart"/>
+      <w:r>
+        <w:t>Fountas</w:t>
+      </w:r>
       <w:proofErr w:type="spellEnd"/>
+      <w:r>
+        <w:t xml:space="preserve"> et al., 2015). Most r</w:t>
+      </w:r>
+      <w:r>
+        <w:t>esponses to it are integrative,</w:t>
+      </w:r>
+      <w:r>
+        <w:t xml:space="preserve"> two systems and a </w:t>
+      </w:r>
       <w:proofErr w:type="spellStart"/>
+      <w:r>
+        <w:t>synchronisation</w:t>
+      </w:r>
       <w:proofErr w:type="spellEnd"/>
+      <w:r>
+        <w:t xml:space="preserve"> path between them. AGRI-PROFIT’s response is different in kind: there is only one write, and it posts both records in a single commit, so the two cannot drift because they were never separate. The finding that makes this more than an assertion is arithmetic. On 29 August 2026 the database held exactly as many financial t</w:t>
+      </w:r>
+      <w:r>
+        <w:t>ransactions as operational logs</w:t>
+      </w:r>
+      <w:r>
+        <w:t xml:space="preserve"> 1</w:t>
+      </w:r>
+      <w:r>
+        <w:t>09 of each, with zero unpaired</w:t>
+      </w:r>
+      <w:r>
+        <w:t xml:space="preserve"> at Alembic revision b9e5f30c74a1. There is no reconciliation step in the platform because there is nothing to reconcile, and the correlation the literature describes as unavailable is not computed but inherent: every cost already carries the activity that incurred it and the crop it was incurred against. The cost of this design is equally real and is stated in Chapter Three: the ledger is single-entry, so it is an analytical instrument rather than a bookkeeping system in the accounting sense. That is the right trade for the target user, whose alternative is not double-entry software but paper, and it should not be presented as anything else.</w:t>
+      </w:r>
     </w:p>
     <w:p>
       <w:pPr>
         <w:pStyle w:val="BodyPara"/>
       </w:pPr>
       <w:r>
-        <w:t>Security and the deployment path. Role-based authorisation over three roles and eleven named permissions was exercised live, with the permission check preceding the farm-scope check so that a refusal is never an existence oracle; login throttling returned 429 on the eleventh failure within the window without naming an account; the raw token reached none of the three logs recording its request; monetary bounds rejected four out-of-range inputs; and a backup was taken and restored with every row count matching. The production composition was built, started and probed with seven of seven checks passing. No instance has served a real user.</w:t>
+        <w:t xml:space="preserve">The drying-to-price chain is the engineering contribution. The result most specific to agricultural and </w:t>
       </w:r>
       <w:proofErr w:type="spellStart"/>
+      <w:r>
+        <w:t>bioresources</w:t>
+      </w:r>
       <w:proofErr w:type="spellEnd"/>
+      <w:r>
+        <w:t xml:space="preserve"> engineering is the computed chain running from a moisture measurement to a price. A maize harvest weighed in at 100 kg and 25% moisture, dried to 13%, weighed out at 84 kg, and the unit cost of production moved from ₦35.00 to ₦41.67 per kilogram. The 19% difference is post-harvest mass </w:t>
+      </w:r>
+      <w:r>
+        <w:lastRenderedPageBreak/>
+        <w:t xml:space="preserve">reduction expressed in money, and a farmer pricing on the wet-basis figure would under-recover ₦6.67 on every kilogram sold. Three properties make this a result rather than an illustration. First, the chain is computed end to end without manual intervention: the drying run is an operational log like any other, so it posts its cost through the same paired write, and </w:t>
+      </w:r>
+      <w:proofErr w:type="gramStart"/>
+      <w:r>
+        <w:t>its</w:t>
+      </w:r>
+      <w:proofErr w:type="gramEnd"/>
+      <w:r>
+        <w:t xml:space="preserve"> computed marketable output becomes the denominator of the unit-cost figure. Second, the denominator is the mass actually weighed out rather than the mass t</w:t>
+      </w:r>
+      <w:r>
+        <w:t>he dry-matter balance predicts — 84 kg against 86.21 kg —</w:t>
+      </w:r>
+      <w:r>
+        <w:t xml:space="preserve"> which is the conservative choice and charges the pricing decision only with grain that reached the store. Third, the distinction the module is most likely to get wrong is guarded by a test that fails if it is ever collapsed: water removed is a water balance, not a mass difference, and conflating them would make process loss and drying performance the same number. One refinement must travel with the ₦41.67 figure now that the demonstration farm owns a depreciating asset. For maize that figure is also the break-even price on a cash basis: the enterprise carries no unclassified cost and no recorded fixed cost, so its cash cost and its recorded cost are the same quantity, and both give ₦41.67. On a total-cost basis, once maize takes its ₦58.88 share of the farm-wide depreciation overlay, the figure is ₦42.37. Cowpea is the contrasting case on the same farm, where the two diverge. The </w:t>
+      </w:r>
+      <w:r>
+        <w:t>two answer different questions,</w:t>
+      </w:r>
+      <w:r>
+        <w:t xml:space="preserve"> what must be obtained this season to avoid a cash loss, and what must be obtained to cover the w</w:t>
+      </w:r>
+      <w:r>
+        <w:t>ear on the assets used as well</w:t>
+      </w:r>
+      <w:r>
+        <w:t xml:space="preserve"> and neither should be quoted as though it were the other. Break-even yield, in kilograms and retrospective, is a third quantity again and is never to be conflated with either price. This junction is the answer to the question of what makes the platform an agricultural engineering artefact rather than a bookkeeping application. The thin-layer models themselves are long established and are not the contribution; their coupling to the financial record is.</w:t>
+      </w:r>
+    </w:p>
+    <w:p>
+      <w:pPr>
+        <w:pStyle w:val="H3"/>
+      </w:pPr>
+      <w:r>
+        <w:lastRenderedPageBreak/>
+        <w:t>5.2.2 Comparison with the Literature</w:t>
+      </w:r>
     </w:p>
     <w:p>
       <w:pPr>
         <w:pStyle w:val="BodyPara"/>
       </w:pPr>
       <w:r>
+        <w:t>That claim is a claim about the literature, and it can only be tested against the literature. What follows compares this work topic by topic with the sources reviewed in Chapter Two: where the platform follows a published finding, where it departs from one, and where the reviewed work stops short of the junction this study occupies. Each paragraph is headed with the topic it treats.</w:t>
+      </w:r>
+    </w:p>
+    <w:p>
+      <w:pPr>
+        <w:pStyle w:val="BodyPara"/>
+      </w:pPr>
+      <w:r>
+        <w:t xml:space="preserve">On the modelling ladder. </w:t>
+      </w:r>
+      <w:r>
+        <w:t xml:space="preserve">Van </w:t>
+      </w:r>
+      <w:proofErr w:type="spellStart"/>
+      <w:r>
+        <w:t>Klompenburg</w:t>
+      </w:r>
+      <w:proofErr w:type="spellEnd"/>
+      <w:r>
+        <w:t xml:space="preserve"> et al. (2020)</w:t>
+      </w:r>
+      <w:r>
+        <w:t xml:space="preserve"> find tree-based ensembles to perform strongly on tabular agricultural data at far lower computational cost than deep networks, and the implemented forecast tier follows that finding with a 200-estimator Random Forest. Chapter </w:t>
+      </w:r>
+      <w:r>
+        <w:t>one</w:t>
+      </w:r>
+      <w:r>
+        <w:t xml:space="preserve"> scoped the statistical tier as lightweight modelling, and the implementation went one step up the modelling ladder to an ensemble of regression trees; that is a defensible design decision rather than a drift, and it is taken on the grounds of cost and interpretability that van </w:t>
+      </w:r>
+      <w:proofErr w:type="spellStart"/>
+      <w:r>
+        <w:t>Klompenburg</w:t>
+      </w:r>
+      <w:proofErr w:type="spellEnd"/>
+      <w:r>
+        <w:t xml:space="preserve"> et al. establish. The counter-case is recorded rather than suppressed: </w:t>
+      </w:r>
+      <w:proofErr w:type="spellStart"/>
+      <w:r>
+        <w:t>Olisah</w:t>
+      </w:r>
+      <w:proofErr w:type="spellEnd"/>
+      <w:r>
+        <w:t xml:space="preserve"> et al. (2024), working on Nigerian corn-yield prediction for smallholder decision support, report that a carefully tuned deep neural network </w:t>
+      </w:r>
+      <w:proofErr w:type="spellStart"/>
+      <w:r>
+        <w:t>regressor</w:t>
+      </w:r>
+      <w:proofErr w:type="spellEnd"/>
+      <w:r>
+        <w:t xml:space="preserve"> outperformed the models they compared it against and that the quality of pre-processing was decisive. Their work is an unpublished preprint and is cited here for its pre-processing finding rather than as authority for a model choice; the implemented tier deliberately does not yet exercise that finding, because it is trained on clean synthetic data for which the pre-processing pipeline they describe has nothing to do. That is the correct reading of the R² of 0.9762 reported in Chapter Four: it is the recovery of a constructed relationship, and the moment the platform trains on real farm records the pre-processing problem those authors identify becomes the central one. All three re</w:t>
+      </w:r>
+      <w:r>
+        <w:t>gression measures are reported</w:t>
+      </w:r>
+      <w:r>
+        <w:t xml:space="preserve"> R² 0.9762, MAE 0.</w:t>
+      </w:r>
+      <w:r>
+        <w:t>2414 t/ha and RMSE 0.4883 t/ha</w:t>
+      </w:r>
+      <w:r>
+        <w:t xml:space="preserve"> and all three are reproducible to six decimal places from the recorded seed, so what </w:t>
+      </w:r>
+      <w:r>
         <w:lastRenderedPageBreak/>
-        <w:t>The usability strand of the specified evaluation was not executed. No System Usability Scale score, heuristic-severity rating, task-completion measurement or evaluator finding is reported anywhere in this work.</w:t>
-      </w:r>
-    </w:p>
-    <w:p>
-      <w:pPr>
-        <w:pStyle w:val="H2"/>
-      </w:pPr>
-      <w:r>
-        <w:t>5.2 Conclusion</w:t>
+        <w:t>is unproven is the model’s relevance and not the integrity of the procedure that produced it.</w:t>
+      </w:r>
+    </w:p>
+    <w:p>
+      <w:pPr>
+        <w:pStyle w:val="BodyPara"/>
+      </w:pPr>
+      <w:r>
+        <w:t xml:space="preserve">On post-harvest drying. The thin-layer models the platform fits are those established by Lewis (1921) and Page (1949) and reviewed by </w:t>
+      </w:r>
+      <w:proofErr w:type="spellStart"/>
+      <w:r>
+        <w:t>Onwude</w:t>
+      </w:r>
+      <w:proofErr w:type="spellEnd"/>
+      <w:r>
+        <w:t xml:space="preserve"> et al. (2016); nothing in the kinetics is new, and no claim to the contrary is made. What the reviewed literature does not do is carry those outputs into a cost record. </w:t>
+      </w:r>
+      <w:proofErr w:type="spellStart"/>
+      <w:r>
+        <w:t>Baidhe</w:t>
+      </w:r>
+      <w:proofErr w:type="spellEnd"/>
+      <w:r>
+        <w:t xml:space="preserve"> et al. (2024) report that inadequate and unmeasured drying remains a principal determinant of grain quality loss across Africa, and that smallholder practice judges the end point by eye; the enterprise-budgeting literature (Kay et al., 2016) supplies the cost-</w:t>
+      </w:r>
+      <w:proofErr w:type="spellStart"/>
+      <w:r>
+        <w:t>behaviour</w:t>
+      </w:r>
+      <w:proofErr w:type="spellEnd"/>
+      <w:r>
+        <w:t xml:space="preserve"> taxonomy and the unit-cost formulation but assumes the output quantity is given. This work joins the two, and the ₦35.00-to-₦41.67 result is what the junction produces. That is the contribution claimed for Objective (v), stated at its true size: a demonstrated computation on seeded runs, not a validated finding about Nigerian maize.</w:t>
       </w:r>
     </w:p>
     <w:p>
@@ -20395,7 +20670,7 @@
         <w:pStyle w:val="H3"/>
       </w:pPr>
       <w:r>
-        <w:t>5.2.1 Interpretation of the Major Findings</w:t>
+        <w:t>5.2.3 Limitations</w:t>
       </w:r>
     </w:p>
     <w:p>
@@ -20403,49 +20678,57 @@
         <w:pStyle w:val="BodyPara"/>
       </w:pPr>
       <w:r>
-        <w:t>The paired write is the structural contribution, and it is visible in the data. The literature identifies the separation of farm financial accounts from operational records as a historical accident with continuing costs: duplicated entry, administrative fatigue, and the impossibility of correlating agronomic inputs with financial outcome (</w:t>
+        <w:t>The limitations that bound this work are set out in Section 4.14 and are interpreted here rather than restated in full. Two kinds are distinguished throughout, and each entry below is labelled with the kind or kinds it belongs to: an implementation limitation is something the system does not do, and an evaluation limitation is something the system may well do that this study did not measure. The distinction is not a softening. It separates what would require building from what would require measuring, and the two have different consequences for what may be claimed.</w:t>
+      </w:r>
+    </w:p>
+    <w:p>
+      <w:pPr>
+        <w:pStyle w:val="BodyPara"/>
+      </w:pPr>
+      <w:r>
+        <w:t xml:space="preserve">Data </w:t>
+      </w:r>
+      <w:r>
+        <w:t xml:space="preserve">evaluation. Every figure in Chapter Four derives from a single seeded demonstration farm. There has been no field trial and no real farmer data. The seeded records were constructed to exercise the platform’s analytical paths, so they are not a </w:t>
+      </w:r>
+      <w:r>
+        <w:lastRenderedPageBreak/>
+        <w:t>sample of Nigerian farm practice, and no inference about typical costs, margins or yields should be drawn from them.</w:t>
+      </w:r>
+    </w:p>
+    <w:p>
+      <w:pPr>
+        <w:pStyle w:val="BodyPara"/>
+      </w:pPr>
+      <w:r>
+        <w:t>The forecast tier</w:t>
+      </w:r>
+      <w:r>
+        <w:t xml:space="preserve"> implementation and evaluation. The yield model is trained on synthetic data and is not validated against any real observation; it learns from no farm’s records and does not adapt from use. Its reported quality measures the recovery of a constructed relationship. It is, however, reproducible: the pipeline is seed-deterministic, the dataset carries a recorded fingerprint, and the three metrics were re-derived to six decimal places on 29 August 2026 by regenerating and refitting rather than by reading the sidecar. What is unproven is the model’s relevance, not the integrity of the procedure. The claim that the artefact was not reproducible from the repository, carried by an earlier draft, was wrong and understated the project’s own </w:t>
       </w:r>
       <w:proofErr w:type="spellStart"/>
       <w:r>
-        <w:t>Poppe</w:t>
+        <w:t>rigour</w:t>
       </w:r>
       <w:proofErr w:type="spellEnd"/>
       <w:r>
-        <w:t xml:space="preserve"> et al., 2023; </w:t>
+        <w:t xml:space="preserve">. No claim of field-predictive accuracy is made, and the model should not be relied upon for a planting or input decision in its present state. The model family is chosen on the cost and interpretability grounds established by van </w:t>
       </w:r>
       <w:proofErr w:type="spellStart"/>
       <w:r>
-        <w:t>Fountas</w:t>
+        <w:t>Klompenburg</w:t>
       </w:r>
       <w:proofErr w:type="spellEnd"/>
       <w:r>
-        <w:t xml:space="preserve"> et al., 2015). Most r</w:t>
-      </w:r>
-      <w:r>
-        <w:t>esponses to it are integrative,</w:t>
-      </w:r>
-      <w:r>
-        <w:t xml:space="preserve"> two systems and a </w:t>
+        <w:t xml:space="preserve"> et al. (2020) and not on a claim of superior accuracy, and the pre-processing problem that </w:t>
       </w:r>
       <w:proofErr w:type="spellStart"/>
       <w:r>
-        <w:t>synchronisation</w:t>
+        <w:t>Olisah</w:t>
       </w:r>
       <w:proofErr w:type="spellEnd"/>
       <w:r>
-        <w:t xml:space="preserve"> path between them. AGRI-PROFIT’s response is different in kind: there is only one write, and it posts both records in a single commit, so the two cannot drift because they were never separate. The finding that makes this more than an assertion is arithmetic. On 29 August 2026 the database held exactly as many financial t</w:t>
-      </w:r>
-      <w:r>
-        <w:t>ransactions as operational logs</w:t>
-      </w:r>
-      <w:r>
-        <w:t xml:space="preserve"> 1</w:t>
-      </w:r>
-      <w:r>
-        <w:t>09 of each, with zero unpaired</w:t>
-      </w:r>
-      <w:r>
-        <w:t xml:space="preserve"> at Alembic revision b9e5f30c74a1. There is no reconciliation step in the platform because there is nothing to reconcile, and the correlation the literature describes as unavailable is not computed but inherent: every cost already carries the activity that incurred it and the crop it was incurred against. The cost of this design is equally real and is stated in Chapter Three: the ledger is single-entry, so it is an analytical instrument rather than a bookkeeping system in the accounting sense. That is the right trade for the target user, whose alternative is not double-entry software but paper, and it should not be presented as anything else.</w:t>
+        <w:t xml:space="preserve"> et al. (2024) find decisive is one this tier does not yet meet, because synthetic data arrives clean.</w:t>
       </w:r>
     </w:p>
     <w:p>
@@ -20453,46 +20736,112 @@
         <w:pStyle w:val="BodyPara"/>
       </w:pPr>
       <w:r>
+        <w:t xml:space="preserve">Forecast interval implementation. The methodological ladder of Section 2.6.3 has three rungs and the platform </w:t>
+      </w:r>
+      <w:proofErr w:type="spellStart"/>
+      <w:r>
+        <w:t>realises</w:t>
+      </w:r>
+      <w:proofErr w:type="spellEnd"/>
+      <w:r>
+        <w:t xml:space="preserve"> two of them, the deterministic tier and the tree-based ensemble; the intermediate regression tier is not implemented. The dispersion measure reported beside a forecast is computed across the individual trees of the ensemble and indicates agreement among them. It is not a calibrated prediction interval and is not reported as one. Established methods for interval estimation from a random forest exist (</w:t>
+      </w:r>
+      <w:proofErr w:type="spellStart"/>
+      <w:r>
+        <w:t>Meinshausen</w:t>
+      </w:r>
+      <w:proofErr w:type="spellEnd"/>
+      <w:r>
+        <w:t xml:space="preserve">, 2006; Wager et al., 2014), and they are the route to a calibrated figure. No figure in Chapter Four derives from the unimplemented tier. The one interval reported there, 3.24 to 6.24 t/ha about a point estimate of 4.74 t/ha, is stated in those </w:t>
+      </w:r>
+      <w:r>
         <w:lastRenderedPageBreak/>
-        <w:t xml:space="preserve">The drying-to-price chain is the engineering contribution. The result most specific to agricultural and </w:t>
+        <w:t>terms: it is the ensemble's internal disagreement on a single case and carries no calibration claim.</w:t>
+      </w:r>
+    </w:p>
+    <w:p>
+      <w:pPr>
+        <w:pStyle w:val="BodyPara"/>
+      </w:pPr>
+      <w:r>
+        <w:t>The decis</w:t>
+      </w:r>
+      <w:r>
+        <w:t xml:space="preserve">ion-support outputs as advice </w:t>
+      </w:r>
+      <w:r>
+        <w:t>evaluation. The arithmetic of the deterministic tier is verified to an unusual degree. Whether acting on it improves an outcome is untested, and on synthetic training data and one seeded farm it is untestable here. The platform computes what a farm’s records imply; it does not know whether what they imply is good agronomy.</w:t>
+      </w:r>
+    </w:p>
+    <w:p>
+      <w:pPr>
+        <w:pStyle w:val="BodyPara"/>
+      </w:pPr>
+      <w:r>
+        <w:t xml:space="preserve">Machinery ownership cost </w:t>
+      </w:r>
+      <w:r>
+        <w:t>implementation. The depreciation overlay omits salvage value, interest on the average investment, and the combined taxes, insurance and housing charge that conventional machinery costing includes, and applies no accumulated-depreciation floor, so an asset retained beyond its implied useful life continues to accrue charge without limit. The resulting divergence from a full ownership-cost figure depends on the depreciation rate the user supplies and is not consistently in one direction, so the break-even price on a total-cost basis should be read as indicative rather than as a costed figure. The break-even price on a cash basis and the operating-expense ratio are unaffected, both excluding non-cash charges.</w:t>
+      </w:r>
+    </w:p>
+    <w:p>
+      <w:pPr>
+        <w:pStyle w:val="BodyPara"/>
+      </w:pPr>
+      <w:r>
+        <w:t xml:space="preserve">Safe-storage thresholds </w:t>
+      </w:r>
+      <w:r>
+        <w:t xml:space="preserve">implementation. Safe-storage thresholds are recorded for nine crops, and the values held are conservative relative to the published equilibrium moisture contents reviewed in Section 2.7. Reconciling each stored constant to a specific published figure per crop is outstanding work rather than completed work. Its practical exposure in this study is limited: the crops exercised in the demonstration data are maize, rice, sorghum, cowpea, cassava and tomato, and no result reported in Chapter Four depends on a threshold for which no applicable published source was located. </w:t>
+      </w:r>
+      <w:r>
+        <w:lastRenderedPageBreak/>
+        <w:t>Where no threshold exists for a crop the platform returns no verdict rather than a default, so an unassessed crop is visibly unassessed rather than silently passed.</w:t>
+      </w:r>
+    </w:p>
+    <w:p>
+      <w:pPr>
+        <w:pStyle w:val="BodyPara"/>
+      </w:pPr>
+      <w:r>
+        <w:t xml:space="preserve">Correctness defects </w:t>
+      </w:r>
+      <w:r>
+        <w:t xml:space="preserve">implementation. Two are known and were reported in Section 4.14: a mistaken reversal cannot itself be rolled back, only compensated by a new unlinked entry, and a stale-revalidation window in the service worker is reasoned but </w:t>
       </w:r>
       <w:proofErr w:type="spellStart"/>
       <w:r>
-        <w:t>bioresources</w:t>
+        <w:t>unreproduced</w:t>
       </w:r>
       <w:proofErr w:type="spellEnd"/>
       <w:r>
-        <w:t xml:space="preserve"> engineering is the computed chain running from a moisture measurement to a price. A maize harvest weighed in at 100 kg and 25% moisture, dried to 13%, weighed out at 84 kg, and the unit cost of production moved from ₦35.00 to ₦41.67 per kilogram. The 19% difference is post-harvest mass reduction expressed in money, and a farmer pricing on the wet-basis figure would under-recover ₦6.67 on every kilogram sold. Three properties make this a result rather than an illustration. First, the chain is computed end to end without manual intervention: the drying run is an operational log like any other, so it posts its cost through the same paired write, and </w:t>
-      </w:r>
-      <w:proofErr w:type="gramStart"/>
-      <w:r>
-        <w:t>its</w:t>
-      </w:r>
-      <w:proofErr w:type="gramEnd"/>
-      <w:r>
-        <w:t xml:space="preserve"> computed marketable output becomes the denominator of the unit-cost figure. Second, the denominator is the mass actually weighed out rather than the mass t</w:t>
-      </w:r>
-      <w:r>
-        <w:t>he dry-matter balance predicts — 84 kg against 86.21 kg —</w:t>
-      </w:r>
-      <w:r>
-        <w:t xml:space="preserve"> which is the conservative choice and charges the pricing decision only with grain that reached the store. Third, the distinction the module is most likely to get wrong is guarded by a test that fails if it is ever collapsed: water removed is a water balance, not a mass difference, and conflating them would make process loss and drying performance the same number. One refinement must travel with the ₦41.67 figure now that the demonstration farm owns a depreciating asset. For maize that figure is also the break-even price on a cash basis: the enterprise carries no unclassified cost and no recorded fixed cost, so its cash cost and its recorded cost are the same quantity, and both give ₦41.67. On a total-cost basis, once maize takes its ₦58.88 share of the farm-wide depreciation overlay, the figure is ₦42.37. Cowpea is the contrasting case on the same farm, where the two diverge. The </w:t>
-      </w:r>
-      <w:r>
-        <w:t>two answer different questions,</w:t>
-      </w:r>
-      <w:r>
-        <w:t xml:space="preserve"> what must be obtained this season to avoid a cash loss, and what must be obtained to cover the w</w:t>
-      </w:r>
-      <w:r>
-        <w:t>ear on the assets used as well</w:t>
-      </w:r>
-      <w:r>
-        <w:t xml:space="preserve"> and neither should be quoted as though it were the other. Break-even yield, in kilograms and </w:t>
+        <w:t xml:space="preserve"> and is therefore a hypothesis rather than a defect. Neither touches the correctness of a figure the platform reports. A second stale-read exposure is now recorded in Sections 3.6.1 and 4.14, and it is of a different kind from the revalidation window: correcting an existing equipment record posts no cache purge, which is not a reasoned hypothesis but an absent call verifiable by reading the source, so the reads derived from the depreciation overlay may be served stale until the entry expires or another write purges it. Two further limitations of the same kind stand: per-operation equipment attribution is captured but costed nowhere, so no machine-hour, </w:t>
+      </w:r>
+      <w:proofErr w:type="spellStart"/>
+      <w:r>
+        <w:t>utilisation</w:t>
+      </w:r>
+      <w:proofErr w:type="spellEnd"/>
+      <w:r>
+        <w:t xml:space="preserve"> or cost-per-hour figure exists anywhere in this work, and the bioprocess summary endpoint has a typed client method and no caller. Three defects carried in earlier drafts are gone: the per-crop reversal-netting report was incorrect and is withdrawn, and unbounded monetary fields and the missing equipment edit path were both closed and verified. The residual set is materially smaller than the one this thesis previously carried, and the re</w:t>
+      </w:r>
+      <w:r>
+        <w:t xml:space="preserve">ason is worth stating plainly </w:t>
+      </w:r>
+      <w:r>
+        <w:t>the defects were found by the project’s own audit and closed before submission rather than being discovered by an examiner.</w:t>
+      </w:r>
+    </w:p>
+    <w:p>
+      <w:pPr>
+        <w:pStyle w:val="BodyPara"/>
+      </w:pPr>
+      <w:r>
+        <w:t xml:space="preserve">Ledger integrity boundary implementation. The soft-immutability constraint reported at Sections 3.5 and 4.15 is enforced by the application: deletion is refused, no update route exists, and a correction posts a linked contra entry that leaves the original visible. It is audit-trail discipline, not cryptographic tamper-evidence. There is no hash chaining, no signing and no append-only log; a party with database access is not constrained by it. </w:t>
       </w:r>
       <w:r>
         <w:lastRenderedPageBreak/>
-        <w:t>retrospective, is a third quantity again and is never to be conflated with either price. This junction is the answer to the question of what makes the platform an agricultural engineering artefact rather than a bookkeeping application. The thin-layer models themselves are long established and are not the contribution; their coupling to the financial record is.</w:t>
+        <w:t>Three verification gaps are carried into future work rather than closed here: there has been no independent security review; there are no component tests for the page and form layer, including the drying-curve chart, and no end-to-end browser test of the offline-to-online transition; and concurrency is measured on SQLite and inferred for PostgreSQL.</w:t>
       </w:r>
     </w:p>
     <w:p>
@@ -20500,7 +20849,7 @@
         <w:pStyle w:val="H3"/>
       </w:pPr>
       <w:r>
-        <w:t>5.2.2 Comparison with the Literature</w:t>
+        <w:t>5.2.4 Conclusion</w:t>
       </w:r>
     </w:p>
     <w:p>
@@ -20508,7 +20857,7 @@
         <w:pStyle w:val="BodyPara"/>
       </w:pPr>
       <w:r>
-        <w:t>That claim is a claim about the literature, and it can only be tested against the literature. What follows compares this work topic by topic with the sources reviewed in Chapter Two: where the platform follows a published finding, where it departs from one, and where the reviewed work stops short of the junction this study occupies. Each paragraph is headed with the topic it treats.</w:t>
+        <w:t>This study set out to design, develop and evaluate AGRI-PROFIT, an offline-first farm record and decision-support platform for Nigerian smallholder and medium-scale enterprises, in response to a documented separation between operational and financial farm records and to the infrastructural and economic conditions that make existing farm management systems inaccessible to that user.</w:t>
       </w:r>
     </w:p>
     <w:p>
@@ -20516,316 +20865,21 @@
         <w:pStyle w:val="BodyPara"/>
       </w:pPr>
       <w:r>
-        <w:t xml:space="preserve">On the modelling ladder. </w:t>
-      </w:r>
-      <w:r>
-        <w:t xml:space="preserve">Van </w:t>
-      </w:r>
-      <w:proofErr w:type="spellStart"/>
-      <w:r>
-        <w:t>Klompenburg</w:t>
-      </w:r>
-      <w:proofErr w:type="spellEnd"/>
-      <w:r>
-        <w:t xml:space="preserve"> et al. (2020)</w:t>
-      </w:r>
-      <w:r>
-        <w:t xml:space="preserve"> find tree-based ensembles to perform strongly on tabular agricultural data at far lower computational cost than deep networks, and the implemented forecast tier follows that finding with a 200-estimator Random Forest. Chapter </w:t>
-      </w:r>
-      <w:r>
-        <w:t>one</w:t>
-      </w:r>
-      <w:r>
-        <w:t xml:space="preserve"> scoped the statistical tier as lightweight modelling, and the implementation went one step up the modelling ladder to an ensemble of regression trees; that is a defensible design decision rather than a drift, and it is taken on the grounds of cost and interpretability that van </w:t>
-      </w:r>
-      <w:proofErr w:type="spellStart"/>
-      <w:r>
-        <w:t>Klompenburg</w:t>
-      </w:r>
-      <w:proofErr w:type="spellEnd"/>
-      <w:r>
-        <w:t xml:space="preserve"> et al. establish. The counter-case is recorded rather than suppressed: </w:t>
-      </w:r>
-      <w:proofErr w:type="spellStart"/>
-      <w:r>
-        <w:t>Olisah</w:t>
-      </w:r>
-      <w:proofErr w:type="spellEnd"/>
-      <w:r>
-        <w:t xml:space="preserve"> et al. (2024), working on Nigerian corn-yield prediction for smallholder decision support, report that a carefully tuned deep neural network </w:t>
-      </w:r>
-      <w:proofErr w:type="spellStart"/>
-      <w:r>
-        <w:t>regressor</w:t>
-      </w:r>
-      <w:proofErr w:type="spellEnd"/>
-      <w:r>
-        <w:t xml:space="preserve"> outperformed the models they compared it against and that the quality of pre-processing was decisive. Their work is an unpublished preprint and is cited here for its pre-processing finding rather than as authority for a model choice; the implemented tier deliberately does not yet exercise that finding, because it is trained on clean synthetic data for which the pre-processing pipeline they describe has nothing to </w:t>
+        <w:t>What the work does not establish is equally definite. There has been no field trial, no real farmer data and no user evaluation, so Objective (IV) is partially achieved; the forecast tier is trained on synthetic data and its reported accuracy is the recovery of a constructed relationship; the performance figures are modelled throttling against a local server rather than a field measurement; the data boundary is proven by tests and by probing a running stack rather than by an independent security assessment, and the ledger is audit-trailed rather than cryptographically tamper-evident; and the platform has never been deployed to serve a real user, on a real domain, on a departmental host.</w:t>
+      </w:r>
+    </w:p>
+    <w:p>
+      <w:pPr>
+        <w:pStyle w:val="BodyPara"/>
+      </w:pPr>
+      <w:r>
+        <w:t>The contribution, stated at its true size, is a verified prototype: an architecture in which the operational and financial record cannot drift apart, a decision-support layer that is arithmetically correct and honest about the limits of its inputs, and a demonstration that post-harvest process measurements can be carried through to a pricing decision automatically. To those this work adds a methodological resu</w:t>
+      </w:r>
+      <w:r>
+        <w:t xml:space="preserve">lt it did not set out to find </w:t>
       </w:r>
       <w:r>
         <w:lastRenderedPageBreak/>
-        <w:t>do. That is the correct reading of the R² of 0.9762 reported in Chapter Four: it is the recovery of a constructed relationship, and the moment the platform trains on real farm records the pre-processing problem those authors identify becomes the central one. All three re</w:t>
-      </w:r>
-      <w:r>
-        <w:t>gression measures are reported</w:t>
-      </w:r>
-      <w:r>
-        <w:t xml:space="preserve"> R² 0.9762, MAE 0.</w:t>
-      </w:r>
-      <w:r>
-        <w:t>2414 t/ha and RMSE 0.4883 t/ha</w:t>
-      </w:r>
-      <w:r>
-        <w:t xml:space="preserve"> and all three are reproducible to six decimal places from the recorded seed, so what is unproven is the model’s relevance and not the integrity of the procedure that produced it.</w:t>
-      </w:r>
-    </w:p>
-    <w:p>
-      <w:pPr>
-        <w:pStyle w:val="BodyPara"/>
-      </w:pPr>
-      <w:r>
-        <w:t xml:space="preserve">On post-harvest drying. The thin-layer models the platform fits are those established by Lewis (1921) and Page (1949) and reviewed by </w:t>
-      </w:r>
-      <w:proofErr w:type="spellStart"/>
-      <w:r>
-        <w:t>Onwude</w:t>
-      </w:r>
-      <w:proofErr w:type="spellEnd"/>
-      <w:r>
-        <w:t xml:space="preserve"> et al. (2016); nothing in the kinetics is new, and no claim to the contrary is made. What the reviewed literature does not do is carry those outputs into a cost record. </w:t>
-      </w:r>
-      <w:proofErr w:type="spellStart"/>
-      <w:r>
-        <w:t>Baidhe</w:t>
-      </w:r>
-      <w:proofErr w:type="spellEnd"/>
-      <w:r>
-        <w:t xml:space="preserve"> et al. (2024) report that inadequate and unmeasured drying remains a principal determinant of grain quality loss across Africa, and that smallholder practice judges the end point by eye; the enterprise-budgeting literature (Kay et al., 2016) supplies the cost-</w:t>
-      </w:r>
-      <w:proofErr w:type="spellStart"/>
-      <w:r>
-        <w:t>behaviour</w:t>
-      </w:r>
-      <w:proofErr w:type="spellEnd"/>
-      <w:r>
-        <w:t xml:space="preserve"> taxonomy and the unit-cost formulation but assumes the output quantity is given. This work joins the two, and the ₦35.00-to-₦41.67 result is what the junction produces. That is the contribution claimed for Objective (v), stated at its true size: a demonstrated computation on seeded runs, not a validated finding about Nigerian maize.</w:t>
-      </w:r>
-    </w:p>
-    <w:p>
-      <w:pPr>
-        <w:pStyle w:val="H3"/>
-      </w:pPr>
-      <w:r>
-        <w:t>5.2.3 Limitations</w:t>
-      </w:r>
-    </w:p>
-    <w:p>
-      <w:pPr>
-        <w:pStyle w:val="BodyPara"/>
-      </w:pPr>
-      <w:r>
-        <w:t xml:space="preserve">The limitations that bound this work are set out in Section 4.14 and are interpreted here rather than restated in full. Two kinds are distinguished throughout, and each entry below is labelled with the kind or kinds it belongs to: an implementation limitation is something the system does not do, and an evaluation limitation is something the system may well do that this study did not measure. The distinction is not a softening. It </w:t>
-      </w:r>
-      <w:r>
-        <w:lastRenderedPageBreak/>
-        <w:t>separates what would require building from what would require measuring, and the two have different consequences for what may be claimed.</w:t>
-      </w:r>
-    </w:p>
-    <w:p>
-      <w:pPr>
-        <w:pStyle w:val="BodyPara"/>
-      </w:pPr>
-      <w:r>
-        <w:t xml:space="preserve">Data </w:t>
-      </w:r>
-      <w:r>
-        <w:t>evaluation. Every figure in Chapter Four derives from a single seeded demonstration farm. There has been no field trial and no real farmer data. The seeded records were constructed to exercise the platform’s analytical paths, so they are not a sample of Nigerian farm practice, and no inference about typical costs, margins or yields should be drawn from them.</w:t>
-      </w:r>
-    </w:p>
-    <w:p>
-      <w:pPr>
-        <w:pStyle w:val="BodyPara"/>
-      </w:pPr>
-      <w:r>
-        <w:t>The forecast tier</w:t>
-      </w:r>
-      <w:r>
-        <w:t xml:space="preserve"> implementation and evaluation. The yield model is trained on synthetic data and is not validated against any real observation; it learns from no farm’s records and does not adapt from use. Its reported quality measures the recovery of a constructed relationship. It is, however, reproducible: the pipeline is seed-deterministic, the dataset carries a recorded fingerprint, and the three metrics were re-derived to six decimal places on 29 August 2026 by regenerating and refitting rather than by reading the sidecar. What is unproven is the model’s relevance, not the integrity of the procedure. The claim that the artefact was not reproducible from the repository, carried by an earlier draft, was wrong and understated the project’s own </w:t>
-      </w:r>
-      <w:proofErr w:type="spellStart"/>
-      <w:r>
-        <w:t>rigour</w:t>
-      </w:r>
-      <w:proofErr w:type="spellEnd"/>
-      <w:r>
-        <w:t xml:space="preserve">. No claim of field-predictive accuracy is made, and the model should not be relied upon for a planting or input decision in its present state. The model family is chosen on the cost and interpretability grounds established by van </w:t>
-      </w:r>
-      <w:proofErr w:type="spellStart"/>
-      <w:r>
-        <w:t>Klompenburg</w:t>
-      </w:r>
-      <w:proofErr w:type="spellEnd"/>
-      <w:r>
-        <w:t xml:space="preserve"> et al. (2020) and not on a claim of superior accuracy, and the pre-processing problem that </w:t>
-      </w:r>
-      <w:proofErr w:type="spellStart"/>
-      <w:r>
-        <w:t>Olisah</w:t>
-      </w:r>
-      <w:proofErr w:type="spellEnd"/>
-      <w:r>
-        <w:t xml:space="preserve"> et al. (2024) find decisive is one this tier does not yet meet, because synthetic data arrives clean.</w:t>
-      </w:r>
-    </w:p>
-    <w:p>
-      <w:pPr>
-        <w:pStyle w:val="BodyPara"/>
-      </w:pPr>
-      <w:r>
-        <w:t xml:space="preserve">Forecast interval implementation. The methodological ladder of Section 2.6.3 has three rungs and the platform </w:t>
-      </w:r>
-      <w:proofErr w:type="spellStart"/>
-      <w:r>
-        <w:t>realises</w:t>
-      </w:r>
-      <w:proofErr w:type="spellEnd"/>
-      <w:r>
-        <w:t xml:space="preserve"> two of them, the deterministic tier and the tree-based ensemble; the intermediate regression tier is not implemented. The dispersion measure </w:t>
-      </w:r>
-      <w:r>
-        <w:lastRenderedPageBreak/>
-        <w:t>reported beside a forecast is computed across the individual trees of the ensemble and indicates agreement among them. It is not a calibrated prediction interval and is not reported as one. Established methods for interval estimation from a random forest exist (</w:t>
-      </w:r>
-      <w:proofErr w:type="spellStart"/>
-      <w:r>
-        <w:t>Meinshausen</w:t>
-      </w:r>
-      <w:proofErr w:type="spellEnd"/>
-      <w:r>
-        <w:t>, 2006; Wager et al., 2014), and they are the route to a calibrated figure. No figure in Chapter Four derives from the unimplemented tier. The one interval reported there, 3.24 to 6.24 t/ha about a point estimate of 4.74 t/ha, is stated in those terms: it is the ensemble's internal disagreement on a single case and carries no calibration claim.</w:t>
-      </w:r>
-    </w:p>
-    <w:p>
-      <w:pPr>
-        <w:pStyle w:val="BodyPara"/>
-      </w:pPr>
-      <w:r>
-        <w:t>The decis</w:t>
-      </w:r>
-      <w:r>
-        <w:t xml:space="preserve">ion-support outputs as advice </w:t>
-      </w:r>
-      <w:r>
-        <w:t>evaluation. The arithmetic of the deterministic tier is verified to an unusual degree. Whether acting on it improves an outcome is untested, and on synthetic training data and one seeded farm it is untestable here. The platform computes what a farm’s records imply; it does not know whether what they imply is good agronomy.</w:t>
-      </w:r>
-    </w:p>
-    <w:p>
-      <w:pPr>
-        <w:pStyle w:val="BodyPara"/>
-      </w:pPr>
-      <w:r>
-        <w:t xml:space="preserve">Machinery ownership cost </w:t>
-      </w:r>
-      <w:r>
-        <w:t>implementation. The depreciation overlay omits salvage value, interest on the average investment, and the combined taxes, insurance and housing charge that conventional machinery costing includes, and applies no accumulated-depreciation floor, so an asset retained beyond its implied useful life continues to accrue charge without limit. The resulting divergence from a full ownership-cost figure depends on the depreciation rate the user supplies and is not consistently in one direction, so the break-even price on a total-cost basis should be read as indicative rather than as a costed figure. The break-even price on a cash basis and the operating-expense ratio are unaffected, both excluding non-cash charges.</w:t>
-      </w:r>
-    </w:p>
-    <w:p>
-      <w:pPr>
-        <w:pStyle w:val="BodyPara"/>
-      </w:pPr>
-      <w:r>
-        <w:t xml:space="preserve">Safe-storage thresholds </w:t>
-      </w:r>
-      <w:r>
-        <w:t xml:space="preserve">implementation. Safe-storage thresholds are recorded for nine crops, and the values held are conservative relative to the published equilibrium </w:t>
-      </w:r>
-      <w:r>
-        <w:lastRenderedPageBreak/>
-        <w:t>moisture contents reviewed in Section 2.7. Reconciling each stored constant to a specific published figure per crop is outstanding work rather than completed work. Its practical exposure in this study is limited: the crops exercised in the demonstration data are maize, rice, sorghum, cowpea, cassava and tomato, and no result reported in Chapter Four depends on a threshold for which no applicable published source was located. Where no threshold exists for a crop the platform returns no verdict rather than a default, so an unassessed crop is visibly unassessed rather than silently passed.</w:t>
-      </w:r>
-    </w:p>
-    <w:p>
-      <w:pPr>
-        <w:pStyle w:val="BodyPara"/>
-      </w:pPr>
-      <w:r>
-        <w:t xml:space="preserve">Correctness defects </w:t>
-      </w:r>
-      <w:r>
-        <w:t xml:space="preserve">implementation. Two are known and were reported in Section 4.14: a mistaken reversal cannot itself be rolled back, only compensated by a new unlinked entry, and a stale-revalidation window in the service worker is reasoned but </w:t>
-      </w:r>
-      <w:proofErr w:type="spellStart"/>
-      <w:r>
-        <w:t>unreproduced</w:t>
-      </w:r>
-      <w:proofErr w:type="spellEnd"/>
-      <w:r>
-        <w:t xml:space="preserve"> and is therefore a hypothesis rather than a defect. Neither touches the correctness of a figure the platform reports. A second stale-read exposure is now recorded in Sections 3.6.1 and 4.14, and it is of a different kind from the revalidation window: correcting an existing equipment record posts no cache purge, which is not a reasoned hypothesis but an absent call verifiable by reading the source, so the reads derived from the depreciation overlay may be served stale until the entry expires or another write purges it. Two further limitations of the same kind stand: per-operation equipment attribution is captured but costed nowhere, so no machine-hour, </w:t>
-      </w:r>
-      <w:proofErr w:type="spellStart"/>
-      <w:r>
-        <w:t>utilisation</w:t>
-      </w:r>
-      <w:proofErr w:type="spellEnd"/>
-      <w:r>
-        <w:t xml:space="preserve"> or cost-per-hour figure exists anywhere in this work, and the bioprocess summary endpoint has a typed client method and no caller. Three defects carried in earlier drafts are gone: the per-crop reversal-netting report was incorrect and is withdrawn, and unbounded monetary fields and the missing equipment edit path were both closed and verified. The residual set is materially smaller than the one this thesis previously carried, and the re</w:t>
-      </w:r>
-      <w:r>
-        <w:t xml:space="preserve">ason is worth stating plainly </w:t>
-      </w:r>
-      <w:r>
-        <w:t>the defects were found by the project’s own audit and closed before submission rather than being discovered by an examiner.</w:t>
-      </w:r>
-    </w:p>
-    <w:p>
-      <w:pPr>
-        <w:pStyle w:val="BodyPara"/>
-      </w:pPr>
-      <w:r>
-        <w:lastRenderedPageBreak/>
-        <w:t>Ledger integrity boundary implementation. The soft-immutability constraint reported at Sections 3.5 and 4.15 is enforced by the application: deletion is refused, no update route exists, and a correction posts a linked contra entry that leaves the original visible. It is audit-trail discipline, not cryptographic tamper-evidence. There is no hash chaining, no signing and no append-only log; a party with database access is not constrained by it. Three verification gaps are carried into future work rather than closed here: there has been no independent security review; there are no component tests for the page and form layer, including the drying-curve chart, and no end-to-end browser test of the offline-to-online transition; and concurrency is measured on SQLite and inferred for PostgreSQL.</w:t>
-      </w:r>
-    </w:p>
-    <w:p>
-      <w:pPr>
-        <w:pStyle w:val="H3"/>
-      </w:pPr>
-      <w:r>
-        <w:t>5.2.4 Conclusion</w:t>
-      </w:r>
-    </w:p>
-    <w:p>
-      <w:pPr>
-        <w:pStyle w:val="BodyPara"/>
-      </w:pPr>
-      <w:r>
-        <w:t>This study set out to design, develop and evaluate AGRI-PROFIT, an offline-first farm record and decision-support platform for Nigerian smallholder and medium-scale enterprises, in response to a documented separation between operational and financial farm records and to the infrastructural and economic conditions that make existing farm management systems inaccessible to that user.</w:t>
-      </w:r>
-    </w:p>
-    <w:p>
-      <w:pPr>
-        <w:pStyle w:val="BodyPara"/>
-      </w:pPr>
-      <w:r>
-        <w:t>What the work does not establish is equally definite. There has been no field trial, no real farmer data and no user evaluation, so Objective (IV) is partially achieved; the forecast tier is trained on synthetic data and its reported accuracy is the recovery of a constructed relationship; the performance figures are modelled throttling against a local server rather than a field measurement; the data boundary is proven by tests and by probing a running stack rather than by an independent security assessment, and the ledger is audit-trailed rather than cryptographically tamper-evident; and the platform has never been deployed to serve a real user, on a real domain, on a departmental host.</w:t>
-      </w:r>
-    </w:p>
-    <w:p>
-      <w:pPr>
-        <w:pStyle w:val="BodyPara"/>
-      </w:pPr>
-      <w:r>
-        <w:t xml:space="preserve">The contribution, stated at its true size, is a verified prototype: an architecture in which the operational and financial record cannot drift apart, a decision-support layer that is arithmetically correct and honest about the limits of its inputs, and a demonstration that post-harvest process measurements can be carried through to a pricing decision </w:t>
-      </w:r>
-      <w:r>
-        <w:lastRenderedPageBreak/>
-        <w:t>automatically. To those this work adds a methodological resu</w:t>
-      </w:r>
-      <w:r>
-        <w:t xml:space="preserve">lt it did not set out to find </w:t>
-      </w:r>
-      <w:r>
         <w:t>that a defect read out of code without bei</w:t>
       </w:r>
       <w:r>
@@ -21160,7 +21214,13 @@
         <w:rPr>
           <w:szCs w:val="24"/>
         </w:rPr>
-        <w:t xml:space="preserve">, R., Martinez, P., &amp; Ahmad, R. (2022). The digitization of agricultural industry — </w:t>
+        <w:t>, R., Martinez, P., &amp; Ahmad, R. (2022). The digitiza</w:t>
+      </w:r>
+      <w:r>
+        <w:rPr>
+          <w:szCs w:val="24"/>
+        </w:rPr>
+        <w:t xml:space="preserve">tion of agricultural industry </w:t>
       </w:r>
       <w:proofErr w:type="gramStart"/>
       <w:r>
@@ -21695,7 +21755,32 @@
         <w:rPr>
           <w:szCs w:val="24"/>
         </w:rPr>
-        <w:t>Griffith, C., Mills, B., Kim, K., &amp; Johnson, J. (2024). Farm financial analysis series: Ratios to measure farm financial health (Publication 3712). Mississippi State University Extension Service. https://extension.msstate.edu/sites/default/files/publications/P3712_web.pdf</w:t>
+        <w:t>Griffith, C., Mills, B., Kim, K., &amp; Johnson, J. (2024). Farm financial analysis series: Ratios to measure farm financial health (Publication 3712</w:t>
+      </w:r>
+      <w:r>
+        <w:rPr>
+          <w:szCs w:val="24"/>
+        </w:rPr>
+        <w:t>). Mississippi State University</w:t>
+      </w:r>
+      <w:r>
+        <w:rPr>
+          <w:szCs w:val="24"/>
+        </w:rPr>
+        <w:tab/>
+        <w:t>Extension</w:t>
+      </w:r>
+      <w:r>
+        <w:rPr>
+          <w:szCs w:val="24"/>
+        </w:rPr>
+        <w:tab/>
+      </w:r>
+      <w:r>
+        <w:rPr>
+          <w:szCs w:val="24"/>
+        </w:rPr>
+        <w:t>Service. https://extension.msstate.edu/sites/default/files/publications/P3712_web.pdf</w:t>
       </w:r>
     </w:p>
     <w:p>
@@ -21732,7 +21817,10 @@
       </w:r>
       <w:proofErr w:type="spellEnd"/>
       <w:r>
-        <w:t xml:space="preserve">, N. (2012). The model of farm management information system: A case study of a diversified German farm. DETUROPE — </w:t>
+        <w:t>, N. (2012). The model of farm management information system: A case study of a dive</w:t>
+      </w:r>
+      <w:r>
+        <w:t xml:space="preserve">rsified German farm. DETUROPE </w:t>
       </w:r>
       <w:proofErr w:type="gramStart"/>
       <w:r>
@@ -21765,7 +21853,43 @@
           <w:szCs w:val="24"/>
         </w:rPr>
         <w:lastRenderedPageBreak/>
-        <w:t>Johnson, J. (2020). Farm machinery cost calculations (Publication 3543). Mississippi State University Extension Service. https://www.agecon.msstate.edu/whatwedo/budgets.php</w:t>
+        <w:t xml:space="preserve">Johnson, J. (2020). Farm machinery cost calculations (Publication 3543). Mississippi State </w:t>
+      </w:r>
+      <w:r>
+        <w:rPr>
+          <w:szCs w:val="24"/>
+        </w:rPr>
+        <w:tab/>
+      </w:r>
+      <w:r>
+        <w:rPr>
+          <w:szCs w:val="24"/>
+        </w:rPr>
+        <w:t xml:space="preserve">University </w:t>
+      </w:r>
+      <w:r>
+        <w:rPr>
+          <w:szCs w:val="24"/>
+        </w:rPr>
+        <w:tab/>
+      </w:r>
+      <w:r>
+        <w:rPr>
+          <w:szCs w:val="24"/>
+        </w:rPr>
+        <w:t xml:space="preserve">Extension </w:t>
+      </w:r>
+      <w:r>
+        <w:rPr>
+          <w:szCs w:val="24"/>
+        </w:rPr>
+        <w:tab/>
+      </w:r>
+      <w:r>
+        <w:rPr>
+          <w:szCs w:val="24"/>
+        </w:rPr>
+        <w:t>Service. https://www.agecon.msstate.edu/whatwedo/budgets.php</w:t>
       </w:r>
     </w:p>
     <w:p>
@@ -21848,7 +21972,31 @@
       </w:r>
       <w:proofErr w:type="spellEnd"/>
       <w:r>
-        <w:t>, R. (1990). Heuristic evaluation of user interfaces. In Proceedings of the SIGCHI Conference on Human Factors in Computing Systems (pp. 249–256). Association for Computing Machinery. https://doi.org/10.1145/97243.97281</w:t>
+        <w:t xml:space="preserve">, R. (1990). Heuristic evaluation of user interfaces. In Proceedings of the SIGCHI Conference on Human Factors in Computing Systems (pp. 249–256). </w:t>
+      </w:r>
+      <w:r>
+        <w:tab/>
+      </w:r>
+      <w:r>
+        <w:t xml:space="preserve">Association </w:t>
+      </w:r>
+      <w:r>
+        <w:tab/>
+      </w:r>
+      <w:r>
+        <w:t xml:space="preserve">for </w:t>
+      </w:r>
+      <w:r>
+        <w:tab/>
+      </w:r>
+      <w:r>
+        <w:t xml:space="preserve">Computing </w:t>
+      </w:r>
+      <w:r>
+        <w:tab/>
+      </w:r>
+      <w:r>
+        <w:t>Machinery. https://doi.org/10.1145/97243.97281</w:t>
       </w:r>
     </w:p>
     <w:p>
@@ -22002,7 +22150,39 @@
       </w:r>
       <w:proofErr w:type="spellEnd"/>
       <w:r>
-        <w:t>, B. (2019). Obstacles and features of farm management information systems: A systematic literature review. Computers and Electronics in Agriculture, 157, 189–204. https://doi.org/10.1016/j.compag.2018.12.044</w:t>
+        <w:t xml:space="preserve">, B. (2019). Obstacles and features of farm management information systems: A systematic literature review. Computers and </w:t>
+      </w:r>
+      <w:r>
+        <w:tab/>
+      </w:r>
+      <w:r>
+        <w:t xml:space="preserve">Electronics </w:t>
+      </w:r>
+      <w:r>
+        <w:tab/>
+      </w:r>
+      <w:r>
+        <w:t xml:space="preserve">in </w:t>
+      </w:r>
+      <w:r>
+        <w:tab/>
+      </w:r>
+      <w:r>
+        <w:t xml:space="preserve">Agriculture, </w:t>
+      </w:r>
+      <w:r>
+        <w:tab/>
+      </w:r>
+      <w:r>
+        <w:t xml:space="preserve">157, </w:t>
+      </w:r>
+      <w:r>
+        <w:tab/>
+      </w:r>
+      <w:bookmarkStart w:id="138" w:name="_GoBack"/>
+      <w:bookmarkEnd w:id="138"/>
+      <w:r>
+        <w:t>189–204. https://doi.org/10.1016/j.compag.2018.12.044</w:t>
       </w:r>
     </w:p>
     <w:p>
@@ -27500,7 +27680,7 @@
       <w:pPr>
         <w:pStyle w:val="ChapterLabel"/>
       </w:pPr>
-      <w:bookmarkStart w:id="138" w:name="_Toc238621362"/>
+      <w:bookmarkStart w:id="139" w:name="_Toc238621362"/>
       <w:r>
         <w:rPr>
           <w:szCs w:val="28"/>
@@ -27508,33 +27688,33 @@
         <w:lastRenderedPageBreak/>
         <w:t>APPENDIX F</w:t>
       </w:r>
-      <w:bookmarkEnd w:id="138"/>
+      <w:bookmarkEnd w:id="139"/>
     </w:p>
     <w:p>
       <w:pPr>
         <w:pStyle w:val="ChapterTitle"/>
       </w:pPr>
-      <w:bookmarkStart w:id="139" w:name="_Toc238621363"/>
+      <w:bookmarkStart w:id="140" w:name="_Toc238621363"/>
       <w:r>
         <w:rPr>
           <w:szCs w:val="28"/>
         </w:rPr>
         <w:t>SEEDED DRYING RUN IN FULL</w:t>
       </w:r>
-      <w:bookmarkEnd w:id="139"/>
+      <w:bookmarkEnd w:id="140"/>
     </w:p>
     <w:p>
       <w:pPr>
         <w:pStyle w:val="TableCaption"/>
       </w:pPr>
-      <w:bookmarkStart w:id="140" w:name="_Toc238621491"/>
+      <w:bookmarkStart w:id="141" w:name="_Toc238621491"/>
       <w:r>
         <w:rPr>
           <w:szCs w:val="24"/>
         </w:rPr>
         <w:t>Table F.1: Maize drying run, farm 26, as computed by the platform</w:t>
       </w:r>
-      <w:bookmarkEnd w:id="140"/>
+      <w:bookmarkEnd w:id="141"/>
     </w:p>
     <w:tbl>
       <w:tblPr>
@@ -27930,8 +28110,6 @@
               </w:rPr>
               <w:t>14.08 kg</w:t>
             </w:r>
-            <w:bookmarkStart w:id="141" w:name="_GoBack"/>
-            <w:bookmarkEnd w:id="141"/>
           </w:p>
         </w:tc>
       </w:tr>
@@ -28903,7 +29081,7 @@
         <w:noProof/>
         <w:szCs w:val="24"/>
       </w:rPr>
-      <w:t>118</w:t>
+      <w:t>107</w:t>
     </w:r>
     <w:r>
       <w:rPr>
@@ -41288,7 +41466,7 @@
 </file>
 
 <file path=customXml/itemProps1.xml><?xml version="1.0" encoding="utf-8"?>
-<ds:datastoreItem xmlns:ds="http://schemas.openxmlformats.org/officeDocument/2006/customXml" ds:itemID="{8395E60A-9281-47C0-A8D0-813B16650644}">
+<ds:datastoreItem xmlns:ds="http://schemas.openxmlformats.org/officeDocument/2006/customXml" ds:itemID="{A2BA0091-949A-4DC6-B7FD-90463B9F37A6}">
   <ds:schemaRefs>
     <ds:schemaRef ds:uri="http://schemas.openxmlformats.org/officeDocument/2006/bibliography"/>
   </ds:schemaRefs>

</xml_diff>

<commit_message>
docs(thesis): reduce 3.6.4 and 3.6.8, removing restatement of Chapters 4 and 5
- 3.6.4 Mechanisation and Equipment Tracker cut from 597 to 421 words:
  the three-respect comparison against conventional machinery costing is
  stated again at 4.6.2, 5.2.3 and 5.3.2, so only its sole-source content
  is kept here
- 3.6.8 Feature-Phone (USSD/SMS) cut from 241 to 168 words, the design
  compressed to one sentence and the not-built statement retained
- sole-source material kept: the 6% and 40% divergence magnitudes, the
  declining-balance clause, the partial-update path, maintenance events,
  the list-price fact, the ADR ordinal, the removed navigation entries
- 3.6.10's reference to Section 3.6.4 and 3.3.2's to Section 3.6.8 both
  still resolve; no unresolved section references remain

Co-Authored-By: Claude Opus 5 <noreply@anthropic.com>
Claude-Session: https://claude.ai/code/session_011P7xNiUBbxrtAuKry16MD1
</commit_message>
<xml_diff>
--- a/Thesis_Ch1-5_with_figures.docx
+++ b/Thesis_Ch1-5_with_figures.docx
@@ -8519,38 +8519,7 @@
         <w:rPr>
           <w:szCs w:val="24"/>
         </w:rPr>
-        <w:t>The calculation is a simplification of conventional machinery costing in three respects, each stated here rather than concealed. First, the annual charge is taken against the full purchase value: conventional practice charges purchase cost less an estimated salvage value over the useful life, with salvage estimated as a published age-and-class factor applied to the new list price of a comparable machine (Johnson, 2020). The platform records only the purchase value and not a list price, so the salvage factor cannot be applied even where the user holds one. Second, the derived charge covers depreciation alone, where conventional ownership cost also includes interest on the average investment and a combined taxes, insurance and housing charge (Johnson, 2020). Third, the charge is not bounded by an implied useful life: no accumulated-depreciation floor is applied and no declining-balance alternative is offered, so an asset retained beyond the life implied by its rate continues to accrue charge indefinitely. A second mechanism compounds this where the reporting period is not specified: the default window is derived from the span of the ledger and widens with each new entry, so the period charge grows as records accumu</w:t>
-      </w:r>
-      <w:r>
-        <w:rPr>
-          <w:szCs w:val="24"/>
-        </w:rPr>
-        <w:t xml:space="preserve">late. The two are independent </w:t>
-      </w:r>
-      <w:r>
-        <w:rPr>
-          <w:szCs w:val="24"/>
-        </w:rPr>
-        <w:t>the absence of a floor removes the endpoint, the wid</w:t>
-      </w:r>
-      <w:r>
-        <w:rPr>
-          <w:szCs w:val="24"/>
-        </w:rPr>
-        <w:t xml:space="preserve">ening window extends the span </w:t>
-      </w:r>
-      <w:r>
-        <w:rPr>
-          <w:szCs w:val="24"/>
-        </w:rPr>
-        <w:t xml:space="preserve">and a break-even price </w:t>
-      </w:r>
-      <w:r>
-        <w:rPr>
-          <w:szCs w:val="24"/>
-        </w:rPr>
-        <w:lastRenderedPageBreak/>
-        <w:t>quoted from a derived window should be pinned by specifying the period explicitly if it is to be held to.</w:t>
+        <w:t>The calculation is a simplification of conventional machinery costing (Johnson, 2020): the annual charge is taken against the full purchase value, the platform recording no list price to which a published salvage factor could be applied; it covers depreciation alone rather than full ownership cost; and no accumulated-depreciation floor is applied and no declining-balance alternative offered, so an asset retained beyond its implied life accrues charge indefinitely. Where the reporting period is not specified the default window is derived from the span of the ledger and widens with each entry, so a break-even price quoted from a derived window should be pinned by specifying the period explicitly if it is to be held to.</w:t>
       </w:r>
     </w:p>
     <w:p>
@@ -8561,7 +8530,7 @@
         <w:rPr>
           <w:szCs w:val="24"/>
         </w:rPr>
-        <w:t>These omissions do not act in a single direction and do not cancel in any principled way. Against a full ownership-cost calculation for a representative tractor, a rate entered as the reciprocal of useful life gives a figure approximately six per cent below the conventional total, while a salvage-adjusted rate gives one approximately forty per cent below it; the unbounded charge pushes in the opposite direction for any asset held past its implied life. The direction and magnitude of the divergence therefore depend on the rate the user supplies and on the age of the asset, and no claim of conservatism is made.</w:t>
+        <w:t>These omissions do not act in a single direction and do not cancel in any principled way. Against a full ownership-cost calculation for a representative tractor, a rate entered as the reciprocal of useful life gives a figure approximately six per cent below the conventional total, while a salvage-adjusted rate gives one approximately forty per cent below it; the unbounded charge pushes in the opposite direction for any asset held past its implied life. No claim of conservatism is made.</w:t>
       </w:r>
     </w:p>
     <w:p>
@@ -8572,7 +8541,7 @@
         <w:rPr>
           <w:szCs w:val="24"/>
         </w:rPr>
-        <w:t>The break-even price on a cash basis and the operating-expense ratio exclude all non-cash charges and are unaffected by any of the above. Only the break-even price on a total-cost basis inherits the divergence. Representative machine performance and salvage parameters, where a user holds them, are published in the machinery-management data standard of the American Society of Agricultural and Biological Engineers (ASABE, 2011).</w:t>
+        <w:t>The break-even price on a cash basis and the operating-expense ratio exclude all non-cash charges and are unaffected; only the break-even price on a total-cost basis inherits the divergence.</w:t>
       </w:r>
     </w:p>
     <w:p>
@@ -9057,43 +9026,12 @@
         <w:rPr>
           <w:szCs w:val="24"/>
         </w:rPr>
-        <w:t xml:space="preserve">The socio-technical barrier at the heart of Objective 1 is that a large proportion of rural Nigerian farmers do not hold a smartphone. The design response to it is an inbound message channel through which a farm activity could be recorded from a feature phone. This section states that design, and states equally plainly that none of it is built. The intended mechanism is an inbound </w:t>
+        <w:t>The socio-technical barrier at the heart of Objective 1 is that a large proportion of rural Nigerian farmers do not hold a smartphone. The design response is a gateway-agnostic inbound message channel: a webhook accepting a sender identifier and a short structured text, a parser converting that text into an activity and an amount, a mapping from the sender’s number to a registered farm so that unregistered senders are rejected, and creation of the paired Operational Log and Financial Transaction through the same ledger service the application uses, so that a phone-entered record would be indistinguishable from an app-entered one. None of it is built: there is no route, no webhook, no parser, no sender-to-farm mapping, no harness and no test, and the navigation entries that once gestured at this channel were removed because no backend supported them. The channel is recorded in Section 5.3 as future work. Its absence is the principal limit on the reach of the contribution and is stated as such rather than qualified.</w:t>
       </w:r>
       <w:proofErr w:type="spellStart"/>
-      <w:r>
-        <w:rPr>
-          <w:szCs w:val="24"/>
-        </w:rPr>
-        <w:t>webhook</w:t>
-      </w:r>
       <w:proofErr w:type="spellEnd"/>
-      <w:r>
-        <w:rPr>
-          <w:szCs w:val="24"/>
-        </w:rPr>
-        <w:t xml:space="preserve"> accepting a message consisting of a sender </w:t>
-      </w:r>
-      <w:r>
-        <w:rPr>
-          <w:szCs w:val="24"/>
-        </w:rPr>
-        <w:lastRenderedPageBreak/>
-        <w:t xml:space="preserve">identifier and a short structured text, a parser converting that text into an activity and an amount, a mapping from the sender’s number to a registered farm so that unregistered senders are rejected, and creation of the paired Operational Log and Financial Transaction through the same ledger service the application uses, so that a phone-entered record would be indistinguishable from an app-entered one. The channel would be gateway-agnostic, so that it could be exercised against simulated inbound payloads before any carrier integration. In the release evaluated by this thesis there is no such route, no </w:t>
-      </w:r>
       <w:proofErr w:type="spellStart"/>
-      <w:r>
-        <w:rPr>
-          <w:szCs w:val="24"/>
-        </w:rPr>
-        <w:t>webhook</w:t>
-      </w:r>
       <w:proofErr w:type="spellEnd"/>
-      <w:r>
-        <w:rPr>
-          <w:szCs w:val="24"/>
-        </w:rPr>
-        <w:t>, no parser, no sender-to-farm mapping, no simulated harness and no test; the navigation entries that once gestured at this channel were removed because no backend supported them. The channel is therefore recorded in Section 5.3 as future work, and no result anywhere in Chapter Four or Chapter Five rests on it. Its absence is the principal limit on the reach of the contribution and is stated as such rather than qualified.</w:t>
-      </w:r>
     </w:p>
     <w:p>
       <w:pPr>

</xml_diff>

<commit_message>
docs(thesis): em-dash reduction across prose and four table cells
68 removed at 43 sites, replaced with parentheses, commas, colons,
semicolons or sentence splits as each sentence required; §4.14's
run-in label regularised; P297 and the §4.12 Author's note held back
by decision; TOC capitalisation aligned at 4.13. No figure, citation,
cross-reference or caption changed.

Co-Authored-By: Claude Opus 5 <noreply@anthropic.com>
Claude-Session: https://claude.ai/code/session_011P7xNiUBbxrtAuKry16MD1
</commit_message>
<xml_diff>
--- a/Thesis_Ch1-5_with_figures.docx
+++ b/Thesis_Ch1-5_with_figures.docx
@@ -678,7 +678,7 @@
         <w:rPr>
           <w:szCs w:val="24"/>
         </w:rPr>
-        <w:t xml:space="preserve">Nigerian smallholder and medium-scale farms keep production and cost records on paper, so the cost of production per crop is rarely known at sale; existing farm management software assumes continuous connectivity and charges per user seat. This work designed, implemented and evaluated AGRI-PROFIT, an offline-first web platform comprising a soft-immutable paired-write ledger in which every operational record posts its financial transaction in a single commit and is corrected only by a linked contra entry, a deterministic decision-support layer computing nine quantities including per-crop gross margin, unit cost of production on two bases and retrospective break-even yield, and a post-harvest drying module applying thin-layer kinetics to the farm’s own records. A design-and-build methodology was adopted, its four-strand evaluation specified in advance. Functional verification at both recorded implementation states returned 426 collected backend cases — 422 passed, 4 skipped, none failed — at 96% statement coverage over 1,601 statements, with 148 frontend tests at 42.14% statement coverage, and the drying model recovered its designed parameters to within one part in ten thousand. For a 100 kg maize harvest dried from 25% to 13% moisture and weighed out at 84 kg, unit cost moves from ₦35.00 to ₦41.67 per kilogram: post-harvest mass loss expressed in money. Under 0.4 Mbps simulated throttling the service worker reduced network transfer on a repeat visit from 139,245 bytes to 127, first paint from 5,661.2 </w:t>
+        <w:t xml:space="preserve">Nigerian smallholder and medium-scale farms keep production and cost records on paper, so the cost of production per crop is rarely known at sale; existing farm management software assumes continuous connectivity and charges per user seat. This work designed, implemented and evaluated AGRI-PROFIT, an offline-first web platform comprising a soft-immutable paired-write ledger in which every operational record posts its financial transaction in a single commit and is corrected only by a linked contra entry, a deterministic decision-support layer computing nine quantities including per-crop gross margin, unit cost of production on two bases and retrospective break-even yield, and a post-harvest drying module applying thin-layer kinetics to the farm’s own records. A design-and-build methodology was adopted, its four-strand evaluation specified in advance. Functional verification at both recorded implementation states returned 426 collected backend cases (422 passed, 4 skipped, none failed) at 96% statement coverage over 1,601 statements, with 148 frontend tests at 42.14% statement coverage, and the drying model recovered its designed parameters to within one part in ten thousand. For a 100 kg maize harvest dried from 25% to 13% moisture and weighed out at 84 kg, unit cost moves from ₦35.00 to ₦41.67 per kilogram: post-harvest mass loss expressed in money. Under 0.4 Mbps simulated throttling the service worker reduced network transfer on a repeat visit from 139,245 bytes to 127, first paint from 5,661.2 </w:t>
       </w:r>
       <w:proofErr w:type="spellStart"/>
       <w:r>
@@ -2122,8 +2122,7 @@
         </w:tabs>
       </w:pPr>
       <w:r>
-        <w:lastRenderedPageBreak/>
-        <w:t>4.13 Results Against the Stated Objectives</w:t>
+        <w:t>4.13 Results against the Stated Objectives</w:t>
       </w:r>
       <w:r>
         <w:tab/>
@@ -3376,8 +3375,7 @@
         <w:rPr>
           <w:szCs w:val="24"/>
         </w:rPr>
-        <w:lastRenderedPageBreak/>
-        <w:t>rural credit—factors that are unevenly distributed in developing economies (</w:t>
+        <w:t>rural credit, all of which are unevenly distributed in developing economies (</w:t>
       </w:r>
       <w:proofErr w:type="spellStart"/>
       <w:r>
@@ -4885,7 +4883,7 @@
         <w:rPr>
           <w:szCs w:val="24"/>
         </w:rPr>
-        <w:t xml:space="preserve">Within agricultural informatics, a Decision-Support System (DSS) does not make isolated operational decisions; rather, it processes heterogeneous metrics—such as weather patterns, soil conditions, market prices, and historical yields—through deterministic rules or statistical and machine-learning models to provide stakeholders with actionable, </w:t>
+        <w:t xml:space="preserve">Within agricultural informatics, a Decision-Support System (DSS) does not make isolated operational decisions; rather, it processes heterogeneous metrics (such as weather patterns, soil conditions, market prices, and historical yields) through deterministic rules or statistical and machine-learning models to provide stakeholders with actionable, </w:t>
       </w:r>
       <w:proofErr w:type="spellStart"/>
       <w:r>
@@ -5225,7 +5223,7 @@
         <w:rPr>
           <w:szCs w:val="24"/>
         </w:rPr>
-        <w:t>, clear options rather than overwhelming them with raw, unprocessed big data—a design principle directly reflected in the AGRI-PROFIT decision-support layer.</w:t>
+        <w:t>, clear options rather than overwhelming them with raw, unprocessed big data, a design principle directly reflected in the AGRI-PROFIT decision-support layer.</w:t>
       </w:r>
     </w:p>
     <w:p>
@@ -6064,7 +6062,7 @@
         <w:rPr>
           <w:szCs w:val="24"/>
         </w:rPr>
-        <w:t xml:space="preserve"> usage, and observed yields) and financial records (input costs, sales revenue, and overheads) are automatically and atomically paired at the point of entry—each operation linked to its corresponding financial </w:t>
+        <w:t xml:space="preserve"> usage, and observed yields) and financial records (input costs, sales revenue, and overheads) are automatically and atomically paired at the point of entry, each operation linked to its corresponding financial </w:t>
       </w:r>
       <w:r>
         <w:rPr>
@@ -6299,7 +6297,7 @@
           <w:szCs w:val="24"/>
         </w:rPr>
         <w:tab/>
-        <w:t>Tier 1 – Deterministic, rule-based engine (baseline). Transparent financial rules compute, directly from the records, per-crop gross margin and its ranking, unit cost of production on a harvested and on a marketable basis, retrospective break-even yield, and — through the enterprise-economics layer — break-even price on a cash and a total-cost basis. Input thresholds are not computed and are not claimed. This tier requires no training data and is fully explainable, satisfying the bounded-rationality requirement for clear, satisficing recommendations (Section 2.2.2). The computation itself is performed server-side on modest hosting; what survives a loss of connectivity is the readability of its most recent results, which the client holds in a service-worker cache. The tier is therefore available offline, and it does not execute on the device.</w:t>
+        <w:t>Tier 1 – Deterministic, rule-based engine (baseline). Transparent financial rules compute, directly from the records, per-crop gross margin and its ranking, unit cost of production on a harvested and on a marketable basis, retrospective break-even yield, and, through the enterprise-economics layer, break-even price on a cash and a total-cost basis. Input thresholds are not computed and are not claimed. This tier requires no training data and is fully explainable, satisfying the bounded-rationality requirement for clear, satisficing recommendations (Section 2.2.2). The computation itself is performed server-side on modest hosting; what survives a loss of connectivity is the readability of its most recent results, which the client holds in a service-worker cache. The tier is therefore available offline, and it does not execute on the device.</w:t>
       </w:r>
     </w:p>
     <w:p>
@@ -6804,7 +6802,7 @@
       </w:r>
       <w:proofErr w:type="gramEnd"/>
       <w:r>
-        <w:t xml:space="preserve">M0 − Me), where M is the moisture content at time t, M0 the initial moisture content and Me the equilibrium moisture content — the value at which the produce is in balance with the water </w:t>
+        <w:t xml:space="preserve">M0 − Me), where M is the moisture content at time t, M0 the initial moisture content and Me the equilibrium moisture content, the value at which the produce is in balance with the water </w:t>
       </w:r>
       <w:proofErr w:type="spellStart"/>
       <w:r>
@@ -9082,7 +9080,7 @@
         <w:pStyle w:val="BodyPara"/>
       </w:pPr>
       <w:r>
-        <w:t>The design decision that matters financially is which mass becomes the denominator of the unit-cost calculation. The module uses the mass actually weighed out, not the mass the dry-matter balance predicts, because costing against a predicted mass would charge the farmer’s pricing decision with grain that never reached the store. Every malformed submission — outlet mass exceeding inlet mass, a final moisture not below the initial, non-positive mass, moisture outside the physical range, or readings not in strictly increasing time order — is rejected at the schema edge, and the same rules are mirrored in the client so that an invalid run is refused before it is queued offline rather than retrying forever.</w:t>
+        <w:t>The design decision that matters financially is which mass becomes the denominator of the unit-cost calculation. The module uses the mass actually weighed out, not the mass the dry-matter balance predicts, because costing against a predicted mass would charge the farmer’s pricing decision with grain that never reached the store. Every malformed submission (outlet mass exceeding inlet mass, a final moisture not below the initial, non-positive mass, moisture outside the physical range, or readings not in strictly increasing time order) is rejected at the schema edge, and the same rules are mirrored in the client so that an invalid run is refused before it is queued offline rather than retrying forever.</w:t>
       </w:r>
     </w:p>
     <w:p>
@@ -9604,7 +9602,7 @@
         <w:rPr>
           <w:szCs w:val="24"/>
         </w:rPr>
-        <w:t>, data isolation, throttling, credential hygiene and scoped sharing, and named what that design does not provide. Finally, it presented a four-strand evaluation methodology—functional verification, performance benchmarking, hosting-cost analysis, and heuristic-plus-SUS usability evaluation—of which three were executed and one was not, together with a fully specified field evaluation designed as future work. The results of applying this methodology are presented in Chapter Four.</w:t>
+        <w:t>, data isolation, throttling, credential hygiene and scoped sharing, and named what that design does not provide. Finally, it presented a four-strand evaluation methodology (functional verification, performance benchmarking, hosting-cost analysis, and heuristic-plus-SUS usability evaluation) of which three were executed and one was not, together with a fully specified field evaluation designed as future work. The results of applying this methodology are presented in Chapter Four.</w:t>
       </w:r>
     </w:p>
     <w:p>
@@ -11434,8 +11432,7 @@
         <w:rPr>
           <w:szCs w:val="24"/>
         </w:rPr>
-        <w:lastRenderedPageBreak/>
-        <w:t>Third, the figures are the ledger, not a projection. Each is the sum of transactions carrying that crop’s category, with reversed pairs netted — at farm level and per crop as well.</w:t>
+        <w:t>Third, the figures are the ledger, not a projection. Each is the sum of transactions carrying that crop’s category, with reversed pairs netted, at farm level and per crop as well.</w:t>
       </w:r>
     </w:p>
     <w:p>
@@ -11568,7 +11565,7 @@
         <w:rPr>
           <w:szCs w:val="24"/>
         </w:rPr>
-        <w:t>Unit cost is the figure most directly connected to the pricing decision a farmer faces at the farm gate. The platform computes it as attributed cost divided by output, and — this being the point at which the record-keeping layer meets the process-engineering layer — it distinguishes the mass that left the field from the mass that can actually be sold.</w:t>
+        <w:t>Unit cost is the figure most directly connected to the pricing decision a farmer faces at the farm gate. The platform computes it as attributed cost divided by output, and, this being the point at which the record-keeping layer meets the process-engineering layer, it distinguishes the mass that left the field from the mass that can actually be sold.</w:t>
       </w:r>
     </w:p>
     <w:p>
@@ -12386,7 +12383,7 @@
         <w:rPr>
           <w:szCs w:val="24"/>
         </w:rPr>
-        <w:t xml:space="preserve"> For the maize run those two differ: from 100 kg at 25% moisture the dry matter is 75.0 kg, which at 13% final moisture should weigh 86.21 kg, against 84 kg observed. Costing against the predicted 86.21 kg would give ₦40.60 per kilogram and would charge the farmer’s pricing decision with grain that never reached the store. Costing against the observed 84 kg is the conservative and correct choice, and it is the one the platform makes. And where no drying run exists, as with cassava, the marketable figure is withheld rather than defaulted to the harvest mass — the two are not the same quantity, and reporting one as the other would be a silent error.</w:t>
+        <w:t xml:space="preserve"> For the maize run those two differ: from 100 kg at 25% moisture the dry matter is 75.0 kg, which at 13% final moisture should weigh 86.21 kg, against 84 kg observed. Costing against the predicted 86.21 kg would give ₦40.60 per kilogram and would charge the farmer’s pricing decision with grain that never reached the store. Costing against the observed 84 kg is the conservative and correct choice, and it is the one the platform makes. And where no drying run exists, as with cassava, the marketable figure is withheld rather than defaulted to the harvest mass. The two are not the same quantity, and reporting one as the other would be a silent error.</w:t>
       </w:r>
     </w:p>
     <w:p>
@@ -12394,7 +12391,7 @@
         <w:pStyle w:val="BodyPara"/>
       </w:pPr>
       <w:r>
-        <w:t>The same reporting decision applies to cowpea. Its dry-matter balance predicts an outlet mass of 444.75 kg against 431.0 kg observed, a process loss of 13.75 kg or 3.09% — below the five per cent threshold at which the platform raises a data-quality warning. Costing against the predicted mass would give ₦601.92 per kilogram; the platform uses the observed 431.0 kg and reports ₦621.11. Both predicted masses are quoted here rounded, while the costing divides by the unrounded value. In both crops the conservative denominator is the one the farmer can actually carry to market.</w:t>
+        <w:t>The same reporting decision applies to cowpea. Its dry-matter balance predicts an outlet mass of 444.75 kg against 431.0 kg observed, a process loss of 13.75 kg or 3.09%, below the five per cent threshold at which the platform raises a data-quality warning. Costing against the predicted mass would give ₦601.92 per kilogram; the platform uses the observed 431.0 kg and reports ₦621.11. Both predicted masses are quoted here rounded, while the costing divides by the unrounded value. In both crops the conservative denominator is the one the farmer can actually carry to market.</w:t>
       </w:r>
     </w:p>
     <w:p>
@@ -13293,7 +13290,7 @@
         <w:rPr>
           <w:szCs w:val="24"/>
         </w:rPr>
-        <w:t xml:space="preserve"> price, and a break-even yield computed against a price that does not exist would be arithmetic dressed as advice. The figure is likewise withheld where no yield has been recorded, where the sale that established the price has since been reversed, and where no cost has been attributed to the crop — in that last case an arithmetically valid break-even yield of zero kilograms would communicate a false completeness to a user whose actual situation is that they have not recorded their costs. All four null cases are asserted by named tests.</w:t>
+        <w:t xml:space="preserve"> price, and a break-even yield computed against a price that does not exist would be arithmetic dressed as advice. The figure is likewise withheld where no yield has been recorded, where the sale that established the price has since been reversed, and where no cost has been attributed to the crop. In that last case an arithmetically valid break-even yield of zero kilograms would communicate a false completeness to a user whose actual situation is that they have not recorded their costs. All four null cases are asserted by named tests.</w:t>
       </w:r>
     </w:p>
     <w:p>
@@ -14667,7 +14664,7 @@
         <w:rPr>
           <w:szCs w:val="24"/>
         </w:rPr>
-        <w:t>, the regression and the back-transformation from ln k to k are each correct — the whole of the fitting path.</w:t>
+        <w:t>, the regression and the back-transformation from ln k to k are each correct: the whole of the fitting path.</w:t>
       </w:r>
     </w:p>
     <w:p>
@@ -15606,7 +15603,7 @@
         <w:rPr>
           <w:szCs w:val="24"/>
         </w:rPr>
-        <w:t xml:space="preserve">The engineering significance of this module is not the kinetics in isolation — the models are long established — but that its output enters the financial record. A drying run is recorded as an operational activity like any other, so it posts its cost to the ledger through the same paired write as a </w:t>
+        <w:t xml:space="preserve">The engineering significance of this module is not the kinetics in isolation (the models are long established) but that its output enters the financial record. A drying run is recorded as an operational activity like any other, so it posts its cost to the ledger through the same paired write as a </w:t>
       </w:r>
       <w:proofErr w:type="spellStart"/>
       <w:r>
@@ -15634,7 +15631,7 @@
         <w:rPr>
           <w:szCs w:val="24"/>
         </w:rPr>
-        <w:t xml:space="preserve"> computed marketable output becomes the denominator of the unit-cost figure in Table 4.3. The chain from a moisture measurement to a price per marketable kilogram — 100 kg at 25% moisture, dried to 13%, weighed out at 84 kg, costed at ₦41.67 rather than ₦35.00 — is computed by the platform without manual intervention at any step. Access control and reversal handling travel with it: a drying run belonging to another farm returns HTTP 404, and a reversed run is excluded from the summary.</w:t>
+        <w:t xml:space="preserve"> computed marketable output becomes the denominator of the unit-cost figure in Table 4.3. The chain from a moisture measurement to a price per marketable kilogram (100 kg at 25% moisture, dried to 13%, weighed out at 84 kg, costed at ₦41.67 rather than ₦35.00) is computed by the platform without manual intervention at any step. Access control and reversal handling travel with it: a drying run belonging to another farm returns HTTP 404, and a reversed run is excluded from the summary.</w:t>
       </w:r>
     </w:p>
     <w:p>
@@ -16417,21 +16414,20 @@
         <w:rPr>
           <w:szCs w:val="24"/>
         </w:rPr>
-        <w:t xml:space="preserve">Table 4.8 gives the cost structure for maize and for the farm as a whole, bucket by bucket. Classification coverage is itself the substantive result. It states what proportion of recorded cost carries a cost subtype, and it is reported rather than hidden because every downstream figure inherits its incompleteness. At farm level 11.75% of recorded cost is unclassified — two </w:t>
+        <w:t>Table 4.8 gives the cost structure for maize and for the farm as a whole, bucket by bucket. Classification coverage is itself the substantive result. It states what proportion of recorded cost carries a cost subtype, and it is reported rather than hidden because every downstream figure inherits its incompleteness. At farm level 11.75% of recorded cost is unclassified (two mechanisation</w:t>
       </w:r>
       <w:proofErr w:type="spellStart"/>
       <w:r>
         <w:rPr>
           <w:szCs w:val="24"/>
         </w:rPr>
-        <w:t>mechanisation</w:t>
       </w:r>
       <w:proofErr w:type="spellEnd"/>
       <w:r>
         <w:rPr>
           <w:szCs w:val="24"/>
         </w:rPr>
-        <w:t xml:space="preserve"> logs entered without cost parameters — and the platform reports that as unclassified rather than defaulting it into a bucket. An unclassified cost sits inside the total and outside the cash figure, so a reader can see exactly how much of the analysis rests on classified data. The maize enterprise, at 100% coverage, is the case where the figures can be read without that reservation.</w:t>
+        <w:t xml:space="preserve"> logs entered without cost parameters) and the platform reports that as unclassified rather than defaulting it into a bucket. An unclassified cost sits inside the total and outside the cash figure, so a reader can see exactly how much of the analysis rests on classified data. The maize enterprise, at 100% coverage, is the case where the figures can be read without that reservation.</w:t>
       </w:r>
     </w:p>
     <w:p>
@@ -16906,8 +16902,7 @@
         <w:rPr>
           <w:szCs w:val="24"/>
         </w:rPr>
-        <w:lastRenderedPageBreak/>
-        <w:t>Table 4.9 reports the derived overlay and the allocation computed from it. Three properties are asserted by test. A zero depreciation rate counts as unrated and is reported in the unrated count, never as a zero charge — so a partial overlay is visible as partial rather than being read as a small true fixed cost (Figure 4.7). The allocation is proportional to direct cost and is computed farm-wide before any crop filter is applied, so the same figure cannot change according to how it was requested. And where the total direct cost is zero, every share and every allocation is undefined rather than being split evenly, on the reasoning that an even split invents an allocation base that does not exist.</w:t>
+        <w:t>Table 4.9 reports the derived overlay and the allocation computed from it. Three properties are asserted by test. A zero depreciation rate counts as unrated and is reported in the unrated count, never as a zero charge, so a partial overlay is visible as partial rather than being read as a small true fixed cost (Figure 4.7). The allocation is proportional to direct cost and is computed farm-wide before any crop filter is applied, so the same figure cannot change according to how it was requested. And where the total direct cost is zero, every share and every allocation is undefined rather than being split evenly, on the reasoning that an even split invents an allocation base that does not exist.</w:t>
       </w:r>
     </w:p>
     <w:p>
@@ -16998,7 +16993,7 @@
         <w:rPr>
           <w:szCs w:val="24"/>
         </w:rPr>
-        <w:t xml:space="preserve">The partial-budget calculator evaluates a proposed change by four terms — added revenue, reduced cost, lost revenue and added cost — and returns the signed net change. A probe with added revenue ₦120,000, reduced cost ₦15,000, no lost revenue and added cost ₦90,000 returned benefits of ₦135,000 against costs of ₦90,000 for a net change of </w:t>
+        <w:t xml:space="preserve">The partial-budget calculator evaluates a proposed change by four terms (added revenue, reduced cost, lost revenue and added cost) and returns the signed net change. A probe with added revenue ₦120,000, reduced cost ₦15,000, no lost revenue and added cost ₦90,000 returned benefits of ₦135,000 against costs of ₦90,000 for a net change of </w:t>
       </w:r>
       <w:r>
         <w:rPr>
@@ -17023,7 +17018,7 @@
         <w:rPr>
           <w:szCs w:val="24"/>
         </w:rPr>
-        <w:t xml:space="preserve">The result of interest here is not the arithmetic but the parity. The partial budget is implemented twice — once in the backend service and once in the client, so that it remains available offline — and two implementations of the same formula are an invitation to divergence. Eight cases were hand-computed, placed in a single shared fixture read verbatim by both suites, and asserted against both implementations. </w:t>
+        <w:t xml:space="preserve">The result of interest here is not the arithmetic but the parity. The partial budget is implemented twice (once in the backend service and once in the client, so that it remains available offline) and two implementations of the same formula are an invitation to divergence. Eight cases were hand-computed, placed in a single shared fixture read verbatim by both suites, and asserted against both implementations. </w:t>
       </w:r>
       <w:r>
         <w:rPr>
@@ -17159,7 +17154,7 @@
         <w:rPr>
           <w:szCs w:val="24"/>
         </w:rPr>
-        <w:t xml:space="preserve"> average, so that a null is never read without the count that explains it — one season and ten seasons are different reasons for the same null.</w:t>
+        <w:t xml:space="preserve"> average, so that a null is never read without the count that explains it: one season and ten seasons are different reasons for the same null.</w:t>
       </w:r>
     </w:p>
     <w:p>
@@ -17221,7 +17216,7 @@
         <w:rPr>
           <w:szCs w:val="24"/>
         </w:rPr>
-        <w:t xml:space="preserve"> agronomic relationship and the model was then fitted to that generated data, so an R² of 0.9762 measures how well the Random Forest recovers a relationship that was constructed to be recoverable. It is evidence that the machine-learning pipeline is correctly implemented — that features are encoded, the model fitted, and predictions served end to end — and it is </w:t>
+        <w:t xml:space="preserve"> agronomic relationship and the model was then fitted to that generated data, so an R² of 0.9762 measures how well the Random Forest recovers a relationship that was constructed to be recoverable. It is evidence that the machine-learning pipeline is correctly implemented (that features are encoded, the model fitted, and predictions served end to end) and it is not</w:t>
       </w:r>
       <w:r>
         <w:rPr>
@@ -17229,7 +17224,7 @@
           <w:bCs/>
           <w:szCs w:val="24"/>
         </w:rPr>
-        <w:t>not evidence that the model predicts Nigerian smallholder yields.</w:t>
+        <w:t xml:space="preserve"> evidence that the model predicts Nigerian smallholder yields.</w:t>
       </w:r>
       <w:r>
         <w:rPr>
@@ -17268,7 +17263,7 @@
         <w:rPr>
           <w:szCs w:val="24"/>
         </w:rPr>
-        <w:t xml:space="preserve">Second — and this reverses a claim carried by an earlier draft — the artefact is reproducible from the repository. The generation seed, the split seed and the estimator seed are all fixed; the generated dataset carries the recorded SHA-256 fingerprint given </w:t>
+        <w:t xml:space="preserve">Second, and this reverses a claim carried by an earlier draft, the artefact is reproducible from the repository. The generation seed, the split seed and the estimator seed are all fixed; the generated dataset carries the recorded SHA-256 fingerprint given </w:t>
       </w:r>
       <w:r>
         <w:rPr>
@@ -17314,7 +17309,7 @@
         <w:rPr>
           <w:szCs w:val="24"/>
         </w:rPr>
-        <w:t>Third, the root-mean-square error is computed and reported: 0.4883 t/ha, measured 0.488334 over the held-out split. Chapter Three states that RMSE is a standard complementary measure for continuous prediction tasks in agricultural yield modelling, and all three measures — R² 0.9762, MAE 0.2414 t/ha and RMSE 0.4883 t/ha — are reported together. The earlier record of a missing RMSE is closed.</w:t>
+        <w:t>Third, the root-mean-square error is computed and reported: 0.4883 t/ha, measured 0.488334 over the held-out split. Chapter Three states that RMSE is a standard complementary measure for continuous prediction tasks in agricultural yield modelling, and all three measures (R² 0.9762, MAE 0.2414 t/ha and RMSE 0.4883 t/ha) are reported together. The earlier record of a missing RMSE is closed.</w:t>
       </w:r>
     </w:p>
     <w:p>
@@ -17418,7 +17413,7 @@
       </w:r>
       <w:proofErr w:type="spellEnd"/>
       <w:r>
-        <w:t xml:space="preserve"> ones. Of the five enterprises in the demonstration ledger, three can be forecast and two cannot — and the two that cannot include cowpea, the largest enterprise on the farm by revenue, recorded cost and gross margin.</w:t>
+        <w:t xml:space="preserve"> ones. Of the five enterprises in the demonstration ledger, three can be forecast and two cannot, and the two that cannot include cowpea, the largest enterprise on the farm by revenue, recorded cost and gross margin.</w:t>
       </w:r>
     </w:p>
     <w:p>
@@ -17518,7 +17513,7 @@
         <w:rPr>
           <w:szCs w:val="24"/>
         </w:rPr>
-        <w:t xml:space="preserve"> by feature — farm records, decision support, dashboard, authentication and investor sharing — over a library layer providing the local database, the </w:t>
+        <w:t xml:space="preserve"> by feature (farm records, decision support, dashboard, authentication and investor sharing) over a library layer providing the local database, the </w:t>
       </w:r>
       <w:proofErr w:type="spellStart"/>
       <w:r>
@@ -17929,8 +17924,7 @@
         <w:rPr>
           <w:szCs w:val="24"/>
         </w:rPr>
-        <w:lastRenderedPageBreak/>
-        <w:t>API outputs — detail, summary, validation and reversal handling — are covered by the test block. What is not covered is the drawing of the picture.</w:t>
+        <w:t>API outputs (detail, summary, validation and reversal handling) are covered by the test block. What is not covered is the drawing of the picture.</w:t>
       </w:r>
     </w:p>
     <w:p>
@@ -18153,21 +18147,20 @@
         <w:rPr>
           <w:szCs w:val="24"/>
         </w:rPr>
-        <w:t xml:space="preserve"> to 70.6 </w:t>
+        <w:t xml:space="preserve"> to 70.6 ms, a factor</w:t>
       </w:r>
       <w:proofErr w:type="spellStart"/>
       <w:r>
         <w:rPr>
           <w:szCs w:val="24"/>
         </w:rPr>
-        <w:t>ms</w:t>
       </w:r>
       <w:proofErr w:type="spellEnd"/>
       <w:r>
         <w:rPr>
           <w:szCs w:val="24"/>
         </w:rPr>
-        <w:t xml:space="preserve"> — a factor of eighty — and network transfer fell from 139,245 bytes over eight requests to 127 bytes over seven, with largest </w:t>
+        <w:t xml:space="preserve"> of eighty, and network transfer fell from 139,245 bytes over eight requests to 127 bytes over seven, with largest </w:t>
       </w:r>
       <w:proofErr w:type="spellStart"/>
       <w:r>
@@ -18245,7 +18238,7 @@
         <w:rPr>
           <w:szCs w:val="24"/>
         </w:rPr>
-        <w:t xml:space="preserve">The two exercised containers — the FastAPI backend and PostgreSQL 15 — measure 178.9 to 202.8 MiB at rest against the seeded dataset (Table C.1); on that footprint a 2 </w:t>
+        <w:t xml:space="preserve">The two exercised containers, the FastAPI backend and PostgreSQL 15, measure 178.9 to 202.8 MiB at rest against the seeded dataset (Table C.1); on that footprint a 2 </w:t>
       </w:r>
       <w:r>
         <w:rPr>
@@ -18299,7 +18292,7 @@
         <w:pStyle w:val="BodyPara"/>
       </w:pPr>
       <w:r>
-        <w:t>Table B.2 of Appendix B records the deployment, migration and recovery checks and their outcomes. The distinction that these results establish, and that must be carried into Chapter Five, is between a deployment path that has been demonstrated and a deployment that has been performed. This work has the first and not the second. The production composition builds, starts and answers its probes; the migration chain runs and rolls back against a real PostgreSQL server; a backup was taken and restored with every row count matching and the paired-write invariant intact. No instance serves a real user, no certificate has been issued for a real hostname, and there is no observability of any kind — no metrics, no tracing, no alerting, the containers logging to standard output only. Nor is any continuous-integration result recorded: the workflow is defined and the substance of its jobs was executed locally, which is what Section 4.9 reports, and no claim that the pipeline passed is made anywhere in this work.</w:t>
+        <w:t>Table B.2 of Appendix B records the deployment, migration and recovery checks and their outcomes. The distinction that these results establish, and that must be carried into Chapter Five, is between a deployment path that has been demonstrated and a deployment that has been performed. This work has the first and not the second. The production composition builds, starts and answers its probes; the migration chain runs and rolls back against a real PostgreSQL server; a backup was taken and restored with every row count matching and the paired-write invariant intact. No instance serves a real user, no certificate has been issued for a real hostname, and there is no observability of any kind: no metrics, no tracing, no alerting, the containers logging to standard output only. Nor is any continuous-integration result recorded: the workflow is defined and the substance of its jobs was executed locally, which is what Section 4.9 reports, and no claim that the pipeline passed is made anywhere in this work.</w:t>
       </w:r>
     </w:p>
     <w:p>
@@ -18340,7 +18333,7 @@
         <w:rPr>
           <w:szCs w:val="24"/>
         </w:rPr>
-        <w:t xml:space="preserve"> The project holds a complete facilitator run-sheet and a three-part evaluation pack — a task script, a heuristic checklist and the ten-item SUS questionnaire — and the frozen evidence base contains no completed instrument of any kind: no scored SUS forms, no filled heuristic checklists, no session notes, no participant records and no scans or photographs. This </w:t>
+        <w:t xml:space="preserve"> The project holds a complete facilitator run-sheet and a three-part evaluation pack (a task script, a heuristic checklist and the ten-item SUS questionnaire) and the frozen evidence base contains no completed instrument of any kind: no scored SUS forms, no filled heuristic checklists, no session notes, no participant records and no scans or photographs. This </w:t>
       </w:r>
       <w:r>
         <w:rPr>
@@ -19470,7 +19463,7 @@
               <w:jc w:val="center"/>
             </w:pPr>
             <w:r>
-              <w:t>The barriers identified in Chapters One and Two — fragmentation, interoperability, complexity, connectivity and cost — were carried into the non-functional requirements of Section 3.3.2 and answered by specific implemented mechanisms: the paired write against fragmentation (109 logs, 109 transactions, 0 unpaired), the offline queue and service worker against connectivity, and the fixed-instance cost profile against cost</w:t>
+              <w:t>The barriers identified in Chapters One and Two (fragmentation, interoperability, complexity, connectivity and cost) were carried into the non-functional requirements of Section 3.3.2 and answered by specific implemented mechanisms: the paired write against fragmentation (109 logs, 109 transactions, 0 unpaired), the offline queue and service worker against connectivity, and the fixed-instance cost profile against cost</w:t>
             </w:r>
           </w:p>
         </w:tc>
@@ -19782,7 +19775,7 @@
               <w:jc w:val="center"/>
             </w:pPr>
             <w:r>
-              <w:t>Achieved as a demonstrated computation on seeded runs. No drying trial was conducted with real produce, no dryer was instrumented, and the thin-layer models themselves are long established and are not claimed as a contribution — their coupling to the financial record is</w:t>
+              <w:t>Achieved as a demonstrated computation on seeded runs. No drying trial was conducted with real produce, no dryer was instrumented, and the thin-layer models themselves are long established and are not claimed as a contribution; their coupling to the financial record is</w:t>
             </w:r>
           </w:p>
         </w:tc>
@@ -19927,7 +19920,7 @@
           <w:bCs/>
           <w:szCs w:val="24"/>
         </w:rPr>
-        <w:t xml:space="preserve">Verification gaps — evaluation limitations. There are no component tests for the page and form layer, including the drying-curve chart. The client-side mirror of the monetary bounds is asserted only as a pure function; the wiring between the form and the validator is tested nowhere, as the 422 results in Appendix B are server-side responses. The local-database migration is proven against an in-memory </w:t>
+        <w:t xml:space="preserve">Verification gaps. These are evaluation limitations. There are no component tests for the page and form layer, including the drying-curve chart. The client-side mirror of the monetary bounds is asserted only as a pure function; the wiring between the form and the validator is tested nowhere, as the 422 results in Appendix B are server-side responses. The local-database migration is proven against an in-memory </w:t>
       </w:r>
       <w:proofErr w:type="spellStart"/>
       <w:r>
@@ -19971,7 +19964,7 @@
           <w:bCs/>
           <w:szCs w:val="24"/>
         </w:rPr>
-        <w:t xml:space="preserve">Data-state limitations. The live database holds eleven unidentified exploratory farms from development, deliberately left in place rather than deleted on an assumption, and two farms share the name “Demo Farm” — only farm 26 carries the seeded data, which is why no figure in this chapter is taken from a farm-list view. Machine hours are populated on three of eight </w:t>
+        <w:t xml:space="preserve">Data-state limitations. The live database holds eleven unidentified exploratory farms from development, deliberately left in place rather than deleted on an assumption, and two farms share the name “Demo Farm”; only farm 26 carries the seeded data, which is why no figure in this chapter is taken from a farm-list view. Machine hours are populated on three of eight </w:t>
       </w:r>
       <w:proofErr w:type="spellStart"/>
       <w:r>
@@ -19987,7 +19980,7 @@
           <w:bCs/>
           <w:szCs w:val="24"/>
         </w:rPr>
-        <w:t xml:space="preserve"> logs. Two components of the hosting footprint — the static server and the container runtime — were not sampled at all, so the total is part-measured and part-assumed. The maize and cowpea sale figures are chosen totals rather than rate-times-quantity, so the </w:t>
+        <w:t xml:space="preserve"> logs. Two components of the hosting footprint, the static server and the container runtime, were not sampled at all, so the total is part-measured and part-assumed. The maize and cowpea sale figures are chosen totals rather than rate-times-quantity, so the </w:t>
       </w:r>
       <w:proofErr w:type="spellStart"/>
       <w:r>
@@ -20114,7 +20107,7 @@
         <w:rPr>
           <w:szCs w:val="24"/>
         </w:rPr>
-        <w:t xml:space="preserve"> holds sequentially and under a genuine two-thread race. Coverage is concentrated where it matters — every module that serves a request is fully or almost fully covered — and its distribution is reported rather than averaged away.</w:t>
+        <w:t xml:space="preserve"> holds sequentially and under a genuine two-thread race. Coverage is concentrated where it matters (every module that serves a request is fully or almost fully covered) and its distribution is reported rather than averaged away.</w:t>
       </w:r>
     </w:p>
     <w:p>
@@ -20154,7 +20147,7 @@
         <w:rPr>
           <w:szCs w:val="24"/>
         </w:rPr>
-        <w:t>The security and tenancy boundary is exercised as well as asserted, and is reported with its residuals at Section 4.11 and in Tables B.1 and B.2; the standing caveats — synthetic training data for the forecast tier, a production path demonstrated but never deployed, no independent security assessment, and a usability strand specified and not executed — are stated at Sections 4.7, 4.12 and 4.14. Chapter Five interprets these results against the problem set out in Chapter One, states the platform’s limitations in full, and sets out what would be required to take it from a verified prototype to a deployed system.</w:t>
+        <w:t>The security and tenancy boundary is exercised as well as asserted, and is reported with its residuals at Section 4.11 and in Tables B.1 and B.2; the standing caveats (synthetic training data for the forecast tier, a production path demonstrated but never deployed, no independent security assessment, and a usability strand specified and not executed) are stated at Sections 4.7, 4.12 and 4.14. Chapter Five interprets these results against the problem set out in Chapter One, states the platform’s limitations in full, and sets out what would be required to take it from a verified prototype to a deployed system.</w:t>
       </w:r>
     </w:p>
     <w:p>
@@ -20337,7 +20330,7 @@
         <w:pStyle w:val="BodyPara"/>
       </w:pPr>
       <w:r>
-        <w:t>Post-harvest coupling. A maize harvest of 100 kg at 25% moisture, dried to 13% and weighed out at 84 kg against a dry-matter prediction of 86.21 kg, moved the unit cost of production from ₦35.00 to ₦41.67 per marketable kilogram — a 19% difference, being post-harvest mass reduction expressed in money. The Page and Newton models were recovered from a designed fixture at k = 0.30 and n = 0.75 to within one part in ten thousand.</w:t>
+        <w:t>Post-harvest coupling. A maize harvest of 100 kg at 25% moisture, dried to 13% and weighed out at 84 kg against a dry-matter prediction of 86.21 kg, moved the unit cost of production from ₦35.00 to ₦41.67 per marketable kilogram, a 19% difference, being post-harvest mass reduction expressed in money. The Page and Newton models were recovered from a designed fixture at k = 0.30 and n = 0.75 to within one part in ten thousand.</w:t>
       </w:r>
     </w:p>
     <w:p>
@@ -20468,10 +20461,10 @@
         <w:t xml:space="preserve"> computed marketable output becomes the denominator of the unit-cost figure. Second, the denominator is the mass actually weighed out rather than the mass t</w:t>
       </w:r>
       <w:r>
-        <w:t>he dry-matter balance predicts — 84 kg against 86.21 kg —</w:t>
-      </w:r>
-      <w:r>
-        <w:t xml:space="preserve"> which is the conservative choice and charges the pricing decision only with grain that reached the store. Third, the distinction the module is most likely to get wrong is guarded by a test that fails if it is ever collapsed: water removed is a water balance, not a mass difference, and conflating them would make process loss and drying performance the same number. One refinement must travel with the ₦41.67 figure now that the demonstration farm owns a depreciating asset. For maize that figure is also the break-even price on a cash basis: the enterprise carries no unclassified cost and no recorded fixed cost, so its cash cost and its recorded cost are the same quantity, and both give ₦41.67. On a total-cost basis, once maize takes its ₦58.88 share of the farm-wide depreciation overlay, the figure is ₦42.37. Cowpea is the contrasting case on the same farm, where the two diverge. The </w:t>
+        <w:t>he dry-matter balance predicts (84 kg against 86.21 kg), which is</w:t>
+      </w:r>
+      <w:r>
+        <w:t xml:space="preserve"> the conservative choice and charges the pricing decision only with grain that reached the store. Third, the distinction the module is most likely to get wrong is guarded by a test that fails if it is ever collapsed: water removed is a water balance, not a mass difference, and conflating them would make process loss and drying performance the same number. One refinement must travel with the ₦41.67 figure now that the demonstration farm owns a depreciating asset. For maize that figure is also the break-even price on a cash basis: the enterprise carries no unclassified cost and no recorded fixed cost, so its cash cost and its recorded cost are the same quantity, and both give ₦41.67. On a total-cost basis, once maize takes its ₦58.88 share of the farm-wide depreciation overlay, the figure is ₦42.37. Cowpea is the contrasting case on the same farm, where the two diverge. The </w:t>
       </w:r>
       <w:r>
         <w:t>two answer different questions,</w:t>
@@ -22591,7 +22584,7 @@
               <w:rPr>
                 <w:lang w:val="en-GB"/>
               </w:rPr>
-              <w:t xml:space="preserve"> unit cost of production on two bases, and nine quantities in all — per-crop gross margin and its ranking; unit cost of production on a harvested-mass basis; unit cost of production on a marketable-mass basis where a drying run exists; retrospective break-even yield; cost structure classified by economic behaviour with an explicit classification-coverage figure; a derived fixed-cost overlay and its proportional allocation; break-even price on a cash and on a total-cost basis; a yield-sensitivity matrix; and an operating-expense ratio — together with a partial-budget calculator and an Olympic-average yield baseline.</w:t>
+              <w:t xml:space="preserve"> unit cost of production on two bases, and nine quantities in all: per-crop gross margin and its ranking; unit cost of production on a harvested-mass basis; unit cost of production on a marketable-mass basis where a drying run exists; retrospective break-even yield; cost structure classified by economic behaviour with an explicit classification-coverage figure; a derived fixed-cost overlay and its proportional allocation; break-even price on a cash and on a total-cost basis; a yield-sensitivity matrix; and an operating-expense ratio, together with a partial-budget calculator and an Olympic-average yield baseline.</w:t>
             </w:r>
           </w:p>
         </w:tc>
@@ -28006,7 +27999,7 @@
               <w:rPr>
                 <w:sz w:val="22"/>
               </w:rPr>
-              <w:t>2.21 kg (2.56%) — below the 5% data-quality threshold</w:t>
+              <w:t>2.21 kg (2.56%), below the 5% data-quality threshold</w:t>
             </w:r>
           </w:p>
         </w:tc>

</xml_diff>

<commit_message>
docs(thesis): drop the 4.12 Author's note, fix abstract and TOC spacing
Delete the second-person drafting instruction under the Table 4.10
caption (160 words); Section 3.8.4 already carries the SUS method, the
panel size and both procedural controls, and nothing cross-references
the note. Remove the inline double-spacing override on the abstract so
the Abstract Body style's single spacing applies, as the departmental
guideline requires, and set space-after on toc 1 from 5 pt to 0 pt.
Line spacing stays at 2.0. No entry removed from the TOC, List of
Tables or List of Figures; no heading, caption or text changed.

Also remove the untracked deleted_para_484.txt, a stale extract whose
paragraph index no longer points at the content it describes.

Co-Authored-By: Claude Opus 5 <noreply@anthropic.com>
Claude-Session: https://claude.ai/code/session_011P7xNiUBbxrtAuKry16MD1
</commit_message>
<xml_diff>
--- a/Thesis_Ch1-5_with_figures.docx
+++ b/Thesis_Ch1-5_with_figures.docx
@@ -672,7 +672,7 @@
     <w:p>
       <w:pPr>
         <w:pStyle w:val="AbstractBody"/>
-        <w:spacing w:line="480" w:lineRule="auto"/>
+        <w:spacing/>
       </w:pPr>
       <w:r>
         <w:rPr>
@@ -18963,53 +18963,6 @@
         <w:pStyle w:val="BodyPara"/>
         <w:spacing w:after="120" w:line="240" w:lineRule="auto"/>
       </w:pPr>
-    </w:p>
-    <w:p>
-      <w:pPr>
-        <w:pStyle w:val="NoteBlock"/>
-      </w:pPr>
-      <w:r>
-        <w:rPr>
-          <w:b/>
-          <w:bCs/>
-          <w:szCs w:val="24"/>
-        </w:rPr>
-        <w:t>Author’s note — what must exist before each cell is filled.</w:t>
-      </w:r>
-      <w:r>
-        <w:rPr>
-          <w:szCs w:val="24"/>
-        </w:rPr>
-        <w:t xml:space="preserve"> SUS is scored by the standard procedure: odd-numbered items score (response − 1), even-numbered items score (5 − response), the ten adjusted scores are summed to a total out of 40, and the total is multiplied by 2.5 to give a score from 0 to 100. It is not a percentage. Report the mean </w:t>
-      </w:r>
-      <w:r>
-        <w:rPr>
-          <w:b/>
-          <w:bCs/>
-          <w:szCs w:val="24"/>
-        </w:rPr>
-        <w:t>with the individual scores beside it</w:t>
-      </w:r>
-      <w:r>
-        <w:rPr>
-          <w:szCs w:val="24"/>
-        </w:rPr>
-        <w:t xml:space="preserve"> and label it indicative rather than statistically representative, since SUS is understood to be unstable below roughly a dozen respondents and the specified panel is three to five. Merge the issue logs, </w:t>
-      </w:r>
-      <w:proofErr w:type="spellStart"/>
-      <w:r>
-        <w:rPr>
-          <w:szCs w:val="24"/>
-        </w:rPr>
-        <w:t>deduplicate</w:t>
-      </w:r>
-      <w:proofErr w:type="spellEnd"/>
-      <w:r>
-        <w:rPr>
-          <w:szCs w:val="24"/>
-        </w:rPr>
-        <w:t>, and keep the highest severity any evaluator assigned to each issue. Photograph or scan every completed sheet: these are the raw instruments an examiner may ask to see. State the panel at its true size — a panel smaller than the method specifies is a limitation, and a panel reported larger than it was is misconduct.</w:t>
-      </w:r>
     </w:p>
     <w:p>
       <w:pPr>
@@ -40879,7 +40832,7 @@
     <w:unhideWhenUsed/>
     <w:rsid w:val="008A0666"/>
     <w:pPr>
-      <w:spacing w:after="100"/>
+      <w:spacing w:after="0"/>
     </w:pPr>
   </w:style>
   <w:style w:type="paragraph" w:styleId="TOC2">

</xml_diff>